<commit_message>
Align เรียน with end of phone number on envelopes
Co-Authored-By: Claude Opus 5.5 <noreply@anthropic.com>
Claude-Session: https://claude.ai/code/session_01J3NTsmEhLtUpdxrpfiWApU
</commit_message>
<xml_diff>
--- a/output/ซองเรียน_94_หน่วย.docx
+++ b/output/ซองเรียน_94_หน่วย.docx
@@ -47,10 +47,10 @@
     <w:p>
       <w:pPr>
         <w:tabs>
-          <w:tab w:pos="2188" w:val="left"/>
+          <w:tab w:pos="2588" w:val="left"/>
         </w:tabs>
         <w:spacing w:before="580" w:after="0" w:line="440" w:lineRule="exact"/>
-        <w:ind w:left="2188" w:hanging="720"/>
+        <w:ind w:left="2588" w:hanging="720"/>
       </w:pPr>
       <w:r>
         <w:rPr>
@@ -111,10 +111,10 @@
     <w:p>
       <w:pPr>
         <w:tabs>
-          <w:tab w:pos="2188" w:val="left"/>
+          <w:tab w:pos="2588" w:val="left"/>
         </w:tabs>
         <w:spacing w:before="580" w:after="0" w:line="440" w:lineRule="exact"/>
-        <w:ind w:left="2188" w:hanging="720"/>
+        <w:ind w:left="2588" w:hanging="720"/>
       </w:pPr>
       <w:r>
         <w:rPr>
@@ -126,60 +126,9 @@
         </w:rPr>
         <w:t>เรียน</w:t>
         <w:tab/>
-        <w:t>ผู้บังคับกองพันทหารสารวัตร สำนักกองบัญชาการ กองบัญชาการกองทัพไทย</w:t>
-      </w:r>
-    </w:p>
-    <w:p>
-      <w:pPr>
-        <w:pageBreakBefore/>
-        <w:spacing w:before="0" w:after="0" w:line="364" w:lineRule="exact"/>
-      </w:pPr>
-      <w:r>
-        <w:rPr>
-          <w:rFonts w:ascii="TH SarabunPSK" w:hAnsi="TH SarabunPSK" w:cs="TH SarabunPSK" w:eastAsia="TH SarabunPSK"/>
-          <w:b w:val="0"/>
-          <w:sz w:val="21"/>
-          <w:szCs w:val="21"/>
-        </w:rPr>
-        <w:t>วปอ.สปท.</w:t>
-      </w:r>
-    </w:p>
-    <w:p>
-      <w:pPr>
-        <w:spacing w:before="0" w:after="0" w:line="364" w:lineRule="exact"/>
-      </w:pPr>
-      <w:r>
-        <w:rPr>
-          <w:rFonts w:ascii="TH SarabunPSK" w:hAnsi="TH SarabunPSK" w:cs="TH SarabunPSK" w:eastAsia="TH SarabunPSK"/>
-          <w:b w:val="0"/>
-          <w:sz w:val="21"/>
-          <w:szCs w:val="21"/>
-        </w:rPr>
-        <w:t>กห ๐๓๑๗.๒/๑๖๑๑</w:t>
-      </w:r>
-    </w:p>
-    <w:p>
-      <w:pPr>
-        <w:spacing w:before="0" w:after="0" w:line="364" w:lineRule="exact"/>
-      </w:pPr>
-      <w:r>
-        <w:rPr>
-          <w:rFonts w:ascii="TH SarabunPSK" w:hAnsi="TH SarabunPSK" w:cs="TH SarabunPSK" w:eastAsia="TH SarabunPSK"/>
-          <w:b w:val="0"/>
-          <w:sz w:val="21"/>
-          <w:szCs w:val="21"/>
-        </w:rPr>
-        <w:t>โทร. ๐ ๒๕๗๒ ๒๕๒๗</w:t>
-      </w:r>
-    </w:p>
-    <w:p>
-      <w:pPr>
-        <w:tabs>
-          <w:tab w:pos="2188" w:val="left"/>
-        </w:tabs>
-        <w:spacing w:before="580" w:after="0" w:line="440" w:lineRule="exact"/>
-        <w:ind w:left="2188" w:hanging="720"/>
-      </w:pPr>
+        <w:t>ผู้บังคับกองพันทหารสารวัตร สำนักกองบัญชาการ</w:t>
+        <w:br/>
+      </w:r>
       <w:r>
         <w:rPr>
           <w:rFonts w:ascii="TH SarabunPSK" w:hAnsi="TH SarabunPSK" w:cs="TH SarabunPSK" w:eastAsia="TH SarabunPSK"/>
@@ -188,9 +137,7 @@
           <w:szCs w:val="26"/>
           <w:bCs/>
         </w:rPr>
-        <w:t>เรียน</w:t>
-        <w:tab/>
-        <w:t>ผู้อำนวยการสำนักงานเลขานุการ กองบัญชาการกองทัพไทย</w:t>
+        <w:t>กองบัญชาการกองทัพไทย</w:t>
       </w:r>
     </w:p>
     <w:p>
@@ -239,10 +186,10 @@
     <w:p>
       <w:pPr>
         <w:tabs>
-          <w:tab w:pos="2188" w:val="left"/>
+          <w:tab w:pos="2588" w:val="left"/>
         </w:tabs>
         <w:spacing w:before="580" w:after="0" w:line="440" w:lineRule="exact"/>
-        <w:ind w:left="2188" w:hanging="720"/>
+        <w:ind w:left="2588" w:hanging="720"/>
       </w:pPr>
       <w:r>
         <w:rPr>
@@ -254,7 +201,7 @@
         </w:rPr>
         <w:t>เรียน</w:t>
         <w:tab/>
-        <w:t>ผู้อำนวยการสำนักตรวจการปฏิบัติราชการ สำนักงานจเรทหาร</w:t>
+        <w:t>ผู้อำนวยการสำนักงานเลขานุการ กองบัญชาการกองทัพไทย</w:t>
       </w:r>
     </w:p>
     <w:p>
@@ -303,10 +250,10 @@
     <w:p>
       <w:pPr>
         <w:tabs>
-          <w:tab w:pos="2188" w:val="left"/>
+          <w:tab w:pos="2588" w:val="left"/>
         </w:tabs>
         <w:spacing w:before="580" w:after="0" w:line="440" w:lineRule="exact"/>
-        <w:ind w:left="2188" w:hanging="720"/>
+        <w:ind w:left="2588" w:hanging="720"/>
       </w:pPr>
       <w:r>
         <w:rPr>
@@ -318,7 +265,7 @@
         </w:rPr>
         <w:t>เรียน</w:t>
         <w:tab/>
-        <w:t>ผู้อำนวยการสำนักปฏิบัติการ หน่วยบัญชาการไซเบอร์ทหาร</w:t>
+        <w:t>ผู้อำนวยการสำนักตรวจการปฏิบัติราชการ สำนักงานจเรทหาร</w:t>
       </w:r>
     </w:p>
     <w:p>
@@ -367,10 +314,10 @@
     <w:p>
       <w:pPr>
         <w:tabs>
-          <w:tab w:pos="2188" w:val="left"/>
+          <w:tab w:pos="2588" w:val="left"/>
         </w:tabs>
         <w:spacing w:before="580" w:after="0" w:line="440" w:lineRule="exact"/>
-        <w:ind w:left="2188" w:hanging="720"/>
+        <w:ind w:left="2588" w:hanging="720"/>
       </w:pPr>
       <w:r>
         <w:rPr>
@@ -382,7 +329,7 @@
         </w:rPr>
         <w:t>เรียน</w:t>
         <w:tab/>
-        <w:t>ผู้อำนวยการสำนักนโยบายและแผนกำลังพล กรมกำลังพลทหาร</w:t>
+        <w:t>ผู้อำนวยการสำนักปฏิบัติการ หน่วยบัญชาการไซเบอร์ทหาร</w:t>
       </w:r>
     </w:p>
     <w:p>
@@ -431,10 +378,10 @@
     <w:p>
       <w:pPr>
         <w:tabs>
-          <w:tab w:pos="2188" w:val="left"/>
+          <w:tab w:pos="2588" w:val="left"/>
         </w:tabs>
         <w:spacing w:before="580" w:after="0" w:line="440" w:lineRule="exact"/>
-        <w:ind w:left="2188" w:hanging="720"/>
+        <w:ind w:left="2588" w:hanging="720"/>
       </w:pPr>
       <w:r>
         <w:rPr>
@@ -446,7 +393,7 @@
         </w:rPr>
         <w:t>เรียน</w:t>
         <w:tab/>
-        <w:t>ผู้อำนวยการสำนักข่าวกรอง กรมข่าวทหาร</w:t>
+        <w:t>ผู้อำนวยการสำนักนโยบายและแผนกำลังพล กรมกำลังพลทหาร</w:t>
       </w:r>
     </w:p>
     <w:p>
@@ -495,10 +442,10 @@
     <w:p>
       <w:pPr>
         <w:tabs>
-          <w:tab w:pos="2188" w:val="left"/>
+          <w:tab w:pos="2588" w:val="left"/>
         </w:tabs>
         <w:spacing w:before="580" w:after="0" w:line="440" w:lineRule="exact"/>
-        <w:ind w:left="2188" w:hanging="720"/>
+        <w:ind w:left="2588" w:hanging="720"/>
       </w:pPr>
       <w:r>
         <w:rPr>
@@ -510,7 +457,7 @@
         </w:rPr>
         <w:t>เรียน</w:t>
         <w:tab/>
-        <w:t>ผู้อำนวยการสำนักวิเทศสัมพันธ์ กรมข่าวทหาร</w:t>
+        <w:t>ผู้อำนวยการสำนักข่าวกรอง กรมข่าวทหาร</w:t>
       </w:r>
     </w:p>
     <w:p>
@@ -559,10 +506,10 @@
     <w:p>
       <w:pPr>
         <w:tabs>
-          <w:tab w:pos="2188" w:val="left"/>
+          <w:tab w:pos="2588" w:val="left"/>
         </w:tabs>
         <w:spacing w:before="580" w:after="0" w:line="440" w:lineRule="exact"/>
-        <w:ind w:left="2188" w:hanging="720"/>
+        <w:ind w:left="2588" w:hanging="720"/>
       </w:pPr>
       <w:r>
         <w:rPr>
@@ -574,7 +521,7 @@
         </w:rPr>
         <w:t>เรียน</w:t>
         <w:tab/>
-        <w:t>ผู้อำนวยการสำนักนโยบายและแผน กรมยุทธการทหาร</w:t>
+        <w:t>ผู้อำนวยการสำนักวิเทศสัมพันธ์ กรมข่าวทหาร</w:t>
       </w:r>
     </w:p>
     <w:p>
@@ -623,10 +570,10 @@
     <w:p>
       <w:pPr>
         <w:tabs>
-          <w:tab w:pos="2188" w:val="left"/>
+          <w:tab w:pos="2588" w:val="left"/>
         </w:tabs>
         <w:spacing w:before="580" w:after="0" w:line="440" w:lineRule="exact"/>
-        <w:ind w:left="2188" w:hanging="720"/>
+        <w:ind w:left="2588" w:hanging="720"/>
       </w:pPr>
       <w:r>
         <w:rPr>
@@ -638,7 +585,7 @@
         </w:rPr>
         <w:t>เรียน</w:t>
         <w:tab/>
-        <w:t>ผู้อำนวยการสำนักปฏิบัติการ กรมยุทธการทหาร</w:t>
+        <w:t>ผู้อำนวยการสำนักนโยบายและแผน กรมยุทธการทหาร</w:t>
       </w:r>
     </w:p>
     <w:p>
@@ -687,10 +634,10 @@
     <w:p>
       <w:pPr>
         <w:tabs>
-          <w:tab w:pos="2188" w:val="left"/>
+          <w:tab w:pos="2588" w:val="left"/>
         </w:tabs>
         <w:spacing w:before="580" w:after="0" w:line="440" w:lineRule="exact"/>
-        <w:ind w:left="2188" w:hanging="720"/>
+        <w:ind w:left="2588" w:hanging="720"/>
       </w:pPr>
       <w:r>
         <w:rPr>
@@ -702,7 +649,7 @@
         </w:rPr>
         <w:t>เรียน</w:t>
         <w:tab/>
-        <w:t>ผู้อำนวยการสำนักวางแผนการฝึกร่วมและผสม กรมยุทธการทหาร</w:t>
+        <w:t>ผู้อำนวยการสำนักปฏิบัติการ กรมยุทธการทหาร</w:t>
       </w:r>
     </w:p>
     <w:p>
@@ -751,10 +698,10 @@
     <w:p>
       <w:pPr>
         <w:tabs>
-          <w:tab w:pos="2188" w:val="left"/>
+          <w:tab w:pos="2588" w:val="left"/>
         </w:tabs>
         <w:spacing w:before="580" w:after="0" w:line="440" w:lineRule="exact"/>
-        <w:ind w:left="2188" w:hanging="720"/>
+        <w:ind w:left="2588" w:hanging="720"/>
       </w:pPr>
       <w:r>
         <w:rPr>
@@ -766,7 +713,7 @@
         </w:rPr>
         <w:t>เรียน</w:t>
         <w:tab/>
-        <w:t>ผู้อำนวยการศูนย์ปฏิบัติการเพื่อสันติภาพ กรมยุทธการทหาร</w:t>
+        <w:t>ผู้อำนวยการสำนักวางแผนการฝึกร่วมและผสม กรมยุทธการทหาร</w:t>
       </w:r>
     </w:p>
     <w:p>
@@ -815,10 +762,10 @@
     <w:p>
       <w:pPr>
         <w:tabs>
-          <w:tab w:pos="2188" w:val="left"/>
+          <w:tab w:pos="2588" w:val="left"/>
         </w:tabs>
         <w:spacing w:before="580" w:after="0" w:line="440" w:lineRule="exact"/>
-        <w:ind w:left="2188" w:hanging="720"/>
+        <w:ind w:left="2588" w:hanging="720"/>
       </w:pPr>
       <w:r>
         <w:rPr>
@@ -830,9 +777,60 @@
         </w:rPr>
         <w:t>เรียน</w:t>
         <w:tab/>
-        <w:t>ผู้อำนวยการสำนักงานประสานภารกิจด้านความมั่นคง</w:t>
-        <w:br/>
-      </w:r>
+        <w:t>ผู้อำนวยการศูนย์ปฏิบัติการเพื่อสันติภาพ กรมยุทธการทหาร</w:t>
+      </w:r>
+    </w:p>
+    <w:p>
+      <w:pPr>
+        <w:pageBreakBefore/>
+        <w:spacing w:before="0" w:after="0" w:line="364" w:lineRule="exact"/>
+      </w:pPr>
+      <w:r>
+        <w:rPr>
+          <w:rFonts w:ascii="TH SarabunPSK" w:hAnsi="TH SarabunPSK" w:cs="TH SarabunPSK" w:eastAsia="TH SarabunPSK"/>
+          <w:b w:val="0"/>
+          <w:sz w:val="21"/>
+          <w:szCs w:val="21"/>
+        </w:rPr>
+        <w:t>วปอ.สปท.</w:t>
+      </w:r>
+    </w:p>
+    <w:p>
+      <w:pPr>
+        <w:spacing w:before="0" w:after="0" w:line="364" w:lineRule="exact"/>
+      </w:pPr>
+      <w:r>
+        <w:rPr>
+          <w:rFonts w:ascii="TH SarabunPSK" w:hAnsi="TH SarabunPSK" w:cs="TH SarabunPSK" w:eastAsia="TH SarabunPSK"/>
+          <w:b w:val="0"/>
+          <w:sz w:val="21"/>
+          <w:szCs w:val="21"/>
+        </w:rPr>
+        <w:t>กห ๐๓๑๗.๒/๑๖๑๑</w:t>
+      </w:r>
+    </w:p>
+    <w:p>
+      <w:pPr>
+        <w:spacing w:before="0" w:after="0" w:line="364" w:lineRule="exact"/>
+      </w:pPr>
+      <w:r>
+        <w:rPr>
+          <w:rFonts w:ascii="TH SarabunPSK" w:hAnsi="TH SarabunPSK" w:cs="TH SarabunPSK" w:eastAsia="TH SarabunPSK"/>
+          <w:b w:val="0"/>
+          <w:sz w:val="21"/>
+          <w:szCs w:val="21"/>
+        </w:rPr>
+        <w:t>โทร. ๐ ๒๕๗๒ ๒๕๒๗</w:t>
+      </w:r>
+    </w:p>
+    <w:p>
+      <w:pPr>
+        <w:tabs>
+          <w:tab w:pos="2588" w:val="left"/>
+        </w:tabs>
+        <w:spacing w:before="580" w:after="0" w:line="440" w:lineRule="exact"/>
+        <w:ind w:left="2588" w:hanging="720"/>
+      </w:pPr>
       <w:r>
         <w:rPr>
           <w:rFonts w:ascii="TH SarabunPSK" w:hAnsi="TH SarabunPSK" w:cs="TH SarabunPSK" w:eastAsia="TH SarabunPSK"/>
@@ -841,60 +839,11 @@
           <w:szCs w:val="26"/>
           <w:bCs/>
         </w:rPr>
-        <w:t>กับ กอ.รมน. กรมยุทธการทหาร</w:t>
-      </w:r>
-    </w:p>
-    <w:p>
-      <w:pPr>
-        <w:pageBreakBefore/>
-        <w:spacing w:before="0" w:after="0" w:line="364" w:lineRule="exact"/>
-      </w:pPr>
-      <w:r>
-        <w:rPr>
-          <w:rFonts w:ascii="TH SarabunPSK" w:hAnsi="TH SarabunPSK" w:cs="TH SarabunPSK" w:eastAsia="TH SarabunPSK"/>
-          <w:b w:val="0"/>
-          <w:sz w:val="21"/>
-          <w:szCs w:val="21"/>
-        </w:rPr>
-        <w:t>วปอ.สปท.</w:t>
-      </w:r>
-    </w:p>
-    <w:p>
-      <w:pPr>
-        <w:spacing w:before="0" w:after="0" w:line="364" w:lineRule="exact"/>
-      </w:pPr>
-      <w:r>
-        <w:rPr>
-          <w:rFonts w:ascii="TH SarabunPSK" w:hAnsi="TH SarabunPSK" w:cs="TH SarabunPSK" w:eastAsia="TH SarabunPSK"/>
-          <w:b w:val="0"/>
-          <w:sz w:val="21"/>
-          <w:szCs w:val="21"/>
-        </w:rPr>
-        <w:t>กห ๐๓๑๗.๒/๑๖๑๑</w:t>
-      </w:r>
-    </w:p>
-    <w:p>
-      <w:pPr>
-        <w:spacing w:before="0" w:after="0" w:line="364" w:lineRule="exact"/>
-      </w:pPr>
-      <w:r>
-        <w:rPr>
-          <w:rFonts w:ascii="TH SarabunPSK" w:hAnsi="TH SarabunPSK" w:cs="TH SarabunPSK" w:eastAsia="TH SarabunPSK"/>
-          <w:b w:val="0"/>
-          <w:sz w:val="21"/>
-          <w:szCs w:val="21"/>
-        </w:rPr>
-        <w:t>โทร. ๐ ๒๕๗๒ ๒๕๒๗</w:t>
-      </w:r>
-    </w:p>
-    <w:p>
-      <w:pPr>
-        <w:tabs>
-          <w:tab w:pos="2188" w:val="left"/>
-        </w:tabs>
-        <w:spacing w:before="580" w:after="0" w:line="440" w:lineRule="exact"/>
-        <w:ind w:left="2188" w:hanging="720"/>
-      </w:pPr>
+        <w:t>เรียน</w:t>
+        <w:tab/>
+        <w:t>ผู้อำนวยการสำนักงานประสานภารกิจด้านความมั่นคง</w:t>
+        <w:br/>
+      </w:r>
       <w:r>
         <w:rPr>
           <w:rFonts w:ascii="TH SarabunPSK" w:hAnsi="TH SarabunPSK" w:cs="TH SarabunPSK" w:eastAsia="TH SarabunPSK"/>
@@ -903,9 +852,7 @@
           <w:szCs w:val="26"/>
           <w:bCs/>
         </w:rPr>
-        <w:t>เรียน</w:t>
-        <w:tab/>
-        <w:t>ผู้อำนวยการสำนักส่งกำลังบำรุงร่วม กรมส่งกำลังบำรุงทหาร</w:t>
+        <w:t>กับ กอ.รมน. กรมยุทธการทหาร</w:t>
       </w:r>
     </w:p>
     <w:p>
@@ -954,10 +901,10 @@
     <w:p>
       <w:pPr>
         <w:tabs>
-          <w:tab w:pos="2188" w:val="left"/>
+          <w:tab w:pos="2588" w:val="left"/>
         </w:tabs>
         <w:spacing w:before="580" w:after="0" w:line="440" w:lineRule="exact"/>
-        <w:ind w:left="2188" w:hanging="720"/>
+        <w:ind w:left="2588" w:hanging="720"/>
       </w:pPr>
       <w:r>
         <w:rPr>
@@ -969,7 +916,7 @@
         </w:rPr>
         <w:t>เรียน</w:t>
         <w:tab/>
-        <w:t>ผู้อำนวยการสำนักบริหารสิ่งอุปกรณ์ กรมส่งกำลังบำรุงทหาร</w:t>
+        <w:t>ผู้อำนวยการสำนักส่งกำลังบำรุงร่วม กรมส่งกำลังบำรุงทหาร</w:t>
       </w:r>
     </w:p>
     <w:p>
@@ -1018,10 +965,10 @@
     <w:p>
       <w:pPr>
         <w:tabs>
-          <w:tab w:pos="2188" w:val="left"/>
+          <w:tab w:pos="2588" w:val="left"/>
         </w:tabs>
         <w:spacing w:before="580" w:after="0" w:line="440" w:lineRule="exact"/>
-        <w:ind w:left="2188" w:hanging="720"/>
+        <w:ind w:left="2588" w:hanging="720"/>
       </w:pPr>
       <w:r>
         <w:rPr>
@@ -1033,7 +980,7 @@
         </w:rPr>
         <w:t>เรียน</w:t>
         <w:tab/>
-        <w:t>ผู้อำนวยการสำนักปฏิบัติการกิจการพลเรือน กรมกิจการพลเรือนทหาร</w:t>
+        <w:t>ผู้อำนวยการสำนักบริหารสิ่งอุปกรณ์ กรมส่งกำลังบำรุงทหาร</w:t>
       </w:r>
     </w:p>
     <w:p>
@@ -1082,10 +1029,10 @@
     <w:p>
       <w:pPr>
         <w:tabs>
-          <w:tab w:pos="2188" w:val="left"/>
+          <w:tab w:pos="2588" w:val="left"/>
         </w:tabs>
         <w:spacing w:before="580" w:after="0" w:line="440" w:lineRule="exact"/>
-        <w:ind w:left="2188" w:hanging="720"/>
+        <w:ind w:left="2588" w:hanging="720"/>
       </w:pPr>
       <w:r>
         <w:rPr>
@@ -1097,7 +1044,7 @@
         </w:rPr>
         <w:t>เรียน</w:t>
         <w:tab/>
-        <w:t>ผู้อำนวยการสำนักประชาสัมพันธ์ กรมกิจการพลเรือนทหาร</w:t>
+        <w:t>ผู้อำนวยการสำนักปฏิบัติการกิจการพลเรือน กรมกิจการพลเรือนทหาร</w:t>
       </w:r>
     </w:p>
     <w:p>
@@ -1146,10 +1093,10 @@
     <w:p>
       <w:pPr>
         <w:tabs>
-          <w:tab w:pos="2188" w:val="left"/>
+          <w:tab w:pos="2588" w:val="left"/>
         </w:tabs>
         <w:spacing w:before="580" w:after="0" w:line="440" w:lineRule="exact"/>
-        <w:ind w:left="2188" w:hanging="720"/>
+        <w:ind w:left="2588" w:hanging="720"/>
       </w:pPr>
       <w:r>
         <w:rPr>
@@ -1161,7 +1108,7 @@
         </w:rPr>
         <w:t>เรียน</w:t>
         <w:tab/>
-        <w:t>ผู้อำนวยการสำนักแผนและอำนวยการสื่อสาร กรมการสื่อสารทหาร</w:t>
+        <w:t>ผู้อำนวยการสำนักประชาสัมพันธ์ กรมกิจการพลเรือนทหาร</w:t>
       </w:r>
     </w:p>
     <w:p>
@@ -1210,10 +1157,10 @@
     <w:p>
       <w:pPr>
         <w:tabs>
-          <w:tab w:pos="2188" w:val="left"/>
+          <w:tab w:pos="2588" w:val="left"/>
         </w:tabs>
         <w:spacing w:before="580" w:after="0" w:line="440" w:lineRule="exact"/>
-        <w:ind w:left="2188" w:hanging="720"/>
+        <w:ind w:left="2588" w:hanging="720"/>
       </w:pPr>
       <w:r>
         <w:rPr>
@@ -1225,7 +1172,7 @@
         </w:rPr>
         <w:t>เรียน</w:t>
         <w:tab/>
-        <w:t>ผู้อำนวยการศูนย์โทรคมนาคมทหาร กรมการสื่อสารทหาร</w:t>
+        <w:t>ผู้อำนวยการสำนักแผนและอำนวยการสื่อสาร กรมการสื่อสารทหาร</w:t>
       </w:r>
     </w:p>
     <w:p>
@@ -1274,10 +1221,10 @@
     <w:p>
       <w:pPr>
         <w:tabs>
-          <w:tab w:pos="2188" w:val="left"/>
+          <w:tab w:pos="2588" w:val="left"/>
         </w:tabs>
         <w:spacing w:before="580" w:after="0" w:line="440" w:lineRule="exact"/>
-        <w:ind w:left="2188" w:hanging="720"/>
+        <w:ind w:left="2588" w:hanging="720"/>
       </w:pPr>
       <w:r>
         <w:rPr>
@@ -1289,7 +1236,7 @@
         </w:rPr>
         <w:t>เรียน</w:t>
         <w:tab/>
-        <w:t>ผู้อำนวยการศูนย์เทคโนโลยีสารสนเทศทหาร กรมการสื่อสารทหาร</w:t>
+        <w:t>ผู้อำนวยการศูนย์โทรคมนาคมทหาร กรมการสื่อสารทหาร</w:t>
       </w:r>
     </w:p>
     <w:p>
@@ -1338,10 +1285,10 @@
     <w:p>
       <w:pPr>
         <w:tabs>
-          <w:tab w:pos="2188" w:val="left"/>
+          <w:tab w:pos="2588" w:val="left"/>
         </w:tabs>
         <w:spacing w:before="580" w:after="0" w:line="440" w:lineRule="exact"/>
-        <w:ind w:left="2188" w:hanging="720"/>
+        <w:ind w:left="2588" w:hanging="720"/>
       </w:pPr>
       <w:r>
         <w:rPr>
@@ -1353,7 +1300,7 @@
         </w:rPr>
         <w:t>เรียน</w:t>
         <w:tab/>
-        <w:t>ผู้บังคับกองพันทหารสื่อสาร กองบัญชาการกองทัพไทย</w:t>
+        <w:t>ผู้อำนวยการศูนย์เทคโนโลยีสารสนเทศทหาร กรมการสื่อสารทหาร</w:t>
       </w:r>
     </w:p>
     <w:p>
@@ -1402,10 +1349,10 @@
     <w:p>
       <w:pPr>
         <w:tabs>
-          <w:tab w:pos="2188" w:val="left"/>
+          <w:tab w:pos="2588" w:val="left"/>
         </w:tabs>
         <w:spacing w:before="580" w:after="0" w:line="440" w:lineRule="exact"/>
-        <w:ind w:left="2188" w:hanging="720"/>
+        <w:ind w:left="2588" w:hanging="720"/>
       </w:pPr>
       <w:r>
         <w:rPr>
@@ -1417,7 +1364,7 @@
         </w:rPr>
         <w:t>เรียน</w:t>
         <w:tab/>
-        <w:t>ผู้บังคับกองพันปฏิบัติการสงครามอิเล็กทรอนิกส์ กรมการสื่อสารทหาร</w:t>
+        <w:t>ผู้บังคับกองพันทหารสื่อสาร กองบัญชาการกองทัพไทย</w:t>
       </w:r>
     </w:p>
     <w:p>
@@ -1466,10 +1413,10 @@
     <w:p>
       <w:pPr>
         <w:tabs>
-          <w:tab w:pos="2188" w:val="left"/>
+          <w:tab w:pos="2588" w:val="left"/>
         </w:tabs>
         <w:spacing w:before="580" w:after="0" w:line="440" w:lineRule="exact"/>
-        <w:ind w:left="2188" w:hanging="720"/>
+        <w:ind w:left="2588" w:hanging="720"/>
       </w:pPr>
       <w:r>
         <w:rPr>
@@ -1481,7 +1428,7 @@
         </w:rPr>
         <w:t>เรียน</w:t>
         <w:tab/>
-        <w:t>ผู้อำนวยการสำนักบริหารทรัพยากร สำนักงานปลัดบัญชีทหาร</w:t>
+        <w:t>ผู้บังคับกองพันปฏิบัติการสงครามอิเล็กทรอนิกส์ กรมการสื่อสารทหาร</w:t>
       </w:r>
     </w:p>
     <w:p>
@@ -1530,10 +1477,10 @@
     <w:p>
       <w:pPr>
         <w:tabs>
-          <w:tab w:pos="2188" w:val="left"/>
+          <w:tab w:pos="2588" w:val="left"/>
         </w:tabs>
         <w:spacing w:before="580" w:after="0" w:line="440" w:lineRule="exact"/>
-        <w:ind w:left="2188" w:hanging="720"/>
+        <w:ind w:left="2588" w:hanging="720"/>
       </w:pPr>
       <w:r>
         <w:rPr>
@@ -1545,7 +1492,7 @@
         </w:rPr>
         <w:t>เรียน</w:t>
         <w:tab/>
-        <w:t>ผู้อำนวยการสำนักงานทหารพัฒนา หน่วยบัญชาการทหารพัฒนา</w:t>
+        <w:t>ผู้อำนวยการสำนักบริหารทรัพยากร สำนักงานปลัดบัญชีทหาร</w:t>
       </w:r>
     </w:p>
     <w:p>
@@ -1594,10 +1541,10 @@
     <w:p>
       <w:pPr>
         <w:tabs>
-          <w:tab w:pos="2188" w:val="left"/>
+          <w:tab w:pos="2588" w:val="left"/>
         </w:tabs>
         <w:spacing w:before="580" w:after="0" w:line="440" w:lineRule="exact"/>
-        <w:ind w:left="2188" w:hanging="720"/>
+        <w:ind w:left="2588" w:hanging="720"/>
       </w:pPr>
       <w:r>
         <w:rPr>
@@ -1609,7 +1556,7 @@
         </w:rPr>
         <w:t>เรียน</w:t>
         <w:tab/>
-        <w:t>ผู้อำนวยการสำนักงานสนับสนุน หน่วยบัญชาการทหารพัฒนา</w:t>
+        <w:t>ผู้อำนวยการสำนักงานทหารพัฒนา หน่วยบัญชาการทหารพัฒนา</w:t>
       </w:r>
     </w:p>
     <w:p>
@@ -1658,10 +1605,10 @@
     <w:p>
       <w:pPr>
         <w:tabs>
-          <w:tab w:pos="2188" w:val="left"/>
+          <w:tab w:pos="2588" w:val="left"/>
         </w:tabs>
         <w:spacing w:before="580" w:after="0" w:line="440" w:lineRule="exact"/>
-        <w:ind w:left="2188" w:hanging="720"/>
+        <w:ind w:left="2588" w:hanging="720"/>
       </w:pPr>
       <w:r>
         <w:rPr>
@@ -1673,9 +1620,60 @@
         </w:rPr>
         <w:t>เรียน</w:t>
         <w:tab/>
-        <w:t>ผู้อำนวยการสำนักงานพัฒนาโครงการอันเนื่องมาจากพระราชดำริ</w:t>
-        <w:br/>
-      </w:r>
+        <w:t>ผู้อำนวยการสำนักงานสนับสนุน หน่วยบัญชาการทหารพัฒนา</w:t>
+      </w:r>
+    </w:p>
+    <w:p>
+      <w:pPr>
+        <w:pageBreakBefore/>
+        <w:spacing w:before="0" w:after="0" w:line="364" w:lineRule="exact"/>
+      </w:pPr>
+      <w:r>
+        <w:rPr>
+          <w:rFonts w:ascii="TH SarabunPSK" w:hAnsi="TH SarabunPSK" w:cs="TH SarabunPSK" w:eastAsia="TH SarabunPSK"/>
+          <w:b w:val="0"/>
+          <w:sz w:val="21"/>
+          <w:szCs w:val="21"/>
+        </w:rPr>
+        <w:t>วปอ.สปท.</w:t>
+      </w:r>
+    </w:p>
+    <w:p>
+      <w:pPr>
+        <w:spacing w:before="0" w:after="0" w:line="364" w:lineRule="exact"/>
+      </w:pPr>
+      <w:r>
+        <w:rPr>
+          <w:rFonts w:ascii="TH SarabunPSK" w:hAnsi="TH SarabunPSK" w:cs="TH SarabunPSK" w:eastAsia="TH SarabunPSK"/>
+          <w:b w:val="0"/>
+          <w:sz w:val="21"/>
+          <w:szCs w:val="21"/>
+        </w:rPr>
+        <w:t>กห ๐๓๑๗.๒/๑๖๑๑</w:t>
+      </w:r>
+    </w:p>
+    <w:p>
+      <w:pPr>
+        <w:spacing w:before="0" w:after="0" w:line="364" w:lineRule="exact"/>
+      </w:pPr>
+      <w:r>
+        <w:rPr>
+          <w:rFonts w:ascii="TH SarabunPSK" w:hAnsi="TH SarabunPSK" w:cs="TH SarabunPSK" w:eastAsia="TH SarabunPSK"/>
+          <w:b w:val="0"/>
+          <w:sz w:val="21"/>
+          <w:szCs w:val="21"/>
+        </w:rPr>
+        <w:t>โทร. ๐ ๒๕๗๒ ๒๕๒๗</w:t>
+      </w:r>
+    </w:p>
+    <w:p>
+      <w:pPr>
+        <w:tabs>
+          <w:tab w:pos="2588" w:val="left"/>
+        </w:tabs>
+        <w:spacing w:before="580" w:after="0" w:line="440" w:lineRule="exact"/>
+        <w:ind w:left="2588" w:hanging="720"/>
+      </w:pPr>
       <w:r>
         <w:rPr>
           <w:rFonts w:ascii="TH SarabunPSK" w:hAnsi="TH SarabunPSK" w:cs="TH SarabunPSK" w:eastAsia="TH SarabunPSK"/>
@@ -1684,60 +1682,11 @@
           <w:szCs w:val="26"/>
           <w:bCs/>
         </w:rPr>
-        <w:t>หน่วยบัญชาการทหารพัฒนา</w:t>
-      </w:r>
-    </w:p>
-    <w:p>
-      <w:pPr>
-        <w:pageBreakBefore/>
-        <w:spacing w:before="0" w:after="0" w:line="364" w:lineRule="exact"/>
-      </w:pPr>
-      <w:r>
-        <w:rPr>
-          <w:rFonts w:ascii="TH SarabunPSK" w:hAnsi="TH SarabunPSK" w:cs="TH SarabunPSK" w:eastAsia="TH SarabunPSK"/>
-          <w:b w:val="0"/>
-          <w:sz w:val="21"/>
-          <w:szCs w:val="21"/>
-        </w:rPr>
-        <w:t>วปอ.สปท.</w:t>
-      </w:r>
-    </w:p>
-    <w:p>
-      <w:pPr>
-        <w:spacing w:before="0" w:after="0" w:line="364" w:lineRule="exact"/>
-      </w:pPr>
-      <w:r>
-        <w:rPr>
-          <w:rFonts w:ascii="TH SarabunPSK" w:hAnsi="TH SarabunPSK" w:cs="TH SarabunPSK" w:eastAsia="TH SarabunPSK"/>
-          <w:b w:val="0"/>
-          <w:sz w:val="21"/>
-          <w:szCs w:val="21"/>
-        </w:rPr>
-        <w:t>กห ๐๓๑๗.๒/๑๖๑๑</w:t>
-      </w:r>
-    </w:p>
-    <w:p>
-      <w:pPr>
-        <w:spacing w:before="0" w:after="0" w:line="364" w:lineRule="exact"/>
-      </w:pPr>
-      <w:r>
-        <w:rPr>
-          <w:rFonts w:ascii="TH SarabunPSK" w:hAnsi="TH SarabunPSK" w:cs="TH SarabunPSK" w:eastAsia="TH SarabunPSK"/>
-          <w:b w:val="0"/>
-          <w:sz w:val="21"/>
-          <w:szCs w:val="21"/>
-        </w:rPr>
-        <w:t>โทร. ๐ ๒๕๗๒ ๒๕๒๗</w:t>
-      </w:r>
-    </w:p>
-    <w:p>
-      <w:pPr>
-        <w:tabs>
-          <w:tab w:pos="2188" w:val="left"/>
-        </w:tabs>
-        <w:spacing w:before="580" w:after="0" w:line="440" w:lineRule="exact"/>
-        <w:ind w:left="2188" w:hanging="720"/>
-      </w:pPr>
+        <w:t>เรียน</w:t>
+        <w:tab/>
+        <w:t>ผู้อำนวยการสำนักงานพัฒนาโครงการอันเนื่องมาจากพระราชดำริ</w:t>
+        <w:br/>
+      </w:r>
       <w:r>
         <w:rPr>
           <w:rFonts w:ascii="TH SarabunPSK" w:hAnsi="TH SarabunPSK" w:cs="TH SarabunPSK" w:eastAsia="TH SarabunPSK"/>
@@ -1746,9 +1695,7 @@
           <w:szCs w:val="26"/>
           <w:bCs/>
         </w:rPr>
-        <w:t>เรียน</w:t>
-        <w:tab/>
-        <w:t>ผู้อำนวยการสำนักงานพัฒนาภาค 1 หน่วยบัญชาการทหารพัฒนา</w:t>
+        <w:t>หน่วยบัญชาการทหารพัฒนา</w:t>
       </w:r>
     </w:p>
     <w:p>
@@ -1797,10 +1744,10 @@
     <w:p>
       <w:pPr>
         <w:tabs>
-          <w:tab w:pos="2188" w:val="left"/>
+          <w:tab w:pos="2588" w:val="left"/>
         </w:tabs>
         <w:spacing w:before="580" w:after="0" w:line="440" w:lineRule="exact"/>
-        <w:ind w:left="2188" w:hanging="720"/>
+        <w:ind w:left="2588" w:hanging="720"/>
       </w:pPr>
       <w:r>
         <w:rPr>
@@ -1812,7 +1759,7 @@
         </w:rPr>
         <w:t>เรียน</w:t>
         <w:tab/>
-        <w:t>ผู้บังคับหน่วยพัฒนาการเคลื่อนที่ 11 สำนักงานพัฒนาภาค 1</w:t>
+        <w:t>ผู้อำนวยการสำนักงานพัฒนาภาค 1 หน่วยบัญชาการทหารพัฒนา</w:t>
       </w:r>
     </w:p>
     <w:p>
@@ -1861,10 +1808,10 @@
     <w:p>
       <w:pPr>
         <w:tabs>
-          <w:tab w:pos="2188" w:val="left"/>
+          <w:tab w:pos="2588" w:val="left"/>
         </w:tabs>
         <w:spacing w:before="580" w:after="0" w:line="440" w:lineRule="exact"/>
-        <w:ind w:left="2188" w:hanging="720"/>
+        <w:ind w:left="2588" w:hanging="720"/>
       </w:pPr>
       <w:r>
         <w:rPr>
@@ -1876,7 +1823,7 @@
         </w:rPr>
         <w:t>เรียน</w:t>
         <w:tab/>
-        <w:t>ผู้บังคับหน่วยพัฒนาการเคลื่อนที่ 12 สำนักงานพัฒนาภาค 1</w:t>
+        <w:t>ผู้บังคับหน่วยพัฒนาการเคลื่อนที่ 11 สำนักงานพัฒนาภาค 1</w:t>
       </w:r>
     </w:p>
     <w:p>
@@ -1925,10 +1872,10 @@
     <w:p>
       <w:pPr>
         <w:tabs>
-          <w:tab w:pos="2188" w:val="left"/>
+          <w:tab w:pos="2588" w:val="left"/>
         </w:tabs>
         <w:spacing w:before="580" w:after="0" w:line="440" w:lineRule="exact"/>
-        <w:ind w:left="2188" w:hanging="720"/>
+        <w:ind w:left="2588" w:hanging="720"/>
       </w:pPr>
       <w:r>
         <w:rPr>
@@ -1940,7 +1887,7 @@
         </w:rPr>
         <w:t>เรียน</w:t>
         <w:tab/>
-        <w:t>ผู้บังคับหน่วยพัฒนาการเคลื่อนที่ 13 สำนักงานพัฒนาภาค 1</w:t>
+        <w:t>ผู้บังคับหน่วยพัฒนาการเคลื่อนที่ 12 สำนักงานพัฒนาภาค 1</w:t>
       </w:r>
     </w:p>
     <w:p>
@@ -1989,10 +1936,10 @@
     <w:p>
       <w:pPr>
         <w:tabs>
-          <w:tab w:pos="2188" w:val="left"/>
+          <w:tab w:pos="2588" w:val="left"/>
         </w:tabs>
         <w:spacing w:before="580" w:after="0" w:line="440" w:lineRule="exact"/>
-        <w:ind w:left="2188" w:hanging="720"/>
+        <w:ind w:left="2588" w:hanging="720"/>
       </w:pPr>
       <w:r>
         <w:rPr>
@@ -2004,7 +1951,7 @@
         </w:rPr>
         <w:t>เรียน</w:t>
         <w:tab/>
-        <w:t>ผู้บังคับหน่วยพัฒนาการเคลื่อนที่ 14 สำนักงานพัฒนาภาค 1</w:t>
+        <w:t>ผู้บังคับหน่วยพัฒนาการเคลื่อนที่ 13 สำนักงานพัฒนาภาค 1</w:t>
       </w:r>
     </w:p>
     <w:p>
@@ -2053,10 +2000,10 @@
     <w:p>
       <w:pPr>
         <w:tabs>
-          <w:tab w:pos="2188" w:val="left"/>
+          <w:tab w:pos="2588" w:val="left"/>
         </w:tabs>
         <w:spacing w:before="580" w:after="0" w:line="440" w:lineRule="exact"/>
-        <w:ind w:left="2188" w:hanging="720"/>
+        <w:ind w:left="2588" w:hanging="720"/>
       </w:pPr>
       <w:r>
         <w:rPr>
@@ -2068,7 +2015,7 @@
         </w:rPr>
         <w:t>เรียน</w:t>
         <w:tab/>
-        <w:t>ผู้บังคับหน่วยพัฒนาการเคลื่อนที่ 15 สำนักงานพัฒนาภาค 1</w:t>
+        <w:t>ผู้บังคับหน่วยพัฒนาการเคลื่อนที่ 14 สำนักงานพัฒนาภาค 1</w:t>
       </w:r>
     </w:p>
     <w:p>
@@ -2117,10 +2064,10 @@
     <w:p>
       <w:pPr>
         <w:tabs>
-          <w:tab w:pos="2188" w:val="left"/>
+          <w:tab w:pos="2588" w:val="left"/>
         </w:tabs>
         <w:spacing w:before="580" w:after="0" w:line="440" w:lineRule="exact"/>
-        <w:ind w:left="2188" w:hanging="720"/>
+        <w:ind w:left="2588" w:hanging="720"/>
       </w:pPr>
       <w:r>
         <w:rPr>
@@ -2132,7 +2079,7 @@
         </w:rPr>
         <w:t>เรียน</w:t>
         <w:tab/>
-        <w:t>ผู้อำนวยการสำนักงานพัฒนาภาค 2 หน่วยบัญชาการทหารพัฒนา</w:t>
+        <w:t>ผู้บังคับหน่วยพัฒนาการเคลื่อนที่ 15 สำนักงานพัฒนาภาค 1</w:t>
       </w:r>
     </w:p>
     <w:p>
@@ -2181,10 +2128,10 @@
     <w:p>
       <w:pPr>
         <w:tabs>
-          <w:tab w:pos="2188" w:val="left"/>
+          <w:tab w:pos="2588" w:val="left"/>
         </w:tabs>
         <w:spacing w:before="580" w:after="0" w:line="440" w:lineRule="exact"/>
-        <w:ind w:left="2188" w:hanging="720"/>
+        <w:ind w:left="2588" w:hanging="720"/>
       </w:pPr>
       <w:r>
         <w:rPr>
@@ -2196,7 +2143,7 @@
         </w:rPr>
         <w:t>เรียน</w:t>
         <w:tab/>
-        <w:t>ผู้บังคับหน่วยพัฒนาการเคลื่อนที่ 21 สำนักงานพัฒนาภาค 2</w:t>
+        <w:t>ผู้อำนวยการสำนักงานพัฒนาภาค 2 หน่วยบัญชาการทหารพัฒนา</w:t>
       </w:r>
     </w:p>
     <w:p>
@@ -2245,10 +2192,10 @@
     <w:p>
       <w:pPr>
         <w:tabs>
-          <w:tab w:pos="2188" w:val="left"/>
+          <w:tab w:pos="2588" w:val="left"/>
         </w:tabs>
         <w:spacing w:before="580" w:after="0" w:line="440" w:lineRule="exact"/>
-        <w:ind w:left="2188" w:hanging="720"/>
+        <w:ind w:left="2588" w:hanging="720"/>
       </w:pPr>
       <w:r>
         <w:rPr>
@@ -2260,7 +2207,7 @@
         </w:rPr>
         <w:t>เรียน</w:t>
         <w:tab/>
-        <w:t>ผู้บังคับหน่วยพัฒนาการเคลื่อนที่ 22 สำนักงานพัฒนาภาค 2</w:t>
+        <w:t>ผู้บังคับหน่วยพัฒนาการเคลื่อนที่ 21 สำนักงานพัฒนาภาค 2</w:t>
       </w:r>
     </w:p>
     <w:p>
@@ -2309,10 +2256,10 @@
     <w:p>
       <w:pPr>
         <w:tabs>
-          <w:tab w:pos="2188" w:val="left"/>
+          <w:tab w:pos="2588" w:val="left"/>
         </w:tabs>
         <w:spacing w:before="580" w:after="0" w:line="440" w:lineRule="exact"/>
-        <w:ind w:left="2188" w:hanging="720"/>
+        <w:ind w:left="2588" w:hanging="720"/>
       </w:pPr>
       <w:r>
         <w:rPr>
@@ -2324,7 +2271,7 @@
         </w:rPr>
         <w:t>เรียน</w:t>
         <w:tab/>
-        <w:t>ผู้บังคับหน่วยพัฒนาการเคลื่อนที่ 23 สำนักงานพัฒนาภาค 2</w:t>
+        <w:t>ผู้บังคับหน่วยพัฒนาการเคลื่อนที่ 22 สำนักงานพัฒนาภาค 2</w:t>
       </w:r>
     </w:p>
     <w:p>
@@ -2373,10 +2320,10 @@
     <w:p>
       <w:pPr>
         <w:tabs>
-          <w:tab w:pos="2188" w:val="left"/>
+          <w:tab w:pos="2588" w:val="left"/>
         </w:tabs>
         <w:spacing w:before="580" w:after="0" w:line="440" w:lineRule="exact"/>
-        <w:ind w:left="2188" w:hanging="720"/>
+        <w:ind w:left="2588" w:hanging="720"/>
       </w:pPr>
       <w:r>
         <w:rPr>
@@ -2388,7 +2335,7 @@
         </w:rPr>
         <w:t>เรียน</w:t>
         <w:tab/>
-        <w:t>ผู้บังคับหน่วยพัฒนาการเคลื่อนที่ 24 สำนักงานพัฒนาภาค 2</w:t>
+        <w:t>ผู้บังคับหน่วยพัฒนาการเคลื่อนที่ 23 สำนักงานพัฒนาภาค 2</w:t>
       </w:r>
     </w:p>
     <w:p>
@@ -2437,10 +2384,10 @@
     <w:p>
       <w:pPr>
         <w:tabs>
-          <w:tab w:pos="2188" w:val="left"/>
+          <w:tab w:pos="2588" w:val="left"/>
         </w:tabs>
         <w:spacing w:before="580" w:after="0" w:line="440" w:lineRule="exact"/>
-        <w:ind w:left="2188" w:hanging="720"/>
+        <w:ind w:left="2588" w:hanging="720"/>
       </w:pPr>
       <w:r>
         <w:rPr>
@@ -2452,7 +2399,7 @@
         </w:rPr>
         <w:t>เรียน</w:t>
         <w:tab/>
-        <w:t>ผู้บังคับหน่วยพัฒนาการเคลื่อนที่ 25 สำนักงานพัฒนาภาค 2</w:t>
+        <w:t>ผู้บังคับหน่วยพัฒนาการเคลื่อนที่ 24 สำนักงานพัฒนาภาค 2</w:t>
       </w:r>
     </w:p>
     <w:p>
@@ -2501,10 +2448,10 @@
     <w:p>
       <w:pPr>
         <w:tabs>
-          <w:tab w:pos="2188" w:val="left"/>
+          <w:tab w:pos="2588" w:val="left"/>
         </w:tabs>
         <w:spacing w:before="580" w:after="0" w:line="440" w:lineRule="exact"/>
-        <w:ind w:left="2188" w:hanging="720"/>
+        <w:ind w:left="2588" w:hanging="720"/>
       </w:pPr>
       <w:r>
         <w:rPr>
@@ -2516,7 +2463,7 @@
         </w:rPr>
         <w:t>เรียน</w:t>
         <w:tab/>
-        <w:t>ผู้บังคับหน่วยพัฒนาการเคลื่อนที่ 26 สำนักงานพัฒนาภาค 2</w:t>
+        <w:t>ผู้บังคับหน่วยพัฒนาการเคลื่อนที่ 25 สำนักงานพัฒนาภาค 2</w:t>
       </w:r>
     </w:p>
     <w:p>
@@ -2565,10 +2512,10 @@
     <w:p>
       <w:pPr>
         <w:tabs>
-          <w:tab w:pos="2188" w:val="left"/>
+          <w:tab w:pos="2588" w:val="left"/>
         </w:tabs>
         <w:spacing w:before="580" w:after="0" w:line="440" w:lineRule="exact"/>
-        <w:ind w:left="2188" w:hanging="720"/>
+        <w:ind w:left="2588" w:hanging="720"/>
       </w:pPr>
       <w:r>
         <w:rPr>
@@ -2580,7 +2527,7 @@
         </w:rPr>
         <w:t>เรียน</w:t>
         <w:tab/>
-        <w:t>ผู้อำนวยการสำนักงานพัฒนาภาค 3 หน่วยบัญชาการทหารพัฒนา</w:t>
+        <w:t>ผู้บังคับหน่วยพัฒนาการเคลื่อนที่ 26 สำนักงานพัฒนาภาค 2</w:t>
       </w:r>
     </w:p>
     <w:p>
@@ -2629,10 +2576,10 @@
     <w:p>
       <w:pPr>
         <w:tabs>
-          <w:tab w:pos="2188" w:val="left"/>
+          <w:tab w:pos="2588" w:val="left"/>
         </w:tabs>
         <w:spacing w:before="580" w:after="0" w:line="440" w:lineRule="exact"/>
-        <w:ind w:left="2188" w:hanging="720"/>
+        <w:ind w:left="2588" w:hanging="720"/>
       </w:pPr>
       <w:r>
         <w:rPr>
@@ -2644,7 +2591,7 @@
         </w:rPr>
         <w:t>เรียน</w:t>
         <w:tab/>
-        <w:t>ผู้บังคับหน่วยพัฒนาการเคลื่อนที่ 31 สำนักงานพัฒนาภาค 3</w:t>
+        <w:t>ผู้อำนวยการสำนักงานพัฒนาภาค 3 หน่วยบัญชาการทหารพัฒนา</w:t>
       </w:r>
     </w:p>
     <w:p>
@@ -2693,10 +2640,10 @@
     <w:p>
       <w:pPr>
         <w:tabs>
-          <w:tab w:pos="2188" w:val="left"/>
+          <w:tab w:pos="2588" w:val="left"/>
         </w:tabs>
         <w:spacing w:before="580" w:after="0" w:line="440" w:lineRule="exact"/>
-        <w:ind w:left="2188" w:hanging="720"/>
+        <w:ind w:left="2588" w:hanging="720"/>
       </w:pPr>
       <w:r>
         <w:rPr>
@@ -2708,7 +2655,7 @@
         </w:rPr>
         <w:t>เรียน</w:t>
         <w:tab/>
-        <w:t>ผู้บังคับหน่วยพัฒนาการเคลื่อนที่ 32 สำนักงานพัฒนาภาค 3</w:t>
+        <w:t>ผู้บังคับหน่วยพัฒนาการเคลื่อนที่ 31 สำนักงานพัฒนาภาค 3</w:t>
       </w:r>
     </w:p>
     <w:p>
@@ -2757,10 +2704,10 @@
     <w:p>
       <w:pPr>
         <w:tabs>
-          <w:tab w:pos="2188" w:val="left"/>
+          <w:tab w:pos="2588" w:val="left"/>
         </w:tabs>
         <w:spacing w:before="580" w:after="0" w:line="440" w:lineRule="exact"/>
-        <w:ind w:left="2188" w:hanging="720"/>
+        <w:ind w:left="2588" w:hanging="720"/>
       </w:pPr>
       <w:r>
         <w:rPr>
@@ -2772,7 +2719,7 @@
         </w:rPr>
         <w:t>เรียน</w:t>
         <w:tab/>
-        <w:t>ผู้บังคับหน่วยพัฒนาการเคลื่อนที่ 33 สำนักงานพัฒนาภาค 3</w:t>
+        <w:t>ผู้บังคับหน่วยพัฒนาการเคลื่อนที่ 32 สำนักงานพัฒนาภาค 3</w:t>
       </w:r>
     </w:p>
     <w:p>
@@ -2821,10 +2768,10 @@
     <w:p>
       <w:pPr>
         <w:tabs>
-          <w:tab w:pos="2188" w:val="left"/>
+          <w:tab w:pos="2588" w:val="left"/>
         </w:tabs>
         <w:spacing w:before="580" w:after="0" w:line="440" w:lineRule="exact"/>
-        <w:ind w:left="2188" w:hanging="720"/>
+        <w:ind w:left="2588" w:hanging="720"/>
       </w:pPr>
       <w:r>
         <w:rPr>
@@ -2836,7 +2783,7 @@
         </w:rPr>
         <w:t>เรียน</w:t>
         <w:tab/>
-        <w:t>ผู้บังคับหน่วยพัฒนาการเคลื่อนที่ 34 สำนักงานพัฒนาภาค 3</w:t>
+        <w:t>ผู้บังคับหน่วยพัฒนาการเคลื่อนที่ 33 สำนักงานพัฒนาภาค 3</w:t>
       </w:r>
     </w:p>
     <w:p>
@@ -2885,10 +2832,10 @@
     <w:p>
       <w:pPr>
         <w:tabs>
-          <w:tab w:pos="2188" w:val="left"/>
+          <w:tab w:pos="2588" w:val="left"/>
         </w:tabs>
         <w:spacing w:before="580" w:after="0" w:line="440" w:lineRule="exact"/>
-        <w:ind w:left="2188" w:hanging="720"/>
+        <w:ind w:left="2588" w:hanging="720"/>
       </w:pPr>
       <w:r>
         <w:rPr>
@@ -2900,7 +2847,7 @@
         </w:rPr>
         <w:t>เรียน</w:t>
         <w:tab/>
-        <w:t>ผู้บังคับหน่วยพัฒนาการเคลื่อนที่ 35 สำนักงานพัฒนาภาค 3</w:t>
+        <w:t>ผู้บังคับหน่วยพัฒนาการเคลื่อนที่ 34 สำนักงานพัฒนาภาค 3</w:t>
       </w:r>
     </w:p>
     <w:p>
@@ -2949,10 +2896,10 @@
     <w:p>
       <w:pPr>
         <w:tabs>
-          <w:tab w:pos="2188" w:val="left"/>
+          <w:tab w:pos="2588" w:val="left"/>
         </w:tabs>
         <w:spacing w:before="580" w:after="0" w:line="440" w:lineRule="exact"/>
-        <w:ind w:left="2188" w:hanging="720"/>
+        <w:ind w:left="2588" w:hanging="720"/>
       </w:pPr>
       <w:r>
         <w:rPr>
@@ -2964,7 +2911,7 @@
         </w:rPr>
         <w:t>เรียน</w:t>
         <w:tab/>
-        <w:t>ผู้บังคับหน่วยพัฒนาการเคลื่อนที่ 36 สำนักงานพัฒนาภาค 3</w:t>
+        <w:t>ผู้บังคับหน่วยพัฒนาการเคลื่อนที่ 35 สำนักงานพัฒนาภาค 3</w:t>
       </w:r>
     </w:p>
     <w:p>
@@ -3013,10 +2960,10 @@
     <w:p>
       <w:pPr>
         <w:tabs>
-          <w:tab w:pos="2188" w:val="left"/>
+          <w:tab w:pos="2588" w:val="left"/>
         </w:tabs>
         <w:spacing w:before="580" w:after="0" w:line="440" w:lineRule="exact"/>
-        <w:ind w:left="2188" w:hanging="720"/>
+        <w:ind w:left="2588" w:hanging="720"/>
       </w:pPr>
       <w:r>
         <w:rPr>
@@ -3028,7 +2975,7 @@
         </w:rPr>
         <w:t>เรียน</w:t>
         <w:tab/>
-        <w:t>ผู้อำนวยการสำนักงานพัฒนาภาค 4 หน่วยบัญชาการทหารพัฒนา</w:t>
+        <w:t>ผู้บังคับหน่วยพัฒนาการเคลื่อนที่ 36 สำนักงานพัฒนาภาค 3</w:t>
       </w:r>
     </w:p>
     <w:p>
@@ -3077,10 +3024,10 @@
     <w:p>
       <w:pPr>
         <w:tabs>
-          <w:tab w:pos="2188" w:val="left"/>
+          <w:tab w:pos="2588" w:val="left"/>
         </w:tabs>
         <w:spacing w:before="580" w:after="0" w:line="440" w:lineRule="exact"/>
-        <w:ind w:left="2188" w:hanging="720"/>
+        <w:ind w:left="2588" w:hanging="720"/>
       </w:pPr>
       <w:r>
         <w:rPr>
@@ -3092,7 +3039,7 @@
         </w:rPr>
         <w:t>เรียน</w:t>
         <w:tab/>
-        <w:t>ผู้บังคับหน่วยพัฒนาการเคลื่อนที่ 41 สำนักงานพัฒนาภาค 4</w:t>
+        <w:t>ผู้อำนวยการสำนักงานพัฒนาภาค 4 หน่วยบัญชาการทหารพัฒนา</w:t>
       </w:r>
     </w:p>
     <w:p>
@@ -3141,10 +3088,10 @@
     <w:p>
       <w:pPr>
         <w:tabs>
-          <w:tab w:pos="2188" w:val="left"/>
+          <w:tab w:pos="2588" w:val="left"/>
         </w:tabs>
         <w:spacing w:before="580" w:after="0" w:line="440" w:lineRule="exact"/>
-        <w:ind w:left="2188" w:hanging="720"/>
+        <w:ind w:left="2588" w:hanging="720"/>
       </w:pPr>
       <w:r>
         <w:rPr>
@@ -3156,7 +3103,7 @@
         </w:rPr>
         <w:t>เรียน</w:t>
         <w:tab/>
-        <w:t>ผู้บังคับหน่วยพัฒนาการเคลื่อนที่ 42 สำนักงานพัฒนาภาค 4</w:t>
+        <w:t>ผู้บังคับหน่วยพัฒนาการเคลื่อนที่ 41 สำนักงานพัฒนาภาค 4</w:t>
       </w:r>
     </w:p>
     <w:p>
@@ -3205,10 +3152,10 @@
     <w:p>
       <w:pPr>
         <w:tabs>
-          <w:tab w:pos="2188" w:val="left"/>
+          <w:tab w:pos="2588" w:val="left"/>
         </w:tabs>
         <w:spacing w:before="580" w:after="0" w:line="440" w:lineRule="exact"/>
-        <w:ind w:left="2188" w:hanging="720"/>
+        <w:ind w:left="2588" w:hanging="720"/>
       </w:pPr>
       <w:r>
         <w:rPr>
@@ -3220,7 +3167,7 @@
         </w:rPr>
         <w:t>เรียน</w:t>
         <w:tab/>
-        <w:t>ผู้บังคับหน่วยพัฒนาการเคลื่อนที่ 43 สำนักงานพัฒนาภาค 4</w:t>
+        <w:t>ผู้บังคับหน่วยพัฒนาการเคลื่อนที่ 42 สำนักงานพัฒนาภาค 4</w:t>
       </w:r>
     </w:p>
     <w:p>
@@ -3269,10 +3216,10 @@
     <w:p>
       <w:pPr>
         <w:tabs>
-          <w:tab w:pos="2188" w:val="left"/>
+          <w:tab w:pos="2588" w:val="left"/>
         </w:tabs>
         <w:spacing w:before="580" w:after="0" w:line="440" w:lineRule="exact"/>
-        <w:ind w:left="2188" w:hanging="720"/>
+        <w:ind w:left="2588" w:hanging="720"/>
       </w:pPr>
       <w:r>
         <w:rPr>
@@ -3284,7 +3231,7 @@
         </w:rPr>
         <w:t>เรียน</w:t>
         <w:tab/>
-        <w:t>ผู้บังคับหน่วยพัฒนาการเคลื่อนที่ 44 สำนักงานพัฒนาภาค 4</w:t>
+        <w:t>ผู้บังคับหน่วยพัฒนาการเคลื่อนที่ 43 สำนักงานพัฒนาภาค 4</w:t>
       </w:r>
     </w:p>
     <w:p>
@@ -3333,10 +3280,10 @@
     <w:p>
       <w:pPr>
         <w:tabs>
-          <w:tab w:pos="2188" w:val="left"/>
+          <w:tab w:pos="2588" w:val="left"/>
         </w:tabs>
         <w:spacing w:before="580" w:after="0" w:line="440" w:lineRule="exact"/>
-        <w:ind w:left="2188" w:hanging="720"/>
+        <w:ind w:left="2588" w:hanging="720"/>
       </w:pPr>
       <w:r>
         <w:rPr>
@@ -3348,7 +3295,7 @@
         </w:rPr>
         <w:t>เรียน</w:t>
         <w:tab/>
-        <w:t>ผู้บังคับหน่วยพัฒนาการเคลื่อนที่ 45 สำนักงานพัฒนาภาค 4</w:t>
+        <w:t>ผู้บังคับหน่วยพัฒนาการเคลื่อนที่ 44 สำนักงานพัฒนาภาค 4</w:t>
       </w:r>
     </w:p>
     <w:p>
@@ -3397,10 +3344,10 @@
     <w:p>
       <w:pPr>
         <w:tabs>
-          <w:tab w:pos="2188" w:val="left"/>
+          <w:tab w:pos="2588" w:val="left"/>
         </w:tabs>
         <w:spacing w:before="580" w:after="0" w:line="440" w:lineRule="exact"/>
-        <w:ind w:left="2188" w:hanging="720"/>
+        <w:ind w:left="2588" w:hanging="720"/>
       </w:pPr>
       <w:r>
         <w:rPr>
@@ -3412,7 +3359,7 @@
         </w:rPr>
         <w:t>เรียน</w:t>
         <w:tab/>
-        <w:t>ผู้บังคับหน่วยพัฒนาการเคลื่อนที่ 46 สำนักงานพัฒนาภาค 4</w:t>
+        <w:t>ผู้บังคับหน่วยพัฒนาการเคลื่อนที่ 45 สำนักงานพัฒนาภาค 4</w:t>
       </w:r>
     </w:p>
     <w:p>
@@ -3461,10 +3408,10 @@
     <w:p>
       <w:pPr>
         <w:tabs>
-          <w:tab w:pos="2188" w:val="left"/>
+          <w:tab w:pos="2588" w:val="left"/>
         </w:tabs>
         <w:spacing w:before="580" w:after="0" w:line="440" w:lineRule="exact"/>
-        <w:ind w:left="2188" w:hanging="720"/>
+        <w:ind w:left="2588" w:hanging="720"/>
       </w:pPr>
       <w:r>
         <w:rPr>
@@ -3476,7 +3423,7 @@
         </w:rPr>
         <w:t>เรียน</w:t>
         <w:tab/>
-        <w:t>ผู้อำนวยการสำนักงานพัฒนาภาค 5 หน่วยบัญชาการทหารพัฒนา</w:t>
+        <w:t>ผู้บังคับหน่วยพัฒนาการเคลื่อนที่ 46 สำนักงานพัฒนาภาค 4</w:t>
       </w:r>
     </w:p>
     <w:p>
@@ -3525,10 +3472,10 @@
     <w:p>
       <w:pPr>
         <w:tabs>
-          <w:tab w:pos="2188" w:val="left"/>
+          <w:tab w:pos="2588" w:val="left"/>
         </w:tabs>
         <w:spacing w:before="580" w:after="0" w:line="440" w:lineRule="exact"/>
-        <w:ind w:left="2188" w:hanging="720"/>
+        <w:ind w:left="2588" w:hanging="720"/>
       </w:pPr>
       <w:r>
         <w:rPr>
@@ -3540,7 +3487,7 @@
         </w:rPr>
         <w:t>เรียน</w:t>
         <w:tab/>
-        <w:t>ผู้บังคับหน่วยพัฒนาการเคลื่อนที่ 51 สำนักงานพัฒนาภาค 5</w:t>
+        <w:t>ผู้อำนวยการสำนักงานพัฒนาภาค 5 หน่วยบัญชาการทหารพัฒนา</w:t>
       </w:r>
     </w:p>
     <w:p>
@@ -3589,10 +3536,10 @@
     <w:p>
       <w:pPr>
         <w:tabs>
-          <w:tab w:pos="2188" w:val="left"/>
+          <w:tab w:pos="2588" w:val="left"/>
         </w:tabs>
         <w:spacing w:before="580" w:after="0" w:line="440" w:lineRule="exact"/>
-        <w:ind w:left="2188" w:hanging="720"/>
+        <w:ind w:left="2588" w:hanging="720"/>
       </w:pPr>
       <w:r>
         <w:rPr>
@@ -3604,7 +3551,7 @@
         </w:rPr>
         <w:t>เรียน</w:t>
         <w:tab/>
-        <w:t>ผู้บังคับหน่วยพัฒนาการเคลื่อนที่ 52 สำนักงานพัฒนาภาค 5</w:t>
+        <w:t>ผู้บังคับหน่วยพัฒนาการเคลื่อนที่ 51 สำนักงานพัฒนาภาค 5</w:t>
       </w:r>
     </w:p>
     <w:p>
@@ -3653,10 +3600,10 @@
     <w:p>
       <w:pPr>
         <w:tabs>
-          <w:tab w:pos="2188" w:val="left"/>
+          <w:tab w:pos="2588" w:val="left"/>
         </w:tabs>
         <w:spacing w:before="580" w:after="0" w:line="440" w:lineRule="exact"/>
-        <w:ind w:left="2188" w:hanging="720"/>
+        <w:ind w:left="2588" w:hanging="720"/>
       </w:pPr>
       <w:r>
         <w:rPr>
@@ -3668,7 +3615,7 @@
         </w:rPr>
         <w:t>เรียน</w:t>
         <w:tab/>
-        <w:t>ผู้บังคับหน่วยพัฒนาการเคลื่อนที่ 53 สำนักงานพัฒนาภาค 5</w:t>
+        <w:t>ผู้บังคับหน่วยพัฒนาการเคลื่อนที่ 52 สำนักงานพัฒนาภาค 5</w:t>
       </w:r>
     </w:p>
     <w:p>
@@ -3717,10 +3664,10 @@
     <w:p>
       <w:pPr>
         <w:tabs>
-          <w:tab w:pos="2188" w:val="left"/>
+          <w:tab w:pos="2588" w:val="left"/>
         </w:tabs>
         <w:spacing w:before="580" w:after="0" w:line="440" w:lineRule="exact"/>
-        <w:ind w:left="2188" w:hanging="720"/>
+        <w:ind w:left="2588" w:hanging="720"/>
       </w:pPr>
       <w:r>
         <w:rPr>
@@ -3732,7 +3679,7 @@
         </w:rPr>
         <w:t>เรียน</w:t>
         <w:tab/>
-        <w:t>ผู้บังคับหน่วยพัฒนาการเคลื่อนที่ 54 สำนักงานพัฒนาภาค 5</w:t>
+        <w:t>ผู้บังคับหน่วยพัฒนาการเคลื่อนที่ 53 สำนักงานพัฒนาภาค 5</w:t>
       </w:r>
     </w:p>
     <w:p>
@@ -3781,10 +3728,10 @@
     <w:p>
       <w:pPr>
         <w:tabs>
-          <w:tab w:pos="2188" w:val="left"/>
+          <w:tab w:pos="2588" w:val="left"/>
         </w:tabs>
         <w:spacing w:before="580" w:after="0" w:line="440" w:lineRule="exact"/>
-        <w:ind w:left="2188" w:hanging="720"/>
+        <w:ind w:left="2588" w:hanging="720"/>
       </w:pPr>
       <w:r>
         <w:rPr>
@@ -3796,7 +3743,7 @@
         </w:rPr>
         <w:t>เรียน</w:t>
         <w:tab/>
-        <w:t>ผู้บังคับหน่วยพัฒนาการเคลื่อนที่ 55 สำนักงานพัฒนาภาค 5</w:t>
+        <w:t>ผู้บังคับหน่วยพัฒนาการเคลื่อนที่ 54 สำนักงานพัฒนาภาค 5</w:t>
       </w:r>
     </w:p>
     <w:p>
@@ -3845,10 +3792,10 @@
     <w:p>
       <w:pPr>
         <w:tabs>
-          <w:tab w:pos="2188" w:val="left"/>
+          <w:tab w:pos="2588" w:val="left"/>
         </w:tabs>
         <w:spacing w:before="580" w:after="0" w:line="440" w:lineRule="exact"/>
-        <w:ind w:left="2188" w:hanging="720"/>
+        <w:ind w:left="2588" w:hanging="720"/>
       </w:pPr>
       <w:r>
         <w:rPr>
@@ -3860,7 +3807,7 @@
         </w:rPr>
         <w:t>เรียน</w:t>
         <w:tab/>
-        <w:t>ผู้บังคับหน่วยพัฒนาการเคลื่อนที่ 56 สำนักงานพัฒนาภาค 5</w:t>
+        <w:t>ผู้บังคับหน่วยพัฒนาการเคลื่อนที่ 55 สำนักงานพัฒนาภาค 5</w:t>
       </w:r>
     </w:p>
     <w:p>
@@ -3909,10 +3856,10 @@
     <w:p>
       <w:pPr>
         <w:tabs>
-          <w:tab w:pos="2188" w:val="left"/>
+          <w:tab w:pos="2588" w:val="left"/>
         </w:tabs>
         <w:spacing w:before="580" w:after="0" w:line="440" w:lineRule="exact"/>
-        <w:ind w:left="2188" w:hanging="720"/>
+        <w:ind w:left="2588" w:hanging="720"/>
       </w:pPr>
       <w:r>
         <w:rPr>
@@ -3924,7 +3871,7 @@
         </w:rPr>
         <w:t>เรียน</w:t>
         <w:tab/>
-        <w:t>ผู้บังคับหน่วยพัฒนาการพิเศษ หน่วยบัญชาการทหารพัฒนา</w:t>
+        <w:t>ผู้บังคับหน่วยพัฒนาการเคลื่อนที่ 56 สำนักงานพัฒนาภาค 5</w:t>
       </w:r>
     </w:p>
     <w:p>
@@ -3973,10 +3920,10 @@
     <w:p>
       <w:pPr>
         <w:tabs>
-          <w:tab w:pos="2188" w:val="left"/>
+          <w:tab w:pos="2588" w:val="left"/>
         </w:tabs>
         <w:spacing w:before="580" w:after="0" w:line="440" w:lineRule="exact"/>
-        <w:ind w:left="2188" w:hanging="720"/>
+        <w:ind w:left="2588" w:hanging="720"/>
       </w:pPr>
       <w:r>
         <w:rPr>
@@ -3988,7 +3935,7 @@
         </w:rPr>
         <w:t>เรียน</w:t>
         <w:tab/>
-        <w:t>ผู้อำนวยการสำนักปฏิบัติการข่าว ศูนย์รักษาความปลอดภัย</w:t>
+        <w:t>ผู้บังคับหน่วยพัฒนาการพิเศษ หน่วยบัญชาการทหารพัฒนา</w:t>
       </w:r>
     </w:p>
     <w:p>
@@ -4037,10 +3984,10 @@
     <w:p>
       <w:pPr>
         <w:tabs>
-          <w:tab w:pos="2188" w:val="left"/>
+          <w:tab w:pos="2588" w:val="left"/>
         </w:tabs>
         <w:spacing w:before="580" w:after="0" w:line="440" w:lineRule="exact"/>
-        <w:ind w:left="2188" w:hanging="720"/>
+        <w:ind w:left="2588" w:hanging="720"/>
       </w:pPr>
       <w:r>
         <w:rPr>
@@ -4052,7 +3999,7 @@
         </w:rPr>
         <w:t>เรียน</w:t>
         <w:tab/>
-        <w:t>ผู้อำนวยการสำนักรักษาความปลอดภัย ศูนย์รักษาความปลอดภัย</w:t>
+        <w:t>ผู้อำนวยการสำนักปฏิบัติการข่าว ศูนย์รักษาความปลอดภัย</w:t>
       </w:r>
     </w:p>
     <w:p>
@@ -4101,10 +4048,10 @@
     <w:p>
       <w:pPr>
         <w:tabs>
-          <w:tab w:pos="2188" w:val="left"/>
+          <w:tab w:pos="2588" w:val="left"/>
         </w:tabs>
         <w:spacing w:before="580" w:after="0" w:line="440" w:lineRule="exact"/>
-        <w:ind w:left="2188" w:hanging="720"/>
+        <w:ind w:left="2588" w:hanging="720"/>
       </w:pPr>
       <w:r>
         <w:rPr>
@@ -4116,7 +4063,7 @@
         </w:rPr>
         <w:t>เรียน</w:t>
         <w:tab/>
-        <w:t>ผู้อำนวยการสำนักบริการสิทธิประโยชน์กำลังพล กรมสารบรรณทหาร</w:t>
+        <w:t>ผู้อำนวยการสำนักรักษาความปลอดภัย ศูนย์รักษาความปลอดภัย</w:t>
       </w:r>
     </w:p>
     <w:p>
@@ -4165,10 +4112,10 @@
     <w:p>
       <w:pPr>
         <w:tabs>
-          <w:tab w:pos="2188" w:val="left"/>
+          <w:tab w:pos="2588" w:val="left"/>
         </w:tabs>
         <w:spacing w:before="580" w:after="0" w:line="440" w:lineRule="exact"/>
-        <w:ind w:left="2188" w:hanging="720"/>
+        <w:ind w:left="2588" w:hanging="720"/>
       </w:pPr>
       <w:r>
         <w:rPr>
@@ -4180,7 +4127,7 @@
         </w:rPr>
         <w:t>เรียน</w:t>
         <w:tab/>
-        <w:t>ผู้อำนวยการสำนักปฏิบัติการเพื่อความมั่นคง กรมกิจการชายแดนทหาร</w:t>
+        <w:t>ผู้อำนวยการสำนักบริการสิทธิประโยชน์กำลังพล กรมสารบรรณทหาร</w:t>
       </w:r>
     </w:p>
     <w:p>
@@ -4229,10 +4176,10 @@
     <w:p>
       <w:pPr>
         <w:tabs>
-          <w:tab w:pos="2188" w:val="left"/>
+          <w:tab w:pos="2588" w:val="left"/>
         </w:tabs>
         <w:spacing w:before="580" w:after="0" w:line="440" w:lineRule="exact"/>
-        <w:ind w:left="2188" w:hanging="720"/>
+        <w:ind w:left="2588" w:hanging="720"/>
       </w:pPr>
       <w:r>
         <w:rPr>
@@ -4244,7 +4191,7 @@
         </w:rPr>
         <w:t>เรียน</w:t>
         <w:tab/>
-        <w:t>เสนาธิการวิทยาลัยเสนาธิการทหาร สถาบันวิชาการป้องกันประเทศ</w:t>
+        <w:t>ผู้อำนวยการสำนักปฏิบัติการเพื่อความมั่นคง กรมกิจการชายแดนทหาร</w:t>
       </w:r>
     </w:p>
     <w:p>
@@ -4293,10 +4240,10 @@
     <w:p>
       <w:pPr>
         <w:tabs>
-          <w:tab w:pos="2188" w:val="left"/>
+          <w:tab w:pos="2588" w:val="left"/>
         </w:tabs>
         <w:spacing w:before="580" w:after="0" w:line="440" w:lineRule="exact"/>
-        <w:ind w:left="2188" w:hanging="720"/>
+        <w:ind w:left="2588" w:hanging="720"/>
       </w:pPr>
       <w:r>
         <w:rPr>
@@ -4308,7 +4255,7 @@
         </w:rPr>
         <w:t>เรียน</w:t>
         <w:tab/>
-        <w:t>คุณ เนวิน บุญฤทธิ์ ผู้จัดการธนาคาร ทีทีบี สาขาสนามเป้า</w:t>
+        <w:t>เสนาธิการวิทยาลัยเสนาธิการทหาร สถาบันวิชาการป้องกันประเทศ</w:t>
       </w:r>
     </w:p>
     <w:p>
@@ -4357,10 +4304,10 @@
     <w:p>
       <w:pPr>
         <w:tabs>
-          <w:tab w:pos="2188" w:val="left"/>
+          <w:tab w:pos="2588" w:val="left"/>
         </w:tabs>
         <w:spacing w:before="580" w:after="0" w:line="440" w:lineRule="exact"/>
-        <w:ind w:left="2188" w:hanging="720"/>
+        <w:ind w:left="2588" w:hanging="720"/>
       </w:pPr>
       <w:r>
         <w:rPr>
@@ -4372,7 +4319,7 @@
         </w:rPr>
         <w:t>เรียน</w:t>
         <w:tab/>
-        <w:t>บริษัท เพชราภรณ์ กรุ๊ป แทรเวล จำกัด</w:t>
+        <w:t>คุณ เนวิน บุญฤทธิ์ ผู้จัดการธนาคาร ทีทีบี สาขาสนามเป้า</w:t>
       </w:r>
     </w:p>
     <w:p>
@@ -4421,10 +4368,10 @@
     <w:p>
       <w:pPr>
         <w:tabs>
-          <w:tab w:pos="2188" w:val="left"/>
+          <w:tab w:pos="2588" w:val="left"/>
         </w:tabs>
         <w:spacing w:before="580" w:after="0" w:line="440" w:lineRule="exact"/>
-        <w:ind w:left="2188" w:hanging="720"/>
+        <w:ind w:left="2588" w:hanging="720"/>
       </w:pPr>
       <w:r>
         <w:rPr>
@@ -4436,7 +4383,7 @@
         </w:rPr>
         <w:t>เรียน</w:t>
         <w:tab/>
-        <w:t>บริษัท ซูพีเรียร์ ทัวร์ จำกัด</w:t>
+        <w:t>บริษัท เพชราภรณ์ กรุ๊ป แทรเวล จำกัด</w:t>
       </w:r>
     </w:p>
     <w:p>
@@ -4485,10 +4432,10 @@
     <w:p>
       <w:pPr>
         <w:tabs>
-          <w:tab w:pos="2188" w:val="left"/>
+          <w:tab w:pos="2588" w:val="left"/>
         </w:tabs>
         <w:spacing w:before="580" w:after="0" w:line="440" w:lineRule="exact"/>
-        <w:ind w:left="2188" w:hanging="720"/>
+        <w:ind w:left="2588" w:hanging="720"/>
       </w:pPr>
       <w:r>
         <w:rPr>
@@ -4500,7 +4447,7 @@
         </w:rPr>
         <w:t>เรียน</w:t>
         <w:tab/>
-        <w:t>บริษัท กรีน เวย์ แทรเวล จำกัด</w:t>
+        <w:t>บริษัท ซูพีเรียร์ ทัวร์ จำกัด</w:t>
       </w:r>
     </w:p>
     <w:p>
@@ -4549,10 +4496,10 @@
     <w:p>
       <w:pPr>
         <w:tabs>
-          <w:tab w:pos="2188" w:val="left"/>
+          <w:tab w:pos="2588" w:val="left"/>
         </w:tabs>
         <w:spacing w:before="580" w:after="0" w:line="440" w:lineRule="exact"/>
-        <w:ind w:left="2188" w:hanging="720"/>
+        <w:ind w:left="2588" w:hanging="720"/>
       </w:pPr>
       <w:r>
         <w:rPr>
@@ -4564,7 +4511,7 @@
         </w:rPr>
         <w:t>เรียน</w:t>
         <w:tab/>
-        <w:t>บริษัท เวิลด์ แทรเวิล ดีไซน์ จำกัด</w:t>
+        <w:t>บริษัท กรีน เวย์ แทรเวล จำกัด</w:t>
       </w:r>
     </w:p>
     <w:p>
@@ -4613,10 +4560,10 @@
     <w:p>
       <w:pPr>
         <w:tabs>
-          <w:tab w:pos="2188" w:val="left"/>
+          <w:tab w:pos="2588" w:val="left"/>
         </w:tabs>
         <w:spacing w:before="580" w:after="0" w:line="440" w:lineRule="exact"/>
-        <w:ind w:left="2188" w:hanging="720"/>
+        <w:ind w:left="2588" w:hanging="720"/>
       </w:pPr>
       <w:r>
         <w:rPr>
@@ -4628,7 +4575,7 @@
         </w:rPr>
         <w:t>เรียน</w:t>
         <w:tab/>
-        <w:t>บริษัท มาร์วิน แทรเวิล จำกัด</w:t>
+        <w:t>บริษัท เวิลด์ แทรเวิล ดีไซน์ จำกัด</w:t>
       </w:r>
     </w:p>
     <w:p>
@@ -4677,10 +4624,10 @@
     <w:p>
       <w:pPr>
         <w:tabs>
-          <w:tab w:pos="2188" w:val="left"/>
+          <w:tab w:pos="2588" w:val="left"/>
         </w:tabs>
         <w:spacing w:before="580" w:after="0" w:line="440" w:lineRule="exact"/>
-        <w:ind w:left="2188" w:hanging="720"/>
+        <w:ind w:left="2588" w:hanging="720"/>
       </w:pPr>
       <w:r>
         <w:rPr>
@@ -4692,7 +4639,7 @@
         </w:rPr>
         <w:t>เรียน</w:t>
         <w:tab/>
-        <w:t>บริษัท อัลโมโด ทัวร์ จำกัด</w:t>
+        <w:t>บริษัท มาร์วิน แทรเวิล จำกัด</w:t>
       </w:r>
     </w:p>
     <w:p>
@@ -4741,10 +4688,10 @@
     <w:p>
       <w:pPr>
         <w:tabs>
-          <w:tab w:pos="2188" w:val="left"/>
+          <w:tab w:pos="2588" w:val="left"/>
         </w:tabs>
         <w:spacing w:before="580" w:after="0" w:line="440" w:lineRule="exact"/>
-        <w:ind w:left="2188" w:hanging="720"/>
+        <w:ind w:left="2588" w:hanging="720"/>
       </w:pPr>
       <w:r>
         <w:rPr>
@@ -4756,7 +4703,7 @@
         </w:rPr>
         <w:t>เรียน</w:t>
         <w:tab/>
-        <w:t>บริษัท ออล อิน ทราเวล จำกัด</w:t>
+        <w:t>บริษัท อัลโมโด ทัวร์ จำกัด</w:t>
       </w:r>
     </w:p>
     <w:p>
@@ -4805,10 +4752,10 @@
     <w:p>
       <w:pPr>
         <w:tabs>
-          <w:tab w:pos="2188" w:val="left"/>
+          <w:tab w:pos="2588" w:val="left"/>
         </w:tabs>
         <w:spacing w:before="580" w:after="0" w:line="440" w:lineRule="exact"/>
-        <w:ind w:left="2188" w:hanging="720"/>
+        <w:ind w:left="2588" w:hanging="720"/>
       </w:pPr>
       <w:r>
         <w:rPr>
@@ -4820,7 +4767,7 @@
         </w:rPr>
         <w:t>เรียน</w:t>
         <w:tab/>
-        <w:t>บริษัท นีโอ ทราเวล จำกัด</w:t>
+        <w:t>บริษัท ออล อิน ทราเวล จำกัด</w:t>
       </w:r>
     </w:p>
     <w:p>
@@ -4869,10 +4816,10 @@
     <w:p>
       <w:pPr>
         <w:tabs>
-          <w:tab w:pos="2188" w:val="left"/>
+          <w:tab w:pos="2588" w:val="left"/>
         </w:tabs>
         <w:spacing w:before="580" w:after="0" w:line="440" w:lineRule="exact"/>
-        <w:ind w:left="2188" w:hanging="720"/>
+        <w:ind w:left="2588" w:hanging="720"/>
       </w:pPr>
       <w:r>
         <w:rPr>
@@ -4884,7 +4831,7 @@
         </w:rPr>
         <w:t>เรียน</w:t>
         <w:tab/>
-        <w:t>บริษัท ไดนามิค ทัวร์ จำกัด</w:t>
+        <w:t>บริษัท นีโอ ทราเวล จำกัด</w:t>
       </w:r>
     </w:p>
     <w:p>
@@ -4933,10 +4880,10 @@
     <w:p>
       <w:pPr>
         <w:tabs>
-          <w:tab w:pos="2188" w:val="left"/>
+          <w:tab w:pos="2588" w:val="left"/>
         </w:tabs>
         <w:spacing w:before="580" w:after="0" w:line="440" w:lineRule="exact"/>
-        <w:ind w:left="2188" w:hanging="720"/>
+        <w:ind w:left="2588" w:hanging="720"/>
       </w:pPr>
       <w:r>
         <w:rPr>
@@ -4948,7 +4895,7 @@
         </w:rPr>
         <w:t>เรียน</w:t>
         <w:tab/>
-        <w:t>บริษัท ธนัชวิชญ์ แทรเวล กรุ๊ป จำกัด</w:t>
+        <w:t>บริษัท ไดนามิค ทัวร์ จำกัด</w:t>
       </w:r>
     </w:p>
     <w:p>
@@ -4997,10 +4944,10 @@
     <w:p>
       <w:pPr>
         <w:tabs>
-          <w:tab w:pos="2188" w:val="left"/>
+          <w:tab w:pos="2588" w:val="left"/>
         </w:tabs>
         <w:spacing w:before="580" w:after="0" w:line="440" w:lineRule="exact"/>
-        <w:ind w:left="2188" w:hanging="720"/>
+        <w:ind w:left="2588" w:hanging="720"/>
       </w:pPr>
       <w:r>
         <w:rPr>
@@ -5012,7 +4959,7 @@
         </w:rPr>
         <w:t>เรียน</w:t>
         <w:tab/>
-        <w:t>K-MAN Distribution (เค-แมน ดิสทริบิวชั่น)</w:t>
+        <w:t>บริษัท ธนัชวิชญ์ แทรเวล กรุ๊ป จำกัด</w:t>
       </w:r>
     </w:p>
     <w:p>
@@ -5061,10 +5008,10 @@
     <w:p>
       <w:pPr>
         <w:tabs>
-          <w:tab w:pos="2188" w:val="left"/>
+          <w:tab w:pos="2588" w:val="left"/>
         </w:tabs>
         <w:spacing w:before="580" w:after="0" w:line="440" w:lineRule="exact"/>
-        <w:ind w:left="2188" w:hanging="720"/>
+        <w:ind w:left="2588" w:hanging="720"/>
       </w:pPr>
       <w:r>
         <w:rPr>
@@ -5076,7 +5023,7 @@
         </w:rPr>
         <w:t>เรียน</w:t>
         <w:tab/>
-        <w:t>บริษัท อภิสฤษฎิ์ จำกัด</w:t>
+        <w:t>K-MAN Distribution (เค-แมน ดิสทริบิวชั่น)</w:t>
       </w:r>
     </w:p>
     <w:p>
@@ -5125,10 +5072,10 @@
     <w:p>
       <w:pPr>
         <w:tabs>
-          <w:tab w:pos="2188" w:val="left"/>
+          <w:tab w:pos="2588" w:val="left"/>
         </w:tabs>
         <w:spacing w:before="580" w:after="0" w:line="440" w:lineRule="exact"/>
-        <w:ind w:left="2188" w:hanging="720"/>
+        <w:ind w:left="2588" w:hanging="720"/>
       </w:pPr>
       <w:r>
         <w:rPr>
@@ -5140,7 +5087,7 @@
         </w:rPr>
         <w:t>เรียน</w:t>
         <w:tab/>
-        <w:t>บริษัท กีล่า สปอร์ต จำกัด</w:t>
+        <w:t>บริษัท อภิสฤษฎิ์ จำกัด</w:t>
       </w:r>
     </w:p>
     <w:p>
@@ -5189,10 +5136,10 @@
     <w:p>
       <w:pPr>
         <w:tabs>
-          <w:tab w:pos="2188" w:val="left"/>
+          <w:tab w:pos="2588" w:val="left"/>
         </w:tabs>
         <w:spacing w:before="580" w:after="0" w:line="440" w:lineRule="exact"/>
-        <w:ind w:left="2188" w:hanging="720"/>
+        <w:ind w:left="2588" w:hanging="720"/>
       </w:pPr>
       <w:r>
         <w:rPr>
@@ -5204,7 +5151,7 @@
         </w:rPr>
         <w:t>เรียน</w:t>
         <w:tab/>
-        <w:t>บริษัท วี.เค.การ์เมนท์ จำกัด (สำนักงานใหญ่)</w:t>
+        <w:t>บริษัท กีล่า สปอร์ต จำกัด</w:t>
       </w:r>
     </w:p>
     <w:p>
@@ -5253,10 +5200,10 @@
     <w:p>
       <w:pPr>
         <w:tabs>
-          <w:tab w:pos="2188" w:val="left"/>
+          <w:tab w:pos="2588" w:val="left"/>
         </w:tabs>
         <w:spacing w:before="580" w:after="0" w:line="440" w:lineRule="exact"/>
-        <w:ind w:left="2188" w:hanging="720"/>
+        <w:ind w:left="2588" w:hanging="720"/>
       </w:pPr>
       <w:r>
         <w:rPr>
@@ -5268,7 +5215,7 @@
         </w:rPr>
         <w:t>เรียน</w:t>
         <w:tab/>
-        <w:t>บริษัท พลอยศรีรัฐ ซัพลาย จำกัด (สำนักงานใหญ่)</w:t>
+        <w:t>บริษัท วี.เค.การ์เมนท์ จำกัด (สำนักงานใหญ่)</w:t>
       </w:r>
     </w:p>
     <w:p>
@@ -5317,10 +5264,10 @@
     <w:p>
       <w:pPr>
         <w:tabs>
-          <w:tab w:pos="2188" w:val="left"/>
+          <w:tab w:pos="2588" w:val="left"/>
         </w:tabs>
         <w:spacing w:before="580" w:after="0" w:line="440" w:lineRule="exact"/>
-        <w:ind w:left="2188" w:hanging="720"/>
+        <w:ind w:left="2588" w:hanging="720"/>
       </w:pPr>
       <w:r>
         <w:rPr>
@@ -5332,7 +5279,7 @@
         </w:rPr>
         <w:t>เรียน</w:t>
         <w:tab/>
-        <w:t>ห้างหุ้นส่วนจำกัด ศ.วีระพันธ์</w:t>
+        <w:t>บริษัท พลอยศรีรัฐ ซัพลาย จำกัด (สำนักงานใหญ่)</w:t>
       </w:r>
     </w:p>
     <w:p>
@@ -5381,10 +5328,10 @@
     <w:p>
       <w:pPr>
         <w:tabs>
-          <w:tab w:pos="2188" w:val="left"/>
+          <w:tab w:pos="2588" w:val="left"/>
         </w:tabs>
         <w:spacing w:before="580" w:after="0" w:line="440" w:lineRule="exact"/>
-        <w:ind w:left="2188" w:hanging="720"/>
+        <w:ind w:left="2588" w:hanging="720"/>
       </w:pPr>
       <w:r>
         <w:rPr>
@@ -5396,7 +5343,7 @@
         </w:rPr>
         <w:t>เรียน</w:t>
         <w:tab/>
-        <w:t>ร้าน สูทสภา (อรุณลักษณ์สูทสภา)</w:t>
+        <w:t>ห้างหุ้นส่วนจำกัด ศ.วีระพันธ์</w:t>
       </w:r>
     </w:p>
     <w:p>
@@ -5445,10 +5392,10 @@
     <w:p>
       <w:pPr>
         <w:tabs>
-          <w:tab w:pos="2188" w:val="left"/>
+          <w:tab w:pos="2588" w:val="left"/>
         </w:tabs>
         <w:spacing w:before="580" w:after="0" w:line="440" w:lineRule="exact"/>
-        <w:ind w:left="2188" w:hanging="720"/>
+        <w:ind w:left="2588" w:hanging="720"/>
       </w:pPr>
       <w:r>
         <w:rPr>
@@ -5460,7 +5407,7 @@
         </w:rPr>
         <w:t>เรียน</w:t>
         <w:tab/>
-        <w:t>ร้าน John Perfect Tailor</w:t>
+        <w:t>ร้าน สูทสภา (อรุณลักษณ์สูทสภา)</w:t>
       </w:r>
     </w:p>
     <w:p>
@@ -5509,10 +5456,10 @@
     <w:p>
       <w:pPr>
         <w:tabs>
-          <w:tab w:pos="2188" w:val="left"/>
+          <w:tab w:pos="2588" w:val="left"/>
         </w:tabs>
         <w:spacing w:before="580" w:after="0" w:line="440" w:lineRule="exact"/>
-        <w:ind w:left="2188" w:hanging="720"/>
+        <w:ind w:left="2588" w:hanging="720"/>
       </w:pPr>
       <w:r>
         <w:rPr>
@@ -5524,7 +5471,7 @@
         </w:rPr>
         <w:t>เรียน</w:t>
         <w:tab/>
-        <w:t>ร้าน เด่นแชมป์สูท</w:t>
+        <w:t>ร้าน John Perfect Tailor</w:t>
       </w:r>
     </w:p>
     <w:p>
@@ -5573,10 +5520,10 @@
     <w:p>
       <w:pPr>
         <w:tabs>
-          <w:tab w:pos="2188" w:val="left"/>
+          <w:tab w:pos="2588" w:val="left"/>
         </w:tabs>
         <w:spacing w:before="580" w:after="0" w:line="440" w:lineRule="exact"/>
-        <w:ind w:left="2188" w:hanging="720"/>
+        <w:ind w:left="2588" w:hanging="720"/>
       </w:pPr>
       <w:r>
         <w:rPr>
@@ -5588,7 +5535,7 @@
         </w:rPr>
         <w:t>เรียน</w:t>
         <w:tab/>
-        <w:t>ร้าน AR Tailor House (ร้านชูวิทย์)</w:t>
+        <w:t>ร้าน เด่นแชมป์สูท</w:t>
       </w:r>
     </w:p>
     <w:p>
@@ -5637,10 +5584,10 @@
     <w:p>
       <w:pPr>
         <w:tabs>
-          <w:tab w:pos="2188" w:val="left"/>
+          <w:tab w:pos="2588" w:val="left"/>
         </w:tabs>
         <w:spacing w:before="580" w:after="0" w:line="440" w:lineRule="exact"/>
-        <w:ind w:left="2188" w:hanging="720"/>
+        <w:ind w:left="2588" w:hanging="720"/>
       </w:pPr>
       <w:r>
         <w:rPr>
@@ -5652,7 +5599,7 @@
         </w:rPr>
         <w:t>เรียน</w:t>
         <w:tab/>
-        <w:t>ร้าน สูทเวิลด์เซ็นเตอร์</w:t>
+        <w:t>ร้าน AR Tailor House (ร้านชูวิทย์)</w:t>
       </w:r>
     </w:p>
     <w:p>
@@ -5701,10 +5648,10 @@
     <w:p>
       <w:pPr>
         <w:tabs>
-          <w:tab w:pos="2188" w:val="left"/>
+          <w:tab w:pos="2588" w:val="left"/>
         </w:tabs>
         <w:spacing w:before="580" w:after="0" w:line="440" w:lineRule="exact"/>
-        <w:ind w:left="2188" w:hanging="720"/>
+        <w:ind w:left="2588" w:hanging="720"/>
       </w:pPr>
       <w:r>
         <w:rPr>
@@ -5716,7 +5663,7 @@
         </w:rPr>
         <w:t>เรียน</w:t>
         <w:tab/>
-        <w:t>ร้าน ช่อชัยพฤกษ์</w:t>
+        <w:t>ร้าน สูทเวิลด์เซ็นเตอร์</w:t>
       </w:r>
     </w:p>
     <w:p>
@@ -5765,10 +5712,10 @@
     <w:p>
       <w:pPr>
         <w:tabs>
-          <w:tab w:pos="2188" w:val="left"/>
+          <w:tab w:pos="2588" w:val="left"/>
         </w:tabs>
         <w:spacing w:before="580" w:after="0" w:line="440" w:lineRule="exact"/>
-        <w:ind w:left="2188" w:hanging="720"/>
+        <w:ind w:left="2588" w:hanging="720"/>
       </w:pPr>
       <w:r>
         <w:rPr>
@@ -5780,7 +5727,7 @@
         </w:rPr>
         <w:t>เรียน</w:t>
         <w:tab/>
-        <w:t>บริษัท สูทแน็ค จำกัด</w:t>
+        <w:t>ร้าน ช่อชัยพฤกษ์</w:t>
       </w:r>
     </w:p>
     <w:p>
@@ -5829,10 +5776,10 @@
     <w:p>
       <w:pPr>
         <w:tabs>
-          <w:tab w:pos="2188" w:val="left"/>
+          <w:tab w:pos="2588" w:val="left"/>
         </w:tabs>
         <w:spacing w:before="580" w:after="0" w:line="440" w:lineRule="exact"/>
-        <w:ind w:left="2188" w:hanging="720"/>
+        <w:ind w:left="2588" w:hanging="720"/>
       </w:pPr>
       <w:r>
         <w:rPr>
@@ -5844,7 +5791,7 @@
         </w:rPr>
         <w:t>เรียน</w:t>
         <w:tab/>
-        <w:t>ร้าน สูททะนง</w:t>
+        <w:t>บริษัท สูทแน็ค จำกัด</w:t>
       </w:r>
     </w:p>
     <w:p>
@@ -5893,10 +5840,10 @@
     <w:p>
       <w:pPr>
         <w:tabs>
-          <w:tab w:pos="2188" w:val="left"/>
+          <w:tab w:pos="2588" w:val="left"/>
         </w:tabs>
         <w:spacing w:before="580" w:after="0" w:line="440" w:lineRule="exact"/>
-        <w:ind w:left="2188" w:hanging="720"/>
+        <w:ind w:left="2588" w:hanging="720"/>
       </w:pPr>
       <w:r>
         <w:rPr>
@@ -5908,7 +5855,7 @@
         </w:rPr>
         <w:t>เรียน</w:t>
         <w:tab/>
-        <w:t>ร้าน Aek Siam Tailor</w:t>
+        <w:t>ร้าน สูททะนง</w:t>
       </w:r>
     </w:p>
     <w:p>
@@ -5957,10 +5904,10 @@
     <w:p>
       <w:pPr>
         <w:tabs>
-          <w:tab w:pos="2188" w:val="left"/>
+          <w:tab w:pos="2588" w:val="left"/>
         </w:tabs>
         <w:spacing w:before="580" w:after="0" w:line="440" w:lineRule="exact"/>
-        <w:ind w:left="2188" w:hanging="720"/>
+        <w:ind w:left="2588" w:hanging="720"/>
       </w:pPr>
       <w:r>
         <w:rPr>
@@ -5972,7 +5919,7 @@
         </w:rPr>
         <w:t>เรียน</w:t>
         <w:tab/>
-        <w:t>บริษัท ทวินสูท จำกัด</w:t>
+        <w:t>ร้าน Aek Siam Tailor</w:t>
       </w:r>
     </w:p>
     <w:p>
@@ -6021,10 +5968,74 @@
     <w:p>
       <w:pPr>
         <w:tabs>
-          <w:tab w:pos="2188" w:val="left"/>
+          <w:tab w:pos="2588" w:val="left"/>
         </w:tabs>
         <w:spacing w:before="580" w:after="0" w:line="440" w:lineRule="exact"/>
-        <w:ind w:left="2188" w:hanging="720"/>
+        <w:ind w:left="2588" w:hanging="720"/>
+      </w:pPr>
+      <w:r>
+        <w:rPr>
+          <w:rFonts w:ascii="TH SarabunPSK" w:hAnsi="TH SarabunPSK" w:cs="TH SarabunPSK" w:eastAsia="TH SarabunPSK"/>
+          <w:b/>
+          <w:sz w:val="26"/>
+          <w:szCs w:val="26"/>
+          <w:bCs/>
+        </w:rPr>
+        <w:t>เรียน</w:t>
+        <w:tab/>
+        <w:t>บริษัท ทวินสูท จำกัด</w:t>
+      </w:r>
+    </w:p>
+    <w:p>
+      <w:pPr>
+        <w:pageBreakBefore/>
+        <w:spacing w:before="0" w:after="0" w:line="364" w:lineRule="exact"/>
+      </w:pPr>
+      <w:r>
+        <w:rPr>
+          <w:rFonts w:ascii="TH SarabunPSK" w:hAnsi="TH SarabunPSK" w:cs="TH SarabunPSK" w:eastAsia="TH SarabunPSK"/>
+          <w:b w:val="0"/>
+          <w:sz w:val="21"/>
+          <w:szCs w:val="21"/>
+        </w:rPr>
+        <w:t>วปอ.สปท.</w:t>
+      </w:r>
+    </w:p>
+    <w:p>
+      <w:pPr>
+        <w:spacing w:before="0" w:after="0" w:line="364" w:lineRule="exact"/>
+      </w:pPr>
+      <w:r>
+        <w:rPr>
+          <w:rFonts w:ascii="TH SarabunPSK" w:hAnsi="TH SarabunPSK" w:cs="TH SarabunPSK" w:eastAsia="TH SarabunPSK"/>
+          <w:b w:val="0"/>
+          <w:sz w:val="21"/>
+          <w:szCs w:val="21"/>
+        </w:rPr>
+        <w:t>กห ๐๓๑๗.๒/๑๖๑๑</w:t>
+      </w:r>
+    </w:p>
+    <w:p>
+      <w:pPr>
+        <w:spacing w:before="0" w:after="0" w:line="364" w:lineRule="exact"/>
+      </w:pPr>
+      <w:r>
+        <w:rPr>
+          <w:rFonts w:ascii="TH SarabunPSK" w:hAnsi="TH SarabunPSK" w:cs="TH SarabunPSK" w:eastAsia="TH SarabunPSK"/>
+          <w:b w:val="0"/>
+          <w:sz w:val="21"/>
+          <w:szCs w:val="21"/>
+        </w:rPr>
+        <w:t>โทร. ๐ ๒๕๗๒ ๒๕๒๗</w:t>
+      </w:r>
+    </w:p>
+    <w:p>
+      <w:pPr>
+        <w:tabs>
+          <w:tab w:pos="2588" w:val="left"/>
+        </w:tabs>
+        <w:spacing w:before="580" w:after="0" w:line="440" w:lineRule="exact"/>
+        <w:ind w:left="2588" w:hanging="720"/>
       </w:pPr>
       <w:r>
         <w:rPr>

</xml_diff>

<commit_message>
Reposition เรียน and wrap names at the width of the reference line
Co-Authored-By: Claude Opus 5.5 <noreply@anthropic.com>
Claude-Session: https://claude.ai/code/session_01J3NTsmEhLtUpdxrpfiWApU
</commit_message>
<xml_diff>
--- a/output/ซองเรียน_94_หน่วย.docx
+++ b/output/ซองเรียน_94_หน่วย.docx
@@ -47,10 +47,10 @@
     <w:p>
       <w:pPr>
         <w:tabs>
-          <w:tab w:pos="2588" w:val="left"/>
+          <w:tab w:pos="3028" w:val="left"/>
         </w:tabs>
         <w:spacing w:before="580" w:after="0" w:line="440" w:lineRule="exact"/>
-        <w:ind w:left="2588" w:hanging="720"/>
+        <w:ind w:left="3028" w:hanging="720"/>
       </w:pPr>
       <w:r>
         <w:rPr>
@@ -62,60 +62,9 @@
         </w:rPr>
         <w:t>เรียน</w:t>
         <w:tab/>
-        <w:t>ผู้บังคับกองพันระวังป้องกัน สำนักกองบัญชาการ กองบัญชาการกองทัพไทย</w:t>
-      </w:r>
-    </w:p>
-    <w:p>
-      <w:pPr>
-        <w:pageBreakBefore/>
-        <w:spacing w:before="0" w:after="0" w:line="364" w:lineRule="exact"/>
-      </w:pPr>
-      <w:r>
-        <w:rPr>
-          <w:rFonts w:ascii="TH SarabunPSK" w:hAnsi="TH SarabunPSK" w:cs="TH SarabunPSK" w:eastAsia="TH SarabunPSK"/>
-          <w:b w:val="0"/>
-          <w:sz w:val="21"/>
-          <w:szCs w:val="21"/>
-        </w:rPr>
-        <w:t>วปอ.สปท.</w:t>
-      </w:r>
-    </w:p>
-    <w:p>
-      <w:pPr>
-        <w:spacing w:before="0" w:after="0" w:line="364" w:lineRule="exact"/>
-      </w:pPr>
-      <w:r>
-        <w:rPr>
-          <w:rFonts w:ascii="TH SarabunPSK" w:hAnsi="TH SarabunPSK" w:cs="TH SarabunPSK" w:eastAsia="TH SarabunPSK"/>
-          <w:b w:val="0"/>
-          <w:sz w:val="21"/>
-          <w:szCs w:val="21"/>
-        </w:rPr>
-        <w:t>กห ๐๓๑๗.๒/๑๖๑๑</w:t>
-      </w:r>
-    </w:p>
-    <w:p>
-      <w:pPr>
-        <w:spacing w:before="0" w:after="0" w:line="364" w:lineRule="exact"/>
-      </w:pPr>
-      <w:r>
-        <w:rPr>
-          <w:rFonts w:ascii="TH SarabunPSK" w:hAnsi="TH SarabunPSK" w:cs="TH SarabunPSK" w:eastAsia="TH SarabunPSK"/>
-          <w:b w:val="0"/>
-          <w:sz w:val="21"/>
-          <w:szCs w:val="21"/>
-        </w:rPr>
-        <w:t>โทร. ๐ ๒๕๗๒ ๒๕๒๗</w:t>
-      </w:r>
-    </w:p>
-    <w:p>
-      <w:pPr>
-        <w:tabs>
-          <w:tab w:pos="2588" w:val="left"/>
-        </w:tabs>
-        <w:spacing w:before="580" w:after="0" w:line="440" w:lineRule="exact"/>
-        <w:ind w:left="2588" w:hanging="720"/>
-      </w:pPr>
+        <w:t>ผู้บังคับกองพันระวังป้องกัน สำนักกองบัญชาการ</w:t>
+        <w:br/>
+      </w:r>
       <w:r>
         <w:rPr>
           <w:rFonts w:ascii="TH SarabunPSK" w:hAnsi="TH SarabunPSK" w:cs="TH SarabunPSK" w:eastAsia="TH SarabunPSK"/>
@@ -124,6 +73,68 @@
           <w:szCs w:val="26"/>
           <w:bCs/>
         </w:rPr>
+        <w:t>กองบัญชาการกองทัพไทย</w:t>
+      </w:r>
+    </w:p>
+    <w:p>
+      <w:pPr>
+        <w:pageBreakBefore/>
+        <w:spacing w:before="0" w:after="0" w:line="364" w:lineRule="exact"/>
+      </w:pPr>
+      <w:r>
+        <w:rPr>
+          <w:rFonts w:ascii="TH SarabunPSK" w:hAnsi="TH SarabunPSK" w:cs="TH SarabunPSK" w:eastAsia="TH SarabunPSK"/>
+          <w:b w:val="0"/>
+          <w:sz w:val="21"/>
+          <w:szCs w:val="21"/>
+        </w:rPr>
+        <w:t>วปอ.สปท.</w:t>
+      </w:r>
+    </w:p>
+    <w:p>
+      <w:pPr>
+        <w:spacing w:before="0" w:after="0" w:line="364" w:lineRule="exact"/>
+      </w:pPr>
+      <w:r>
+        <w:rPr>
+          <w:rFonts w:ascii="TH SarabunPSK" w:hAnsi="TH SarabunPSK" w:cs="TH SarabunPSK" w:eastAsia="TH SarabunPSK"/>
+          <w:b w:val="0"/>
+          <w:sz w:val="21"/>
+          <w:szCs w:val="21"/>
+        </w:rPr>
+        <w:t>กห ๐๓๑๗.๒/๑๖๑๑</w:t>
+      </w:r>
+    </w:p>
+    <w:p>
+      <w:pPr>
+        <w:spacing w:before="0" w:after="0" w:line="364" w:lineRule="exact"/>
+      </w:pPr>
+      <w:r>
+        <w:rPr>
+          <w:rFonts w:ascii="TH SarabunPSK" w:hAnsi="TH SarabunPSK" w:cs="TH SarabunPSK" w:eastAsia="TH SarabunPSK"/>
+          <w:b w:val="0"/>
+          <w:sz w:val="21"/>
+          <w:szCs w:val="21"/>
+        </w:rPr>
+        <w:t>โทร. ๐ ๒๕๗๒ ๒๕๒๗</w:t>
+      </w:r>
+    </w:p>
+    <w:p>
+      <w:pPr>
+        <w:tabs>
+          <w:tab w:pos="3028" w:val="left"/>
+        </w:tabs>
+        <w:spacing w:before="580" w:after="0" w:line="440" w:lineRule="exact"/>
+        <w:ind w:left="3028" w:hanging="720"/>
+      </w:pPr>
+      <w:r>
+        <w:rPr>
+          <w:rFonts w:ascii="TH SarabunPSK" w:hAnsi="TH SarabunPSK" w:cs="TH SarabunPSK" w:eastAsia="TH SarabunPSK"/>
+          <w:b/>
+          <w:sz w:val="26"/>
+          <w:szCs w:val="26"/>
+          <w:bCs/>
+        </w:rPr>
         <w:t>เรียน</w:t>
         <w:tab/>
         <w:t>ผู้บังคับกองพันทหารสารวัตร สำนักกองบัญชาการ</w:t>
@@ -186,10 +197,10 @@
     <w:p>
       <w:pPr>
         <w:tabs>
-          <w:tab w:pos="2588" w:val="left"/>
+          <w:tab w:pos="3028" w:val="left"/>
         </w:tabs>
         <w:spacing w:before="580" w:after="0" w:line="440" w:lineRule="exact"/>
-        <w:ind w:left="2588" w:hanging="720"/>
+        <w:ind w:left="3028" w:hanging="720"/>
       </w:pPr>
       <w:r>
         <w:rPr>
@@ -250,10 +261,10 @@
     <w:p>
       <w:pPr>
         <w:tabs>
-          <w:tab w:pos="2588" w:val="left"/>
+          <w:tab w:pos="3028" w:val="left"/>
         </w:tabs>
         <w:spacing w:before="580" w:after="0" w:line="440" w:lineRule="exact"/>
-        <w:ind w:left="2588" w:hanging="720"/>
+        <w:ind w:left="3028" w:hanging="720"/>
       </w:pPr>
       <w:r>
         <w:rPr>
@@ -265,60 +276,9 @@
         </w:rPr>
         <w:t>เรียน</w:t>
         <w:tab/>
-        <w:t>ผู้อำนวยการสำนักตรวจการปฏิบัติราชการ สำนักงานจเรทหาร</w:t>
-      </w:r>
-    </w:p>
-    <w:p>
-      <w:pPr>
-        <w:pageBreakBefore/>
-        <w:spacing w:before="0" w:after="0" w:line="364" w:lineRule="exact"/>
-      </w:pPr>
-      <w:r>
-        <w:rPr>
-          <w:rFonts w:ascii="TH SarabunPSK" w:hAnsi="TH SarabunPSK" w:cs="TH SarabunPSK" w:eastAsia="TH SarabunPSK"/>
-          <w:b w:val="0"/>
-          <w:sz w:val="21"/>
-          <w:szCs w:val="21"/>
-        </w:rPr>
-        <w:t>วปอ.สปท.</w:t>
-      </w:r>
-    </w:p>
-    <w:p>
-      <w:pPr>
-        <w:spacing w:before="0" w:after="0" w:line="364" w:lineRule="exact"/>
-      </w:pPr>
-      <w:r>
-        <w:rPr>
-          <w:rFonts w:ascii="TH SarabunPSK" w:hAnsi="TH SarabunPSK" w:cs="TH SarabunPSK" w:eastAsia="TH SarabunPSK"/>
-          <w:b w:val="0"/>
-          <w:sz w:val="21"/>
-          <w:szCs w:val="21"/>
-        </w:rPr>
-        <w:t>กห ๐๓๑๗.๒/๑๖๑๑</w:t>
-      </w:r>
-    </w:p>
-    <w:p>
-      <w:pPr>
-        <w:spacing w:before="0" w:after="0" w:line="364" w:lineRule="exact"/>
-      </w:pPr>
-      <w:r>
-        <w:rPr>
-          <w:rFonts w:ascii="TH SarabunPSK" w:hAnsi="TH SarabunPSK" w:cs="TH SarabunPSK" w:eastAsia="TH SarabunPSK"/>
-          <w:b w:val="0"/>
-          <w:sz w:val="21"/>
-          <w:szCs w:val="21"/>
-        </w:rPr>
-        <w:t>โทร. ๐ ๒๕๗๒ ๒๕๒๗</w:t>
-      </w:r>
-    </w:p>
-    <w:p>
-      <w:pPr>
-        <w:tabs>
-          <w:tab w:pos="2588" w:val="left"/>
-        </w:tabs>
-        <w:spacing w:before="580" w:after="0" w:line="440" w:lineRule="exact"/>
-        <w:ind w:left="2588" w:hanging="720"/>
-      </w:pPr>
+        <w:t>ผู้อำนวยการสำนักตรวจการปฏิบัติราชการ</w:t>
+        <w:br/>
+      </w:r>
       <w:r>
         <w:rPr>
           <w:rFonts w:ascii="TH SarabunPSK" w:hAnsi="TH SarabunPSK" w:cs="TH SarabunPSK" w:eastAsia="TH SarabunPSK"/>
@@ -327,9 +287,7 @@
           <w:szCs w:val="26"/>
           <w:bCs/>
         </w:rPr>
-        <w:t>เรียน</w:t>
-        <w:tab/>
-        <w:t>ผู้อำนวยการสำนักปฏิบัติการ หน่วยบัญชาการไซเบอร์ทหาร</w:t>
+        <w:t>สำนักงานจเรทหาร</w:t>
       </w:r>
     </w:p>
     <w:p>
@@ -378,10 +336,10 @@
     <w:p>
       <w:pPr>
         <w:tabs>
-          <w:tab w:pos="2588" w:val="left"/>
+          <w:tab w:pos="3028" w:val="left"/>
         </w:tabs>
         <w:spacing w:before="580" w:after="0" w:line="440" w:lineRule="exact"/>
-        <w:ind w:left="2588" w:hanging="720"/>
+        <w:ind w:left="3028" w:hanging="720"/>
       </w:pPr>
       <w:r>
         <w:rPr>
@@ -393,7 +351,7 @@
         </w:rPr>
         <w:t>เรียน</w:t>
         <w:tab/>
-        <w:t>ผู้อำนวยการสำนักนโยบายและแผนกำลังพล กรมกำลังพลทหาร</w:t>
+        <w:t>ผู้อำนวยการสำนักปฏิบัติการ หน่วยบัญชาการไซเบอร์ทหาร</w:t>
       </w:r>
     </w:p>
     <w:p>
@@ -442,10 +400,10 @@
     <w:p>
       <w:pPr>
         <w:tabs>
-          <w:tab w:pos="2588" w:val="left"/>
+          <w:tab w:pos="3028" w:val="left"/>
         </w:tabs>
         <w:spacing w:before="580" w:after="0" w:line="440" w:lineRule="exact"/>
-        <w:ind w:left="2588" w:hanging="720"/>
+        <w:ind w:left="3028" w:hanging="720"/>
       </w:pPr>
       <w:r>
         <w:rPr>
@@ -457,60 +415,9 @@
         </w:rPr>
         <w:t>เรียน</w:t>
         <w:tab/>
-        <w:t>ผู้อำนวยการสำนักข่าวกรอง กรมข่าวทหาร</w:t>
-      </w:r>
-    </w:p>
-    <w:p>
-      <w:pPr>
-        <w:pageBreakBefore/>
-        <w:spacing w:before="0" w:after="0" w:line="364" w:lineRule="exact"/>
-      </w:pPr>
-      <w:r>
-        <w:rPr>
-          <w:rFonts w:ascii="TH SarabunPSK" w:hAnsi="TH SarabunPSK" w:cs="TH SarabunPSK" w:eastAsia="TH SarabunPSK"/>
-          <w:b w:val="0"/>
-          <w:sz w:val="21"/>
-          <w:szCs w:val="21"/>
-        </w:rPr>
-        <w:t>วปอ.สปท.</w:t>
-      </w:r>
-    </w:p>
-    <w:p>
-      <w:pPr>
-        <w:spacing w:before="0" w:after="0" w:line="364" w:lineRule="exact"/>
-      </w:pPr>
-      <w:r>
-        <w:rPr>
-          <w:rFonts w:ascii="TH SarabunPSK" w:hAnsi="TH SarabunPSK" w:cs="TH SarabunPSK" w:eastAsia="TH SarabunPSK"/>
-          <w:b w:val="0"/>
-          <w:sz w:val="21"/>
-          <w:szCs w:val="21"/>
-        </w:rPr>
-        <w:t>กห ๐๓๑๗.๒/๑๖๑๑</w:t>
-      </w:r>
-    </w:p>
-    <w:p>
-      <w:pPr>
-        <w:spacing w:before="0" w:after="0" w:line="364" w:lineRule="exact"/>
-      </w:pPr>
-      <w:r>
-        <w:rPr>
-          <w:rFonts w:ascii="TH SarabunPSK" w:hAnsi="TH SarabunPSK" w:cs="TH SarabunPSK" w:eastAsia="TH SarabunPSK"/>
-          <w:b w:val="0"/>
-          <w:sz w:val="21"/>
-          <w:szCs w:val="21"/>
-        </w:rPr>
-        <w:t>โทร. ๐ ๒๕๗๒ ๒๕๒๗</w:t>
-      </w:r>
-    </w:p>
-    <w:p>
-      <w:pPr>
-        <w:tabs>
-          <w:tab w:pos="2588" w:val="left"/>
-        </w:tabs>
-        <w:spacing w:before="580" w:after="0" w:line="440" w:lineRule="exact"/>
-        <w:ind w:left="2588" w:hanging="720"/>
-      </w:pPr>
+        <w:t>ผู้อำนวยการสำนักนโยบายและแผนกำลังพล</w:t>
+        <w:br/>
+      </w:r>
       <w:r>
         <w:rPr>
           <w:rFonts w:ascii="TH SarabunPSK" w:hAnsi="TH SarabunPSK" w:cs="TH SarabunPSK" w:eastAsia="TH SarabunPSK"/>
@@ -519,9 +426,7 @@
           <w:szCs w:val="26"/>
           <w:bCs/>
         </w:rPr>
-        <w:t>เรียน</w:t>
-        <w:tab/>
-        <w:t>ผู้อำนวยการสำนักวิเทศสัมพันธ์ กรมข่าวทหาร</w:t>
+        <w:t>กรมกำลังพลทหาร</w:t>
       </w:r>
     </w:p>
     <w:p>
@@ -570,10 +475,10 @@
     <w:p>
       <w:pPr>
         <w:tabs>
-          <w:tab w:pos="2588" w:val="left"/>
+          <w:tab w:pos="3028" w:val="left"/>
         </w:tabs>
         <w:spacing w:before="580" w:after="0" w:line="440" w:lineRule="exact"/>
-        <w:ind w:left="2588" w:hanging="720"/>
+        <w:ind w:left="3028" w:hanging="720"/>
       </w:pPr>
       <w:r>
         <w:rPr>
@@ -585,7 +490,7 @@
         </w:rPr>
         <w:t>เรียน</w:t>
         <w:tab/>
-        <w:t>ผู้อำนวยการสำนักนโยบายและแผน กรมยุทธการทหาร</w:t>
+        <w:t>ผู้อำนวยการสำนักข่าวกรอง กรมข่าวทหาร</w:t>
       </w:r>
     </w:p>
     <w:p>
@@ -634,10 +539,10 @@
     <w:p>
       <w:pPr>
         <w:tabs>
-          <w:tab w:pos="2588" w:val="left"/>
+          <w:tab w:pos="3028" w:val="left"/>
         </w:tabs>
         <w:spacing w:before="580" w:after="0" w:line="440" w:lineRule="exact"/>
-        <w:ind w:left="2588" w:hanging="720"/>
+        <w:ind w:left="3028" w:hanging="720"/>
       </w:pPr>
       <w:r>
         <w:rPr>
@@ -649,7 +554,7 @@
         </w:rPr>
         <w:t>เรียน</w:t>
         <w:tab/>
-        <w:t>ผู้อำนวยการสำนักปฏิบัติการ กรมยุทธการทหาร</w:t>
+        <w:t>ผู้อำนวยการสำนักวิเทศสัมพันธ์ กรมข่าวทหาร</w:t>
       </w:r>
     </w:p>
     <w:p>
@@ -698,10 +603,10 @@
     <w:p>
       <w:pPr>
         <w:tabs>
-          <w:tab w:pos="2588" w:val="left"/>
+          <w:tab w:pos="3028" w:val="left"/>
         </w:tabs>
         <w:spacing w:before="580" w:after="0" w:line="440" w:lineRule="exact"/>
-        <w:ind w:left="2588" w:hanging="720"/>
+        <w:ind w:left="3028" w:hanging="720"/>
       </w:pPr>
       <w:r>
         <w:rPr>
@@ -713,7 +618,7 @@
         </w:rPr>
         <w:t>เรียน</w:t>
         <w:tab/>
-        <w:t>ผู้อำนวยการสำนักวางแผนการฝึกร่วมและผสม กรมยุทธการทหาร</w:t>
+        <w:t>ผู้อำนวยการสำนักนโยบายและแผน กรมยุทธการทหาร</w:t>
       </w:r>
     </w:p>
     <w:p>
@@ -762,10 +667,10 @@
     <w:p>
       <w:pPr>
         <w:tabs>
-          <w:tab w:pos="2588" w:val="left"/>
+          <w:tab w:pos="3028" w:val="left"/>
         </w:tabs>
         <w:spacing w:before="580" w:after="0" w:line="440" w:lineRule="exact"/>
-        <w:ind w:left="2588" w:hanging="720"/>
+        <w:ind w:left="3028" w:hanging="720"/>
       </w:pPr>
       <w:r>
         <w:rPr>
@@ -777,7 +682,7 @@
         </w:rPr>
         <w:t>เรียน</w:t>
         <w:tab/>
-        <w:t>ผู้อำนวยการศูนย์ปฏิบัติการเพื่อสันติภาพ กรมยุทธการทหาร</w:t>
+        <w:t>ผู้อำนวยการสำนักปฏิบัติการ กรมยุทธการทหาร</w:t>
       </w:r>
     </w:p>
     <w:p>
@@ -826,10 +731,10 @@
     <w:p>
       <w:pPr>
         <w:tabs>
-          <w:tab w:pos="2588" w:val="left"/>
+          <w:tab w:pos="3028" w:val="left"/>
         </w:tabs>
         <w:spacing w:before="580" w:after="0" w:line="440" w:lineRule="exact"/>
-        <w:ind w:left="2588" w:hanging="720"/>
+        <w:ind w:left="3028" w:hanging="720"/>
       </w:pPr>
       <w:r>
         <w:rPr>
@@ -841,7 +746,7 @@
         </w:rPr>
         <w:t>เรียน</w:t>
         <w:tab/>
-        <w:t>ผู้อำนวยการสำนักงานประสานภารกิจด้านความมั่นคง</w:t>
+        <w:t>ผู้อำนวยการสำนักวางแผนการฝึกร่วมและผสม</w:t>
         <w:br/>
       </w:r>
       <w:r>
@@ -852,7 +757,7 @@
           <w:szCs w:val="26"/>
           <w:bCs/>
         </w:rPr>
-        <w:t>กับ กอ.รมน. กรมยุทธการทหาร</w:t>
+        <w:t>กรมยุทธการทหาร</w:t>
       </w:r>
     </w:p>
     <w:p>
@@ -901,10 +806,10 @@
     <w:p>
       <w:pPr>
         <w:tabs>
-          <w:tab w:pos="2588" w:val="left"/>
+          <w:tab w:pos="3028" w:val="left"/>
         </w:tabs>
         <w:spacing w:before="580" w:after="0" w:line="440" w:lineRule="exact"/>
-        <w:ind w:left="2588" w:hanging="720"/>
+        <w:ind w:left="3028" w:hanging="720"/>
       </w:pPr>
       <w:r>
         <w:rPr>
@@ -916,7 +821,7 @@
         </w:rPr>
         <w:t>เรียน</w:t>
         <w:tab/>
-        <w:t>ผู้อำนวยการสำนักส่งกำลังบำรุงร่วม กรมส่งกำลังบำรุงทหาร</w:t>
+        <w:t>ผู้อำนวยการศูนย์ปฏิบัติการเพื่อสันติภาพ กรมยุทธการทหาร</w:t>
       </w:r>
     </w:p>
     <w:p>
@@ -965,10 +870,10 @@
     <w:p>
       <w:pPr>
         <w:tabs>
-          <w:tab w:pos="2588" w:val="left"/>
+          <w:tab w:pos="3028" w:val="left"/>
         </w:tabs>
         <w:spacing w:before="580" w:after="0" w:line="440" w:lineRule="exact"/>
-        <w:ind w:left="2588" w:hanging="720"/>
+        <w:ind w:left="3028" w:hanging="720"/>
       </w:pPr>
       <w:r>
         <w:rPr>
@@ -980,60 +885,9 @@
         </w:rPr>
         <w:t>เรียน</w:t>
         <w:tab/>
-        <w:t>ผู้อำนวยการสำนักบริหารสิ่งอุปกรณ์ กรมส่งกำลังบำรุงทหาร</w:t>
-      </w:r>
-    </w:p>
-    <w:p>
-      <w:pPr>
-        <w:pageBreakBefore/>
-        <w:spacing w:before="0" w:after="0" w:line="364" w:lineRule="exact"/>
-      </w:pPr>
-      <w:r>
-        <w:rPr>
-          <w:rFonts w:ascii="TH SarabunPSK" w:hAnsi="TH SarabunPSK" w:cs="TH SarabunPSK" w:eastAsia="TH SarabunPSK"/>
-          <w:b w:val="0"/>
-          <w:sz w:val="21"/>
-          <w:szCs w:val="21"/>
-        </w:rPr>
-        <w:t>วปอ.สปท.</w:t>
-      </w:r>
-    </w:p>
-    <w:p>
-      <w:pPr>
-        <w:spacing w:before="0" w:after="0" w:line="364" w:lineRule="exact"/>
-      </w:pPr>
-      <w:r>
-        <w:rPr>
-          <w:rFonts w:ascii="TH SarabunPSK" w:hAnsi="TH SarabunPSK" w:cs="TH SarabunPSK" w:eastAsia="TH SarabunPSK"/>
-          <w:b w:val="0"/>
-          <w:sz w:val="21"/>
-          <w:szCs w:val="21"/>
-        </w:rPr>
-        <w:t>กห ๐๓๑๗.๒/๑๖๑๑</w:t>
-      </w:r>
-    </w:p>
-    <w:p>
-      <w:pPr>
-        <w:spacing w:before="0" w:after="0" w:line="364" w:lineRule="exact"/>
-      </w:pPr>
-      <w:r>
-        <w:rPr>
-          <w:rFonts w:ascii="TH SarabunPSK" w:hAnsi="TH SarabunPSK" w:cs="TH SarabunPSK" w:eastAsia="TH SarabunPSK"/>
-          <w:b w:val="0"/>
-          <w:sz w:val="21"/>
-          <w:szCs w:val="21"/>
-        </w:rPr>
-        <w:t>โทร. ๐ ๒๕๗๒ ๒๕๒๗</w:t>
-      </w:r>
-    </w:p>
-    <w:p>
-      <w:pPr>
-        <w:tabs>
-          <w:tab w:pos="2588" w:val="left"/>
-        </w:tabs>
-        <w:spacing w:before="580" w:after="0" w:line="440" w:lineRule="exact"/>
-        <w:ind w:left="2588" w:hanging="720"/>
-      </w:pPr>
+        <w:t>ผู้อำนวยการสำนักงานประสานภารกิจด้านความมั่นคง</w:t>
+        <w:br/>
+      </w:r>
       <w:r>
         <w:rPr>
           <w:rFonts w:ascii="TH SarabunPSK" w:hAnsi="TH SarabunPSK" w:cs="TH SarabunPSK" w:eastAsia="TH SarabunPSK"/>
@@ -1042,9 +896,7 @@
           <w:szCs w:val="26"/>
           <w:bCs/>
         </w:rPr>
-        <w:t>เรียน</w:t>
-        <w:tab/>
-        <w:t>ผู้อำนวยการสำนักปฏิบัติการกิจการพลเรือน กรมกิจการพลเรือนทหาร</w:t>
+        <w:t>กับ กอ.รมน. กรมยุทธการทหาร</w:t>
       </w:r>
     </w:p>
     <w:p>
@@ -1093,10 +945,10 @@
     <w:p>
       <w:pPr>
         <w:tabs>
-          <w:tab w:pos="2588" w:val="left"/>
+          <w:tab w:pos="3028" w:val="left"/>
         </w:tabs>
         <w:spacing w:before="580" w:after="0" w:line="440" w:lineRule="exact"/>
-        <w:ind w:left="2588" w:hanging="720"/>
+        <w:ind w:left="3028" w:hanging="720"/>
       </w:pPr>
       <w:r>
         <w:rPr>
@@ -1108,7 +960,7 @@
         </w:rPr>
         <w:t>เรียน</w:t>
         <w:tab/>
-        <w:t>ผู้อำนวยการสำนักประชาสัมพันธ์ กรมกิจการพลเรือนทหาร</w:t>
+        <w:t>ผู้อำนวยการสำนักส่งกำลังบำรุงร่วม กรมส่งกำลังบำรุงทหาร</w:t>
       </w:r>
     </w:p>
     <w:p>
@@ -1157,10 +1009,10 @@
     <w:p>
       <w:pPr>
         <w:tabs>
-          <w:tab w:pos="2588" w:val="left"/>
+          <w:tab w:pos="3028" w:val="left"/>
         </w:tabs>
         <w:spacing w:before="580" w:after="0" w:line="440" w:lineRule="exact"/>
-        <w:ind w:left="2588" w:hanging="720"/>
+        <w:ind w:left="3028" w:hanging="720"/>
       </w:pPr>
       <w:r>
         <w:rPr>
@@ -1172,7 +1024,7 @@
         </w:rPr>
         <w:t>เรียน</w:t>
         <w:tab/>
-        <w:t>ผู้อำนวยการสำนักแผนและอำนวยการสื่อสาร กรมการสื่อสารทหาร</w:t>
+        <w:t>ผู้อำนวยการสำนักบริหารสิ่งอุปกรณ์ กรมส่งกำลังบำรุงทหาร</w:t>
       </w:r>
     </w:p>
     <w:p>
@@ -1221,10 +1073,10 @@
     <w:p>
       <w:pPr>
         <w:tabs>
-          <w:tab w:pos="2588" w:val="left"/>
+          <w:tab w:pos="3028" w:val="left"/>
         </w:tabs>
         <w:spacing w:before="580" w:after="0" w:line="440" w:lineRule="exact"/>
-        <w:ind w:left="2588" w:hanging="720"/>
+        <w:ind w:left="3028" w:hanging="720"/>
       </w:pPr>
       <w:r>
         <w:rPr>
@@ -1236,60 +1088,9 @@
         </w:rPr>
         <w:t>เรียน</w:t>
         <w:tab/>
-        <w:t>ผู้อำนวยการศูนย์โทรคมนาคมทหาร กรมการสื่อสารทหาร</w:t>
-      </w:r>
-    </w:p>
-    <w:p>
-      <w:pPr>
-        <w:pageBreakBefore/>
-        <w:spacing w:before="0" w:after="0" w:line="364" w:lineRule="exact"/>
-      </w:pPr>
-      <w:r>
-        <w:rPr>
-          <w:rFonts w:ascii="TH SarabunPSK" w:hAnsi="TH SarabunPSK" w:cs="TH SarabunPSK" w:eastAsia="TH SarabunPSK"/>
-          <w:b w:val="0"/>
-          <w:sz w:val="21"/>
-          <w:szCs w:val="21"/>
-        </w:rPr>
-        <w:t>วปอ.สปท.</w:t>
-      </w:r>
-    </w:p>
-    <w:p>
-      <w:pPr>
-        <w:spacing w:before="0" w:after="0" w:line="364" w:lineRule="exact"/>
-      </w:pPr>
-      <w:r>
-        <w:rPr>
-          <w:rFonts w:ascii="TH SarabunPSK" w:hAnsi="TH SarabunPSK" w:cs="TH SarabunPSK" w:eastAsia="TH SarabunPSK"/>
-          <w:b w:val="0"/>
-          <w:sz w:val="21"/>
-          <w:szCs w:val="21"/>
-        </w:rPr>
-        <w:t>กห ๐๓๑๗.๒/๑๖๑๑</w:t>
-      </w:r>
-    </w:p>
-    <w:p>
-      <w:pPr>
-        <w:spacing w:before="0" w:after="0" w:line="364" w:lineRule="exact"/>
-      </w:pPr>
-      <w:r>
-        <w:rPr>
-          <w:rFonts w:ascii="TH SarabunPSK" w:hAnsi="TH SarabunPSK" w:cs="TH SarabunPSK" w:eastAsia="TH SarabunPSK"/>
-          <w:b w:val="0"/>
-          <w:sz w:val="21"/>
-          <w:szCs w:val="21"/>
-        </w:rPr>
-        <w:t>โทร. ๐ ๒๕๗๒ ๒๕๒๗</w:t>
-      </w:r>
-    </w:p>
-    <w:p>
-      <w:pPr>
-        <w:tabs>
-          <w:tab w:pos="2588" w:val="left"/>
-        </w:tabs>
-        <w:spacing w:before="580" w:after="0" w:line="440" w:lineRule="exact"/>
-        <w:ind w:left="2588" w:hanging="720"/>
-      </w:pPr>
+        <w:t>ผู้อำนวยการสำนักปฏิบัติการกิจการพลเรือน</w:t>
+        <w:br/>
+      </w:r>
       <w:r>
         <w:rPr>
           <w:rFonts w:ascii="TH SarabunPSK" w:hAnsi="TH SarabunPSK" w:cs="TH SarabunPSK" w:eastAsia="TH SarabunPSK"/>
@@ -1298,9 +1099,7 @@
           <w:szCs w:val="26"/>
           <w:bCs/>
         </w:rPr>
-        <w:t>เรียน</w:t>
-        <w:tab/>
-        <w:t>ผู้อำนวยการศูนย์เทคโนโลยีสารสนเทศทหาร กรมการสื่อสารทหาร</w:t>
+        <w:t>กรมกิจการพลเรือนทหาร</w:t>
       </w:r>
     </w:p>
     <w:p>
@@ -1349,10 +1148,10 @@
     <w:p>
       <w:pPr>
         <w:tabs>
-          <w:tab w:pos="2588" w:val="left"/>
+          <w:tab w:pos="3028" w:val="left"/>
         </w:tabs>
         <w:spacing w:before="580" w:after="0" w:line="440" w:lineRule="exact"/>
-        <w:ind w:left="2588" w:hanging="720"/>
+        <w:ind w:left="3028" w:hanging="720"/>
       </w:pPr>
       <w:r>
         <w:rPr>
@@ -1364,7 +1163,7 @@
         </w:rPr>
         <w:t>เรียน</w:t>
         <w:tab/>
-        <w:t>ผู้บังคับกองพันทหารสื่อสาร กองบัญชาการกองทัพไทย</w:t>
+        <w:t>ผู้อำนวยการสำนักประชาสัมพันธ์ กรมกิจการพลเรือนทหาร</w:t>
       </w:r>
     </w:p>
     <w:p>
@@ -1413,10 +1212,10 @@
     <w:p>
       <w:pPr>
         <w:tabs>
-          <w:tab w:pos="2588" w:val="left"/>
+          <w:tab w:pos="3028" w:val="left"/>
         </w:tabs>
         <w:spacing w:before="580" w:after="0" w:line="440" w:lineRule="exact"/>
-        <w:ind w:left="2588" w:hanging="720"/>
+        <w:ind w:left="3028" w:hanging="720"/>
       </w:pPr>
       <w:r>
         <w:rPr>
@@ -1428,60 +1227,9 @@
         </w:rPr>
         <w:t>เรียน</w:t>
         <w:tab/>
-        <w:t>ผู้บังคับกองพันปฏิบัติการสงครามอิเล็กทรอนิกส์ กรมการสื่อสารทหาร</w:t>
-      </w:r>
-    </w:p>
-    <w:p>
-      <w:pPr>
-        <w:pageBreakBefore/>
-        <w:spacing w:before="0" w:after="0" w:line="364" w:lineRule="exact"/>
-      </w:pPr>
-      <w:r>
-        <w:rPr>
-          <w:rFonts w:ascii="TH SarabunPSK" w:hAnsi="TH SarabunPSK" w:cs="TH SarabunPSK" w:eastAsia="TH SarabunPSK"/>
-          <w:b w:val="0"/>
-          <w:sz w:val="21"/>
-          <w:szCs w:val="21"/>
-        </w:rPr>
-        <w:t>วปอ.สปท.</w:t>
-      </w:r>
-    </w:p>
-    <w:p>
-      <w:pPr>
-        <w:spacing w:before="0" w:after="0" w:line="364" w:lineRule="exact"/>
-      </w:pPr>
-      <w:r>
-        <w:rPr>
-          <w:rFonts w:ascii="TH SarabunPSK" w:hAnsi="TH SarabunPSK" w:cs="TH SarabunPSK" w:eastAsia="TH SarabunPSK"/>
-          <w:b w:val="0"/>
-          <w:sz w:val="21"/>
-          <w:szCs w:val="21"/>
-        </w:rPr>
-        <w:t>กห ๐๓๑๗.๒/๑๖๑๑</w:t>
-      </w:r>
-    </w:p>
-    <w:p>
-      <w:pPr>
-        <w:spacing w:before="0" w:after="0" w:line="364" w:lineRule="exact"/>
-      </w:pPr>
-      <w:r>
-        <w:rPr>
-          <w:rFonts w:ascii="TH SarabunPSK" w:hAnsi="TH SarabunPSK" w:cs="TH SarabunPSK" w:eastAsia="TH SarabunPSK"/>
-          <w:b w:val="0"/>
-          <w:sz w:val="21"/>
-          <w:szCs w:val="21"/>
-        </w:rPr>
-        <w:t>โทร. ๐ ๒๕๗๒ ๒๕๒๗</w:t>
-      </w:r>
-    </w:p>
-    <w:p>
-      <w:pPr>
-        <w:tabs>
-          <w:tab w:pos="2588" w:val="left"/>
-        </w:tabs>
-        <w:spacing w:before="580" w:after="0" w:line="440" w:lineRule="exact"/>
-        <w:ind w:left="2588" w:hanging="720"/>
-      </w:pPr>
+        <w:t>ผู้อำนวยการสำนักแผนและอำนวยการสื่อสาร</w:t>
+        <w:br/>
+      </w:r>
       <w:r>
         <w:rPr>
           <w:rFonts w:ascii="TH SarabunPSK" w:hAnsi="TH SarabunPSK" w:cs="TH SarabunPSK" w:eastAsia="TH SarabunPSK"/>
@@ -1490,9 +1238,7 @@
           <w:szCs w:val="26"/>
           <w:bCs/>
         </w:rPr>
-        <w:t>เรียน</w:t>
-        <w:tab/>
-        <w:t>ผู้อำนวยการสำนักบริหารทรัพยากร สำนักงานปลัดบัญชีทหาร</w:t>
+        <w:t>กรมการสื่อสารทหาร</w:t>
       </w:r>
     </w:p>
     <w:p>
@@ -1541,10 +1287,10 @@
     <w:p>
       <w:pPr>
         <w:tabs>
-          <w:tab w:pos="2588" w:val="left"/>
+          <w:tab w:pos="3028" w:val="left"/>
         </w:tabs>
         <w:spacing w:before="580" w:after="0" w:line="440" w:lineRule="exact"/>
-        <w:ind w:left="2588" w:hanging="720"/>
+        <w:ind w:left="3028" w:hanging="720"/>
       </w:pPr>
       <w:r>
         <w:rPr>
@@ -1556,7 +1302,7 @@
         </w:rPr>
         <w:t>เรียน</w:t>
         <w:tab/>
-        <w:t>ผู้อำนวยการสำนักงานทหารพัฒนา หน่วยบัญชาการทหารพัฒนา</w:t>
+        <w:t>ผู้อำนวยการศูนย์โทรคมนาคมทหาร กรมการสื่อสารทหาร</w:t>
       </w:r>
     </w:p>
     <w:p>
@@ -1605,10 +1351,10 @@
     <w:p>
       <w:pPr>
         <w:tabs>
-          <w:tab w:pos="2588" w:val="left"/>
+          <w:tab w:pos="3028" w:val="left"/>
         </w:tabs>
         <w:spacing w:before="580" w:after="0" w:line="440" w:lineRule="exact"/>
-        <w:ind w:left="2588" w:hanging="720"/>
+        <w:ind w:left="3028" w:hanging="720"/>
       </w:pPr>
       <w:r>
         <w:rPr>
@@ -1620,60 +1366,9 @@
         </w:rPr>
         <w:t>เรียน</w:t>
         <w:tab/>
-        <w:t>ผู้อำนวยการสำนักงานสนับสนุน หน่วยบัญชาการทหารพัฒนา</w:t>
-      </w:r>
-    </w:p>
-    <w:p>
-      <w:pPr>
-        <w:pageBreakBefore/>
-        <w:spacing w:before="0" w:after="0" w:line="364" w:lineRule="exact"/>
-      </w:pPr>
-      <w:r>
-        <w:rPr>
-          <w:rFonts w:ascii="TH SarabunPSK" w:hAnsi="TH SarabunPSK" w:cs="TH SarabunPSK" w:eastAsia="TH SarabunPSK"/>
-          <w:b w:val="0"/>
-          <w:sz w:val="21"/>
-          <w:szCs w:val="21"/>
-        </w:rPr>
-        <w:t>วปอ.สปท.</w:t>
-      </w:r>
-    </w:p>
-    <w:p>
-      <w:pPr>
-        <w:spacing w:before="0" w:after="0" w:line="364" w:lineRule="exact"/>
-      </w:pPr>
-      <w:r>
-        <w:rPr>
-          <w:rFonts w:ascii="TH SarabunPSK" w:hAnsi="TH SarabunPSK" w:cs="TH SarabunPSK" w:eastAsia="TH SarabunPSK"/>
-          <w:b w:val="0"/>
-          <w:sz w:val="21"/>
-          <w:szCs w:val="21"/>
-        </w:rPr>
-        <w:t>กห ๐๓๑๗.๒/๑๖๑๑</w:t>
-      </w:r>
-    </w:p>
-    <w:p>
-      <w:pPr>
-        <w:spacing w:before="0" w:after="0" w:line="364" w:lineRule="exact"/>
-      </w:pPr>
-      <w:r>
-        <w:rPr>
-          <w:rFonts w:ascii="TH SarabunPSK" w:hAnsi="TH SarabunPSK" w:cs="TH SarabunPSK" w:eastAsia="TH SarabunPSK"/>
-          <w:b w:val="0"/>
-          <w:sz w:val="21"/>
-          <w:szCs w:val="21"/>
-        </w:rPr>
-        <w:t>โทร. ๐ ๒๕๗๒ ๒๕๒๗</w:t>
-      </w:r>
-    </w:p>
-    <w:p>
-      <w:pPr>
-        <w:tabs>
-          <w:tab w:pos="2588" w:val="left"/>
-        </w:tabs>
-        <w:spacing w:before="580" w:after="0" w:line="440" w:lineRule="exact"/>
-        <w:ind w:left="2588" w:hanging="720"/>
-      </w:pPr>
+        <w:t>ผู้อำนวยการศูนย์เทคโนโลยีสารสนเทศทหาร</w:t>
+        <w:br/>
+      </w:r>
       <w:r>
         <w:rPr>
           <w:rFonts w:ascii="TH SarabunPSK" w:hAnsi="TH SarabunPSK" w:cs="TH SarabunPSK" w:eastAsia="TH SarabunPSK"/>
@@ -1682,11 +1377,60 @@
           <w:szCs w:val="26"/>
           <w:bCs/>
         </w:rPr>
-        <w:t>เรียน</w:t>
-        <w:tab/>
-        <w:t>ผู้อำนวยการสำนักงานพัฒนาโครงการอันเนื่องมาจากพระราชดำริ</w:t>
-        <w:br/>
-      </w:r>
+        <w:t>กรมการสื่อสารทหาร</w:t>
+      </w:r>
+    </w:p>
+    <w:p>
+      <w:pPr>
+        <w:pageBreakBefore/>
+        <w:spacing w:before="0" w:after="0" w:line="364" w:lineRule="exact"/>
+      </w:pPr>
+      <w:r>
+        <w:rPr>
+          <w:rFonts w:ascii="TH SarabunPSK" w:hAnsi="TH SarabunPSK" w:cs="TH SarabunPSK" w:eastAsia="TH SarabunPSK"/>
+          <w:b w:val="0"/>
+          <w:sz w:val="21"/>
+          <w:szCs w:val="21"/>
+        </w:rPr>
+        <w:t>วปอ.สปท.</w:t>
+      </w:r>
+    </w:p>
+    <w:p>
+      <w:pPr>
+        <w:spacing w:before="0" w:after="0" w:line="364" w:lineRule="exact"/>
+      </w:pPr>
+      <w:r>
+        <w:rPr>
+          <w:rFonts w:ascii="TH SarabunPSK" w:hAnsi="TH SarabunPSK" w:cs="TH SarabunPSK" w:eastAsia="TH SarabunPSK"/>
+          <w:b w:val="0"/>
+          <w:sz w:val="21"/>
+          <w:szCs w:val="21"/>
+        </w:rPr>
+        <w:t>กห ๐๓๑๗.๒/๑๖๑๑</w:t>
+      </w:r>
+    </w:p>
+    <w:p>
+      <w:pPr>
+        <w:spacing w:before="0" w:after="0" w:line="364" w:lineRule="exact"/>
+      </w:pPr>
+      <w:r>
+        <w:rPr>
+          <w:rFonts w:ascii="TH SarabunPSK" w:hAnsi="TH SarabunPSK" w:cs="TH SarabunPSK" w:eastAsia="TH SarabunPSK"/>
+          <w:b w:val="0"/>
+          <w:sz w:val="21"/>
+          <w:szCs w:val="21"/>
+        </w:rPr>
+        <w:t>โทร. ๐ ๒๕๗๒ ๒๕๒๗</w:t>
+      </w:r>
+    </w:p>
+    <w:p>
+      <w:pPr>
+        <w:tabs>
+          <w:tab w:pos="3028" w:val="left"/>
+        </w:tabs>
+        <w:spacing w:before="580" w:after="0" w:line="440" w:lineRule="exact"/>
+        <w:ind w:left="3028" w:hanging="720"/>
+      </w:pPr>
       <w:r>
         <w:rPr>
           <w:rFonts w:ascii="TH SarabunPSK" w:hAnsi="TH SarabunPSK" w:cs="TH SarabunPSK" w:eastAsia="TH SarabunPSK"/>
@@ -1695,7 +1439,9 @@
           <w:szCs w:val="26"/>
           <w:bCs/>
         </w:rPr>
-        <w:t>หน่วยบัญชาการทหารพัฒนา</w:t>
+        <w:t>เรียน</w:t>
+        <w:tab/>
+        <w:t>ผู้บังคับกองพันทหารสื่อสาร กองบัญชาการกองทัพไทย</w:t>
       </w:r>
     </w:p>
     <w:p>
@@ -1744,10 +1490,10 @@
     <w:p>
       <w:pPr>
         <w:tabs>
-          <w:tab w:pos="2588" w:val="left"/>
+          <w:tab w:pos="3028" w:val="left"/>
         </w:tabs>
         <w:spacing w:before="580" w:after="0" w:line="440" w:lineRule="exact"/>
-        <w:ind w:left="2588" w:hanging="720"/>
+        <w:ind w:left="3028" w:hanging="720"/>
       </w:pPr>
       <w:r>
         <w:rPr>
@@ -1759,60 +1505,9 @@
         </w:rPr>
         <w:t>เรียน</w:t>
         <w:tab/>
-        <w:t>ผู้อำนวยการสำนักงานพัฒนาภาค 1 หน่วยบัญชาการทหารพัฒนา</w:t>
-      </w:r>
-    </w:p>
-    <w:p>
-      <w:pPr>
-        <w:pageBreakBefore/>
-        <w:spacing w:before="0" w:after="0" w:line="364" w:lineRule="exact"/>
-      </w:pPr>
-      <w:r>
-        <w:rPr>
-          <w:rFonts w:ascii="TH SarabunPSK" w:hAnsi="TH SarabunPSK" w:cs="TH SarabunPSK" w:eastAsia="TH SarabunPSK"/>
-          <w:b w:val="0"/>
-          <w:sz w:val="21"/>
-          <w:szCs w:val="21"/>
-        </w:rPr>
-        <w:t>วปอ.สปท.</w:t>
-      </w:r>
-    </w:p>
-    <w:p>
-      <w:pPr>
-        <w:spacing w:before="0" w:after="0" w:line="364" w:lineRule="exact"/>
-      </w:pPr>
-      <w:r>
-        <w:rPr>
-          <w:rFonts w:ascii="TH SarabunPSK" w:hAnsi="TH SarabunPSK" w:cs="TH SarabunPSK" w:eastAsia="TH SarabunPSK"/>
-          <w:b w:val="0"/>
-          <w:sz w:val="21"/>
-          <w:szCs w:val="21"/>
-        </w:rPr>
-        <w:t>กห ๐๓๑๗.๒/๑๖๑๑</w:t>
-      </w:r>
-    </w:p>
-    <w:p>
-      <w:pPr>
-        <w:spacing w:before="0" w:after="0" w:line="364" w:lineRule="exact"/>
-      </w:pPr>
-      <w:r>
-        <w:rPr>
-          <w:rFonts w:ascii="TH SarabunPSK" w:hAnsi="TH SarabunPSK" w:cs="TH SarabunPSK" w:eastAsia="TH SarabunPSK"/>
-          <w:b w:val="0"/>
-          <w:sz w:val="21"/>
-          <w:szCs w:val="21"/>
-        </w:rPr>
-        <w:t>โทร. ๐ ๒๕๗๒ ๒๕๒๗</w:t>
-      </w:r>
-    </w:p>
-    <w:p>
-      <w:pPr>
-        <w:tabs>
-          <w:tab w:pos="2588" w:val="left"/>
-        </w:tabs>
-        <w:spacing w:before="580" w:after="0" w:line="440" w:lineRule="exact"/>
-        <w:ind w:left="2588" w:hanging="720"/>
-      </w:pPr>
+        <w:t>ผู้บังคับกองพันปฏิบัติการสงครามอิเล็กทรอนิกส์</w:t>
+        <w:br/>
+      </w:r>
       <w:r>
         <w:rPr>
           <w:rFonts w:ascii="TH SarabunPSK" w:hAnsi="TH SarabunPSK" w:cs="TH SarabunPSK" w:eastAsia="TH SarabunPSK"/>
@@ -1821,9 +1516,7 @@
           <w:szCs w:val="26"/>
           <w:bCs/>
         </w:rPr>
-        <w:t>เรียน</w:t>
-        <w:tab/>
-        <w:t>ผู้บังคับหน่วยพัฒนาการเคลื่อนที่ 11 สำนักงานพัฒนาภาค 1</w:t>
+        <w:t>กรมการสื่อสารทหาร</w:t>
       </w:r>
     </w:p>
     <w:p>
@@ -1872,10 +1565,10 @@
     <w:p>
       <w:pPr>
         <w:tabs>
-          <w:tab w:pos="2588" w:val="left"/>
+          <w:tab w:pos="3028" w:val="left"/>
         </w:tabs>
         <w:spacing w:before="580" w:after="0" w:line="440" w:lineRule="exact"/>
-        <w:ind w:left="2588" w:hanging="720"/>
+        <w:ind w:left="3028" w:hanging="720"/>
       </w:pPr>
       <w:r>
         <w:rPr>
@@ -1887,60 +1580,9 @@
         </w:rPr>
         <w:t>เรียน</w:t>
         <w:tab/>
-        <w:t>ผู้บังคับหน่วยพัฒนาการเคลื่อนที่ 12 สำนักงานพัฒนาภาค 1</w:t>
-      </w:r>
-    </w:p>
-    <w:p>
-      <w:pPr>
-        <w:pageBreakBefore/>
-        <w:spacing w:before="0" w:after="0" w:line="364" w:lineRule="exact"/>
-      </w:pPr>
-      <w:r>
-        <w:rPr>
-          <w:rFonts w:ascii="TH SarabunPSK" w:hAnsi="TH SarabunPSK" w:cs="TH SarabunPSK" w:eastAsia="TH SarabunPSK"/>
-          <w:b w:val="0"/>
-          <w:sz w:val="21"/>
-          <w:szCs w:val="21"/>
-        </w:rPr>
-        <w:t>วปอ.สปท.</w:t>
-      </w:r>
-    </w:p>
-    <w:p>
-      <w:pPr>
-        <w:spacing w:before="0" w:after="0" w:line="364" w:lineRule="exact"/>
-      </w:pPr>
-      <w:r>
-        <w:rPr>
-          <w:rFonts w:ascii="TH SarabunPSK" w:hAnsi="TH SarabunPSK" w:cs="TH SarabunPSK" w:eastAsia="TH SarabunPSK"/>
-          <w:b w:val="0"/>
-          <w:sz w:val="21"/>
-          <w:szCs w:val="21"/>
-        </w:rPr>
-        <w:t>กห ๐๓๑๗.๒/๑๖๑๑</w:t>
-      </w:r>
-    </w:p>
-    <w:p>
-      <w:pPr>
-        <w:spacing w:before="0" w:after="0" w:line="364" w:lineRule="exact"/>
-      </w:pPr>
-      <w:r>
-        <w:rPr>
-          <w:rFonts w:ascii="TH SarabunPSK" w:hAnsi="TH SarabunPSK" w:cs="TH SarabunPSK" w:eastAsia="TH SarabunPSK"/>
-          <w:b w:val="0"/>
-          <w:sz w:val="21"/>
-          <w:szCs w:val="21"/>
-        </w:rPr>
-        <w:t>โทร. ๐ ๒๕๗๒ ๒๕๒๗</w:t>
-      </w:r>
-    </w:p>
-    <w:p>
-      <w:pPr>
-        <w:tabs>
-          <w:tab w:pos="2588" w:val="left"/>
-        </w:tabs>
-        <w:spacing w:before="580" w:after="0" w:line="440" w:lineRule="exact"/>
-        <w:ind w:left="2588" w:hanging="720"/>
-      </w:pPr>
+        <w:t>ผู้อำนวยการสำนักบริหารทรัพยากร</w:t>
+        <w:br/>
+      </w:r>
       <w:r>
         <w:rPr>
           <w:rFonts w:ascii="TH SarabunPSK" w:hAnsi="TH SarabunPSK" w:cs="TH SarabunPSK" w:eastAsia="TH SarabunPSK"/>
@@ -1949,9 +1591,7 @@
           <w:szCs w:val="26"/>
           <w:bCs/>
         </w:rPr>
-        <w:t>เรียน</w:t>
-        <w:tab/>
-        <w:t>ผู้บังคับหน่วยพัฒนาการเคลื่อนที่ 13 สำนักงานพัฒนาภาค 1</w:t>
+        <w:t>สำนักงานปลัดบัญชีทหาร</w:t>
       </w:r>
     </w:p>
     <w:p>
@@ -2000,10 +1640,10 @@
     <w:p>
       <w:pPr>
         <w:tabs>
-          <w:tab w:pos="2588" w:val="left"/>
+          <w:tab w:pos="3028" w:val="left"/>
         </w:tabs>
         <w:spacing w:before="580" w:after="0" w:line="440" w:lineRule="exact"/>
-        <w:ind w:left="2588" w:hanging="720"/>
+        <w:ind w:left="3028" w:hanging="720"/>
       </w:pPr>
       <w:r>
         <w:rPr>
@@ -2015,60 +1655,9 @@
         </w:rPr>
         <w:t>เรียน</w:t>
         <w:tab/>
-        <w:t>ผู้บังคับหน่วยพัฒนาการเคลื่อนที่ 14 สำนักงานพัฒนาภาค 1</w:t>
-      </w:r>
-    </w:p>
-    <w:p>
-      <w:pPr>
-        <w:pageBreakBefore/>
-        <w:spacing w:before="0" w:after="0" w:line="364" w:lineRule="exact"/>
-      </w:pPr>
-      <w:r>
-        <w:rPr>
-          <w:rFonts w:ascii="TH SarabunPSK" w:hAnsi="TH SarabunPSK" w:cs="TH SarabunPSK" w:eastAsia="TH SarabunPSK"/>
-          <w:b w:val="0"/>
-          <w:sz w:val="21"/>
-          <w:szCs w:val="21"/>
-        </w:rPr>
-        <w:t>วปอ.สปท.</w:t>
-      </w:r>
-    </w:p>
-    <w:p>
-      <w:pPr>
-        <w:spacing w:before="0" w:after="0" w:line="364" w:lineRule="exact"/>
-      </w:pPr>
-      <w:r>
-        <w:rPr>
-          <w:rFonts w:ascii="TH SarabunPSK" w:hAnsi="TH SarabunPSK" w:cs="TH SarabunPSK" w:eastAsia="TH SarabunPSK"/>
-          <w:b w:val="0"/>
-          <w:sz w:val="21"/>
-          <w:szCs w:val="21"/>
-        </w:rPr>
-        <w:t>กห ๐๓๑๗.๒/๑๖๑๑</w:t>
-      </w:r>
-    </w:p>
-    <w:p>
-      <w:pPr>
-        <w:spacing w:before="0" w:after="0" w:line="364" w:lineRule="exact"/>
-      </w:pPr>
-      <w:r>
-        <w:rPr>
-          <w:rFonts w:ascii="TH SarabunPSK" w:hAnsi="TH SarabunPSK" w:cs="TH SarabunPSK" w:eastAsia="TH SarabunPSK"/>
-          <w:b w:val="0"/>
-          <w:sz w:val="21"/>
-          <w:szCs w:val="21"/>
-        </w:rPr>
-        <w:t>โทร. ๐ ๒๕๗๒ ๒๕๒๗</w:t>
-      </w:r>
-    </w:p>
-    <w:p>
-      <w:pPr>
-        <w:tabs>
-          <w:tab w:pos="2588" w:val="left"/>
-        </w:tabs>
-        <w:spacing w:before="580" w:after="0" w:line="440" w:lineRule="exact"/>
-        <w:ind w:left="2588" w:hanging="720"/>
-      </w:pPr>
+        <w:t>ผู้อำนวยการสำนักงานทหารพัฒนา</w:t>
+        <w:br/>
+      </w:r>
       <w:r>
         <w:rPr>
           <w:rFonts w:ascii="TH SarabunPSK" w:hAnsi="TH SarabunPSK" w:cs="TH SarabunPSK" w:eastAsia="TH SarabunPSK"/>
@@ -2077,9 +1666,7 @@
           <w:szCs w:val="26"/>
           <w:bCs/>
         </w:rPr>
-        <w:t>เรียน</w:t>
-        <w:tab/>
-        <w:t>ผู้บังคับหน่วยพัฒนาการเคลื่อนที่ 15 สำนักงานพัฒนาภาค 1</w:t>
+        <w:t>หน่วยบัญชาการทหารพัฒนา</w:t>
       </w:r>
     </w:p>
     <w:p>
@@ -2128,10 +1715,10 @@
     <w:p>
       <w:pPr>
         <w:tabs>
-          <w:tab w:pos="2588" w:val="left"/>
+          <w:tab w:pos="3028" w:val="left"/>
         </w:tabs>
         <w:spacing w:before="580" w:after="0" w:line="440" w:lineRule="exact"/>
-        <w:ind w:left="2588" w:hanging="720"/>
+        <w:ind w:left="3028" w:hanging="720"/>
       </w:pPr>
       <w:r>
         <w:rPr>
@@ -2143,60 +1730,9 @@
         </w:rPr>
         <w:t>เรียน</w:t>
         <w:tab/>
-        <w:t>ผู้อำนวยการสำนักงานพัฒนาภาค 2 หน่วยบัญชาการทหารพัฒนา</w:t>
-      </w:r>
-    </w:p>
-    <w:p>
-      <w:pPr>
-        <w:pageBreakBefore/>
-        <w:spacing w:before="0" w:after="0" w:line="364" w:lineRule="exact"/>
-      </w:pPr>
-      <w:r>
-        <w:rPr>
-          <w:rFonts w:ascii="TH SarabunPSK" w:hAnsi="TH SarabunPSK" w:cs="TH SarabunPSK" w:eastAsia="TH SarabunPSK"/>
-          <w:b w:val="0"/>
-          <w:sz w:val="21"/>
-          <w:szCs w:val="21"/>
-        </w:rPr>
-        <w:t>วปอ.สปท.</w:t>
-      </w:r>
-    </w:p>
-    <w:p>
-      <w:pPr>
-        <w:spacing w:before="0" w:after="0" w:line="364" w:lineRule="exact"/>
-      </w:pPr>
-      <w:r>
-        <w:rPr>
-          <w:rFonts w:ascii="TH SarabunPSK" w:hAnsi="TH SarabunPSK" w:cs="TH SarabunPSK" w:eastAsia="TH SarabunPSK"/>
-          <w:b w:val="0"/>
-          <w:sz w:val="21"/>
-          <w:szCs w:val="21"/>
-        </w:rPr>
-        <w:t>กห ๐๓๑๗.๒/๑๖๑๑</w:t>
-      </w:r>
-    </w:p>
-    <w:p>
-      <w:pPr>
-        <w:spacing w:before="0" w:after="0" w:line="364" w:lineRule="exact"/>
-      </w:pPr>
-      <w:r>
-        <w:rPr>
-          <w:rFonts w:ascii="TH SarabunPSK" w:hAnsi="TH SarabunPSK" w:cs="TH SarabunPSK" w:eastAsia="TH SarabunPSK"/>
-          <w:b w:val="0"/>
-          <w:sz w:val="21"/>
-          <w:szCs w:val="21"/>
-        </w:rPr>
-        <w:t>โทร. ๐ ๒๕๗๒ ๒๕๒๗</w:t>
-      </w:r>
-    </w:p>
-    <w:p>
-      <w:pPr>
-        <w:tabs>
-          <w:tab w:pos="2588" w:val="left"/>
-        </w:tabs>
-        <w:spacing w:before="580" w:after="0" w:line="440" w:lineRule="exact"/>
-        <w:ind w:left="2588" w:hanging="720"/>
-      </w:pPr>
+        <w:t>ผู้อำนวยการสำนักงานสนับสนุน</w:t>
+        <w:br/>
+      </w:r>
       <w:r>
         <w:rPr>
           <w:rFonts w:ascii="TH SarabunPSK" w:hAnsi="TH SarabunPSK" w:cs="TH SarabunPSK" w:eastAsia="TH SarabunPSK"/>
@@ -2205,9 +1741,7 @@
           <w:szCs w:val="26"/>
           <w:bCs/>
         </w:rPr>
-        <w:t>เรียน</w:t>
-        <w:tab/>
-        <w:t>ผู้บังคับหน่วยพัฒนาการเคลื่อนที่ 21 สำนักงานพัฒนาภาค 2</w:t>
+        <w:t>หน่วยบัญชาการทหารพัฒนา</w:t>
       </w:r>
     </w:p>
     <w:p>
@@ -2256,10 +1790,10 @@
     <w:p>
       <w:pPr>
         <w:tabs>
-          <w:tab w:pos="2588" w:val="left"/>
+          <w:tab w:pos="3028" w:val="left"/>
         </w:tabs>
         <w:spacing w:before="580" w:after="0" w:line="440" w:lineRule="exact"/>
-        <w:ind w:left="2588" w:hanging="720"/>
+        <w:ind w:left="3028" w:hanging="720"/>
       </w:pPr>
       <w:r>
         <w:rPr>
@@ -2271,60 +1805,9 @@
         </w:rPr>
         <w:t>เรียน</w:t>
         <w:tab/>
-        <w:t>ผู้บังคับหน่วยพัฒนาการเคลื่อนที่ 22 สำนักงานพัฒนาภาค 2</w:t>
-      </w:r>
-    </w:p>
-    <w:p>
-      <w:pPr>
-        <w:pageBreakBefore/>
-        <w:spacing w:before="0" w:after="0" w:line="364" w:lineRule="exact"/>
-      </w:pPr>
-      <w:r>
-        <w:rPr>
-          <w:rFonts w:ascii="TH SarabunPSK" w:hAnsi="TH SarabunPSK" w:cs="TH SarabunPSK" w:eastAsia="TH SarabunPSK"/>
-          <w:b w:val="0"/>
-          <w:sz w:val="21"/>
-          <w:szCs w:val="21"/>
-        </w:rPr>
-        <w:t>วปอ.สปท.</w:t>
-      </w:r>
-    </w:p>
-    <w:p>
-      <w:pPr>
-        <w:spacing w:before="0" w:after="0" w:line="364" w:lineRule="exact"/>
-      </w:pPr>
-      <w:r>
-        <w:rPr>
-          <w:rFonts w:ascii="TH SarabunPSK" w:hAnsi="TH SarabunPSK" w:cs="TH SarabunPSK" w:eastAsia="TH SarabunPSK"/>
-          <w:b w:val="0"/>
-          <w:sz w:val="21"/>
-          <w:szCs w:val="21"/>
-        </w:rPr>
-        <w:t>กห ๐๓๑๗.๒/๑๖๑๑</w:t>
-      </w:r>
-    </w:p>
-    <w:p>
-      <w:pPr>
-        <w:spacing w:before="0" w:after="0" w:line="364" w:lineRule="exact"/>
-      </w:pPr>
-      <w:r>
-        <w:rPr>
-          <w:rFonts w:ascii="TH SarabunPSK" w:hAnsi="TH SarabunPSK" w:cs="TH SarabunPSK" w:eastAsia="TH SarabunPSK"/>
-          <w:b w:val="0"/>
-          <w:sz w:val="21"/>
-          <w:szCs w:val="21"/>
-        </w:rPr>
-        <w:t>โทร. ๐ ๒๕๗๒ ๒๕๒๗</w:t>
-      </w:r>
-    </w:p>
-    <w:p>
-      <w:pPr>
-        <w:tabs>
-          <w:tab w:pos="2588" w:val="left"/>
-        </w:tabs>
-        <w:spacing w:before="580" w:after="0" w:line="440" w:lineRule="exact"/>
-        <w:ind w:left="2588" w:hanging="720"/>
-      </w:pPr>
+        <w:t>ผู้อำนวยการสำนักงานพัฒนาโครงการ</w:t>
+        <w:br/>
+      </w:r>
       <w:r>
         <w:rPr>
           <w:rFonts w:ascii="TH SarabunPSK" w:hAnsi="TH SarabunPSK" w:cs="TH SarabunPSK" w:eastAsia="TH SarabunPSK"/>
@@ -2333,9 +1816,7 @@
           <w:szCs w:val="26"/>
           <w:bCs/>
         </w:rPr>
-        <w:t>เรียน</w:t>
-        <w:tab/>
-        <w:t>ผู้บังคับหน่วยพัฒนาการเคลื่อนที่ 23 สำนักงานพัฒนาภาค 2</w:t>
+        <w:t>อันเนื่องมาจากพระราชดำริ หน่วยบัญชาการทหารพัฒนา</w:t>
       </w:r>
     </w:p>
     <w:p>
@@ -2384,10 +1865,10 @@
     <w:p>
       <w:pPr>
         <w:tabs>
-          <w:tab w:pos="2588" w:val="left"/>
+          <w:tab w:pos="3028" w:val="left"/>
         </w:tabs>
         <w:spacing w:before="580" w:after="0" w:line="440" w:lineRule="exact"/>
-        <w:ind w:left="2588" w:hanging="720"/>
+        <w:ind w:left="3028" w:hanging="720"/>
       </w:pPr>
       <w:r>
         <w:rPr>
@@ -2399,60 +1880,9 @@
         </w:rPr>
         <w:t>เรียน</w:t>
         <w:tab/>
-        <w:t>ผู้บังคับหน่วยพัฒนาการเคลื่อนที่ 24 สำนักงานพัฒนาภาค 2</w:t>
-      </w:r>
-    </w:p>
-    <w:p>
-      <w:pPr>
-        <w:pageBreakBefore/>
-        <w:spacing w:before="0" w:after="0" w:line="364" w:lineRule="exact"/>
-      </w:pPr>
-      <w:r>
-        <w:rPr>
-          <w:rFonts w:ascii="TH SarabunPSK" w:hAnsi="TH SarabunPSK" w:cs="TH SarabunPSK" w:eastAsia="TH SarabunPSK"/>
-          <w:b w:val="0"/>
-          <w:sz w:val="21"/>
-          <w:szCs w:val="21"/>
-        </w:rPr>
-        <w:t>วปอ.สปท.</w:t>
-      </w:r>
-    </w:p>
-    <w:p>
-      <w:pPr>
-        <w:spacing w:before="0" w:after="0" w:line="364" w:lineRule="exact"/>
-      </w:pPr>
-      <w:r>
-        <w:rPr>
-          <w:rFonts w:ascii="TH SarabunPSK" w:hAnsi="TH SarabunPSK" w:cs="TH SarabunPSK" w:eastAsia="TH SarabunPSK"/>
-          <w:b w:val="0"/>
-          <w:sz w:val="21"/>
-          <w:szCs w:val="21"/>
-        </w:rPr>
-        <w:t>กห ๐๓๑๗.๒/๑๖๑๑</w:t>
-      </w:r>
-    </w:p>
-    <w:p>
-      <w:pPr>
-        <w:spacing w:before="0" w:after="0" w:line="364" w:lineRule="exact"/>
-      </w:pPr>
-      <w:r>
-        <w:rPr>
-          <w:rFonts w:ascii="TH SarabunPSK" w:hAnsi="TH SarabunPSK" w:cs="TH SarabunPSK" w:eastAsia="TH SarabunPSK"/>
-          <w:b w:val="0"/>
-          <w:sz w:val="21"/>
-          <w:szCs w:val="21"/>
-        </w:rPr>
-        <w:t>โทร. ๐ ๒๕๗๒ ๒๕๒๗</w:t>
-      </w:r>
-    </w:p>
-    <w:p>
-      <w:pPr>
-        <w:tabs>
-          <w:tab w:pos="2588" w:val="left"/>
-        </w:tabs>
-        <w:spacing w:before="580" w:after="0" w:line="440" w:lineRule="exact"/>
-        <w:ind w:left="2588" w:hanging="720"/>
-      </w:pPr>
+        <w:t>ผู้อำนวยการสำนักงานพัฒนาภาค 1</w:t>
+        <w:br/>
+      </w:r>
       <w:r>
         <w:rPr>
           <w:rFonts w:ascii="TH SarabunPSK" w:hAnsi="TH SarabunPSK" w:cs="TH SarabunPSK" w:eastAsia="TH SarabunPSK"/>
@@ -2461,9 +1891,7 @@
           <w:szCs w:val="26"/>
           <w:bCs/>
         </w:rPr>
-        <w:t>เรียน</w:t>
-        <w:tab/>
-        <w:t>ผู้บังคับหน่วยพัฒนาการเคลื่อนที่ 25 สำนักงานพัฒนาภาค 2</w:t>
+        <w:t>หน่วยบัญชาการทหารพัฒนา</w:t>
       </w:r>
     </w:p>
     <w:p>
@@ -2512,10 +1940,10 @@
     <w:p>
       <w:pPr>
         <w:tabs>
-          <w:tab w:pos="2588" w:val="left"/>
+          <w:tab w:pos="3028" w:val="left"/>
         </w:tabs>
         <w:spacing w:before="580" w:after="0" w:line="440" w:lineRule="exact"/>
-        <w:ind w:left="2588" w:hanging="720"/>
+        <w:ind w:left="3028" w:hanging="720"/>
       </w:pPr>
       <w:r>
         <w:rPr>
@@ -2527,7 +1955,7 @@
         </w:rPr>
         <w:t>เรียน</w:t>
         <w:tab/>
-        <w:t>ผู้บังคับหน่วยพัฒนาการเคลื่อนที่ 26 สำนักงานพัฒนาภาค 2</w:t>
+        <w:t>ผู้บังคับหน่วยพัฒนาการเคลื่อนที่ 11 สำนักงานพัฒนาภาค 1</w:t>
       </w:r>
     </w:p>
     <w:p>
@@ -2576,10 +2004,10 @@
     <w:p>
       <w:pPr>
         <w:tabs>
-          <w:tab w:pos="2588" w:val="left"/>
+          <w:tab w:pos="3028" w:val="left"/>
         </w:tabs>
         <w:spacing w:before="580" w:after="0" w:line="440" w:lineRule="exact"/>
-        <w:ind w:left="2588" w:hanging="720"/>
+        <w:ind w:left="3028" w:hanging="720"/>
       </w:pPr>
       <w:r>
         <w:rPr>
@@ -2591,7 +2019,7 @@
         </w:rPr>
         <w:t>เรียน</w:t>
         <w:tab/>
-        <w:t>ผู้อำนวยการสำนักงานพัฒนาภาค 3 หน่วยบัญชาการทหารพัฒนา</w:t>
+        <w:t>ผู้บังคับหน่วยพัฒนาการเคลื่อนที่ 12 สำนักงานพัฒนาภาค 1</w:t>
       </w:r>
     </w:p>
     <w:p>
@@ -2640,10 +2068,10 @@
     <w:p>
       <w:pPr>
         <w:tabs>
-          <w:tab w:pos="2588" w:val="left"/>
+          <w:tab w:pos="3028" w:val="left"/>
         </w:tabs>
         <w:spacing w:before="580" w:after="0" w:line="440" w:lineRule="exact"/>
-        <w:ind w:left="2588" w:hanging="720"/>
+        <w:ind w:left="3028" w:hanging="720"/>
       </w:pPr>
       <w:r>
         <w:rPr>
@@ -2655,7 +2083,7 @@
         </w:rPr>
         <w:t>เรียน</w:t>
         <w:tab/>
-        <w:t>ผู้บังคับหน่วยพัฒนาการเคลื่อนที่ 31 สำนักงานพัฒนาภาค 3</w:t>
+        <w:t>ผู้บังคับหน่วยพัฒนาการเคลื่อนที่ 13 สำนักงานพัฒนาภาค 1</w:t>
       </w:r>
     </w:p>
     <w:p>
@@ -2704,10 +2132,10 @@
     <w:p>
       <w:pPr>
         <w:tabs>
-          <w:tab w:pos="2588" w:val="left"/>
+          <w:tab w:pos="3028" w:val="left"/>
         </w:tabs>
         <w:spacing w:before="580" w:after="0" w:line="440" w:lineRule="exact"/>
-        <w:ind w:left="2588" w:hanging="720"/>
+        <w:ind w:left="3028" w:hanging="720"/>
       </w:pPr>
       <w:r>
         <w:rPr>
@@ -2719,7 +2147,7 @@
         </w:rPr>
         <w:t>เรียน</w:t>
         <w:tab/>
-        <w:t>ผู้บังคับหน่วยพัฒนาการเคลื่อนที่ 32 สำนักงานพัฒนาภาค 3</w:t>
+        <w:t>ผู้บังคับหน่วยพัฒนาการเคลื่อนที่ 14 สำนักงานพัฒนาภาค 1</w:t>
       </w:r>
     </w:p>
     <w:p>
@@ -2768,10 +2196,10 @@
     <w:p>
       <w:pPr>
         <w:tabs>
-          <w:tab w:pos="2588" w:val="left"/>
+          <w:tab w:pos="3028" w:val="left"/>
         </w:tabs>
         <w:spacing w:before="580" w:after="0" w:line="440" w:lineRule="exact"/>
-        <w:ind w:left="2588" w:hanging="720"/>
+        <w:ind w:left="3028" w:hanging="720"/>
       </w:pPr>
       <w:r>
         <w:rPr>
@@ -2783,7 +2211,7 @@
         </w:rPr>
         <w:t>เรียน</w:t>
         <w:tab/>
-        <w:t>ผู้บังคับหน่วยพัฒนาการเคลื่อนที่ 33 สำนักงานพัฒนาภาค 3</w:t>
+        <w:t>ผู้บังคับหน่วยพัฒนาการเคลื่อนที่ 15 สำนักงานพัฒนาภาค 1</w:t>
       </w:r>
     </w:p>
     <w:p>
@@ -2832,10 +2260,10 @@
     <w:p>
       <w:pPr>
         <w:tabs>
-          <w:tab w:pos="2588" w:val="left"/>
+          <w:tab w:pos="3028" w:val="left"/>
         </w:tabs>
         <w:spacing w:before="580" w:after="0" w:line="440" w:lineRule="exact"/>
-        <w:ind w:left="2588" w:hanging="720"/>
+        <w:ind w:left="3028" w:hanging="720"/>
       </w:pPr>
       <w:r>
         <w:rPr>
@@ -2847,60 +2275,9 @@
         </w:rPr>
         <w:t>เรียน</w:t>
         <w:tab/>
-        <w:t>ผู้บังคับหน่วยพัฒนาการเคลื่อนที่ 34 สำนักงานพัฒนาภาค 3</w:t>
-      </w:r>
-    </w:p>
-    <w:p>
-      <w:pPr>
-        <w:pageBreakBefore/>
-        <w:spacing w:before="0" w:after="0" w:line="364" w:lineRule="exact"/>
-      </w:pPr>
-      <w:r>
-        <w:rPr>
-          <w:rFonts w:ascii="TH SarabunPSK" w:hAnsi="TH SarabunPSK" w:cs="TH SarabunPSK" w:eastAsia="TH SarabunPSK"/>
-          <w:b w:val="0"/>
-          <w:sz w:val="21"/>
-          <w:szCs w:val="21"/>
-        </w:rPr>
-        <w:t>วปอ.สปท.</w:t>
-      </w:r>
-    </w:p>
-    <w:p>
-      <w:pPr>
-        <w:spacing w:before="0" w:after="0" w:line="364" w:lineRule="exact"/>
-      </w:pPr>
-      <w:r>
-        <w:rPr>
-          <w:rFonts w:ascii="TH SarabunPSK" w:hAnsi="TH SarabunPSK" w:cs="TH SarabunPSK" w:eastAsia="TH SarabunPSK"/>
-          <w:b w:val="0"/>
-          <w:sz w:val="21"/>
-          <w:szCs w:val="21"/>
-        </w:rPr>
-        <w:t>กห ๐๓๑๗.๒/๑๖๑๑</w:t>
-      </w:r>
-    </w:p>
-    <w:p>
-      <w:pPr>
-        <w:spacing w:before="0" w:after="0" w:line="364" w:lineRule="exact"/>
-      </w:pPr>
-      <w:r>
-        <w:rPr>
-          <w:rFonts w:ascii="TH SarabunPSK" w:hAnsi="TH SarabunPSK" w:cs="TH SarabunPSK" w:eastAsia="TH SarabunPSK"/>
-          <w:b w:val="0"/>
-          <w:sz w:val="21"/>
-          <w:szCs w:val="21"/>
-        </w:rPr>
-        <w:t>โทร. ๐ ๒๕๗๒ ๒๕๒๗</w:t>
-      </w:r>
-    </w:p>
-    <w:p>
-      <w:pPr>
-        <w:tabs>
-          <w:tab w:pos="2588" w:val="left"/>
-        </w:tabs>
-        <w:spacing w:before="580" w:after="0" w:line="440" w:lineRule="exact"/>
-        <w:ind w:left="2588" w:hanging="720"/>
-      </w:pPr>
+        <w:t>ผู้อำนวยการสำนักงานพัฒนาภาค 2</w:t>
+        <w:br/>
+      </w:r>
       <w:r>
         <w:rPr>
           <w:rFonts w:ascii="TH SarabunPSK" w:hAnsi="TH SarabunPSK" w:cs="TH SarabunPSK" w:eastAsia="TH SarabunPSK"/>
@@ -2909,9 +2286,7 @@
           <w:szCs w:val="26"/>
           <w:bCs/>
         </w:rPr>
-        <w:t>เรียน</w:t>
-        <w:tab/>
-        <w:t>ผู้บังคับหน่วยพัฒนาการเคลื่อนที่ 35 สำนักงานพัฒนาภาค 3</w:t>
+        <w:t>หน่วยบัญชาการทหารพัฒนา</w:t>
       </w:r>
     </w:p>
     <w:p>
@@ -2960,10 +2335,10 @@
     <w:p>
       <w:pPr>
         <w:tabs>
-          <w:tab w:pos="2588" w:val="left"/>
+          <w:tab w:pos="3028" w:val="left"/>
         </w:tabs>
         <w:spacing w:before="580" w:after="0" w:line="440" w:lineRule="exact"/>
-        <w:ind w:left="2588" w:hanging="720"/>
+        <w:ind w:left="3028" w:hanging="720"/>
       </w:pPr>
       <w:r>
         <w:rPr>
@@ -2975,7 +2350,7 @@
         </w:rPr>
         <w:t>เรียน</w:t>
         <w:tab/>
-        <w:t>ผู้บังคับหน่วยพัฒนาการเคลื่อนที่ 36 สำนักงานพัฒนาภาค 3</w:t>
+        <w:t>ผู้บังคับหน่วยพัฒนาการเคลื่อนที่ 21 สำนักงานพัฒนาภาค 2</w:t>
       </w:r>
     </w:p>
     <w:p>
@@ -3024,10 +2399,10 @@
     <w:p>
       <w:pPr>
         <w:tabs>
-          <w:tab w:pos="2588" w:val="left"/>
+          <w:tab w:pos="3028" w:val="left"/>
         </w:tabs>
         <w:spacing w:before="580" w:after="0" w:line="440" w:lineRule="exact"/>
-        <w:ind w:left="2588" w:hanging="720"/>
+        <w:ind w:left="3028" w:hanging="720"/>
       </w:pPr>
       <w:r>
         <w:rPr>
@@ -3039,7 +2414,7 @@
         </w:rPr>
         <w:t>เรียน</w:t>
         <w:tab/>
-        <w:t>ผู้อำนวยการสำนักงานพัฒนาภาค 4 หน่วยบัญชาการทหารพัฒนา</w:t>
+        <w:t>ผู้บังคับหน่วยพัฒนาการเคลื่อนที่ 22 สำนักงานพัฒนาภาค 2</w:t>
       </w:r>
     </w:p>
     <w:p>
@@ -3088,10 +2463,10 @@
     <w:p>
       <w:pPr>
         <w:tabs>
-          <w:tab w:pos="2588" w:val="left"/>
+          <w:tab w:pos="3028" w:val="left"/>
         </w:tabs>
         <w:spacing w:before="580" w:after="0" w:line="440" w:lineRule="exact"/>
-        <w:ind w:left="2588" w:hanging="720"/>
+        <w:ind w:left="3028" w:hanging="720"/>
       </w:pPr>
       <w:r>
         <w:rPr>
@@ -3103,7 +2478,7 @@
         </w:rPr>
         <w:t>เรียน</w:t>
         <w:tab/>
-        <w:t>ผู้บังคับหน่วยพัฒนาการเคลื่อนที่ 41 สำนักงานพัฒนาภาค 4</w:t>
+        <w:t>ผู้บังคับหน่วยพัฒนาการเคลื่อนที่ 23 สำนักงานพัฒนาภาค 2</w:t>
       </w:r>
     </w:p>
     <w:p>
@@ -3152,10 +2527,10 @@
     <w:p>
       <w:pPr>
         <w:tabs>
-          <w:tab w:pos="2588" w:val="left"/>
+          <w:tab w:pos="3028" w:val="left"/>
         </w:tabs>
         <w:spacing w:before="580" w:after="0" w:line="440" w:lineRule="exact"/>
-        <w:ind w:left="2588" w:hanging="720"/>
+        <w:ind w:left="3028" w:hanging="720"/>
       </w:pPr>
       <w:r>
         <w:rPr>
@@ -3167,7 +2542,7 @@
         </w:rPr>
         <w:t>เรียน</w:t>
         <w:tab/>
-        <w:t>ผู้บังคับหน่วยพัฒนาการเคลื่อนที่ 42 สำนักงานพัฒนาภาค 4</w:t>
+        <w:t>ผู้บังคับหน่วยพัฒนาการเคลื่อนที่ 24 สำนักงานพัฒนาภาค 2</w:t>
       </w:r>
     </w:p>
     <w:p>
@@ -3216,10 +2591,10 @@
     <w:p>
       <w:pPr>
         <w:tabs>
-          <w:tab w:pos="2588" w:val="left"/>
+          <w:tab w:pos="3028" w:val="left"/>
         </w:tabs>
         <w:spacing w:before="580" w:after="0" w:line="440" w:lineRule="exact"/>
-        <w:ind w:left="2588" w:hanging="720"/>
+        <w:ind w:left="3028" w:hanging="720"/>
       </w:pPr>
       <w:r>
         <w:rPr>
@@ -3231,7 +2606,7 @@
         </w:rPr>
         <w:t>เรียน</w:t>
         <w:tab/>
-        <w:t>ผู้บังคับหน่วยพัฒนาการเคลื่อนที่ 43 สำนักงานพัฒนาภาค 4</w:t>
+        <w:t>ผู้บังคับหน่วยพัฒนาการเคลื่อนที่ 25 สำนักงานพัฒนาภาค 2</w:t>
       </w:r>
     </w:p>
     <w:p>
@@ -3280,10 +2655,10 @@
     <w:p>
       <w:pPr>
         <w:tabs>
-          <w:tab w:pos="2588" w:val="left"/>
+          <w:tab w:pos="3028" w:val="left"/>
         </w:tabs>
         <w:spacing w:before="580" w:after="0" w:line="440" w:lineRule="exact"/>
-        <w:ind w:left="2588" w:hanging="720"/>
+        <w:ind w:left="3028" w:hanging="720"/>
       </w:pPr>
       <w:r>
         <w:rPr>
@@ -3295,7 +2670,7 @@
         </w:rPr>
         <w:t>เรียน</w:t>
         <w:tab/>
-        <w:t>ผู้บังคับหน่วยพัฒนาการเคลื่อนที่ 44 สำนักงานพัฒนาภาค 4</w:t>
+        <w:t>ผู้บังคับหน่วยพัฒนาการเคลื่อนที่ 26 สำนักงานพัฒนาภาค 2</w:t>
       </w:r>
     </w:p>
     <w:p>
@@ -3344,10 +2719,10 @@
     <w:p>
       <w:pPr>
         <w:tabs>
-          <w:tab w:pos="2588" w:val="left"/>
+          <w:tab w:pos="3028" w:val="left"/>
         </w:tabs>
         <w:spacing w:before="580" w:after="0" w:line="440" w:lineRule="exact"/>
-        <w:ind w:left="2588" w:hanging="720"/>
+        <w:ind w:left="3028" w:hanging="720"/>
       </w:pPr>
       <w:r>
         <w:rPr>
@@ -3359,60 +2734,9 @@
         </w:rPr>
         <w:t>เรียน</w:t>
         <w:tab/>
-        <w:t>ผู้บังคับหน่วยพัฒนาการเคลื่อนที่ 45 สำนักงานพัฒนาภาค 4</w:t>
-      </w:r>
-    </w:p>
-    <w:p>
-      <w:pPr>
-        <w:pageBreakBefore/>
-        <w:spacing w:before="0" w:after="0" w:line="364" w:lineRule="exact"/>
-      </w:pPr>
-      <w:r>
-        <w:rPr>
-          <w:rFonts w:ascii="TH SarabunPSK" w:hAnsi="TH SarabunPSK" w:cs="TH SarabunPSK" w:eastAsia="TH SarabunPSK"/>
-          <w:b w:val="0"/>
-          <w:sz w:val="21"/>
-          <w:szCs w:val="21"/>
-        </w:rPr>
-        <w:t>วปอ.สปท.</w:t>
-      </w:r>
-    </w:p>
-    <w:p>
-      <w:pPr>
-        <w:spacing w:before="0" w:after="0" w:line="364" w:lineRule="exact"/>
-      </w:pPr>
-      <w:r>
-        <w:rPr>
-          <w:rFonts w:ascii="TH SarabunPSK" w:hAnsi="TH SarabunPSK" w:cs="TH SarabunPSK" w:eastAsia="TH SarabunPSK"/>
-          <w:b w:val="0"/>
-          <w:sz w:val="21"/>
-          <w:szCs w:val="21"/>
-        </w:rPr>
-        <w:t>กห ๐๓๑๗.๒/๑๖๑๑</w:t>
-      </w:r>
-    </w:p>
-    <w:p>
-      <w:pPr>
-        <w:spacing w:before="0" w:after="0" w:line="364" w:lineRule="exact"/>
-      </w:pPr>
-      <w:r>
-        <w:rPr>
-          <w:rFonts w:ascii="TH SarabunPSK" w:hAnsi="TH SarabunPSK" w:cs="TH SarabunPSK" w:eastAsia="TH SarabunPSK"/>
-          <w:b w:val="0"/>
-          <w:sz w:val="21"/>
-          <w:szCs w:val="21"/>
-        </w:rPr>
-        <w:t>โทร. ๐ ๒๕๗๒ ๒๕๒๗</w:t>
-      </w:r>
-    </w:p>
-    <w:p>
-      <w:pPr>
-        <w:tabs>
-          <w:tab w:pos="2588" w:val="left"/>
-        </w:tabs>
-        <w:spacing w:before="580" w:after="0" w:line="440" w:lineRule="exact"/>
-        <w:ind w:left="2588" w:hanging="720"/>
-      </w:pPr>
+        <w:t>ผู้อำนวยการสำนักงานพัฒนาภาค 3</w:t>
+        <w:br/>
+      </w:r>
       <w:r>
         <w:rPr>
           <w:rFonts w:ascii="TH SarabunPSK" w:hAnsi="TH SarabunPSK" w:cs="TH SarabunPSK" w:eastAsia="TH SarabunPSK"/>
@@ -3421,9 +2745,7 @@
           <w:szCs w:val="26"/>
           <w:bCs/>
         </w:rPr>
-        <w:t>เรียน</w:t>
-        <w:tab/>
-        <w:t>ผู้บังคับหน่วยพัฒนาการเคลื่อนที่ 46 สำนักงานพัฒนาภาค 4</w:t>
+        <w:t>หน่วยบัญชาการทหารพัฒนา</w:t>
       </w:r>
     </w:p>
     <w:p>
@@ -3472,10 +2794,10 @@
     <w:p>
       <w:pPr>
         <w:tabs>
-          <w:tab w:pos="2588" w:val="left"/>
+          <w:tab w:pos="3028" w:val="left"/>
         </w:tabs>
         <w:spacing w:before="580" w:after="0" w:line="440" w:lineRule="exact"/>
-        <w:ind w:left="2588" w:hanging="720"/>
+        <w:ind w:left="3028" w:hanging="720"/>
       </w:pPr>
       <w:r>
         <w:rPr>
@@ -3487,7 +2809,7 @@
         </w:rPr>
         <w:t>เรียน</w:t>
         <w:tab/>
-        <w:t>ผู้อำนวยการสำนักงานพัฒนาภาค 5 หน่วยบัญชาการทหารพัฒนา</w:t>
+        <w:t>ผู้บังคับหน่วยพัฒนาการเคลื่อนที่ 31 สำนักงานพัฒนาภาค 3</w:t>
       </w:r>
     </w:p>
     <w:p>
@@ -3536,10 +2858,10 @@
     <w:p>
       <w:pPr>
         <w:tabs>
-          <w:tab w:pos="2588" w:val="left"/>
+          <w:tab w:pos="3028" w:val="left"/>
         </w:tabs>
         <w:spacing w:before="580" w:after="0" w:line="440" w:lineRule="exact"/>
-        <w:ind w:left="2588" w:hanging="720"/>
+        <w:ind w:left="3028" w:hanging="720"/>
       </w:pPr>
       <w:r>
         <w:rPr>
@@ -3551,7 +2873,7 @@
         </w:rPr>
         <w:t>เรียน</w:t>
         <w:tab/>
-        <w:t>ผู้บังคับหน่วยพัฒนาการเคลื่อนที่ 51 สำนักงานพัฒนาภาค 5</w:t>
+        <w:t>ผู้บังคับหน่วยพัฒนาการเคลื่อนที่ 32 สำนักงานพัฒนาภาค 3</w:t>
       </w:r>
     </w:p>
     <w:p>
@@ -3600,10 +2922,10 @@
     <w:p>
       <w:pPr>
         <w:tabs>
-          <w:tab w:pos="2588" w:val="left"/>
+          <w:tab w:pos="3028" w:val="left"/>
         </w:tabs>
         <w:spacing w:before="580" w:after="0" w:line="440" w:lineRule="exact"/>
-        <w:ind w:left="2588" w:hanging="720"/>
+        <w:ind w:left="3028" w:hanging="720"/>
       </w:pPr>
       <w:r>
         <w:rPr>
@@ -3615,7 +2937,7 @@
         </w:rPr>
         <w:t>เรียน</w:t>
         <w:tab/>
-        <w:t>ผู้บังคับหน่วยพัฒนาการเคลื่อนที่ 52 สำนักงานพัฒนาภาค 5</w:t>
+        <w:t>ผู้บังคับหน่วยพัฒนาการเคลื่อนที่ 33 สำนักงานพัฒนาภาค 3</w:t>
       </w:r>
     </w:p>
     <w:p>
@@ -3664,10 +2986,10 @@
     <w:p>
       <w:pPr>
         <w:tabs>
-          <w:tab w:pos="2588" w:val="left"/>
+          <w:tab w:pos="3028" w:val="left"/>
         </w:tabs>
         <w:spacing w:before="580" w:after="0" w:line="440" w:lineRule="exact"/>
-        <w:ind w:left="2588" w:hanging="720"/>
+        <w:ind w:left="3028" w:hanging="720"/>
       </w:pPr>
       <w:r>
         <w:rPr>
@@ -3679,7 +3001,7 @@
         </w:rPr>
         <w:t>เรียน</w:t>
         <w:tab/>
-        <w:t>ผู้บังคับหน่วยพัฒนาการเคลื่อนที่ 53 สำนักงานพัฒนาภาค 5</w:t>
+        <w:t>ผู้บังคับหน่วยพัฒนาการเคลื่อนที่ 34 สำนักงานพัฒนาภาค 3</w:t>
       </w:r>
     </w:p>
     <w:p>
@@ -3728,10 +3050,10 @@
     <w:p>
       <w:pPr>
         <w:tabs>
-          <w:tab w:pos="2588" w:val="left"/>
+          <w:tab w:pos="3028" w:val="left"/>
         </w:tabs>
         <w:spacing w:before="580" w:after="0" w:line="440" w:lineRule="exact"/>
-        <w:ind w:left="2588" w:hanging="720"/>
+        <w:ind w:left="3028" w:hanging="720"/>
       </w:pPr>
       <w:r>
         <w:rPr>
@@ -3743,7 +3065,7 @@
         </w:rPr>
         <w:t>เรียน</w:t>
         <w:tab/>
-        <w:t>ผู้บังคับหน่วยพัฒนาการเคลื่อนที่ 54 สำนักงานพัฒนาภาค 5</w:t>
+        <w:t>ผู้บังคับหน่วยพัฒนาการเคลื่อนที่ 35 สำนักงานพัฒนาภาค 3</w:t>
       </w:r>
     </w:p>
     <w:p>
@@ -3792,10 +3114,10 @@
     <w:p>
       <w:pPr>
         <w:tabs>
-          <w:tab w:pos="2588" w:val="left"/>
+          <w:tab w:pos="3028" w:val="left"/>
         </w:tabs>
         <w:spacing w:before="580" w:after="0" w:line="440" w:lineRule="exact"/>
-        <w:ind w:left="2588" w:hanging="720"/>
+        <w:ind w:left="3028" w:hanging="720"/>
       </w:pPr>
       <w:r>
         <w:rPr>
@@ -3807,7 +3129,7 @@
         </w:rPr>
         <w:t>เรียน</w:t>
         <w:tab/>
-        <w:t>ผู้บังคับหน่วยพัฒนาการเคลื่อนที่ 55 สำนักงานพัฒนาภาค 5</w:t>
+        <w:t>ผู้บังคับหน่วยพัฒนาการเคลื่อนที่ 36 สำนักงานพัฒนาภาค 3</w:t>
       </w:r>
     </w:p>
     <w:p>
@@ -3856,10 +3178,10 @@
     <w:p>
       <w:pPr>
         <w:tabs>
-          <w:tab w:pos="2588" w:val="left"/>
+          <w:tab w:pos="3028" w:val="left"/>
         </w:tabs>
         <w:spacing w:before="580" w:after="0" w:line="440" w:lineRule="exact"/>
-        <w:ind w:left="2588" w:hanging="720"/>
+        <w:ind w:left="3028" w:hanging="720"/>
       </w:pPr>
       <w:r>
         <w:rPr>
@@ -3871,60 +3193,9 @@
         </w:rPr>
         <w:t>เรียน</w:t>
         <w:tab/>
-        <w:t>ผู้บังคับหน่วยพัฒนาการเคลื่อนที่ 56 สำนักงานพัฒนาภาค 5</w:t>
-      </w:r>
-    </w:p>
-    <w:p>
-      <w:pPr>
-        <w:pageBreakBefore/>
-        <w:spacing w:before="0" w:after="0" w:line="364" w:lineRule="exact"/>
-      </w:pPr>
-      <w:r>
-        <w:rPr>
-          <w:rFonts w:ascii="TH SarabunPSK" w:hAnsi="TH SarabunPSK" w:cs="TH SarabunPSK" w:eastAsia="TH SarabunPSK"/>
-          <w:b w:val="0"/>
-          <w:sz w:val="21"/>
-          <w:szCs w:val="21"/>
-        </w:rPr>
-        <w:t>วปอ.สปท.</w:t>
-      </w:r>
-    </w:p>
-    <w:p>
-      <w:pPr>
-        <w:spacing w:before="0" w:after="0" w:line="364" w:lineRule="exact"/>
-      </w:pPr>
-      <w:r>
-        <w:rPr>
-          <w:rFonts w:ascii="TH SarabunPSK" w:hAnsi="TH SarabunPSK" w:cs="TH SarabunPSK" w:eastAsia="TH SarabunPSK"/>
-          <w:b w:val="0"/>
-          <w:sz w:val="21"/>
-          <w:szCs w:val="21"/>
-        </w:rPr>
-        <w:t>กห ๐๓๑๗.๒/๑๖๑๑</w:t>
-      </w:r>
-    </w:p>
-    <w:p>
-      <w:pPr>
-        <w:spacing w:before="0" w:after="0" w:line="364" w:lineRule="exact"/>
-      </w:pPr>
-      <w:r>
-        <w:rPr>
-          <w:rFonts w:ascii="TH SarabunPSK" w:hAnsi="TH SarabunPSK" w:cs="TH SarabunPSK" w:eastAsia="TH SarabunPSK"/>
-          <w:b w:val="0"/>
-          <w:sz w:val="21"/>
-          <w:szCs w:val="21"/>
-        </w:rPr>
-        <w:t>โทร. ๐ ๒๕๗๒ ๒๕๒๗</w:t>
-      </w:r>
-    </w:p>
-    <w:p>
-      <w:pPr>
-        <w:tabs>
-          <w:tab w:pos="2588" w:val="left"/>
-        </w:tabs>
-        <w:spacing w:before="580" w:after="0" w:line="440" w:lineRule="exact"/>
-        <w:ind w:left="2588" w:hanging="720"/>
-      </w:pPr>
+        <w:t>ผู้อำนวยการสำนักงานพัฒนาภาค 4</w:t>
+        <w:br/>
+      </w:r>
       <w:r>
         <w:rPr>
           <w:rFonts w:ascii="TH SarabunPSK" w:hAnsi="TH SarabunPSK" w:cs="TH SarabunPSK" w:eastAsia="TH SarabunPSK"/>
@@ -3933,9 +3204,7 @@
           <w:szCs w:val="26"/>
           <w:bCs/>
         </w:rPr>
-        <w:t>เรียน</w:t>
-        <w:tab/>
-        <w:t>ผู้บังคับหน่วยพัฒนาการพิเศษ หน่วยบัญชาการทหารพัฒนา</w:t>
+        <w:t>หน่วยบัญชาการทหารพัฒนา</w:t>
       </w:r>
     </w:p>
     <w:p>
@@ -3984,10 +3253,10 @@
     <w:p>
       <w:pPr>
         <w:tabs>
-          <w:tab w:pos="2588" w:val="left"/>
+          <w:tab w:pos="3028" w:val="left"/>
         </w:tabs>
         <w:spacing w:before="580" w:after="0" w:line="440" w:lineRule="exact"/>
-        <w:ind w:left="2588" w:hanging="720"/>
+        <w:ind w:left="3028" w:hanging="720"/>
       </w:pPr>
       <w:r>
         <w:rPr>
@@ -3999,7 +3268,7 @@
         </w:rPr>
         <w:t>เรียน</w:t>
         <w:tab/>
-        <w:t>ผู้อำนวยการสำนักปฏิบัติการข่าว ศูนย์รักษาความปลอดภัย</w:t>
+        <w:t>ผู้บังคับหน่วยพัฒนาการเคลื่อนที่ 41 สำนักงานพัฒนาภาค 4</w:t>
       </w:r>
     </w:p>
     <w:p>
@@ -4048,10 +3317,10 @@
     <w:p>
       <w:pPr>
         <w:tabs>
-          <w:tab w:pos="2588" w:val="left"/>
+          <w:tab w:pos="3028" w:val="left"/>
         </w:tabs>
         <w:spacing w:before="580" w:after="0" w:line="440" w:lineRule="exact"/>
-        <w:ind w:left="2588" w:hanging="720"/>
+        <w:ind w:left="3028" w:hanging="720"/>
       </w:pPr>
       <w:r>
         <w:rPr>
@@ -4063,7 +3332,7 @@
         </w:rPr>
         <w:t>เรียน</w:t>
         <w:tab/>
-        <w:t>ผู้อำนวยการสำนักรักษาความปลอดภัย ศูนย์รักษาความปลอดภัย</w:t>
+        <w:t>ผู้บังคับหน่วยพัฒนาการเคลื่อนที่ 42 สำนักงานพัฒนาภาค 4</w:t>
       </w:r>
     </w:p>
     <w:p>
@@ -4112,10 +3381,10 @@
     <w:p>
       <w:pPr>
         <w:tabs>
-          <w:tab w:pos="2588" w:val="left"/>
+          <w:tab w:pos="3028" w:val="left"/>
         </w:tabs>
         <w:spacing w:before="580" w:after="0" w:line="440" w:lineRule="exact"/>
-        <w:ind w:left="2588" w:hanging="720"/>
+        <w:ind w:left="3028" w:hanging="720"/>
       </w:pPr>
       <w:r>
         <w:rPr>
@@ -4127,7 +3396,7 @@
         </w:rPr>
         <w:t>เรียน</w:t>
         <w:tab/>
-        <w:t>ผู้อำนวยการสำนักบริการสิทธิประโยชน์กำลังพล กรมสารบรรณทหาร</w:t>
+        <w:t>ผู้บังคับหน่วยพัฒนาการเคลื่อนที่ 43 สำนักงานพัฒนาภาค 4</w:t>
       </w:r>
     </w:p>
     <w:p>
@@ -4176,10 +3445,10 @@
     <w:p>
       <w:pPr>
         <w:tabs>
-          <w:tab w:pos="2588" w:val="left"/>
+          <w:tab w:pos="3028" w:val="left"/>
         </w:tabs>
         <w:spacing w:before="580" w:after="0" w:line="440" w:lineRule="exact"/>
-        <w:ind w:left="2588" w:hanging="720"/>
+        <w:ind w:left="3028" w:hanging="720"/>
       </w:pPr>
       <w:r>
         <w:rPr>
@@ -4191,7 +3460,7 @@
         </w:rPr>
         <w:t>เรียน</w:t>
         <w:tab/>
-        <w:t>ผู้อำนวยการสำนักปฏิบัติการเพื่อความมั่นคง กรมกิจการชายแดนทหาร</w:t>
+        <w:t>ผู้บังคับหน่วยพัฒนาการเคลื่อนที่ 44 สำนักงานพัฒนาภาค 4</w:t>
       </w:r>
     </w:p>
     <w:p>
@@ -4240,10 +3509,10 @@
     <w:p>
       <w:pPr>
         <w:tabs>
-          <w:tab w:pos="2588" w:val="left"/>
+          <w:tab w:pos="3028" w:val="left"/>
         </w:tabs>
         <w:spacing w:before="580" w:after="0" w:line="440" w:lineRule="exact"/>
-        <w:ind w:left="2588" w:hanging="720"/>
+        <w:ind w:left="3028" w:hanging="720"/>
       </w:pPr>
       <w:r>
         <w:rPr>
@@ -4255,7 +3524,7 @@
         </w:rPr>
         <w:t>เรียน</w:t>
         <w:tab/>
-        <w:t>เสนาธิการวิทยาลัยเสนาธิการทหาร สถาบันวิชาการป้องกันประเทศ</w:t>
+        <w:t>ผู้บังคับหน่วยพัฒนาการเคลื่อนที่ 45 สำนักงานพัฒนาภาค 4</w:t>
       </w:r>
     </w:p>
     <w:p>
@@ -4304,10 +3573,10 @@
     <w:p>
       <w:pPr>
         <w:tabs>
-          <w:tab w:pos="2588" w:val="left"/>
+          <w:tab w:pos="3028" w:val="left"/>
         </w:tabs>
         <w:spacing w:before="580" w:after="0" w:line="440" w:lineRule="exact"/>
-        <w:ind w:left="2588" w:hanging="720"/>
+        <w:ind w:left="3028" w:hanging="720"/>
       </w:pPr>
       <w:r>
         <w:rPr>
@@ -4319,7 +3588,7 @@
         </w:rPr>
         <w:t>เรียน</w:t>
         <w:tab/>
-        <w:t>คุณ เนวิน บุญฤทธิ์ ผู้จัดการธนาคาร ทีทีบี สาขาสนามเป้า</w:t>
+        <w:t>ผู้บังคับหน่วยพัฒนาการเคลื่อนที่ 46 สำนักงานพัฒนาภาค 4</w:t>
       </w:r>
     </w:p>
     <w:p>
@@ -4368,10 +3637,10 @@
     <w:p>
       <w:pPr>
         <w:tabs>
-          <w:tab w:pos="2588" w:val="left"/>
+          <w:tab w:pos="3028" w:val="left"/>
         </w:tabs>
         <w:spacing w:before="580" w:after="0" w:line="440" w:lineRule="exact"/>
-        <w:ind w:left="2588" w:hanging="720"/>
+        <w:ind w:left="3028" w:hanging="720"/>
       </w:pPr>
       <w:r>
         <w:rPr>
@@ -4383,60 +3652,9 @@
         </w:rPr>
         <w:t>เรียน</w:t>
         <w:tab/>
-        <w:t>บริษัท เพชราภรณ์ กรุ๊ป แทรเวล จำกัด</w:t>
-      </w:r>
-    </w:p>
-    <w:p>
-      <w:pPr>
-        <w:pageBreakBefore/>
-        <w:spacing w:before="0" w:after="0" w:line="364" w:lineRule="exact"/>
-      </w:pPr>
-      <w:r>
-        <w:rPr>
-          <w:rFonts w:ascii="TH SarabunPSK" w:hAnsi="TH SarabunPSK" w:cs="TH SarabunPSK" w:eastAsia="TH SarabunPSK"/>
-          <w:b w:val="0"/>
-          <w:sz w:val="21"/>
-          <w:szCs w:val="21"/>
-        </w:rPr>
-        <w:t>วปอ.สปท.</w:t>
-      </w:r>
-    </w:p>
-    <w:p>
-      <w:pPr>
-        <w:spacing w:before="0" w:after="0" w:line="364" w:lineRule="exact"/>
-      </w:pPr>
-      <w:r>
-        <w:rPr>
-          <w:rFonts w:ascii="TH SarabunPSK" w:hAnsi="TH SarabunPSK" w:cs="TH SarabunPSK" w:eastAsia="TH SarabunPSK"/>
-          <w:b w:val="0"/>
-          <w:sz w:val="21"/>
-          <w:szCs w:val="21"/>
-        </w:rPr>
-        <w:t>กห ๐๓๑๗.๒/๑๖๑๑</w:t>
-      </w:r>
-    </w:p>
-    <w:p>
-      <w:pPr>
-        <w:spacing w:before="0" w:after="0" w:line="364" w:lineRule="exact"/>
-      </w:pPr>
-      <w:r>
-        <w:rPr>
-          <w:rFonts w:ascii="TH SarabunPSK" w:hAnsi="TH SarabunPSK" w:cs="TH SarabunPSK" w:eastAsia="TH SarabunPSK"/>
-          <w:b w:val="0"/>
-          <w:sz w:val="21"/>
-          <w:szCs w:val="21"/>
-        </w:rPr>
-        <w:t>โทร. ๐ ๒๕๗๒ ๒๕๒๗</w:t>
-      </w:r>
-    </w:p>
-    <w:p>
-      <w:pPr>
-        <w:tabs>
-          <w:tab w:pos="2588" w:val="left"/>
-        </w:tabs>
-        <w:spacing w:before="580" w:after="0" w:line="440" w:lineRule="exact"/>
-        <w:ind w:left="2588" w:hanging="720"/>
-      </w:pPr>
+        <w:t>ผู้อำนวยการสำนักงานพัฒนาภาค 5</w:t>
+        <w:br/>
+      </w:r>
       <w:r>
         <w:rPr>
           <w:rFonts w:ascii="TH SarabunPSK" w:hAnsi="TH SarabunPSK" w:cs="TH SarabunPSK" w:eastAsia="TH SarabunPSK"/>
@@ -4445,9 +3663,7 @@
           <w:szCs w:val="26"/>
           <w:bCs/>
         </w:rPr>
-        <w:t>เรียน</w:t>
-        <w:tab/>
-        <w:t>บริษัท ซูพีเรียร์ ทัวร์ จำกัด</w:t>
+        <w:t>หน่วยบัญชาการทหารพัฒนา</w:t>
       </w:r>
     </w:p>
     <w:p>
@@ -4496,10 +3712,10 @@
     <w:p>
       <w:pPr>
         <w:tabs>
-          <w:tab w:pos="2588" w:val="left"/>
+          <w:tab w:pos="3028" w:val="left"/>
         </w:tabs>
         <w:spacing w:before="580" w:after="0" w:line="440" w:lineRule="exact"/>
-        <w:ind w:left="2588" w:hanging="720"/>
+        <w:ind w:left="3028" w:hanging="720"/>
       </w:pPr>
       <w:r>
         <w:rPr>
@@ -4511,7 +3727,7 @@
         </w:rPr>
         <w:t>เรียน</w:t>
         <w:tab/>
-        <w:t>บริษัท กรีน เวย์ แทรเวล จำกัด</w:t>
+        <w:t>ผู้บังคับหน่วยพัฒนาการเคลื่อนที่ 51 สำนักงานพัฒนาภาค 5</w:t>
       </w:r>
     </w:p>
     <w:p>
@@ -4560,10 +3776,10 @@
     <w:p>
       <w:pPr>
         <w:tabs>
-          <w:tab w:pos="2588" w:val="left"/>
+          <w:tab w:pos="3028" w:val="left"/>
         </w:tabs>
         <w:spacing w:before="580" w:after="0" w:line="440" w:lineRule="exact"/>
-        <w:ind w:left="2588" w:hanging="720"/>
+        <w:ind w:left="3028" w:hanging="720"/>
       </w:pPr>
       <w:r>
         <w:rPr>
@@ -4575,7 +3791,7 @@
         </w:rPr>
         <w:t>เรียน</w:t>
         <w:tab/>
-        <w:t>บริษัท เวิลด์ แทรเวิล ดีไซน์ จำกัด</w:t>
+        <w:t>ผู้บังคับหน่วยพัฒนาการเคลื่อนที่ 52 สำนักงานพัฒนาภาค 5</w:t>
       </w:r>
     </w:p>
     <w:p>
@@ -4624,10 +3840,10 @@
     <w:p>
       <w:pPr>
         <w:tabs>
-          <w:tab w:pos="2588" w:val="left"/>
+          <w:tab w:pos="3028" w:val="left"/>
         </w:tabs>
         <w:spacing w:before="580" w:after="0" w:line="440" w:lineRule="exact"/>
-        <w:ind w:left="2588" w:hanging="720"/>
+        <w:ind w:left="3028" w:hanging="720"/>
       </w:pPr>
       <w:r>
         <w:rPr>
@@ -4639,7 +3855,7 @@
         </w:rPr>
         <w:t>เรียน</w:t>
         <w:tab/>
-        <w:t>บริษัท มาร์วิน แทรเวิล จำกัด</w:t>
+        <w:t>ผู้บังคับหน่วยพัฒนาการเคลื่อนที่ 53 สำนักงานพัฒนาภาค 5</w:t>
       </w:r>
     </w:p>
     <w:p>
@@ -4688,10 +3904,10 @@
     <w:p>
       <w:pPr>
         <w:tabs>
-          <w:tab w:pos="2588" w:val="left"/>
+          <w:tab w:pos="3028" w:val="left"/>
         </w:tabs>
         <w:spacing w:before="580" w:after="0" w:line="440" w:lineRule="exact"/>
-        <w:ind w:left="2588" w:hanging="720"/>
+        <w:ind w:left="3028" w:hanging="720"/>
       </w:pPr>
       <w:r>
         <w:rPr>
@@ -4703,7 +3919,7 @@
         </w:rPr>
         <w:t>เรียน</w:t>
         <w:tab/>
-        <w:t>บริษัท อัลโมโด ทัวร์ จำกัด</w:t>
+        <w:t>ผู้บังคับหน่วยพัฒนาการเคลื่อนที่ 54 สำนักงานพัฒนาภาค 5</w:t>
       </w:r>
     </w:p>
     <w:p>
@@ -4752,10 +3968,10 @@
     <w:p>
       <w:pPr>
         <w:tabs>
-          <w:tab w:pos="2588" w:val="left"/>
+          <w:tab w:pos="3028" w:val="left"/>
         </w:tabs>
         <w:spacing w:before="580" w:after="0" w:line="440" w:lineRule="exact"/>
-        <w:ind w:left="2588" w:hanging="720"/>
+        <w:ind w:left="3028" w:hanging="720"/>
       </w:pPr>
       <w:r>
         <w:rPr>
@@ -4767,7 +3983,7 @@
         </w:rPr>
         <w:t>เรียน</w:t>
         <w:tab/>
-        <w:t>บริษัท ออล อิน ทราเวล จำกัด</w:t>
+        <w:t>ผู้บังคับหน่วยพัฒนาการเคลื่อนที่ 55 สำนักงานพัฒนาภาค 5</w:t>
       </w:r>
     </w:p>
     <w:p>
@@ -4816,10 +4032,10 @@
     <w:p>
       <w:pPr>
         <w:tabs>
-          <w:tab w:pos="2588" w:val="left"/>
+          <w:tab w:pos="3028" w:val="left"/>
         </w:tabs>
         <w:spacing w:before="580" w:after="0" w:line="440" w:lineRule="exact"/>
-        <w:ind w:left="2588" w:hanging="720"/>
+        <w:ind w:left="3028" w:hanging="720"/>
       </w:pPr>
       <w:r>
         <w:rPr>
@@ -4831,7 +4047,7 @@
         </w:rPr>
         <w:t>เรียน</w:t>
         <w:tab/>
-        <w:t>บริษัท นีโอ ทราเวล จำกัด</w:t>
+        <w:t>ผู้บังคับหน่วยพัฒนาการเคลื่อนที่ 56 สำนักงานพัฒนาภาค 5</w:t>
       </w:r>
     </w:p>
     <w:p>
@@ -4880,10 +4096,10 @@
     <w:p>
       <w:pPr>
         <w:tabs>
-          <w:tab w:pos="2588" w:val="left"/>
+          <w:tab w:pos="3028" w:val="left"/>
         </w:tabs>
         <w:spacing w:before="580" w:after="0" w:line="440" w:lineRule="exact"/>
-        <w:ind w:left="2588" w:hanging="720"/>
+        <w:ind w:left="3028" w:hanging="720"/>
       </w:pPr>
       <w:r>
         <w:rPr>
@@ -4895,7 +4111,7 @@
         </w:rPr>
         <w:t>เรียน</w:t>
         <w:tab/>
-        <w:t>บริษัท ไดนามิค ทัวร์ จำกัด</w:t>
+        <w:t>ผู้บังคับหน่วยพัฒนาการพิเศษ หน่วยบัญชาการทหารพัฒนา</w:t>
       </w:r>
     </w:p>
     <w:p>
@@ -4944,10 +4160,10 @@
     <w:p>
       <w:pPr>
         <w:tabs>
-          <w:tab w:pos="2588" w:val="left"/>
+          <w:tab w:pos="3028" w:val="left"/>
         </w:tabs>
         <w:spacing w:before="580" w:after="0" w:line="440" w:lineRule="exact"/>
-        <w:ind w:left="2588" w:hanging="720"/>
+        <w:ind w:left="3028" w:hanging="720"/>
       </w:pPr>
       <w:r>
         <w:rPr>
@@ -4959,7 +4175,7 @@
         </w:rPr>
         <w:t>เรียน</w:t>
         <w:tab/>
-        <w:t>บริษัท ธนัชวิชญ์ แทรเวล กรุ๊ป จำกัด</w:t>
+        <w:t>ผู้อำนวยการสำนักปฏิบัติการข่าว ศูนย์รักษาความปลอดภัย</w:t>
       </w:r>
     </w:p>
     <w:p>
@@ -5008,10 +4224,10 @@
     <w:p>
       <w:pPr>
         <w:tabs>
-          <w:tab w:pos="2588" w:val="left"/>
+          <w:tab w:pos="3028" w:val="left"/>
         </w:tabs>
         <w:spacing w:before="580" w:after="0" w:line="440" w:lineRule="exact"/>
-        <w:ind w:left="2588" w:hanging="720"/>
+        <w:ind w:left="3028" w:hanging="720"/>
       </w:pPr>
       <w:r>
         <w:rPr>
@@ -5023,60 +4239,9 @@
         </w:rPr>
         <w:t>เรียน</w:t>
         <w:tab/>
-        <w:t>K-MAN Distribution (เค-แมน ดิสทริบิวชั่น)</w:t>
-      </w:r>
-    </w:p>
-    <w:p>
-      <w:pPr>
-        <w:pageBreakBefore/>
-        <w:spacing w:before="0" w:after="0" w:line="364" w:lineRule="exact"/>
-      </w:pPr>
-      <w:r>
-        <w:rPr>
-          <w:rFonts w:ascii="TH SarabunPSK" w:hAnsi="TH SarabunPSK" w:cs="TH SarabunPSK" w:eastAsia="TH SarabunPSK"/>
-          <w:b w:val="0"/>
-          <w:sz w:val="21"/>
-          <w:szCs w:val="21"/>
-        </w:rPr>
-        <w:t>วปอ.สปท.</w:t>
-      </w:r>
-    </w:p>
-    <w:p>
-      <w:pPr>
-        <w:spacing w:before="0" w:after="0" w:line="364" w:lineRule="exact"/>
-      </w:pPr>
-      <w:r>
-        <w:rPr>
-          <w:rFonts w:ascii="TH SarabunPSK" w:hAnsi="TH SarabunPSK" w:cs="TH SarabunPSK" w:eastAsia="TH SarabunPSK"/>
-          <w:b w:val="0"/>
-          <w:sz w:val="21"/>
-          <w:szCs w:val="21"/>
-        </w:rPr>
-        <w:t>กห ๐๓๑๗.๒/๑๖๑๑</w:t>
-      </w:r>
-    </w:p>
-    <w:p>
-      <w:pPr>
-        <w:spacing w:before="0" w:after="0" w:line="364" w:lineRule="exact"/>
-      </w:pPr>
-      <w:r>
-        <w:rPr>
-          <w:rFonts w:ascii="TH SarabunPSK" w:hAnsi="TH SarabunPSK" w:cs="TH SarabunPSK" w:eastAsia="TH SarabunPSK"/>
-          <w:b w:val="0"/>
-          <w:sz w:val="21"/>
-          <w:szCs w:val="21"/>
-        </w:rPr>
-        <w:t>โทร. ๐ ๒๕๗๒ ๒๕๒๗</w:t>
-      </w:r>
-    </w:p>
-    <w:p>
-      <w:pPr>
-        <w:tabs>
-          <w:tab w:pos="2588" w:val="left"/>
-        </w:tabs>
-        <w:spacing w:before="580" w:after="0" w:line="440" w:lineRule="exact"/>
-        <w:ind w:left="2588" w:hanging="720"/>
-      </w:pPr>
+        <w:t>ผู้อำนวยการสำนักรักษาความปลอดภัย</w:t>
+        <w:br/>
+      </w:r>
       <w:r>
         <w:rPr>
           <w:rFonts w:ascii="TH SarabunPSK" w:hAnsi="TH SarabunPSK" w:cs="TH SarabunPSK" w:eastAsia="TH SarabunPSK"/>
@@ -5085,9 +4250,7 @@
           <w:szCs w:val="26"/>
           <w:bCs/>
         </w:rPr>
-        <w:t>เรียน</w:t>
-        <w:tab/>
-        <w:t>บริษัท อภิสฤษฎิ์ จำกัด</w:t>
+        <w:t>ศูนย์รักษาความปลอดภัย</w:t>
       </w:r>
     </w:p>
     <w:p>
@@ -5136,10 +4299,10 @@
     <w:p>
       <w:pPr>
         <w:tabs>
-          <w:tab w:pos="2588" w:val="left"/>
+          <w:tab w:pos="3028" w:val="left"/>
         </w:tabs>
         <w:spacing w:before="580" w:after="0" w:line="440" w:lineRule="exact"/>
-        <w:ind w:left="2588" w:hanging="720"/>
+        <w:ind w:left="3028" w:hanging="720"/>
       </w:pPr>
       <w:r>
         <w:rPr>
@@ -5151,60 +4314,9 @@
         </w:rPr>
         <w:t>เรียน</w:t>
         <w:tab/>
-        <w:t>บริษัท กีล่า สปอร์ต จำกัด</w:t>
-      </w:r>
-    </w:p>
-    <w:p>
-      <w:pPr>
-        <w:pageBreakBefore/>
-        <w:spacing w:before="0" w:after="0" w:line="364" w:lineRule="exact"/>
-      </w:pPr>
-      <w:r>
-        <w:rPr>
-          <w:rFonts w:ascii="TH SarabunPSK" w:hAnsi="TH SarabunPSK" w:cs="TH SarabunPSK" w:eastAsia="TH SarabunPSK"/>
-          <w:b w:val="0"/>
-          <w:sz w:val="21"/>
-          <w:szCs w:val="21"/>
-        </w:rPr>
-        <w:t>วปอ.สปท.</w:t>
-      </w:r>
-    </w:p>
-    <w:p>
-      <w:pPr>
-        <w:spacing w:before="0" w:after="0" w:line="364" w:lineRule="exact"/>
-      </w:pPr>
-      <w:r>
-        <w:rPr>
-          <w:rFonts w:ascii="TH SarabunPSK" w:hAnsi="TH SarabunPSK" w:cs="TH SarabunPSK" w:eastAsia="TH SarabunPSK"/>
-          <w:b w:val="0"/>
-          <w:sz w:val="21"/>
-          <w:szCs w:val="21"/>
-        </w:rPr>
-        <w:t>กห ๐๓๑๗.๒/๑๖๑๑</w:t>
-      </w:r>
-    </w:p>
-    <w:p>
-      <w:pPr>
-        <w:spacing w:before="0" w:after="0" w:line="364" w:lineRule="exact"/>
-      </w:pPr>
-      <w:r>
-        <w:rPr>
-          <w:rFonts w:ascii="TH SarabunPSK" w:hAnsi="TH SarabunPSK" w:cs="TH SarabunPSK" w:eastAsia="TH SarabunPSK"/>
-          <w:b w:val="0"/>
-          <w:sz w:val="21"/>
-          <w:szCs w:val="21"/>
-        </w:rPr>
-        <w:t>โทร. ๐ ๒๕๗๒ ๒๕๒๗</w:t>
-      </w:r>
-    </w:p>
-    <w:p>
-      <w:pPr>
-        <w:tabs>
-          <w:tab w:pos="2588" w:val="left"/>
-        </w:tabs>
-        <w:spacing w:before="580" w:after="0" w:line="440" w:lineRule="exact"/>
-        <w:ind w:left="2588" w:hanging="720"/>
-      </w:pPr>
+        <w:t>ผู้อำนวยการสำนักบริการสิทธิประโยชน์กำลังพล</w:t>
+        <w:br/>
+      </w:r>
       <w:r>
         <w:rPr>
           <w:rFonts w:ascii="TH SarabunPSK" w:hAnsi="TH SarabunPSK" w:cs="TH SarabunPSK" w:eastAsia="TH SarabunPSK"/>
@@ -5213,9 +4325,7 @@
           <w:szCs w:val="26"/>
           <w:bCs/>
         </w:rPr>
-        <w:t>เรียน</w:t>
-        <w:tab/>
-        <w:t>บริษัท วี.เค.การ์เมนท์ จำกัด (สำนักงานใหญ่)</w:t>
+        <w:t>กรมสารบรรณทหาร</w:t>
       </w:r>
     </w:p>
     <w:p>
@@ -5264,10 +4374,10 @@
     <w:p>
       <w:pPr>
         <w:tabs>
-          <w:tab w:pos="2588" w:val="left"/>
+          <w:tab w:pos="3028" w:val="left"/>
         </w:tabs>
         <w:spacing w:before="580" w:after="0" w:line="440" w:lineRule="exact"/>
-        <w:ind w:left="2588" w:hanging="720"/>
+        <w:ind w:left="3028" w:hanging="720"/>
       </w:pPr>
       <w:r>
         <w:rPr>
@@ -5279,60 +4389,9 @@
         </w:rPr>
         <w:t>เรียน</w:t>
         <w:tab/>
-        <w:t>บริษัท พลอยศรีรัฐ ซัพลาย จำกัด (สำนักงานใหญ่)</w:t>
-      </w:r>
-    </w:p>
-    <w:p>
-      <w:pPr>
-        <w:pageBreakBefore/>
-        <w:spacing w:before="0" w:after="0" w:line="364" w:lineRule="exact"/>
-      </w:pPr>
-      <w:r>
-        <w:rPr>
-          <w:rFonts w:ascii="TH SarabunPSK" w:hAnsi="TH SarabunPSK" w:cs="TH SarabunPSK" w:eastAsia="TH SarabunPSK"/>
-          <w:b w:val="0"/>
-          <w:sz w:val="21"/>
-          <w:szCs w:val="21"/>
-        </w:rPr>
-        <w:t>วปอ.สปท.</w:t>
-      </w:r>
-    </w:p>
-    <w:p>
-      <w:pPr>
-        <w:spacing w:before="0" w:after="0" w:line="364" w:lineRule="exact"/>
-      </w:pPr>
-      <w:r>
-        <w:rPr>
-          <w:rFonts w:ascii="TH SarabunPSK" w:hAnsi="TH SarabunPSK" w:cs="TH SarabunPSK" w:eastAsia="TH SarabunPSK"/>
-          <w:b w:val="0"/>
-          <w:sz w:val="21"/>
-          <w:szCs w:val="21"/>
-        </w:rPr>
-        <w:t>กห ๐๓๑๗.๒/๑๖๑๑</w:t>
-      </w:r>
-    </w:p>
-    <w:p>
-      <w:pPr>
-        <w:spacing w:before="0" w:after="0" w:line="364" w:lineRule="exact"/>
-      </w:pPr>
-      <w:r>
-        <w:rPr>
-          <w:rFonts w:ascii="TH SarabunPSK" w:hAnsi="TH SarabunPSK" w:cs="TH SarabunPSK" w:eastAsia="TH SarabunPSK"/>
-          <w:b w:val="0"/>
-          <w:sz w:val="21"/>
-          <w:szCs w:val="21"/>
-        </w:rPr>
-        <w:t>โทร. ๐ ๒๕๗๒ ๒๕๒๗</w:t>
-      </w:r>
-    </w:p>
-    <w:p>
-      <w:pPr>
-        <w:tabs>
-          <w:tab w:pos="2588" w:val="left"/>
-        </w:tabs>
-        <w:spacing w:before="580" w:after="0" w:line="440" w:lineRule="exact"/>
-        <w:ind w:left="2588" w:hanging="720"/>
-      </w:pPr>
+        <w:t>ผู้อำนวยการสำนักปฏิบัติการเพื่อความมั่นคง</w:t>
+        <w:br/>
+      </w:r>
       <w:r>
         <w:rPr>
           <w:rFonts w:ascii="TH SarabunPSK" w:hAnsi="TH SarabunPSK" w:cs="TH SarabunPSK" w:eastAsia="TH SarabunPSK"/>
@@ -5341,9 +4400,7 @@
           <w:szCs w:val="26"/>
           <w:bCs/>
         </w:rPr>
-        <w:t>เรียน</w:t>
-        <w:tab/>
-        <w:t>ห้างหุ้นส่วนจำกัด ศ.วีระพันธ์</w:t>
+        <w:t>กรมกิจการชายแดนทหาร</w:t>
       </w:r>
     </w:p>
     <w:p>
@@ -5392,10 +4449,10 @@
     <w:p>
       <w:pPr>
         <w:tabs>
-          <w:tab w:pos="2588" w:val="left"/>
+          <w:tab w:pos="3028" w:val="left"/>
         </w:tabs>
         <w:spacing w:before="580" w:after="0" w:line="440" w:lineRule="exact"/>
-        <w:ind w:left="2588" w:hanging="720"/>
+        <w:ind w:left="3028" w:hanging="720"/>
       </w:pPr>
       <w:r>
         <w:rPr>
@@ -5407,60 +4464,9 @@
         </w:rPr>
         <w:t>เรียน</w:t>
         <w:tab/>
-        <w:t>ร้าน สูทสภา (อรุณลักษณ์สูทสภา)</w:t>
-      </w:r>
-    </w:p>
-    <w:p>
-      <w:pPr>
-        <w:pageBreakBefore/>
-        <w:spacing w:before="0" w:after="0" w:line="364" w:lineRule="exact"/>
-      </w:pPr>
-      <w:r>
-        <w:rPr>
-          <w:rFonts w:ascii="TH SarabunPSK" w:hAnsi="TH SarabunPSK" w:cs="TH SarabunPSK" w:eastAsia="TH SarabunPSK"/>
-          <w:b w:val="0"/>
-          <w:sz w:val="21"/>
-          <w:szCs w:val="21"/>
-        </w:rPr>
-        <w:t>วปอ.สปท.</w:t>
-      </w:r>
-    </w:p>
-    <w:p>
-      <w:pPr>
-        <w:spacing w:before="0" w:after="0" w:line="364" w:lineRule="exact"/>
-      </w:pPr>
-      <w:r>
-        <w:rPr>
-          <w:rFonts w:ascii="TH SarabunPSK" w:hAnsi="TH SarabunPSK" w:cs="TH SarabunPSK" w:eastAsia="TH SarabunPSK"/>
-          <w:b w:val="0"/>
-          <w:sz w:val="21"/>
-          <w:szCs w:val="21"/>
-        </w:rPr>
-        <w:t>กห ๐๓๑๗.๒/๑๖๑๑</w:t>
-      </w:r>
-    </w:p>
-    <w:p>
-      <w:pPr>
-        <w:spacing w:before="0" w:after="0" w:line="364" w:lineRule="exact"/>
-      </w:pPr>
-      <w:r>
-        <w:rPr>
-          <w:rFonts w:ascii="TH SarabunPSK" w:hAnsi="TH SarabunPSK" w:cs="TH SarabunPSK" w:eastAsia="TH SarabunPSK"/>
-          <w:b w:val="0"/>
-          <w:sz w:val="21"/>
-          <w:szCs w:val="21"/>
-        </w:rPr>
-        <w:t>โทร. ๐ ๒๕๗๒ ๒๕๒๗</w:t>
-      </w:r>
-    </w:p>
-    <w:p>
-      <w:pPr>
-        <w:tabs>
-          <w:tab w:pos="2588" w:val="left"/>
-        </w:tabs>
-        <w:spacing w:before="580" w:after="0" w:line="440" w:lineRule="exact"/>
-        <w:ind w:left="2588" w:hanging="720"/>
-      </w:pPr>
+        <w:t>เสนาธิการวิทยาลัยเสนาธิการทหาร</w:t>
+        <w:br/>
+      </w:r>
       <w:r>
         <w:rPr>
           <w:rFonts w:ascii="TH SarabunPSK" w:hAnsi="TH SarabunPSK" w:cs="TH SarabunPSK" w:eastAsia="TH SarabunPSK"/>
@@ -5469,9 +4475,7 @@
           <w:szCs w:val="26"/>
           <w:bCs/>
         </w:rPr>
-        <w:t>เรียน</w:t>
-        <w:tab/>
-        <w:t>ร้าน John Perfect Tailor</w:t>
+        <w:t>สถาบันวิชาการป้องกันประเทศ</w:t>
       </w:r>
     </w:p>
     <w:p>
@@ -5520,10 +4524,10 @@
     <w:p>
       <w:pPr>
         <w:tabs>
-          <w:tab w:pos="2588" w:val="left"/>
+          <w:tab w:pos="3028" w:val="left"/>
         </w:tabs>
         <w:spacing w:before="580" w:after="0" w:line="440" w:lineRule="exact"/>
-        <w:ind w:left="2588" w:hanging="720"/>
+        <w:ind w:left="3028" w:hanging="720"/>
       </w:pPr>
       <w:r>
         <w:rPr>
@@ -5535,7 +4539,7 @@
         </w:rPr>
         <w:t>เรียน</w:t>
         <w:tab/>
-        <w:t>ร้าน เด่นแชมป์สูท</w:t>
+        <w:t>คุณ เนวิน บุญฤทธิ์ ผู้จัดการธนาคาร ทีทีบี สาขาสนามเป้า</w:t>
       </w:r>
     </w:p>
     <w:p>
@@ -5584,10 +4588,10 @@
     <w:p>
       <w:pPr>
         <w:tabs>
-          <w:tab w:pos="2588" w:val="left"/>
+          <w:tab w:pos="3028" w:val="left"/>
         </w:tabs>
         <w:spacing w:before="580" w:after="0" w:line="440" w:lineRule="exact"/>
-        <w:ind w:left="2588" w:hanging="720"/>
+        <w:ind w:left="3028" w:hanging="720"/>
       </w:pPr>
       <w:r>
         <w:rPr>
@@ -5599,7 +4603,7 @@
         </w:rPr>
         <w:t>เรียน</w:t>
         <w:tab/>
-        <w:t>ร้าน AR Tailor House (ร้านชูวิทย์)</w:t>
+        <w:t>บริษัท เพชราภรณ์ กรุ๊ป แทรเวล จำกัด</w:t>
       </w:r>
     </w:p>
     <w:p>
@@ -5648,10 +4652,10 @@
     <w:p>
       <w:pPr>
         <w:tabs>
-          <w:tab w:pos="2588" w:val="left"/>
+          <w:tab w:pos="3028" w:val="left"/>
         </w:tabs>
         <w:spacing w:before="580" w:after="0" w:line="440" w:lineRule="exact"/>
-        <w:ind w:left="2588" w:hanging="720"/>
+        <w:ind w:left="3028" w:hanging="720"/>
       </w:pPr>
       <w:r>
         <w:rPr>
@@ -5663,7 +4667,7 @@
         </w:rPr>
         <w:t>เรียน</w:t>
         <w:tab/>
-        <w:t>ร้าน สูทเวิลด์เซ็นเตอร์</w:t>
+        <w:t>บริษัท ซูพีเรียร์ ทัวร์ จำกัด</w:t>
       </w:r>
     </w:p>
     <w:p>
@@ -5712,10 +4716,10 @@
     <w:p>
       <w:pPr>
         <w:tabs>
-          <w:tab w:pos="2588" w:val="left"/>
+          <w:tab w:pos="3028" w:val="left"/>
         </w:tabs>
         <w:spacing w:before="580" w:after="0" w:line="440" w:lineRule="exact"/>
-        <w:ind w:left="2588" w:hanging="720"/>
+        <w:ind w:left="3028" w:hanging="720"/>
       </w:pPr>
       <w:r>
         <w:rPr>
@@ -5727,7 +4731,7 @@
         </w:rPr>
         <w:t>เรียน</w:t>
         <w:tab/>
-        <w:t>ร้าน ช่อชัยพฤกษ์</w:t>
+        <w:t>บริษัท กรีน เวย์ แทรเวล จำกัด</w:t>
       </w:r>
     </w:p>
     <w:p>
@@ -5776,10 +4780,10 @@
     <w:p>
       <w:pPr>
         <w:tabs>
-          <w:tab w:pos="2588" w:val="left"/>
+          <w:tab w:pos="3028" w:val="left"/>
         </w:tabs>
         <w:spacing w:before="580" w:after="0" w:line="440" w:lineRule="exact"/>
-        <w:ind w:left="2588" w:hanging="720"/>
+        <w:ind w:left="3028" w:hanging="720"/>
       </w:pPr>
       <w:r>
         <w:rPr>
@@ -5791,7 +4795,7 @@
         </w:rPr>
         <w:t>เรียน</w:t>
         <w:tab/>
-        <w:t>บริษัท สูทแน็ค จำกัด</w:t>
+        <w:t>บริษัท เวิลด์ แทรเวิล ดีไซน์ จำกัด</w:t>
       </w:r>
     </w:p>
     <w:p>
@@ -5840,10 +4844,10 @@
     <w:p>
       <w:pPr>
         <w:tabs>
-          <w:tab w:pos="2588" w:val="left"/>
+          <w:tab w:pos="3028" w:val="left"/>
         </w:tabs>
         <w:spacing w:before="580" w:after="0" w:line="440" w:lineRule="exact"/>
-        <w:ind w:left="2588" w:hanging="720"/>
+        <w:ind w:left="3028" w:hanging="720"/>
       </w:pPr>
       <w:r>
         <w:rPr>
@@ -5855,7 +4859,7 @@
         </w:rPr>
         <w:t>เรียน</w:t>
         <w:tab/>
-        <w:t>ร้าน สูททะนง</w:t>
+        <w:t>บริษัท มาร์วิน แทรเวิล จำกัด</w:t>
       </w:r>
     </w:p>
     <w:p>
@@ -5904,10 +4908,10 @@
     <w:p>
       <w:pPr>
         <w:tabs>
-          <w:tab w:pos="2588" w:val="left"/>
+          <w:tab w:pos="3028" w:val="left"/>
         </w:tabs>
         <w:spacing w:before="580" w:after="0" w:line="440" w:lineRule="exact"/>
-        <w:ind w:left="2588" w:hanging="720"/>
+        <w:ind w:left="3028" w:hanging="720"/>
       </w:pPr>
       <w:r>
         <w:rPr>
@@ -5919,7 +4923,7 @@
         </w:rPr>
         <w:t>เรียน</w:t>
         <w:tab/>
-        <w:t>ร้าน Aek Siam Tailor</w:t>
+        <w:t>บริษัท อัลโมโด ทัวร์ จำกัด</w:t>
       </w:r>
     </w:p>
     <w:p>
@@ -5968,10 +4972,10 @@
     <w:p>
       <w:pPr>
         <w:tabs>
-          <w:tab w:pos="2588" w:val="left"/>
+          <w:tab w:pos="3028" w:val="left"/>
         </w:tabs>
         <w:spacing w:before="580" w:after="0" w:line="440" w:lineRule="exact"/>
-        <w:ind w:left="2588" w:hanging="720"/>
+        <w:ind w:left="3028" w:hanging="720"/>
       </w:pPr>
       <w:r>
         <w:rPr>
@@ -5983,7 +4987,7 @@
         </w:rPr>
         <w:t>เรียน</w:t>
         <w:tab/>
-        <w:t>บริษัท ทวินสูท จำกัด</w:t>
+        <w:t>บริษัท ออล อิน ทราเวล จำกัด</w:t>
       </w:r>
     </w:p>
     <w:p>
@@ -6032,10 +5036,1226 @@
     <w:p>
       <w:pPr>
         <w:tabs>
-          <w:tab w:pos="2588" w:val="left"/>
+          <w:tab w:pos="3028" w:val="left"/>
         </w:tabs>
         <w:spacing w:before="580" w:after="0" w:line="440" w:lineRule="exact"/>
-        <w:ind w:left="2588" w:hanging="720"/>
+        <w:ind w:left="3028" w:hanging="720"/>
+      </w:pPr>
+      <w:r>
+        <w:rPr>
+          <w:rFonts w:ascii="TH SarabunPSK" w:hAnsi="TH SarabunPSK" w:cs="TH SarabunPSK" w:eastAsia="TH SarabunPSK"/>
+          <w:b/>
+          <w:sz w:val="26"/>
+          <w:szCs w:val="26"/>
+          <w:bCs/>
+        </w:rPr>
+        <w:t>เรียน</w:t>
+        <w:tab/>
+        <w:t>บริษัท นีโอ ทราเวล จำกัด</w:t>
+      </w:r>
+    </w:p>
+    <w:p>
+      <w:pPr>
+        <w:pageBreakBefore/>
+        <w:spacing w:before="0" w:after="0" w:line="364" w:lineRule="exact"/>
+      </w:pPr>
+      <w:r>
+        <w:rPr>
+          <w:rFonts w:ascii="TH SarabunPSK" w:hAnsi="TH SarabunPSK" w:cs="TH SarabunPSK" w:eastAsia="TH SarabunPSK"/>
+          <w:b w:val="0"/>
+          <w:sz w:val="21"/>
+          <w:szCs w:val="21"/>
+        </w:rPr>
+        <w:t>วปอ.สปท.</w:t>
+      </w:r>
+    </w:p>
+    <w:p>
+      <w:pPr>
+        <w:spacing w:before="0" w:after="0" w:line="364" w:lineRule="exact"/>
+      </w:pPr>
+      <w:r>
+        <w:rPr>
+          <w:rFonts w:ascii="TH SarabunPSK" w:hAnsi="TH SarabunPSK" w:cs="TH SarabunPSK" w:eastAsia="TH SarabunPSK"/>
+          <w:b w:val="0"/>
+          <w:sz w:val="21"/>
+          <w:szCs w:val="21"/>
+        </w:rPr>
+        <w:t>กห ๐๓๑๗.๒/๑๖๑๑</w:t>
+      </w:r>
+    </w:p>
+    <w:p>
+      <w:pPr>
+        <w:spacing w:before="0" w:after="0" w:line="364" w:lineRule="exact"/>
+      </w:pPr>
+      <w:r>
+        <w:rPr>
+          <w:rFonts w:ascii="TH SarabunPSK" w:hAnsi="TH SarabunPSK" w:cs="TH SarabunPSK" w:eastAsia="TH SarabunPSK"/>
+          <w:b w:val="0"/>
+          <w:sz w:val="21"/>
+          <w:szCs w:val="21"/>
+        </w:rPr>
+        <w:t>โทร. ๐ ๒๕๗๒ ๒๕๒๗</w:t>
+      </w:r>
+    </w:p>
+    <w:p>
+      <w:pPr>
+        <w:tabs>
+          <w:tab w:pos="3028" w:val="left"/>
+        </w:tabs>
+        <w:spacing w:before="580" w:after="0" w:line="440" w:lineRule="exact"/>
+        <w:ind w:left="3028" w:hanging="720"/>
+      </w:pPr>
+      <w:r>
+        <w:rPr>
+          <w:rFonts w:ascii="TH SarabunPSK" w:hAnsi="TH SarabunPSK" w:cs="TH SarabunPSK" w:eastAsia="TH SarabunPSK"/>
+          <w:b/>
+          <w:sz w:val="26"/>
+          <w:szCs w:val="26"/>
+          <w:bCs/>
+        </w:rPr>
+        <w:t>เรียน</w:t>
+        <w:tab/>
+        <w:t>บริษัท ไดนามิค ทัวร์ จำกัด</w:t>
+      </w:r>
+    </w:p>
+    <w:p>
+      <w:pPr>
+        <w:pageBreakBefore/>
+        <w:spacing w:before="0" w:after="0" w:line="364" w:lineRule="exact"/>
+      </w:pPr>
+      <w:r>
+        <w:rPr>
+          <w:rFonts w:ascii="TH SarabunPSK" w:hAnsi="TH SarabunPSK" w:cs="TH SarabunPSK" w:eastAsia="TH SarabunPSK"/>
+          <w:b w:val="0"/>
+          <w:sz w:val="21"/>
+          <w:szCs w:val="21"/>
+        </w:rPr>
+        <w:t>วปอ.สปท.</w:t>
+      </w:r>
+    </w:p>
+    <w:p>
+      <w:pPr>
+        <w:spacing w:before="0" w:after="0" w:line="364" w:lineRule="exact"/>
+      </w:pPr>
+      <w:r>
+        <w:rPr>
+          <w:rFonts w:ascii="TH SarabunPSK" w:hAnsi="TH SarabunPSK" w:cs="TH SarabunPSK" w:eastAsia="TH SarabunPSK"/>
+          <w:b w:val="0"/>
+          <w:sz w:val="21"/>
+          <w:szCs w:val="21"/>
+        </w:rPr>
+        <w:t>กห ๐๓๑๗.๒/๑๖๑๑</w:t>
+      </w:r>
+    </w:p>
+    <w:p>
+      <w:pPr>
+        <w:spacing w:before="0" w:after="0" w:line="364" w:lineRule="exact"/>
+      </w:pPr>
+      <w:r>
+        <w:rPr>
+          <w:rFonts w:ascii="TH SarabunPSK" w:hAnsi="TH SarabunPSK" w:cs="TH SarabunPSK" w:eastAsia="TH SarabunPSK"/>
+          <w:b w:val="0"/>
+          <w:sz w:val="21"/>
+          <w:szCs w:val="21"/>
+        </w:rPr>
+        <w:t>โทร. ๐ ๒๕๗๒ ๒๕๒๗</w:t>
+      </w:r>
+    </w:p>
+    <w:p>
+      <w:pPr>
+        <w:tabs>
+          <w:tab w:pos="3028" w:val="left"/>
+        </w:tabs>
+        <w:spacing w:before="580" w:after="0" w:line="440" w:lineRule="exact"/>
+        <w:ind w:left="3028" w:hanging="720"/>
+      </w:pPr>
+      <w:r>
+        <w:rPr>
+          <w:rFonts w:ascii="TH SarabunPSK" w:hAnsi="TH SarabunPSK" w:cs="TH SarabunPSK" w:eastAsia="TH SarabunPSK"/>
+          <w:b/>
+          <w:sz w:val="26"/>
+          <w:szCs w:val="26"/>
+          <w:bCs/>
+        </w:rPr>
+        <w:t>เรียน</w:t>
+        <w:tab/>
+        <w:t>บริษัท ธนัชวิชญ์ แทรเวล กรุ๊ป จำกัด</w:t>
+      </w:r>
+    </w:p>
+    <w:p>
+      <w:pPr>
+        <w:pageBreakBefore/>
+        <w:spacing w:before="0" w:after="0" w:line="364" w:lineRule="exact"/>
+      </w:pPr>
+      <w:r>
+        <w:rPr>
+          <w:rFonts w:ascii="TH SarabunPSK" w:hAnsi="TH SarabunPSK" w:cs="TH SarabunPSK" w:eastAsia="TH SarabunPSK"/>
+          <w:b w:val="0"/>
+          <w:sz w:val="21"/>
+          <w:szCs w:val="21"/>
+        </w:rPr>
+        <w:t>วปอ.สปท.</w:t>
+      </w:r>
+    </w:p>
+    <w:p>
+      <w:pPr>
+        <w:spacing w:before="0" w:after="0" w:line="364" w:lineRule="exact"/>
+      </w:pPr>
+      <w:r>
+        <w:rPr>
+          <w:rFonts w:ascii="TH SarabunPSK" w:hAnsi="TH SarabunPSK" w:cs="TH SarabunPSK" w:eastAsia="TH SarabunPSK"/>
+          <w:b w:val="0"/>
+          <w:sz w:val="21"/>
+          <w:szCs w:val="21"/>
+        </w:rPr>
+        <w:t>กห ๐๓๑๗.๒/๑๖๑๑</w:t>
+      </w:r>
+    </w:p>
+    <w:p>
+      <w:pPr>
+        <w:spacing w:before="0" w:after="0" w:line="364" w:lineRule="exact"/>
+      </w:pPr>
+      <w:r>
+        <w:rPr>
+          <w:rFonts w:ascii="TH SarabunPSK" w:hAnsi="TH SarabunPSK" w:cs="TH SarabunPSK" w:eastAsia="TH SarabunPSK"/>
+          <w:b w:val="0"/>
+          <w:sz w:val="21"/>
+          <w:szCs w:val="21"/>
+        </w:rPr>
+        <w:t>โทร. ๐ ๒๕๗๒ ๒๕๒๗</w:t>
+      </w:r>
+    </w:p>
+    <w:p>
+      <w:pPr>
+        <w:tabs>
+          <w:tab w:pos="3028" w:val="left"/>
+        </w:tabs>
+        <w:spacing w:before="580" w:after="0" w:line="440" w:lineRule="exact"/>
+        <w:ind w:left="3028" w:hanging="720"/>
+      </w:pPr>
+      <w:r>
+        <w:rPr>
+          <w:rFonts w:ascii="TH SarabunPSK" w:hAnsi="TH SarabunPSK" w:cs="TH SarabunPSK" w:eastAsia="TH SarabunPSK"/>
+          <w:b/>
+          <w:sz w:val="26"/>
+          <w:szCs w:val="26"/>
+          <w:bCs/>
+        </w:rPr>
+        <w:t>เรียน</w:t>
+        <w:tab/>
+        <w:t>K-MAN Distribution (เค-แมน ดิสทริบิวชั่น)</w:t>
+      </w:r>
+    </w:p>
+    <w:p>
+      <w:pPr>
+        <w:pageBreakBefore/>
+        <w:spacing w:before="0" w:after="0" w:line="364" w:lineRule="exact"/>
+      </w:pPr>
+      <w:r>
+        <w:rPr>
+          <w:rFonts w:ascii="TH SarabunPSK" w:hAnsi="TH SarabunPSK" w:cs="TH SarabunPSK" w:eastAsia="TH SarabunPSK"/>
+          <w:b w:val="0"/>
+          <w:sz w:val="21"/>
+          <w:szCs w:val="21"/>
+        </w:rPr>
+        <w:t>วปอ.สปท.</w:t>
+      </w:r>
+    </w:p>
+    <w:p>
+      <w:pPr>
+        <w:spacing w:before="0" w:after="0" w:line="364" w:lineRule="exact"/>
+      </w:pPr>
+      <w:r>
+        <w:rPr>
+          <w:rFonts w:ascii="TH SarabunPSK" w:hAnsi="TH SarabunPSK" w:cs="TH SarabunPSK" w:eastAsia="TH SarabunPSK"/>
+          <w:b w:val="0"/>
+          <w:sz w:val="21"/>
+          <w:szCs w:val="21"/>
+        </w:rPr>
+        <w:t>กห ๐๓๑๗.๒/๑๖๑๑</w:t>
+      </w:r>
+    </w:p>
+    <w:p>
+      <w:pPr>
+        <w:spacing w:before="0" w:after="0" w:line="364" w:lineRule="exact"/>
+      </w:pPr>
+      <w:r>
+        <w:rPr>
+          <w:rFonts w:ascii="TH SarabunPSK" w:hAnsi="TH SarabunPSK" w:cs="TH SarabunPSK" w:eastAsia="TH SarabunPSK"/>
+          <w:b w:val="0"/>
+          <w:sz w:val="21"/>
+          <w:szCs w:val="21"/>
+        </w:rPr>
+        <w:t>โทร. ๐ ๒๕๗๒ ๒๕๒๗</w:t>
+      </w:r>
+    </w:p>
+    <w:p>
+      <w:pPr>
+        <w:tabs>
+          <w:tab w:pos="3028" w:val="left"/>
+        </w:tabs>
+        <w:spacing w:before="580" w:after="0" w:line="440" w:lineRule="exact"/>
+        <w:ind w:left="3028" w:hanging="720"/>
+      </w:pPr>
+      <w:r>
+        <w:rPr>
+          <w:rFonts w:ascii="TH SarabunPSK" w:hAnsi="TH SarabunPSK" w:cs="TH SarabunPSK" w:eastAsia="TH SarabunPSK"/>
+          <w:b/>
+          <w:sz w:val="26"/>
+          <w:szCs w:val="26"/>
+          <w:bCs/>
+        </w:rPr>
+        <w:t>เรียน</w:t>
+        <w:tab/>
+        <w:t>บริษัท อภิสฤษฎิ์ จำกัด</w:t>
+      </w:r>
+    </w:p>
+    <w:p>
+      <w:pPr>
+        <w:pageBreakBefore/>
+        <w:spacing w:before="0" w:after="0" w:line="364" w:lineRule="exact"/>
+      </w:pPr>
+      <w:r>
+        <w:rPr>
+          <w:rFonts w:ascii="TH SarabunPSK" w:hAnsi="TH SarabunPSK" w:cs="TH SarabunPSK" w:eastAsia="TH SarabunPSK"/>
+          <w:b w:val="0"/>
+          <w:sz w:val="21"/>
+          <w:szCs w:val="21"/>
+        </w:rPr>
+        <w:t>วปอ.สปท.</w:t>
+      </w:r>
+    </w:p>
+    <w:p>
+      <w:pPr>
+        <w:spacing w:before="0" w:after="0" w:line="364" w:lineRule="exact"/>
+      </w:pPr>
+      <w:r>
+        <w:rPr>
+          <w:rFonts w:ascii="TH SarabunPSK" w:hAnsi="TH SarabunPSK" w:cs="TH SarabunPSK" w:eastAsia="TH SarabunPSK"/>
+          <w:b w:val="0"/>
+          <w:sz w:val="21"/>
+          <w:szCs w:val="21"/>
+        </w:rPr>
+        <w:t>กห ๐๓๑๗.๒/๑๖๑๑</w:t>
+      </w:r>
+    </w:p>
+    <w:p>
+      <w:pPr>
+        <w:spacing w:before="0" w:after="0" w:line="364" w:lineRule="exact"/>
+      </w:pPr>
+      <w:r>
+        <w:rPr>
+          <w:rFonts w:ascii="TH SarabunPSK" w:hAnsi="TH SarabunPSK" w:cs="TH SarabunPSK" w:eastAsia="TH SarabunPSK"/>
+          <w:b w:val="0"/>
+          <w:sz w:val="21"/>
+          <w:szCs w:val="21"/>
+        </w:rPr>
+        <w:t>โทร. ๐ ๒๕๗๒ ๒๕๒๗</w:t>
+      </w:r>
+    </w:p>
+    <w:p>
+      <w:pPr>
+        <w:tabs>
+          <w:tab w:pos="3028" w:val="left"/>
+        </w:tabs>
+        <w:spacing w:before="580" w:after="0" w:line="440" w:lineRule="exact"/>
+        <w:ind w:left="3028" w:hanging="720"/>
+      </w:pPr>
+      <w:r>
+        <w:rPr>
+          <w:rFonts w:ascii="TH SarabunPSK" w:hAnsi="TH SarabunPSK" w:cs="TH SarabunPSK" w:eastAsia="TH SarabunPSK"/>
+          <w:b/>
+          <w:sz w:val="26"/>
+          <w:szCs w:val="26"/>
+          <w:bCs/>
+        </w:rPr>
+        <w:t>เรียน</w:t>
+        <w:tab/>
+        <w:t>บริษัท กีล่า สปอร์ต จำกัด</w:t>
+      </w:r>
+    </w:p>
+    <w:p>
+      <w:pPr>
+        <w:pageBreakBefore/>
+        <w:spacing w:before="0" w:after="0" w:line="364" w:lineRule="exact"/>
+      </w:pPr>
+      <w:r>
+        <w:rPr>
+          <w:rFonts w:ascii="TH SarabunPSK" w:hAnsi="TH SarabunPSK" w:cs="TH SarabunPSK" w:eastAsia="TH SarabunPSK"/>
+          <w:b w:val="0"/>
+          <w:sz w:val="21"/>
+          <w:szCs w:val="21"/>
+        </w:rPr>
+        <w:t>วปอ.สปท.</w:t>
+      </w:r>
+    </w:p>
+    <w:p>
+      <w:pPr>
+        <w:spacing w:before="0" w:after="0" w:line="364" w:lineRule="exact"/>
+      </w:pPr>
+      <w:r>
+        <w:rPr>
+          <w:rFonts w:ascii="TH SarabunPSK" w:hAnsi="TH SarabunPSK" w:cs="TH SarabunPSK" w:eastAsia="TH SarabunPSK"/>
+          <w:b w:val="0"/>
+          <w:sz w:val="21"/>
+          <w:szCs w:val="21"/>
+        </w:rPr>
+        <w:t>กห ๐๓๑๗.๒/๑๖๑๑</w:t>
+      </w:r>
+    </w:p>
+    <w:p>
+      <w:pPr>
+        <w:spacing w:before="0" w:after="0" w:line="364" w:lineRule="exact"/>
+      </w:pPr>
+      <w:r>
+        <w:rPr>
+          <w:rFonts w:ascii="TH SarabunPSK" w:hAnsi="TH SarabunPSK" w:cs="TH SarabunPSK" w:eastAsia="TH SarabunPSK"/>
+          <w:b w:val="0"/>
+          <w:sz w:val="21"/>
+          <w:szCs w:val="21"/>
+        </w:rPr>
+        <w:t>โทร. ๐ ๒๕๗๒ ๒๕๒๗</w:t>
+      </w:r>
+    </w:p>
+    <w:p>
+      <w:pPr>
+        <w:tabs>
+          <w:tab w:pos="3028" w:val="left"/>
+        </w:tabs>
+        <w:spacing w:before="580" w:after="0" w:line="440" w:lineRule="exact"/>
+        <w:ind w:left="3028" w:hanging="720"/>
+      </w:pPr>
+      <w:r>
+        <w:rPr>
+          <w:rFonts w:ascii="TH SarabunPSK" w:hAnsi="TH SarabunPSK" w:cs="TH SarabunPSK" w:eastAsia="TH SarabunPSK"/>
+          <w:b/>
+          <w:sz w:val="26"/>
+          <w:szCs w:val="26"/>
+          <w:bCs/>
+        </w:rPr>
+        <w:t>เรียน</w:t>
+        <w:tab/>
+        <w:t>บริษัท วี.เค.การ์เมนท์ จำกัด (สำนักงานใหญ่)</w:t>
+      </w:r>
+    </w:p>
+    <w:p>
+      <w:pPr>
+        <w:pageBreakBefore/>
+        <w:spacing w:before="0" w:after="0" w:line="364" w:lineRule="exact"/>
+      </w:pPr>
+      <w:r>
+        <w:rPr>
+          <w:rFonts w:ascii="TH SarabunPSK" w:hAnsi="TH SarabunPSK" w:cs="TH SarabunPSK" w:eastAsia="TH SarabunPSK"/>
+          <w:b w:val="0"/>
+          <w:sz w:val="21"/>
+          <w:szCs w:val="21"/>
+        </w:rPr>
+        <w:t>วปอ.สปท.</w:t>
+      </w:r>
+    </w:p>
+    <w:p>
+      <w:pPr>
+        <w:spacing w:before="0" w:after="0" w:line="364" w:lineRule="exact"/>
+      </w:pPr>
+      <w:r>
+        <w:rPr>
+          <w:rFonts w:ascii="TH SarabunPSK" w:hAnsi="TH SarabunPSK" w:cs="TH SarabunPSK" w:eastAsia="TH SarabunPSK"/>
+          <w:b w:val="0"/>
+          <w:sz w:val="21"/>
+          <w:szCs w:val="21"/>
+        </w:rPr>
+        <w:t>กห ๐๓๑๗.๒/๑๖๑๑</w:t>
+      </w:r>
+    </w:p>
+    <w:p>
+      <w:pPr>
+        <w:spacing w:before="0" w:after="0" w:line="364" w:lineRule="exact"/>
+      </w:pPr>
+      <w:r>
+        <w:rPr>
+          <w:rFonts w:ascii="TH SarabunPSK" w:hAnsi="TH SarabunPSK" w:cs="TH SarabunPSK" w:eastAsia="TH SarabunPSK"/>
+          <w:b w:val="0"/>
+          <w:sz w:val="21"/>
+          <w:szCs w:val="21"/>
+        </w:rPr>
+        <w:t>โทร. ๐ ๒๕๗๒ ๒๕๒๗</w:t>
+      </w:r>
+    </w:p>
+    <w:p>
+      <w:pPr>
+        <w:tabs>
+          <w:tab w:pos="3028" w:val="left"/>
+        </w:tabs>
+        <w:spacing w:before="580" w:after="0" w:line="440" w:lineRule="exact"/>
+        <w:ind w:left="3028" w:hanging="720"/>
+      </w:pPr>
+      <w:r>
+        <w:rPr>
+          <w:rFonts w:ascii="TH SarabunPSK" w:hAnsi="TH SarabunPSK" w:cs="TH SarabunPSK" w:eastAsia="TH SarabunPSK"/>
+          <w:b/>
+          <w:sz w:val="26"/>
+          <w:szCs w:val="26"/>
+          <w:bCs/>
+        </w:rPr>
+        <w:t>เรียน</w:t>
+        <w:tab/>
+        <w:t>บริษัท พลอยศรีรัฐ ซัพลาย จำกัด (สำนักงานใหญ่)</w:t>
+      </w:r>
+    </w:p>
+    <w:p>
+      <w:pPr>
+        <w:pageBreakBefore/>
+        <w:spacing w:before="0" w:after="0" w:line="364" w:lineRule="exact"/>
+      </w:pPr>
+      <w:r>
+        <w:rPr>
+          <w:rFonts w:ascii="TH SarabunPSK" w:hAnsi="TH SarabunPSK" w:cs="TH SarabunPSK" w:eastAsia="TH SarabunPSK"/>
+          <w:b w:val="0"/>
+          <w:sz w:val="21"/>
+          <w:szCs w:val="21"/>
+        </w:rPr>
+        <w:t>วปอ.สปท.</w:t>
+      </w:r>
+    </w:p>
+    <w:p>
+      <w:pPr>
+        <w:spacing w:before="0" w:after="0" w:line="364" w:lineRule="exact"/>
+      </w:pPr>
+      <w:r>
+        <w:rPr>
+          <w:rFonts w:ascii="TH SarabunPSK" w:hAnsi="TH SarabunPSK" w:cs="TH SarabunPSK" w:eastAsia="TH SarabunPSK"/>
+          <w:b w:val="0"/>
+          <w:sz w:val="21"/>
+          <w:szCs w:val="21"/>
+        </w:rPr>
+        <w:t>กห ๐๓๑๗.๒/๑๖๑๑</w:t>
+      </w:r>
+    </w:p>
+    <w:p>
+      <w:pPr>
+        <w:spacing w:before="0" w:after="0" w:line="364" w:lineRule="exact"/>
+      </w:pPr>
+      <w:r>
+        <w:rPr>
+          <w:rFonts w:ascii="TH SarabunPSK" w:hAnsi="TH SarabunPSK" w:cs="TH SarabunPSK" w:eastAsia="TH SarabunPSK"/>
+          <w:b w:val="0"/>
+          <w:sz w:val="21"/>
+          <w:szCs w:val="21"/>
+        </w:rPr>
+        <w:t>โทร. ๐ ๒๕๗๒ ๒๕๒๗</w:t>
+      </w:r>
+    </w:p>
+    <w:p>
+      <w:pPr>
+        <w:tabs>
+          <w:tab w:pos="3028" w:val="left"/>
+        </w:tabs>
+        <w:spacing w:before="580" w:after="0" w:line="440" w:lineRule="exact"/>
+        <w:ind w:left="3028" w:hanging="720"/>
+      </w:pPr>
+      <w:r>
+        <w:rPr>
+          <w:rFonts w:ascii="TH SarabunPSK" w:hAnsi="TH SarabunPSK" w:cs="TH SarabunPSK" w:eastAsia="TH SarabunPSK"/>
+          <w:b/>
+          <w:sz w:val="26"/>
+          <w:szCs w:val="26"/>
+          <w:bCs/>
+        </w:rPr>
+        <w:t>เรียน</w:t>
+        <w:tab/>
+        <w:t>ห้างหุ้นส่วนจำกัด ศ.วีระพันธ์</w:t>
+      </w:r>
+    </w:p>
+    <w:p>
+      <w:pPr>
+        <w:pageBreakBefore/>
+        <w:spacing w:before="0" w:after="0" w:line="364" w:lineRule="exact"/>
+      </w:pPr>
+      <w:r>
+        <w:rPr>
+          <w:rFonts w:ascii="TH SarabunPSK" w:hAnsi="TH SarabunPSK" w:cs="TH SarabunPSK" w:eastAsia="TH SarabunPSK"/>
+          <w:b w:val="0"/>
+          <w:sz w:val="21"/>
+          <w:szCs w:val="21"/>
+        </w:rPr>
+        <w:t>วปอ.สปท.</w:t>
+      </w:r>
+    </w:p>
+    <w:p>
+      <w:pPr>
+        <w:spacing w:before="0" w:after="0" w:line="364" w:lineRule="exact"/>
+      </w:pPr>
+      <w:r>
+        <w:rPr>
+          <w:rFonts w:ascii="TH SarabunPSK" w:hAnsi="TH SarabunPSK" w:cs="TH SarabunPSK" w:eastAsia="TH SarabunPSK"/>
+          <w:b w:val="0"/>
+          <w:sz w:val="21"/>
+          <w:szCs w:val="21"/>
+        </w:rPr>
+        <w:t>กห ๐๓๑๗.๒/๑๖๑๑</w:t>
+      </w:r>
+    </w:p>
+    <w:p>
+      <w:pPr>
+        <w:spacing w:before="0" w:after="0" w:line="364" w:lineRule="exact"/>
+      </w:pPr>
+      <w:r>
+        <w:rPr>
+          <w:rFonts w:ascii="TH SarabunPSK" w:hAnsi="TH SarabunPSK" w:cs="TH SarabunPSK" w:eastAsia="TH SarabunPSK"/>
+          <w:b w:val="0"/>
+          <w:sz w:val="21"/>
+          <w:szCs w:val="21"/>
+        </w:rPr>
+        <w:t>โทร. ๐ ๒๕๗๒ ๒๕๒๗</w:t>
+      </w:r>
+    </w:p>
+    <w:p>
+      <w:pPr>
+        <w:tabs>
+          <w:tab w:pos="3028" w:val="left"/>
+        </w:tabs>
+        <w:spacing w:before="580" w:after="0" w:line="440" w:lineRule="exact"/>
+        <w:ind w:left="3028" w:hanging="720"/>
+      </w:pPr>
+      <w:r>
+        <w:rPr>
+          <w:rFonts w:ascii="TH SarabunPSK" w:hAnsi="TH SarabunPSK" w:cs="TH SarabunPSK" w:eastAsia="TH SarabunPSK"/>
+          <w:b/>
+          <w:sz w:val="26"/>
+          <w:szCs w:val="26"/>
+          <w:bCs/>
+        </w:rPr>
+        <w:t>เรียน</w:t>
+        <w:tab/>
+        <w:t>ร้าน สูทสภา (อรุณลักษณ์สูทสภา)</w:t>
+      </w:r>
+    </w:p>
+    <w:p>
+      <w:pPr>
+        <w:pageBreakBefore/>
+        <w:spacing w:before="0" w:after="0" w:line="364" w:lineRule="exact"/>
+      </w:pPr>
+      <w:r>
+        <w:rPr>
+          <w:rFonts w:ascii="TH SarabunPSK" w:hAnsi="TH SarabunPSK" w:cs="TH SarabunPSK" w:eastAsia="TH SarabunPSK"/>
+          <w:b w:val="0"/>
+          <w:sz w:val="21"/>
+          <w:szCs w:val="21"/>
+        </w:rPr>
+        <w:t>วปอ.สปท.</w:t>
+      </w:r>
+    </w:p>
+    <w:p>
+      <w:pPr>
+        <w:spacing w:before="0" w:after="0" w:line="364" w:lineRule="exact"/>
+      </w:pPr>
+      <w:r>
+        <w:rPr>
+          <w:rFonts w:ascii="TH SarabunPSK" w:hAnsi="TH SarabunPSK" w:cs="TH SarabunPSK" w:eastAsia="TH SarabunPSK"/>
+          <w:b w:val="0"/>
+          <w:sz w:val="21"/>
+          <w:szCs w:val="21"/>
+        </w:rPr>
+        <w:t>กห ๐๓๑๗.๒/๑๖๑๑</w:t>
+      </w:r>
+    </w:p>
+    <w:p>
+      <w:pPr>
+        <w:spacing w:before="0" w:after="0" w:line="364" w:lineRule="exact"/>
+      </w:pPr>
+      <w:r>
+        <w:rPr>
+          <w:rFonts w:ascii="TH SarabunPSK" w:hAnsi="TH SarabunPSK" w:cs="TH SarabunPSK" w:eastAsia="TH SarabunPSK"/>
+          <w:b w:val="0"/>
+          <w:sz w:val="21"/>
+          <w:szCs w:val="21"/>
+        </w:rPr>
+        <w:t>โทร. ๐ ๒๕๗๒ ๒๕๒๗</w:t>
+      </w:r>
+    </w:p>
+    <w:p>
+      <w:pPr>
+        <w:tabs>
+          <w:tab w:pos="3028" w:val="left"/>
+        </w:tabs>
+        <w:spacing w:before="580" w:after="0" w:line="440" w:lineRule="exact"/>
+        <w:ind w:left="3028" w:hanging="720"/>
+      </w:pPr>
+      <w:r>
+        <w:rPr>
+          <w:rFonts w:ascii="TH SarabunPSK" w:hAnsi="TH SarabunPSK" w:cs="TH SarabunPSK" w:eastAsia="TH SarabunPSK"/>
+          <w:b/>
+          <w:sz w:val="26"/>
+          <w:szCs w:val="26"/>
+          <w:bCs/>
+        </w:rPr>
+        <w:t>เรียน</w:t>
+        <w:tab/>
+        <w:t>ร้าน John Perfect Tailor</w:t>
+      </w:r>
+    </w:p>
+    <w:p>
+      <w:pPr>
+        <w:pageBreakBefore/>
+        <w:spacing w:before="0" w:after="0" w:line="364" w:lineRule="exact"/>
+      </w:pPr>
+      <w:r>
+        <w:rPr>
+          <w:rFonts w:ascii="TH SarabunPSK" w:hAnsi="TH SarabunPSK" w:cs="TH SarabunPSK" w:eastAsia="TH SarabunPSK"/>
+          <w:b w:val="0"/>
+          <w:sz w:val="21"/>
+          <w:szCs w:val="21"/>
+        </w:rPr>
+        <w:t>วปอ.สปท.</w:t>
+      </w:r>
+    </w:p>
+    <w:p>
+      <w:pPr>
+        <w:spacing w:before="0" w:after="0" w:line="364" w:lineRule="exact"/>
+      </w:pPr>
+      <w:r>
+        <w:rPr>
+          <w:rFonts w:ascii="TH SarabunPSK" w:hAnsi="TH SarabunPSK" w:cs="TH SarabunPSK" w:eastAsia="TH SarabunPSK"/>
+          <w:b w:val="0"/>
+          <w:sz w:val="21"/>
+          <w:szCs w:val="21"/>
+        </w:rPr>
+        <w:t>กห ๐๓๑๗.๒/๑๖๑๑</w:t>
+      </w:r>
+    </w:p>
+    <w:p>
+      <w:pPr>
+        <w:spacing w:before="0" w:after="0" w:line="364" w:lineRule="exact"/>
+      </w:pPr>
+      <w:r>
+        <w:rPr>
+          <w:rFonts w:ascii="TH SarabunPSK" w:hAnsi="TH SarabunPSK" w:cs="TH SarabunPSK" w:eastAsia="TH SarabunPSK"/>
+          <w:b w:val="0"/>
+          <w:sz w:val="21"/>
+          <w:szCs w:val="21"/>
+        </w:rPr>
+        <w:t>โทร. ๐ ๒๕๗๒ ๒๕๒๗</w:t>
+      </w:r>
+    </w:p>
+    <w:p>
+      <w:pPr>
+        <w:tabs>
+          <w:tab w:pos="3028" w:val="left"/>
+        </w:tabs>
+        <w:spacing w:before="580" w:after="0" w:line="440" w:lineRule="exact"/>
+        <w:ind w:left="3028" w:hanging="720"/>
+      </w:pPr>
+      <w:r>
+        <w:rPr>
+          <w:rFonts w:ascii="TH SarabunPSK" w:hAnsi="TH SarabunPSK" w:cs="TH SarabunPSK" w:eastAsia="TH SarabunPSK"/>
+          <w:b/>
+          <w:sz w:val="26"/>
+          <w:szCs w:val="26"/>
+          <w:bCs/>
+        </w:rPr>
+        <w:t>เรียน</w:t>
+        <w:tab/>
+        <w:t>ร้าน เด่นแชมป์สูท</w:t>
+      </w:r>
+    </w:p>
+    <w:p>
+      <w:pPr>
+        <w:pageBreakBefore/>
+        <w:spacing w:before="0" w:after="0" w:line="364" w:lineRule="exact"/>
+      </w:pPr>
+      <w:r>
+        <w:rPr>
+          <w:rFonts w:ascii="TH SarabunPSK" w:hAnsi="TH SarabunPSK" w:cs="TH SarabunPSK" w:eastAsia="TH SarabunPSK"/>
+          <w:b w:val="0"/>
+          <w:sz w:val="21"/>
+          <w:szCs w:val="21"/>
+        </w:rPr>
+        <w:t>วปอ.สปท.</w:t>
+      </w:r>
+    </w:p>
+    <w:p>
+      <w:pPr>
+        <w:spacing w:before="0" w:after="0" w:line="364" w:lineRule="exact"/>
+      </w:pPr>
+      <w:r>
+        <w:rPr>
+          <w:rFonts w:ascii="TH SarabunPSK" w:hAnsi="TH SarabunPSK" w:cs="TH SarabunPSK" w:eastAsia="TH SarabunPSK"/>
+          <w:b w:val="0"/>
+          <w:sz w:val="21"/>
+          <w:szCs w:val="21"/>
+        </w:rPr>
+        <w:t>กห ๐๓๑๗.๒/๑๖๑๑</w:t>
+      </w:r>
+    </w:p>
+    <w:p>
+      <w:pPr>
+        <w:spacing w:before="0" w:after="0" w:line="364" w:lineRule="exact"/>
+      </w:pPr>
+      <w:r>
+        <w:rPr>
+          <w:rFonts w:ascii="TH SarabunPSK" w:hAnsi="TH SarabunPSK" w:cs="TH SarabunPSK" w:eastAsia="TH SarabunPSK"/>
+          <w:b w:val="0"/>
+          <w:sz w:val="21"/>
+          <w:szCs w:val="21"/>
+        </w:rPr>
+        <w:t>โทร. ๐ ๒๕๗๒ ๒๕๒๗</w:t>
+      </w:r>
+    </w:p>
+    <w:p>
+      <w:pPr>
+        <w:tabs>
+          <w:tab w:pos="3028" w:val="left"/>
+        </w:tabs>
+        <w:spacing w:before="580" w:after="0" w:line="440" w:lineRule="exact"/>
+        <w:ind w:left="3028" w:hanging="720"/>
+      </w:pPr>
+      <w:r>
+        <w:rPr>
+          <w:rFonts w:ascii="TH SarabunPSK" w:hAnsi="TH SarabunPSK" w:cs="TH SarabunPSK" w:eastAsia="TH SarabunPSK"/>
+          <w:b/>
+          <w:sz w:val="26"/>
+          <w:szCs w:val="26"/>
+          <w:bCs/>
+        </w:rPr>
+        <w:t>เรียน</w:t>
+        <w:tab/>
+        <w:t>ร้าน AR Tailor House (ร้านชูวิทย์)</w:t>
+      </w:r>
+    </w:p>
+    <w:p>
+      <w:pPr>
+        <w:pageBreakBefore/>
+        <w:spacing w:before="0" w:after="0" w:line="364" w:lineRule="exact"/>
+      </w:pPr>
+      <w:r>
+        <w:rPr>
+          <w:rFonts w:ascii="TH SarabunPSK" w:hAnsi="TH SarabunPSK" w:cs="TH SarabunPSK" w:eastAsia="TH SarabunPSK"/>
+          <w:b w:val="0"/>
+          <w:sz w:val="21"/>
+          <w:szCs w:val="21"/>
+        </w:rPr>
+        <w:t>วปอ.สปท.</w:t>
+      </w:r>
+    </w:p>
+    <w:p>
+      <w:pPr>
+        <w:spacing w:before="0" w:after="0" w:line="364" w:lineRule="exact"/>
+      </w:pPr>
+      <w:r>
+        <w:rPr>
+          <w:rFonts w:ascii="TH SarabunPSK" w:hAnsi="TH SarabunPSK" w:cs="TH SarabunPSK" w:eastAsia="TH SarabunPSK"/>
+          <w:b w:val="0"/>
+          <w:sz w:val="21"/>
+          <w:szCs w:val="21"/>
+        </w:rPr>
+        <w:t>กห ๐๓๑๗.๒/๑๖๑๑</w:t>
+      </w:r>
+    </w:p>
+    <w:p>
+      <w:pPr>
+        <w:spacing w:before="0" w:after="0" w:line="364" w:lineRule="exact"/>
+      </w:pPr>
+      <w:r>
+        <w:rPr>
+          <w:rFonts w:ascii="TH SarabunPSK" w:hAnsi="TH SarabunPSK" w:cs="TH SarabunPSK" w:eastAsia="TH SarabunPSK"/>
+          <w:b w:val="0"/>
+          <w:sz w:val="21"/>
+          <w:szCs w:val="21"/>
+        </w:rPr>
+        <w:t>โทร. ๐ ๒๕๗๒ ๒๕๒๗</w:t>
+      </w:r>
+    </w:p>
+    <w:p>
+      <w:pPr>
+        <w:tabs>
+          <w:tab w:pos="3028" w:val="left"/>
+        </w:tabs>
+        <w:spacing w:before="580" w:after="0" w:line="440" w:lineRule="exact"/>
+        <w:ind w:left="3028" w:hanging="720"/>
+      </w:pPr>
+      <w:r>
+        <w:rPr>
+          <w:rFonts w:ascii="TH SarabunPSK" w:hAnsi="TH SarabunPSK" w:cs="TH SarabunPSK" w:eastAsia="TH SarabunPSK"/>
+          <w:b/>
+          <w:sz w:val="26"/>
+          <w:szCs w:val="26"/>
+          <w:bCs/>
+        </w:rPr>
+        <w:t>เรียน</w:t>
+        <w:tab/>
+        <w:t>ร้าน สูทเวิลด์เซ็นเตอร์</w:t>
+      </w:r>
+    </w:p>
+    <w:p>
+      <w:pPr>
+        <w:pageBreakBefore/>
+        <w:spacing w:before="0" w:after="0" w:line="364" w:lineRule="exact"/>
+      </w:pPr>
+      <w:r>
+        <w:rPr>
+          <w:rFonts w:ascii="TH SarabunPSK" w:hAnsi="TH SarabunPSK" w:cs="TH SarabunPSK" w:eastAsia="TH SarabunPSK"/>
+          <w:b w:val="0"/>
+          <w:sz w:val="21"/>
+          <w:szCs w:val="21"/>
+        </w:rPr>
+        <w:t>วปอ.สปท.</w:t>
+      </w:r>
+    </w:p>
+    <w:p>
+      <w:pPr>
+        <w:spacing w:before="0" w:after="0" w:line="364" w:lineRule="exact"/>
+      </w:pPr>
+      <w:r>
+        <w:rPr>
+          <w:rFonts w:ascii="TH SarabunPSK" w:hAnsi="TH SarabunPSK" w:cs="TH SarabunPSK" w:eastAsia="TH SarabunPSK"/>
+          <w:b w:val="0"/>
+          <w:sz w:val="21"/>
+          <w:szCs w:val="21"/>
+        </w:rPr>
+        <w:t>กห ๐๓๑๗.๒/๑๖๑๑</w:t>
+      </w:r>
+    </w:p>
+    <w:p>
+      <w:pPr>
+        <w:spacing w:before="0" w:after="0" w:line="364" w:lineRule="exact"/>
+      </w:pPr>
+      <w:r>
+        <w:rPr>
+          <w:rFonts w:ascii="TH SarabunPSK" w:hAnsi="TH SarabunPSK" w:cs="TH SarabunPSK" w:eastAsia="TH SarabunPSK"/>
+          <w:b w:val="0"/>
+          <w:sz w:val="21"/>
+          <w:szCs w:val="21"/>
+        </w:rPr>
+        <w:t>โทร. ๐ ๒๕๗๒ ๒๕๒๗</w:t>
+      </w:r>
+    </w:p>
+    <w:p>
+      <w:pPr>
+        <w:tabs>
+          <w:tab w:pos="3028" w:val="left"/>
+        </w:tabs>
+        <w:spacing w:before="580" w:after="0" w:line="440" w:lineRule="exact"/>
+        <w:ind w:left="3028" w:hanging="720"/>
+      </w:pPr>
+      <w:r>
+        <w:rPr>
+          <w:rFonts w:ascii="TH SarabunPSK" w:hAnsi="TH SarabunPSK" w:cs="TH SarabunPSK" w:eastAsia="TH SarabunPSK"/>
+          <w:b/>
+          <w:sz w:val="26"/>
+          <w:szCs w:val="26"/>
+          <w:bCs/>
+        </w:rPr>
+        <w:t>เรียน</w:t>
+        <w:tab/>
+        <w:t>ร้าน ช่อชัยพฤกษ์</w:t>
+      </w:r>
+    </w:p>
+    <w:p>
+      <w:pPr>
+        <w:pageBreakBefore/>
+        <w:spacing w:before="0" w:after="0" w:line="364" w:lineRule="exact"/>
+      </w:pPr>
+      <w:r>
+        <w:rPr>
+          <w:rFonts w:ascii="TH SarabunPSK" w:hAnsi="TH SarabunPSK" w:cs="TH SarabunPSK" w:eastAsia="TH SarabunPSK"/>
+          <w:b w:val="0"/>
+          <w:sz w:val="21"/>
+          <w:szCs w:val="21"/>
+        </w:rPr>
+        <w:t>วปอ.สปท.</w:t>
+      </w:r>
+    </w:p>
+    <w:p>
+      <w:pPr>
+        <w:spacing w:before="0" w:after="0" w:line="364" w:lineRule="exact"/>
+      </w:pPr>
+      <w:r>
+        <w:rPr>
+          <w:rFonts w:ascii="TH SarabunPSK" w:hAnsi="TH SarabunPSK" w:cs="TH SarabunPSK" w:eastAsia="TH SarabunPSK"/>
+          <w:b w:val="0"/>
+          <w:sz w:val="21"/>
+          <w:szCs w:val="21"/>
+        </w:rPr>
+        <w:t>กห ๐๓๑๗.๒/๑๖๑๑</w:t>
+      </w:r>
+    </w:p>
+    <w:p>
+      <w:pPr>
+        <w:spacing w:before="0" w:after="0" w:line="364" w:lineRule="exact"/>
+      </w:pPr>
+      <w:r>
+        <w:rPr>
+          <w:rFonts w:ascii="TH SarabunPSK" w:hAnsi="TH SarabunPSK" w:cs="TH SarabunPSK" w:eastAsia="TH SarabunPSK"/>
+          <w:b w:val="0"/>
+          <w:sz w:val="21"/>
+          <w:szCs w:val="21"/>
+        </w:rPr>
+        <w:t>โทร. ๐ ๒๕๗๒ ๒๕๒๗</w:t>
+      </w:r>
+    </w:p>
+    <w:p>
+      <w:pPr>
+        <w:tabs>
+          <w:tab w:pos="3028" w:val="left"/>
+        </w:tabs>
+        <w:spacing w:before="580" w:after="0" w:line="440" w:lineRule="exact"/>
+        <w:ind w:left="3028" w:hanging="720"/>
+      </w:pPr>
+      <w:r>
+        <w:rPr>
+          <w:rFonts w:ascii="TH SarabunPSK" w:hAnsi="TH SarabunPSK" w:cs="TH SarabunPSK" w:eastAsia="TH SarabunPSK"/>
+          <w:b/>
+          <w:sz w:val="26"/>
+          <w:szCs w:val="26"/>
+          <w:bCs/>
+        </w:rPr>
+        <w:t>เรียน</w:t>
+        <w:tab/>
+        <w:t>บริษัท สูทแน็ค จำกัด</w:t>
+      </w:r>
+    </w:p>
+    <w:p>
+      <w:pPr>
+        <w:pageBreakBefore/>
+        <w:spacing w:before="0" w:after="0" w:line="364" w:lineRule="exact"/>
+      </w:pPr>
+      <w:r>
+        <w:rPr>
+          <w:rFonts w:ascii="TH SarabunPSK" w:hAnsi="TH SarabunPSK" w:cs="TH SarabunPSK" w:eastAsia="TH SarabunPSK"/>
+          <w:b w:val="0"/>
+          <w:sz w:val="21"/>
+          <w:szCs w:val="21"/>
+        </w:rPr>
+        <w:t>วปอ.สปท.</w:t>
+      </w:r>
+    </w:p>
+    <w:p>
+      <w:pPr>
+        <w:spacing w:before="0" w:after="0" w:line="364" w:lineRule="exact"/>
+      </w:pPr>
+      <w:r>
+        <w:rPr>
+          <w:rFonts w:ascii="TH SarabunPSK" w:hAnsi="TH SarabunPSK" w:cs="TH SarabunPSK" w:eastAsia="TH SarabunPSK"/>
+          <w:b w:val="0"/>
+          <w:sz w:val="21"/>
+          <w:szCs w:val="21"/>
+        </w:rPr>
+        <w:t>กห ๐๓๑๗.๒/๑๖๑๑</w:t>
+      </w:r>
+    </w:p>
+    <w:p>
+      <w:pPr>
+        <w:spacing w:before="0" w:after="0" w:line="364" w:lineRule="exact"/>
+      </w:pPr>
+      <w:r>
+        <w:rPr>
+          <w:rFonts w:ascii="TH SarabunPSK" w:hAnsi="TH SarabunPSK" w:cs="TH SarabunPSK" w:eastAsia="TH SarabunPSK"/>
+          <w:b w:val="0"/>
+          <w:sz w:val="21"/>
+          <w:szCs w:val="21"/>
+        </w:rPr>
+        <w:t>โทร. ๐ ๒๕๗๒ ๒๕๒๗</w:t>
+      </w:r>
+    </w:p>
+    <w:p>
+      <w:pPr>
+        <w:tabs>
+          <w:tab w:pos="3028" w:val="left"/>
+        </w:tabs>
+        <w:spacing w:before="580" w:after="0" w:line="440" w:lineRule="exact"/>
+        <w:ind w:left="3028" w:hanging="720"/>
+      </w:pPr>
+      <w:r>
+        <w:rPr>
+          <w:rFonts w:ascii="TH SarabunPSK" w:hAnsi="TH SarabunPSK" w:cs="TH SarabunPSK" w:eastAsia="TH SarabunPSK"/>
+          <w:b/>
+          <w:sz w:val="26"/>
+          <w:szCs w:val="26"/>
+          <w:bCs/>
+        </w:rPr>
+        <w:t>เรียน</w:t>
+        <w:tab/>
+        <w:t>ร้าน สูททะนง</w:t>
+      </w:r>
+    </w:p>
+    <w:p>
+      <w:pPr>
+        <w:pageBreakBefore/>
+        <w:spacing w:before="0" w:after="0" w:line="364" w:lineRule="exact"/>
+      </w:pPr>
+      <w:r>
+        <w:rPr>
+          <w:rFonts w:ascii="TH SarabunPSK" w:hAnsi="TH SarabunPSK" w:cs="TH SarabunPSK" w:eastAsia="TH SarabunPSK"/>
+          <w:b w:val="0"/>
+          <w:sz w:val="21"/>
+          <w:szCs w:val="21"/>
+        </w:rPr>
+        <w:t>วปอ.สปท.</w:t>
+      </w:r>
+    </w:p>
+    <w:p>
+      <w:pPr>
+        <w:spacing w:before="0" w:after="0" w:line="364" w:lineRule="exact"/>
+      </w:pPr>
+      <w:r>
+        <w:rPr>
+          <w:rFonts w:ascii="TH SarabunPSK" w:hAnsi="TH SarabunPSK" w:cs="TH SarabunPSK" w:eastAsia="TH SarabunPSK"/>
+          <w:b w:val="0"/>
+          <w:sz w:val="21"/>
+          <w:szCs w:val="21"/>
+        </w:rPr>
+        <w:t>กห ๐๓๑๗.๒/๑๖๑๑</w:t>
+      </w:r>
+    </w:p>
+    <w:p>
+      <w:pPr>
+        <w:spacing w:before="0" w:after="0" w:line="364" w:lineRule="exact"/>
+      </w:pPr>
+      <w:r>
+        <w:rPr>
+          <w:rFonts w:ascii="TH SarabunPSK" w:hAnsi="TH SarabunPSK" w:cs="TH SarabunPSK" w:eastAsia="TH SarabunPSK"/>
+          <w:b w:val="0"/>
+          <w:sz w:val="21"/>
+          <w:szCs w:val="21"/>
+        </w:rPr>
+        <w:t>โทร. ๐ ๒๕๗๒ ๒๕๒๗</w:t>
+      </w:r>
+    </w:p>
+    <w:p>
+      <w:pPr>
+        <w:tabs>
+          <w:tab w:pos="3028" w:val="left"/>
+        </w:tabs>
+        <w:spacing w:before="580" w:after="0" w:line="440" w:lineRule="exact"/>
+        <w:ind w:left="3028" w:hanging="720"/>
+      </w:pPr>
+      <w:r>
+        <w:rPr>
+          <w:rFonts w:ascii="TH SarabunPSK" w:hAnsi="TH SarabunPSK" w:cs="TH SarabunPSK" w:eastAsia="TH SarabunPSK"/>
+          <w:b/>
+          <w:sz w:val="26"/>
+          <w:szCs w:val="26"/>
+          <w:bCs/>
+        </w:rPr>
+        <w:t>เรียน</w:t>
+        <w:tab/>
+        <w:t>ร้าน Aek Siam Tailor</w:t>
+      </w:r>
+    </w:p>
+    <w:p>
+      <w:pPr>
+        <w:pageBreakBefore/>
+        <w:spacing w:before="0" w:after="0" w:line="364" w:lineRule="exact"/>
+      </w:pPr>
+      <w:r>
+        <w:rPr>
+          <w:rFonts w:ascii="TH SarabunPSK" w:hAnsi="TH SarabunPSK" w:cs="TH SarabunPSK" w:eastAsia="TH SarabunPSK"/>
+          <w:b w:val="0"/>
+          <w:sz w:val="21"/>
+          <w:szCs w:val="21"/>
+        </w:rPr>
+        <w:t>วปอ.สปท.</w:t>
+      </w:r>
+    </w:p>
+    <w:p>
+      <w:pPr>
+        <w:spacing w:before="0" w:after="0" w:line="364" w:lineRule="exact"/>
+      </w:pPr>
+      <w:r>
+        <w:rPr>
+          <w:rFonts w:ascii="TH SarabunPSK" w:hAnsi="TH SarabunPSK" w:cs="TH SarabunPSK" w:eastAsia="TH SarabunPSK"/>
+          <w:b w:val="0"/>
+          <w:sz w:val="21"/>
+          <w:szCs w:val="21"/>
+        </w:rPr>
+        <w:t>กห ๐๓๑๗.๒/๑๖๑๑</w:t>
+      </w:r>
+    </w:p>
+    <w:p>
+      <w:pPr>
+        <w:spacing w:before="0" w:after="0" w:line="364" w:lineRule="exact"/>
+      </w:pPr>
+      <w:r>
+        <w:rPr>
+          <w:rFonts w:ascii="TH SarabunPSK" w:hAnsi="TH SarabunPSK" w:cs="TH SarabunPSK" w:eastAsia="TH SarabunPSK"/>
+          <w:b w:val="0"/>
+          <w:sz w:val="21"/>
+          <w:szCs w:val="21"/>
+        </w:rPr>
+        <w:t>โทร. ๐ ๒๕๗๒ ๒๕๒๗</w:t>
+      </w:r>
+    </w:p>
+    <w:p>
+      <w:pPr>
+        <w:tabs>
+          <w:tab w:pos="3028" w:val="left"/>
+        </w:tabs>
+        <w:spacing w:before="580" w:after="0" w:line="440" w:lineRule="exact"/>
+        <w:ind w:left="3028" w:hanging="720"/>
+      </w:pPr>
+      <w:r>
+        <w:rPr>
+          <w:rFonts w:ascii="TH SarabunPSK" w:hAnsi="TH SarabunPSK" w:cs="TH SarabunPSK" w:eastAsia="TH SarabunPSK"/>
+          <w:b/>
+          <w:sz w:val="26"/>
+          <w:szCs w:val="26"/>
+          <w:bCs/>
+        </w:rPr>
+        <w:t>เรียน</w:t>
+        <w:tab/>
+        <w:t>บริษัท ทวินสูท จำกัด</w:t>
+      </w:r>
+    </w:p>
+    <w:p>
+      <w:pPr>
+        <w:pageBreakBefore/>
+        <w:spacing w:before="0" w:after="0" w:line="364" w:lineRule="exact"/>
+      </w:pPr>
+      <w:r>
+        <w:rPr>
+          <w:rFonts w:ascii="TH SarabunPSK" w:hAnsi="TH SarabunPSK" w:cs="TH SarabunPSK" w:eastAsia="TH SarabunPSK"/>
+          <w:b w:val="0"/>
+          <w:sz w:val="21"/>
+          <w:szCs w:val="21"/>
+        </w:rPr>
+        <w:t>วปอ.สปท.</w:t>
+      </w:r>
+    </w:p>
+    <w:p>
+      <w:pPr>
+        <w:spacing w:before="0" w:after="0" w:line="364" w:lineRule="exact"/>
+      </w:pPr>
+      <w:r>
+        <w:rPr>
+          <w:rFonts w:ascii="TH SarabunPSK" w:hAnsi="TH SarabunPSK" w:cs="TH SarabunPSK" w:eastAsia="TH SarabunPSK"/>
+          <w:b w:val="0"/>
+          <w:sz w:val="21"/>
+          <w:szCs w:val="21"/>
+        </w:rPr>
+        <w:t>กห ๐๓๑๗.๒/๑๖๑๑</w:t>
+      </w:r>
+    </w:p>
+    <w:p>
+      <w:pPr>
+        <w:spacing w:before="0" w:after="0" w:line="364" w:lineRule="exact"/>
+      </w:pPr>
+      <w:r>
+        <w:rPr>
+          <w:rFonts w:ascii="TH SarabunPSK" w:hAnsi="TH SarabunPSK" w:cs="TH SarabunPSK" w:eastAsia="TH SarabunPSK"/>
+          <w:b w:val="0"/>
+          <w:sz w:val="21"/>
+          <w:szCs w:val="21"/>
+        </w:rPr>
+        <w:t>โทร. ๐ ๒๕๗๒ ๒๕๒๗</w:t>
+      </w:r>
+    </w:p>
+    <w:p>
+      <w:pPr>
+        <w:tabs>
+          <w:tab w:pos="3028" w:val="left"/>
+        </w:tabs>
+        <w:spacing w:before="580" w:after="0" w:line="440" w:lineRule="exact"/>
+        <w:ind w:left="3028" w:hanging="720"/>
       </w:pPr>
       <w:r>
         <w:rPr>

</xml_diff>

<commit_message>
Center เรียน block per example envelopes, wrap only long names
Co-Authored-By: Claude Opus 5.5 <noreply@anthropic.com>
Claude-Session: https://claude.ai/code/session_01J3NTsmEhLtUpdxrpfiWApU
</commit_message>
<xml_diff>
--- a/output/ซองเรียน_94_หน่วย.docx
+++ b/output/ซองเรียน_94_หน่วย.docx
@@ -47,10 +47,10 @@
     <w:p>
       <w:pPr>
         <w:tabs>
-          <w:tab w:pos="3028" w:val="left"/>
+          <w:tab w:pos="2068" w:val="left"/>
         </w:tabs>
         <w:spacing w:before="580" w:after="0" w:line="440" w:lineRule="exact"/>
-        <w:ind w:left="3028" w:hanging="720"/>
+        <w:ind w:left="2068" w:hanging="720"/>
       </w:pPr>
       <w:r>
         <w:rPr>
@@ -62,9 +62,60 @@
         </w:rPr>
         <w:t>เรียน</w:t>
         <w:tab/>
-        <w:t>ผู้บังคับกองพันระวังป้องกัน สำนักกองบัญชาการ</w:t>
-        <w:br/>
-      </w:r>
+        <w:t>ผู้บังคับกองพันระวังป้องกัน สำนักกองบัญชาการ กองบัญชาการกองทัพไทย</w:t>
+      </w:r>
+    </w:p>
+    <w:p>
+      <w:pPr>
+        <w:pageBreakBefore/>
+        <w:spacing w:before="0" w:after="0" w:line="364" w:lineRule="exact"/>
+      </w:pPr>
+      <w:r>
+        <w:rPr>
+          <w:rFonts w:ascii="TH SarabunPSK" w:hAnsi="TH SarabunPSK" w:cs="TH SarabunPSK" w:eastAsia="TH SarabunPSK"/>
+          <w:b w:val="0"/>
+          <w:sz w:val="21"/>
+          <w:szCs w:val="21"/>
+        </w:rPr>
+        <w:t>วปอ.สปท.</w:t>
+      </w:r>
+    </w:p>
+    <w:p>
+      <w:pPr>
+        <w:spacing w:before="0" w:after="0" w:line="364" w:lineRule="exact"/>
+      </w:pPr>
+      <w:r>
+        <w:rPr>
+          <w:rFonts w:ascii="TH SarabunPSK" w:hAnsi="TH SarabunPSK" w:cs="TH SarabunPSK" w:eastAsia="TH SarabunPSK"/>
+          <w:b w:val="0"/>
+          <w:sz w:val="21"/>
+          <w:szCs w:val="21"/>
+        </w:rPr>
+        <w:t>กห ๐๓๑๗.๒/๑๖๑๑</w:t>
+      </w:r>
+    </w:p>
+    <w:p>
+      <w:pPr>
+        <w:spacing w:before="0" w:after="0" w:line="364" w:lineRule="exact"/>
+      </w:pPr>
+      <w:r>
+        <w:rPr>
+          <w:rFonts w:ascii="TH SarabunPSK" w:hAnsi="TH SarabunPSK" w:cs="TH SarabunPSK" w:eastAsia="TH SarabunPSK"/>
+          <w:b w:val="0"/>
+          <w:sz w:val="21"/>
+          <w:szCs w:val="21"/>
+        </w:rPr>
+        <w:t>โทร. ๐ ๒๕๗๒ ๒๕๒๗</w:t>
+      </w:r>
+    </w:p>
+    <w:p>
+      <w:pPr>
+        <w:tabs>
+          <w:tab w:pos="1994" w:val="left"/>
+        </w:tabs>
+        <w:spacing w:before="580" w:after="0" w:line="440" w:lineRule="exact"/>
+        <w:ind w:left="1994" w:hanging="720"/>
+      </w:pPr>
       <w:r>
         <w:rPr>
           <w:rFonts w:ascii="TH SarabunPSK" w:hAnsi="TH SarabunPSK" w:cs="TH SarabunPSK" w:eastAsia="TH SarabunPSK"/>
@@ -73,7 +124,9 @@
           <w:szCs w:val="26"/>
           <w:bCs/>
         </w:rPr>
-        <w:t>กองบัญชาการกองทัพไทย</w:t>
+        <w:t>เรียน</w:t>
+        <w:tab/>
+        <w:t>ผู้บังคับกองพันทหารสารวัตร สำนักกองบัญชาการ กองบัญชาการกองทัพไทย</w:t>
       </w:r>
     </w:p>
     <w:p>
@@ -122,10 +175,10 @@
     <w:p>
       <w:pPr>
         <w:tabs>
-          <w:tab w:pos="3028" w:val="left"/>
+          <w:tab w:pos="2902" w:val="left"/>
         </w:tabs>
         <w:spacing w:before="580" w:after="0" w:line="440" w:lineRule="exact"/>
-        <w:ind w:left="3028" w:hanging="720"/>
+        <w:ind w:left="2902" w:hanging="720"/>
       </w:pPr>
       <w:r>
         <w:rPr>
@@ -137,9 +190,60 @@
         </w:rPr>
         <w:t>เรียน</w:t>
         <w:tab/>
-        <w:t>ผู้บังคับกองพันทหารสารวัตร สำนักกองบัญชาการ</w:t>
-        <w:br/>
-      </w:r>
+        <w:t>ผู้อำนวยการสำนักงานเลขานุการ กองบัญชาการกองทัพไทย</w:t>
+      </w:r>
+    </w:p>
+    <w:p>
+      <w:pPr>
+        <w:pageBreakBefore/>
+        <w:spacing w:before="0" w:after="0" w:line="364" w:lineRule="exact"/>
+      </w:pPr>
+      <w:r>
+        <w:rPr>
+          <w:rFonts w:ascii="TH SarabunPSK" w:hAnsi="TH SarabunPSK" w:cs="TH SarabunPSK" w:eastAsia="TH SarabunPSK"/>
+          <w:b w:val="0"/>
+          <w:sz w:val="21"/>
+          <w:szCs w:val="21"/>
+        </w:rPr>
+        <w:t>วปอ.สปท.</w:t>
+      </w:r>
+    </w:p>
+    <w:p>
+      <w:pPr>
+        <w:spacing w:before="0" w:after="0" w:line="364" w:lineRule="exact"/>
+      </w:pPr>
+      <w:r>
+        <w:rPr>
+          <w:rFonts w:ascii="TH SarabunPSK" w:hAnsi="TH SarabunPSK" w:cs="TH SarabunPSK" w:eastAsia="TH SarabunPSK"/>
+          <w:b w:val="0"/>
+          <w:sz w:val="21"/>
+          <w:szCs w:val="21"/>
+        </w:rPr>
+        <w:t>กห ๐๓๑๗.๒/๑๖๑๑</w:t>
+      </w:r>
+    </w:p>
+    <w:p>
+      <w:pPr>
+        <w:spacing w:before="0" w:after="0" w:line="364" w:lineRule="exact"/>
+      </w:pPr>
+      <w:r>
+        <w:rPr>
+          <w:rFonts w:ascii="TH SarabunPSK" w:hAnsi="TH SarabunPSK" w:cs="TH SarabunPSK" w:eastAsia="TH SarabunPSK"/>
+          <w:b w:val="0"/>
+          <w:sz w:val="21"/>
+          <w:szCs w:val="21"/>
+        </w:rPr>
+        <w:t>โทร. ๐ ๒๕๗๒ ๒๕๒๗</w:t>
+      </w:r>
+    </w:p>
+    <w:p>
+      <w:pPr>
+        <w:tabs>
+          <w:tab w:pos="2791" w:val="left"/>
+        </w:tabs>
+        <w:spacing w:before="580" w:after="0" w:line="440" w:lineRule="exact"/>
+        <w:ind w:left="2791" w:hanging="720"/>
+      </w:pPr>
       <w:r>
         <w:rPr>
           <w:rFonts w:ascii="TH SarabunPSK" w:hAnsi="TH SarabunPSK" w:cs="TH SarabunPSK" w:eastAsia="TH SarabunPSK"/>
@@ -148,7 +252,9 @@
           <w:szCs w:val="26"/>
           <w:bCs/>
         </w:rPr>
-        <w:t>กองบัญชาการกองทัพไทย</w:t>
+        <w:t>เรียน</w:t>
+        <w:tab/>
+        <w:t>ผู้อำนวยการสำนักตรวจการปฏิบัติราชการ สำนักงานจเรทหาร</w:t>
       </w:r>
     </w:p>
     <w:p>
@@ -197,10 +303,10 @@
     <w:p>
       <w:pPr>
         <w:tabs>
-          <w:tab w:pos="3028" w:val="left"/>
+          <w:tab w:pos="2931" w:val="left"/>
         </w:tabs>
         <w:spacing w:before="580" w:after="0" w:line="440" w:lineRule="exact"/>
-        <w:ind w:left="3028" w:hanging="720"/>
+        <w:ind w:left="2931" w:hanging="720"/>
       </w:pPr>
       <w:r>
         <w:rPr>
@@ -212,7 +318,7 @@
         </w:rPr>
         <w:t>เรียน</w:t>
         <w:tab/>
-        <w:t>ผู้อำนวยการสำนักงานเลขานุการ กองบัญชาการกองทัพไทย</w:t>
+        <w:t>ผู้อำนวยการสำนักปฏิบัติการ หน่วยบัญชาการไซเบอร์ทหาร</w:t>
       </w:r>
     </w:p>
     <w:p>
@@ -261,10 +367,10 @@
     <w:p>
       <w:pPr>
         <w:tabs>
-          <w:tab w:pos="3028" w:val="left"/>
+          <w:tab w:pos="2706" w:val="left"/>
         </w:tabs>
         <w:spacing w:before="580" w:after="0" w:line="440" w:lineRule="exact"/>
-        <w:ind w:left="3028" w:hanging="720"/>
+        <w:ind w:left="2706" w:hanging="720"/>
       </w:pPr>
       <w:r>
         <w:rPr>
@@ -276,9 +382,60 @@
         </w:rPr>
         <w:t>เรียน</w:t>
         <w:tab/>
-        <w:t>ผู้อำนวยการสำนักตรวจการปฏิบัติราชการ</w:t>
-        <w:br/>
-      </w:r>
+        <w:t>ผู้อำนวยการสำนักนโยบายและแผนกำลังพล กรมกำลังพลทหาร</w:t>
+      </w:r>
+    </w:p>
+    <w:p>
+      <w:pPr>
+        <w:pageBreakBefore/>
+        <w:spacing w:before="0" w:after="0" w:line="364" w:lineRule="exact"/>
+      </w:pPr>
+      <w:r>
+        <w:rPr>
+          <w:rFonts w:ascii="TH SarabunPSK" w:hAnsi="TH SarabunPSK" w:cs="TH SarabunPSK" w:eastAsia="TH SarabunPSK"/>
+          <w:b w:val="0"/>
+          <w:sz w:val="21"/>
+          <w:szCs w:val="21"/>
+        </w:rPr>
+        <w:t>วปอ.สปท.</w:t>
+      </w:r>
+    </w:p>
+    <w:p>
+      <w:pPr>
+        <w:spacing w:before="0" w:after="0" w:line="364" w:lineRule="exact"/>
+      </w:pPr>
+      <w:r>
+        <w:rPr>
+          <w:rFonts w:ascii="TH SarabunPSK" w:hAnsi="TH SarabunPSK" w:cs="TH SarabunPSK" w:eastAsia="TH SarabunPSK"/>
+          <w:b w:val="0"/>
+          <w:sz w:val="21"/>
+          <w:szCs w:val="21"/>
+        </w:rPr>
+        <w:t>กห ๐๓๑๗.๒/๑๖๑๑</w:t>
+      </w:r>
+    </w:p>
+    <w:p>
+      <w:pPr>
+        <w:spacing w:before="0" w:after="0" w:line="364" w:lineRule="exact"/>
+      </w:pPr>
+      <w:r>
+        <w:rPr>
+          <w:rFonts w:ascii="TH SarabunPSK" w:hAnsi="TH SarabunPSK" w:cs="TH SarabunPSK" w:eastAsia="TH SarabunPSK"/>
+          <w:b w:val="0"/>
+          <w:sz w:val="21"/>
+          <w:szCs w:val="21"/>
+        </w:rPr>
+        <w:t>โทร. ๐ ๒๕๗๒ ๒๕๒๗</w:t>
+      </w:r>
+    </w:p>
+    <w:p>
+      <w:pPr>
+        <w:tabs>
+          <w:tab w:pos="3813" w:val="left"/>
+        </w:tabs>
+        <w:spacing w:before="580" w:after="0" w:line="440" w:lineRule="exact"/>
+        <w:ind w:left="3813" w:hanging="720"/>
+      </w:pPr>
       <w:r>
         <w:rPr>
           <w:rFonts w:ascii="TH SarabunPSK" w:hAnsi="TH SarabunPSK" w:cs="TH SarabunPSK" w:eastAsia="TH SarabunPSK"/>
@@ -287,7 +444,9 @@
           <w:szCs w:val="26"/>
           <w:bCs/>
         </w:rPr>
-        <w:t>สำนักงานจเรทหาร</w:t>
+        <w:t>เรียน</w:t>
+        <w:tab/>
+        <w:t>ผู้อำนวยการสำนักข่าวกรอง กรมข่าวทหาร</w:t>
       </w:r>
     </w:p>
     <w:p>
@@ -336,10 +495,10 @@
     <w:p>
       <w:pPr>
         <w:tabs>
-          <w:tab w:pos="3028" w:val="left"/>
+          <w:tab w:pos="3623" w:val="left"/>
         </w:tabs>
         <w:spacing w:before="580" w:after="0" w:line="440" w:lineRule="exact"/>
-        <w:ind w:left="3028" w:hanging="720"/>
+        <w:ind w:left="3623" w:hanging="720"/>
       </w:pPr>
       <w:r>
         <w:rPr>
@@ -351,7 +510,7 @@
         </w:rPr>
         <w:t>เรียน</w:t>
         <w:tab/>
-        <w:t>ผู้อำนวยการสำนักปฏิบัติการ หน่วยบัญชาการไซเบอร์ทหาร</w:t>
+        <w:t>ผู้อำนวยการสำนักวิเทศสัมพันธ์ กรมข่าวทหาร</w:t>
       </w:r>
     </w:p>
     <w:p>
@@ -400,10 +559,10 @@
     <w:p>
       <w:pPr>
         <w:tabs>
-          <w:tab w:pos="3028" w:val="left"/>
+          <w:tab w:pos="3185" w:val="left"/>
         </w:tabs>
         <w:spacing w:before="580" w:after="0" w:line="440" w:lineRule="exact"/>
-        <w:ind w:left="3028" w:hanging="720"/>
+        <w:ind w:left="3185" w:hanging="720"/>
       </w:pPr>
       <w:r>
         <w:rPr>
@@ -415,9 +574,60 @@
         </w:rPr>
         <w:t>เรียน</w:t>
         <w:tab/>
-        <w:t>ผู้อำนวยการสำนักนโยบายและแผนกำลังพล</w:t>
-        <w:br/>
-      </w:r>
+        <w:t>ผู้อำนวยการสำนักนโยบายและแผน กรมยุทธการทหาร</w:t>
+      </w:r>
+    </w:p>
+    <w:p>
+      <w:pPr>
+        <w:pageBreakBefore/>
+        <w:spacing w:before="0" w:after="0" w:line="364" w:lineRule="exact"/>
+      </w:pPr>
+      <w:r>
+        <w:rPr>
+          <w:rFonts w:ascii="TH SarabunPSK" w:hAnsi="TH SarabunPSK" w:cs="TH SarabunPSK" w:eastAsia="TH SarabunPSK"/>
+          <w:b w:val="0"/>
+          <w:sz w:val="21"/>
+          <w:szCs w:val="21"/>
+        </w:rPr>
+        <w:t>วปอ.สปท.</w:t>
+      </w:r>
+    </w:p>
+    <w:p>
+      <w:pPr>
+        <w:spacing w:before="0" w:after="0" w:line="364" w:lineRule="exact"/>
+      </w:pPr>
+      <w:r>
+        <w:rPr>
+          <w:rFonts w:ascii="TH SarabunPSK" w:hAnsi="TH SarabunPSK" w:cs="TH SarabunPSK" w:eastAsia="TH SarabunPSK"/>
+          <w:b w:val="0"/>
+          <w:sz w:val="21"/>
+          <w:szCs w:val="21"/>
+        </w:rPr>
+        <w:t>กห ๐๓๑๗.๒/๑๖๑๑</w:t>
+      </w:r>
+    </w:p>
+    <w:p>
+      <w:pPr>
+        <w:spacing w:before="0" w:after="0" w:line="364" w:lineRule="exact"/>
+      </w:pPr>
+      <w:r>
+        <w:rPr>
+          <w:rFonts w:ascii="TH SarabunPSK" w:hAnsi="TH SarabunPSK" w:cs="TH SarabunPSK" w:eastAsia="TH SarabunPSK"/>
+          <w:b w:val="0"/>
+          <w:sz w:val="21"/>
+          <w:szCs w:val="21"/>
+        </w:rPr>
+        <w:t>โทร. ๐ ๒๕๗๒ ๒๕๒๗</w:t>
+      </w:r>
+    </w:p>
+    <w:p>
+      <w:pPr>
+        <w:tabs>
+          <w:tab w:pos="3550" w:val="left"/>
+        </w:tabs>
+        <w:spacing w:before="580" w:after="0" w:line="440" w:lineRule="exact"/>
+        <w:ind w:left="3550" w:hanging="720"/>
+      </w:pPr>
       <w:r>
         <w:rPr>
           <w:rFonts w:ascii="TH SarabunPSK" w:hAnsi="TH SarabunPSK" w:cs="TH SarabunPSK" w:eastAsia="TH SarabunPSK"/>
@@ -426,7 +636,9 @@
           <w:szCs w:val="26"/>
           <w:bCs/>
         </w:rPr>
-        <w:t>กรมกำลังพลทหาร</w:t>
+        <w:t>เรียน</w:t>
+        <w:tab/>
+        <w:t>ผู้อำนวยการสำนักปฏิบัติการ กรมยุทธการทหาร</w:t>
       </w:r>
     </w:p>
     <w:p>
@@ -475,10 +687,10 @@
     <w:p>
       <w:pPr>
         <w:tabs>
-          <w:tab w:pos="3028" w:val="left"/>
+          <w:tab w:pos="2586" w:val="left"/>
         </w:tabs>
         <w:spacing w:before="580" w:after="0" w:line="440" w:lineRule="exact"/>
-        <w:ind w:left="3028" w:hanging="720"/>
+        <w:ind w:left="2586" w:hanging="720"/>
       </w:pPr>
       <w:r>
         <w:rPr>
@@ -490,7 +702,7 @@
         </w:rPr>
         <w:t>เรียน</w:t>
         <w:tab/>
-        <w:t>ผู้อำนวยการสำนักข่าวกรอง กรมข่าวทหาร</w:t>
+        <w:t>ผู้อำนวยการสำนักวางแผนการฝึกร่วมและผสม กรมยุทธการทหาร</w:t>
       </w:r>
     </w:p>
     <w:p>
@@ -539,10 +751,10 @@
     <w:p>
       <w:pPr>
         <w:tabs>
-          <w:tab w:pos="3028" w:val="left"/>
+          <w:tab w:pos="2909" w:val="left"/>
         </w:tabs>
         <w:spacing w:before="580" w:after="0" w:line="440" w:lineRule="exact"/>
-        <w:ind w:left="3028" w:hanging="720"/>
+        <w:ind w:left="2909" w:hanging="720"/>
       </w:pPr>
       <w:r>
         <w:rPr>
@@ -554,7 +766,7 @@
         </w:rPr>
         <w:t>เรียน</w:t>
         <w:tab/>
-        <w:t>ผู้อำนวยการสำนักวิเทศสัมพันธ์ กรมข่าวทหาร</w:t>
+        <w:t>ผู้อำนวยการศูนย์ปฏิบัติการเพื่อสันติภาพ กรมยุทธการทหาร</w:t>
       </w:r>
     </w:p>
     <w:p>
@@ -603,10 +815,10 @@
     <w:p>
       <w:pPr>
         <w:tabs>
-          <w:tab w:pos="3028" w:val="left"/>
+          <w:tab w:pos="3232" w:val="left"/>
         </w:tabs>
-        <w:spacing w:before="580" w:after="0" w:line="440" w:lineRule="exact"/>
-        <w:ind w:left="3028" w:hanging="720"/>
+        <w:spacing w:before="360" w:after="0" w:line="440" w:lineRule="exact"/>
+        <w:ind w:left="3232" w:hanging="720"/>
       </w:pPr>
       <w:r>
         <w:rPr>
@@ -618,60 +830,9 @@
         </w:rPr>
         <w:t>เรียน</w:t>
         <w:tab/>
-        <w:t>ผู้อำนวยการสำนักนโยบายและแผน กรมยุทธการทหาร</w:t>
-      </w:r>
-    </w:p>
-    <w:p>
-      <w:pPr>
-        <w:pageBreakBefore/>
-        <w:spacing w:before="0" w:after="0" w:line="364" w:lineRule="exact"/>
-      </w:pPr>
-      <w:r>
-        <w:rPr>
-          <w:rFonts w:ascii="TH SarabunPSK" w:hAnsi="TH SarabunPSK" w:cs="TH SarabunPSK" w:eastAsia="TH SarabunPSK"/>
-          <w:b w:val="0"/>
-          <w:sz w:val="21"/>
-          <w:szCs w:val="21"/>
-        </w:rPr>
-        <w:t>วปอ.สปท.</w:t>
-      </w:r>
-    </w:p>
-    <w:p>
-      <w:pPr>
-        <w:spacing w:before="0" w:after="0" w:line="364" w:lineRule="exact"/>
-      </w:pPr>
-      <w:r>
-        <w:rPr>
-          <w:rFonts w:ascii="TH SarabunPSK" w:hAnsi="TH SarabunPSK" w:cs="TH SarabunPSK" w:eastAsia="TH SarabunPSK"/>
-          <w:b w:val="0"/>
-          <w:sz w:val="21"/>
-          <w:szCs w:val="21"/>
-        </w:rPr>
-        <w:t>กห ๐๓๑๗.๒/๑๖๑๑</w:t>
-      </w:r>
-    </w:p>
-    <w:p>
-      <w:pPr>
-        <w:spacing w:before="0" w:after="0" w:line="364" w:lineRule="exact"/>
-      </w:pPr>
-      <w:r>
-        <w:rPr>
-          <w:rFonts w:ascii="TH SarabunPSK" w:hAnsi="TH SarabunPSK" w:cs="TH SarabunPSK" w:eastAsia="TH SarabunPSK"/>
-          <w:b w:val="0"/>
-          <w:sz w:val="21"/>
-          <w:szCs w:val="21"/>
-        </w:rPr>
-        <w:t>โทร. ๐ ๒๕๗๒ ๒๕๒๗</w:t>
-      </w:r>
-    </w:p>
-    <w:p>
-      <w:pPr>
-        <w:tabs>
-          <w:tab w:pos="3028" w:val="left"/>
-        </w:tabs>
-        <w:spacing w:before="580" w:after="0" w:line="440" w:lineRule="exact"/>
-        <w:ind w:left="3028" w:hanging="720"/>
-      </w:pPr>
+        <w:t>ผู้อำนวยการสำนักงานประสานภารกิจด้านความมั่นคง</w:t>
+        <w:br/>
+      </w:r>
       <w:r>
         <w:rPr>
           <w:rFonts w:ascii="TH SarabunPSK" w:hAnsi="TH SarabunPSK" w:cs="TH SarabunPSK" w:eastAsia="TH SarabunPSK"/>
@@ -680,9 +841,7 @@
           <w:szCs w:val="26"/>
           <w:bCs/>
         </w:rPr>
-        <w:t>เรียน</w:t>
-        <w:tab/>
-        <w:t>ผู้อำนวยการสำนักปฏิบัติการ กรมยุทธการทหาร</w:t>
+        <w:t>กับ กอ.รมน. กรมยุทธการทหาร</w:t>
       </w:r>
     </w:p>
     <w:p>
@@ -731,10 +890,10 @@
     <w:p>
       <w:pPr>
         <w:tabs>
-          <w:tab w:pos="3028" w:val="left"/>
+          <w:tab w:pos="2897" w:val="left"/>
         </w:tabs>
         <w:spacing w:before="580" w:after="0" w:line="440" w:lineRule="exact"/>
-        <w:ind w:left="3028" w:hanging="720"/>
+        <w:ind w:left="2897" w:hanging="720"/>
       </w:pPr>
       <w:r>
         <w:rPr>
@@ -746,9 +905,60 @@
         </w:rPr>
         <w:t>เรียน</w:t>
         <w:tab/>
-        <w:t>ผู้อำนวยการสำนักวางแผนการฝึกร่วมและผสม</w:t>
-        <w:br/>
-      </w:r>
+        <w:t>ผู้อำนวยการสำนักส่งกำลังบำรุงร่วม กรมส่งกำลังบำรุงทหาร</w:t>
+      </w:r>
+    </w:p>
+    <w:p>
+      <w:pPr>
+        <w:pageBreakBefore/>
+        <w:spacing w:before="0" w:after="0" w:line="364" w:lineRule="exact"/>
+      </w:pPr>
+      <w:r>
+        <w:rPr>
+          <w:rFonts w:ascii="TH SarabunPSK" w:hAnsi="TH SarabunPSK" w:cs="TH SarabunPSK" w:eastAsia="TH SarabunPSK"/>
+          <w:b w:val="0"/>
+          <w:sz w:val="21"/>
+          <w:szCs w:val="21"/>
+        </w:rPr>
+        <w:t>วปอ.สปท.</w:t>
+      </w:r>
+    </w:p>
+    <w:p>
+      <w:pPr>
+        <w:spacing w:before="0" w:after="0" w:line="364" w:lineRule="exact"/>
+      </w:pPr>
+      <w:r>
+        <w:rPr>
+          <w:rFonts w:ascii="TH SarabunPSK" w:hAnsi="TH SarabunPSK" w:cs="TH SarabunPSK" w:eastAsia="TH SarabunPSK"/>
+          <w:b w:val="0"/>
+          <w:sz w:val="21"/>
+          <w:szCs w:val="21"/>
+        </w:rPr>
+        <w:t>กห ๐๓๑๗.๒/๑๖๑๑</w:t>
+      </w:r>
+    </w:p>
+    <w:p>
+      <w:pPr>
+        <w:spacing w:before="0" w:after="0" w:line="364" w:lineRule="exact"/>
+      </w:pPr>
+      <w:r>
+        <w:rPr>
+          <w:rFonts w:ascii="TH SarabunPSK" w:hAnsi="TH SarabunPSK" w:cs="TH SarabunPSK" w:eastAsia="TH SarabunPSK"/>
+          <w:b w:val="0"/>
+          <w:sz w:val="21"/>
+          <w:szCs w:val="21"/>
+        </w:rPr>
+        <w:t>โทร. ๐ ๒๕๗๒ ๒๕๒๗</w:t>
+      </w:r>
+    </w:p>
+    <w:p>
+      <w:pPr>
+        <w:tabs>
+          <w:tab w:pos="2893" w:val="left"/>
+        </w:tabs>
+        <w:spacing w:before="580" w:after="0" w:line="440" w:lineRule="exact"/>
+        <w:ind w:left="2893" w:hanging="720"/>
+      </w:pPr>
       <w:r>
         <w:rPr>
           <w:rFonts w:ascii="TH SarabunPSK" w:hAnsi="TH SarabunPSK" w:cs="TH SarabunPSK" w:eastAsia="TH SarabunPSK"/>
@@ -757,7 +967,9 @@
           <w:szCs w:val="26"/>
           <w:bCs/>
         </w:rPr>
-        <w:t>กรมยุทธการทหาร</w:t>
+        <w:t>เรียน</w:t>
+        <w:tab/>
+        <w:t>ผู้อำนวยการสำนักบริหารสิ่งอุปกรณ์ กรมส่งกำลังบำรุงทหาร</w:t>
       </w:r>
     </w:p>
     <w:p>
@@ -806,10 +1018,10 @@
     <w:p>
       <w:pPr>
         <w:tabs>
-          <w:tab w:pos="3028" w:val="left"/>
+          <w:tab w:pos="2379" w:val="left"/>
         </w:tabs>
         <w:spacing w:before="580" w:after="0" w:line="440" w:lineRule="exact"/>
-        <w:ind w:left="3028" w:hanging="720"/>
+        <w:ind w:left="2379" w:hanging="720"/>
       </w:pPr>
       <w:r>
         <w:rPr>
@@ -821,7 +1033,7 @@
         </w:rPr>
         <w:t>เรียน</w:t>
         <w:tab/>
-        <w:t>ผู้อำนวยการศูนย์ปฏิบัติการเพื่อสันติภาพ กรมยุทธการทหาร</w:t>
+        <w:t>ผู้อำนวยการสำนักปฏิบัติการกิจการพลเรือน กรมกิจการพลเรือนทหาร</w:t>
       </w:r>
     </w:p>
     <w:p>
@@ -870,10 +1082,10 @@
     <w:p>
       <w:pPr>
         <w:tabs>
-          <w:tab w:pos="3028" w:val="left"/>
+          <w:tab w:pos="2953" w:val="left"/>
         </w:tabs>
         <w:spacing w:before="580" w:after="0" w:line="440" w:lineRule="exact"/>
-        <w:ind w:left="3028" w:hanging="720"/>
+        <w:ind w:left="2953" w:hanging="720"/>
       </w:pPr>
       <w:r>
         <w:rPr>
@@ -885,9 +1097,60 @@
         </w:rPr>
         <w:t>เรียน</w:t>
         <w:tab/>
-        <w:t>ผู้อำนวยการสำนักงานประสานภารกิจด้านความมั่นคง</w:t>
-        <w:br/>
-      </w:r>
+        <w:t>ผู้อำนวยการสำนักประชาสัมพันธ์ กรมกิจการพลเรือนทหาร</w:t>
+      </w:r>
+    </w:p>
+    <w:p>
+      <w:pPr>
+        <w:pageBreakBefore/>
+        <w:spacing w:before="0" w:after="0" w:line="364" w:lineRule="exact"/>
+      </w:pPr>
+      <w:r>
+        <w:rPr>
+          <w:rFonts w:ascii="TH SarabunPSK" w:hAnsi="TH SarabunPSK" w:cs="TH SarabunPSK" w:eastAsia="TH SarabunPSK"/>
+          <w:b w:val="0"/>
+          <w:sz w:val="21"/>
+          <w:szCs w:val="21"/>
+        </w:rPr>
+        <w:t>วปอ.สปท.</w:t>
+      </w:r>
+    </w:p>
+    <w:p>
+      <w:pPr>
+        <w:spacing w:before="0" w:after="0" w:line="364" w:lineRule="exact"/>
+      </w:pPr>
+      <w:r>
+        <w:rPr>
+          <w:rFonts w:ascii="TH SarabunPSK" w:hAnsi="TH SarabunPSK" w:cs="TH SarabunPSK" w:eastAsia="TH SarabunPSK"/>
+          <w:b w:val="0"/>
+          <w:sz w:val="21"/>
+          <w:szCs w:val="21"/>
+        </w:rPr>
+        <w:t>กห ๐๓๑๗.๒/๑๖๑๑</w:t>
+      </w:r>
+    </w:p>
+    <w:p>
+      <w:pPr>
+        <w:spacing w:before="0" w:after="0" w:line="364" w:lineRule="exact"/>
+      </w:pPr>
+      <w:r>
+        <w:rPr>
+          <w:rFonts w:ascii="TH SarabunPSK" w:hAnsi="TH SarabunPSK" w:cs="TH SarabunPSK" w:eastAsia="TH SarabunPSK"/>
+          <w:b w:val="0"/>
+          <w:sz w:val="21"/>
+          <w:szCs w:val="21"/>
+        </w:rPr>
+        <w:t>โทร. ๐ ๒๕๗๒ ๒๕๒๗</w:t>
+      </w:r>
+    </w:p>
+    <w:p>
+      <w:pPr>
+        <w:tabs>
+          <w:tab w:pos="2534" w:val="left"/>
+        </w:tabs>
+        <w:spacing w:before="580" w:after="0" w:line="440" w:lineRule="exact"/>
+        <w:ind w:left="2534" w:hanging="720"/>
+      </w:pPr>
       <w:r>
         <w:rPr>
           <w:rFonts w:ascii="TH SarabunPSK" w:hAnsi="TH SarabunPSK" w:cs="TH SarabunPSK" w:eastAsia="TH SarabunPSK"/>
@@ -896,7 +1159,9 @@
           <w:szCs w:val="26"/>
           <w:bCs/>
         </w:rPr>
-        <w:t>กับ กอ.รมน. กรมยุทธการทหาร</w:t>
+        <w:t>เรียน</w:t>
+        <w:tab/>
+        <w:t>ผู้อำนวยการสำนักแผนและอำนวยการสื่อสาร กรมการสื่อสารทหาร</w:t>
       </w:r>
     </w:p>
     <w:p>
@@ -945,10 +1210,10 @@
     <w:p>
       <w:pPr>
         <w:tabs>
-          <w:tab w:pos="3028" w:val="left"/>
+          <w:tab w:pos="3047" w:val="left"/>
         </w:tabs>
         <w:spacing w:before="580" w:after="0" w:line="440" w:lineRule="exact"/>
-        <w:ind w:left="3028" w:hanging="720"/>
+        <w:ind w:left="3047" w:hanging="720"/>
       </w:pPr>
       <w:r>
         <w:rPr>
@@ -960,7 +1225,7 @@
         </w:rPr>
         <w:t>เรียน</w:t>
         <w:tab/>
-        <w:t>ผู้อำนวยการสำนักส่งกำลังบำรุงร่วม กรมส่งกำลังบำรุงทหาร</w:t>
+        <w:t>ผู้อำนวยการศูนย์โทรคมนาคมทหาร กรมการสื่อสารทหาร</w:t>
       </w:r>
     </w:p>
     <w:p>
@@ -1009,10 +1274,10 @@
     <w:p>
       <w:pPr>
         <w:tabs>
-          <w:tab w:pos="3028" w:val="left"/>
+          <w:tab w:pos="2592" w:val="left"/>
         </w:tabs>
         <w:spacing w:before="580" w:after="0" w:line="440" w:lineRule="exact"/>
-        <w:ind w:left="3028" w:hanging="720"/>
+        <w:ind w:left="2592" w:hanging="720"/>
       </w:pPr>
       <w:r>
         <w:rPr>
@@ -1024,7 +1289,7 @@
         </w:rPr>
         <w:t>เรียน</w:t>
         <w:tab/>
-        <w:t>ผู้อำนวยการสำนักบริหารสิ่งอุปกรณ์ กรมส่งกำลังบำรุงทหาร</w:t>
+        <w:t>ผู้อำนวยการศูนย์เทคโนโลยีสารสนเทศทหาร กรมการสื่อสารทหาร</w:t>
       </w:r>
     </w:p>
     <w:p>
@@ -1073,10 +1338,10 @@
     <w:p>
       <w:pPr>
         <w:tabs>
-          <w:tab w:pos="3028" w:val="left"/>
+          <w:tab w:pos="3190" w:val="left"/>
         </w:tabs>
         <w:spacing w:before="580" w:after="0" w:line="440" w:lineRule="exact"/>
-        <w:ind w:left="3028" w:hanging="720"/>
+        <w:ind w:left="3190" w:hanging="720"/>
       </w:pPr>
       <w:r>
         <w:rPr>
@@ -1088,9 +1353,60 @@
         </w:rPr>
         <w:t>เรียน</w:t>
         <w:tab/>
-        <w:t>ผู้อำนวยการสำนักปฏิบัติการกิจการพลเรือน</w:t>
-        <w:br/>
-      </w:r>
+        <w:t>ผู้บังคับกองพันทหารสื่อสาร กองบัญชาการกองทัพไทย</w:t>
+      </w:r>
+    </w:p>
+    <w:p>
+      <w:pPr>
+        <w:pageBreakBefore/>
+        <w:spacing w:before="0" w:after="0" w:line="364" w:lineRule="exact"/>
+      </w:pPr>
+      <w:r>
+        <w:rPr>
+          <w:rFonts w:ascii="TH SarabunPSK" w:hAnsi="TH SarabunPSK" w:cs="TH SarabunPSK" w:eastAsia="TH SarabunPSK"/>
+          <w:b w:val="0"/>
+          <w:sz w:val="21"/>
+          <w:szCs w:val="21"/>
+        </w:rPr>
+        <w:t>วปอ.สปท.</w:t>
+      </w:r>
+    </w:p>
+    <w:p>
+      <w:pPr>
+        <w:spacing w:before="0" w:after="0" w:line="364" w:lineRule="exact"/>
+      </w:pPr>
+      <w:r>
+        <w:rPr>
+          <w:rFonts w:ascii="TH SarabunPSK" w:hAnsi="TH SarabunPSK" w:cs="TH SarabunPSK" w:eastAsia="TH SarabunPSK"/>
+          <w:b w:val="0"/>
+          <w:sz w:val="21"/>
+          <w:szCs w:val="21"/>
+        </w:rPr>
+        <w:t>กห ๐๓๑๗.๒/๑๖๑๑</w:t>
+      </w:r>
+    </w:p>
+    <w:p>
+      <w:pPr>
+        <w:spacing w:before="0" w:after="0" w:line="364" w:lineRule="exact"/>
+      </w:pPr>
+      <w:r>
+        <w:rPr>
+          <w:rFonts w:ascii="TH SarabunPSK" w:hAnsi="TH SarabunPSK" w:cs="TH SarabunPSK" w:eastAsia="TH SarabunPSK"/>
+          <w:b w:val="0"/>
+          <w:sz w:val="21"/>
+          <w:szCs w:val="21"/>
+        </w:rPr>
+        <w:t>โทร. ๐ ๒๕๗๒ ๒๕๒๗</w:t>
+      </w:r>
+    </w:p>
+    <w:p>
+      <w:pPr>
+        <w:tabs>
+          <w:tab w:pos="2410" w:val="left"/>
+        </w:tabs>
+        <w:spacing w:before="580" w:after="0" w:line="440" w:lineRule="exact"/>
+        <w:ind w:left="2410" w:hanging="720"/>
+      </w:pPr>
       <w:r>
         <w:rPr>
           <w:rFonts w:ascii="TH SarabunPSK" w:hAnsi="TH SarabunPSK" w:cs="TH SarabunPSK" w:eastAsia="TH SarabunPSK"/>
@@ -1099,7 +1415,9 @@
           <w:szCs w:val="26"/>
           <w:bCs/>
         </w:rPr>
-        <w:t>กรมกิจการพลเรือนทหาร</w:t>
+        <w:t>เรียน</w:t>
+        <w:tab/>
+        <w:t>ผู้บังคับกองพันปฏิบัติการสงครามอิเล็กทรอนิกส์ กรมการสื่อสารทหาร</w:t>
       </w:r>
     </w:p>
     <w:p>
@@ -1148,10 +1466,10 @@
     <w:p>
       <w:pPr>
         <w:tabs>
-          <w:tab w:pos="3028" w:val="left"/>
+          <w:tab w:pos="2807" w:val="left"/>
         </w:tabs>
         <w:spacing w:before="580" w:after="0" w:line="440" w:lineRule="exact"/>
-        <w:ind w:left="3028" w:hanging="720"/>
+        <w:ind w:left="2807" w:hanging="720"/>
       </w:pPr>
       <w:r>
         <w:rPr>
@@ -1163,7 +1481,7 @@
         </w:rPr>
         <w:t>เรียน</w:t>
         <w:tab/>
-        <w:t>ผู้อำนวยการสำนักประชาสัมพันธ์ กรมกิจการพลเรือนทหาร</w:t>
+        <w:t>ผู้อำนวยการสำนักบริหารทรัพยากร สำนักงานปลัดบัญชีทหาร</w:t>
       </w:r>
     </w:p>
     <w:p>
@@ -1212,10 +1530,10 @@
     <w:p>
       <w:pPr>
         <w:tabs>
-          <w:tab w:pos="3028" w:val="left"/>
+          <w:tab w:pos="2649" w:val="left"/>
         </w:tabs>
         <w:spacing w:before="580" w:after="0" w:line="440" w:lineRule="exact"/>
-        <w:ind w:left="3028" w:hanging="720"/>
+        <w:ind w:left="2649" w:hanging="720"/>
       </w:pPr>
       <w:r>
         <w:rPr>
@@ -1227,9 +1545,60 @@
         </w:rPr>
         <w:t>เรียน</w:t>
         <w:tab/>
-        <w:t>ผู้อำนวยการสำนักแผนและอำนวยการสื่อสาร</w:t>
-        <w:br/>
-      </w:r>
+        <w:t>ผู้อำนวยการสำนักงานทหารพัฒนา หน่วยบัญชาการทหารพัฒนา</w:t>
+      </w:r>
+    </w:p>
+    <w:p>
+      <w:pPr>
+        <w:pageBreakBefore/>
+        <w:spacing w:before="0" w:after="0" w:line="364" w:lineRule="exact"/>
+      </w:pPr>
+      <w:r>
+        <w:rPr>
+          <w:rFonts w:ascii="TH SarabunPSK" w:hAnsi="TH SarabunPSK" w:cs="TH SarabunPSK" w:eastAsia="TH SarabunPSK"/>
+          <w:b w:val="0"/>
+          <w:sz w:val="21"/>
+          <w:szCs w:val="21"/>
+        </w:rPr>
+        <w:t>วปอ.สปท.</w:t>
+      </w:r>
+    </w:p>
+    <w:p>
+      <w:pPr>
+        <w:spacing w:before="0" w:after="0" w:line="364" w:lineRule="exact"/>
+      </w:pPr>
+      <w:r>
+        <w:rPr>
+          <w:rFonts w:ascii="TH SarabunPSK" w:hAnsi="TH SarabunPSK" w:cs="TH SarabunPSK" w:eastAsia="TH SarabunPSK"/>
+          <w:b w:val="0"/>
+          <w:sz w:val="21"/>
+          <w:szCs w:val="21"/>
+        </w:rPr>
+        <w:t>กห ๐๓๑๗.๒/๑๖๑๑</w:t>
+      </w:r>
+    </w:p>
+    <w:p>
+      <w:pPr>
+        <w:spacing w:before="0" w:after="0" w:line="364" w:lineRule="exact"/>
+      </w:pPr>
+      <w:r>
+        <w:rPr>
+          <w:rFonts w:ascii="TH SarabunPSK" w:hAnsi="TH SarabunPSK" w:cs="TH SarabunPSK" w:eastAsia="TH SarabunPSK"/>
+          <w:b w:val="0"/>
+          <w:sz w:val="21"/>
+          <w:szCs w:val="21"/>
+        </w:rPr>
+        <w:t>โทร. ๐ ๒๕๗๒ ๒๕๒๗</w:t>
+      </w:r>
+    </w:p>
+    <w:p>
+      <w:pPr>
+        <w:tabs>
+          <w:tab w:pos="2808" w:val="left"/>
+        </w:tabs>
+        <w:spacing w:before="580" w:after="0" w:line="440" w:lineRule="exact"/>
+        <w:ind w:left="2808" w:hanging="720"/>
+      </w:pPr>
       <w:r>
         <w:rPr>
           <w:rFonts w:ascii="TH SarabunPSK" w:hAnsi="TH SarabunPSK" w:cs="TH SarabunPSK" w:eastAsia="TH SarabunPSK"/>
@@ -1238,7 +1607,9 @@
           <w:szCs w:val="26"/>
           <w:bCs/>
         </w:rPr>
-        <w:t>กรมการสื่อสารทหาร</w:t>
+        <w:t>เรียน</w:t>
+        <w:tab/>
+        <w:t>ผู้อำนวยการสำนักงานสนับสนุน หน่วยบัญชาการทหารพัฒนา</w:t>
       </w:r>
     </w:p>
     <w:p>
@@ -1287,10 +1658,10 @@
     <w:p>
       <w:pPr>
         <w:tabs>
-          <w:tab w:pos="3028" w:val="left"/>
+          <w:tab w:pos="2620" w:val="left"/>
         </w:tabs>
-        <w:spacing w:before="580" w:after="0" w:line="440" w:lineRule="exact"/>
-        <w:ind w:left="3028" w:hanging="720"/>
+        <w:spacing w:before="360" w:after="0" w:line="440" w:lineRule="exact"/>
+        <w:ind w:left="2620" w:hanging="720"/>
       </w:pPr>
       <w:r>
         <w:rPr>
@@ -1302,60 +1673,9 @@
         </w:rPr>
         <w:t>เรียน</w:t>
         <w:tab/>
-        <w:t>ผู้อำนวยการศูนย์โทรคมนาคมทหาร กรมการสื่อสารทหาร</w:t>
-      </w:r>
-    </w:p>
-    <w:p>
-      <w:pPr>
-        <w:pageBreakBefore/>
-        <w:spacing w:before="0" w:after="0" w:line="364" w:lineRule="exact"/>
-      </w:pPr>
-      <w:r>
-        <w:rPr>
-          <w:rFonts w:ascii="TH SarabunPSK" w:hAnsi="TH SarabunPSK" w:cs="TH SarabunPSK" w:eastAsia="TH SarabunPSK"/>
-          <w:b w:val="0"/>
-          <w:sz w:val="21"/>
-          <w:szCs w:val="21"/>
-        </w:rPr>
-        <w:t>วปอ.สปท.</w:t>
-      </w:r>
-    </w:p>
-    <w:p>
-      <w:pPr>
-        <w:spacing w:before="0" w:after="0" w:line="364" w:lineRule="exact"/>
-      </w:pPr>
-      <w:r>
-        <w:rPr>
-          <w:rFonts w:ascii="TH SarabunPSK" w:hAnsi="TH SarabunPSK" w:cs="TH SarabunPSK" w:eastAsia="TH SarabunPSK"/>
-          <w:b w:val="0"/>
-          <w:sz w:val="21"/>
-          <w:szCs w:val="21"/>
-        </w:rPr>
-        <w:t>กห ๐๓๑๗.๒/๑๖๑๑</w:t>
-      </w:r>
-    </w:p>
-    <w:p>
-      <w:pPr>
-        <w:spacing w:before="0" w:after="0" w:line="364" w:lineRule="exact"/>
-      </w:pPr>
-      <w:r>
-        <w:rPr>
-          <w:rFonts w:ascii="TH SarabunPSK" w:hAnsi="TH SarabunPSK" w:cs="TH SarabunPSK" w:eastAsia="TH SarabunPSK"/>
-          <w:b w:val="0"/>
-          <w:sz w:val="21"/>
-          <w:szCs w:val="21"/>
-        </w:rPr>
-        <w:t>โทร. ๐ ๒๕๗๒ ๒๕๒๗</w:t>
-      </w:r>
-    </w:p>
-    <w:p>
-      <w:pPr>
-        <w:tabs>
-          <w:tab w:pos="3028" w:val="left"/>
-        </w:tabs>
-        <w:spacing w:before="580" w:after="0" w:line="440" w:lineRule="exact"/>
-        <w:ind w:left="3028" w:hanging="720"/>
-      </w:pPr>
+        <w:t>ผู้อำนวยการสำนักงานพัฒนาโครงการอันเนื่องมาจากพระราชดำริ</w:t>
+        <w:br/>
+      </w:r>
       <w:r>
         <w:rPr>
           <w:rFonts w:ascii="TH SarabunPSK" w:hAnsi="TH SarabunPSK" w:cs="TH SarabunPSK" w:eastAsia="TH SarabunPSK"/>
@@ -1364,11 +1684,60 @@
           <w:szCs w:val="26"/>
           <w:bCs/>
         </w:rPr>
-        <w:t>เรียน</w:t>
-        <w:tab/>
-        <w:t>ผู้อำนวยการศูนย์เทคโนโลยีสารสนเทศทหาร</w:t>
-        <w:br/>
-      </w:r>
+        <w:t>หน่วยบัญชาการทหารพัฒนา</w:t>
+      </w:r>
+    </w:p>
+    <w:p>
+      <w:pPr>
+        <w:pageBreakBefore/>
+        <w:spacing w:before="0" w:after="0" w:line="364" w:lineRule="exact"/>
+      </w:pPr>
+      <w:r>
+        <w:rPr>
+          <w:rFonts w:ascii="TH SarabunPSK" w:hAnsi="TH SarabunPSK" w:cs="TH SarabunPSK" w:eastAsia="TH SarabunPSK"/>
+          <w:b w:val="0"/>
+          <w:sz w:val="21"/>
+          <w:szCs w:val="21"/>
+        </w:rPr>
+        <w:t>วปอ.สปท.</w:t>
+      </w:r>
+    </w:p>
+    <w:p>
+      <w:pPr>
+        <w:spacing w:before="0" w:after="0" w:line="364" w:lineRule="exact"/>
+      </w:pPr>
+      <w:r>
+        <w:rPr>
+          <w:rFonts w:ascii="TH SarabunPSK" w:hAnsi="TH SarabunPSK" w:cs="TH SarabunPSK" w:eastAsia="TH SarabunPSK"/>
+          <w:b w:val="0"/>
+          <w:sz w:val="21"/>
+          <w:szCs w:val="21"/>
+        </w:rPr>
+        <w:t>กห ๐๓๑๗.๒/๑๖๑๑</w:t>
+      </w:r>
+    </w:p>
+    <w:p>
+      <w:pPr>
+        <w:spacing w:before="0" w:after="0" w:line="364" w:lineRule="exact"/>
+      </w:pPr>
+      <w:r>
+        <w:rPr>
+          <w:rFonts w:ascii="TH SarabunPSK" w:hAnsi="TH SarabunPSK" w:cs="TH SarabunPSK" w:eastAsia="TH SarabunPSK"/>
+          <w:b w:val="0"/>
+          <w:sz w:val="21"/>
+          <w:szCs w:val="21"/>
+        </w:rPr>
+        <w:t>โทร. ๐ ๒๕๗๒ ๒๕๒๗</w:t>
+      </w:r>
+    </w:p>
+    <w:p>
+      <w:pPr>
+        <w:tabs>
+          <w:tab w:pos="2604" w:val="left"/>
+        </w:tabs>
+        <w:spacing w:before="580" w:after="0" w:line="440" w:lineRule="exact"/>
+        <w:ind w:left="2604" w:hanging="720"/>
+      </w:pPr>
       <w:r>
         <w:rPr>
           <w:rFonts w:ascii="TH SarabunPSK" w:hAnsi="TH SarabunPSK" w:cs="TH SarabunPSK" w:eastAsia="TH SarabunPSK"/>
@@ -1377,7 +1746,9 @@
           <w:szCs w:val="26"/>
           <w:bCs/>
         </w:rPr>
-        <w:t>กรมการสื่อสารทหาร</w:t>
+        <w:t>เรียน</w:t>
+        <w:tab/>
+        <w:t>ผู้อำนวยการสำนักงานพัฒนาภาค 1 หน่วยบัญชาการทหารพัฒนา</w:t>
       </w:r>
     </w:p>
     <w:p>
@@ -1426,10 +1797,10 @@
     <w:p>
       <w:pPr>
         <w:tabs>
-          <w:tab w:pos="3028" w:val="left"/>
+          <w:tab w:pos="2886" w:val="left"/>
         </w:tabs>
         <w:spacing w:before="580" w:after="0" w:line="440" w:lineRule="exact"/>
-        <w:ind w:left="3028" w:hanging="720"/>
+        <w:ind w:left="2886" w:hanging="720"/>
       </w:pPr>
       <w:r>
         <w:rPr>
@@ -1441,7 +1812,7 @@
         </w:rPr>
         <w:t>เรียน</w:t>
         <w:tab/>
-        <w:t>ผู้บังคับกองพันทหารสื่อสาร กองบัญชาการกองทัพไทย</w:t>
+        <w:t>ผู้บังคับหน่วยพัฒนาการเคลื่อนที่ 11 สำนักงานพัฒนาภาค 1</w:t>
       </w:r>
     </w:p>
     <w:p>
@@ -1490,10 +1861,10 @@
     <w:p>
       <w:pPr>
         <w:tabs>
-          <w:tab w:pos="3028" w:val="left"/>
+          <w:tab w:pos="2886" w:val="left"/>
         </w:tabs>
         <w:spacing w:before="580" w:after="0" w:line="440" w:lineRule="exact"/>
-        <w:ind w:left="3028" w:hanging="720"/>
+        <w:ind w:left="2886" w:hanging="720"/>
       </w:pPr>
       <w:r>
         <w:rPr>
@@ -1505,9 +1876,60 @@
         </w:rPr>
         <w:t>เรียน</w:t>
         <w:tab/>
-        <w:t>ผู้บังคับกองพันปฏิบัติการสงครามอิเล็กทรอนิกส์</w:t>
-        <w:br/>
-      </w:r>
+        <w:t>ผู้บังคับหน่วยพัฒนาการเคลื่อนที่ 12 สำนักงานพัฒนาภาค 1</w:t>
+      </w:r>
+    </w:p>
+    <w:p>
+      <w:pPr>
+        <w:pageBreakBefore/>
+        <w:spacing w:before="0" w:after="0" w:line="364" w:lineRule="exact"/>
+      </w:pPr>
+      <w:r>
+        <w:rPr>
+          <w:rFonts w:ascii="TH SarabunPSK" w:hAnsi="TH SarabunPSK" w:cs="TH SarabunPSK" w:eastAsia="TH SarabunPSK"/>
+          <w:b w:val="0"/>
+          <w:sz w:val="21"/>
+          <w:szCs w:val="21"/>
+        </w:rPr>
+        <w:t>วปอ.สปท.</w:t>
+      </w:r>
+    </w:p>
+    <w:p>
+      <w:pPr>
+        <w:spacing w:before="0" w:after="0" w:line="364" w:lineRule="exact"/>
+      </w:pPr>
+      <w:r>
+        <w:rPr>
+          <w:rFonts w:ascii="TH SarabunPSK" w:hAnsi="TH SarabunPSK" w:cs="TH SarabunPSK" w:eastAsia="TH SarabunPSK"/>
+          <w:b w:val="0"/>
+          <w:sz w:val="21"/>
+          <w:szCs w:val="21"/>
+        </w:rPr>
+        <w:t>กห ๐๓๑๗.๒/๑๖๑๑</w:t>
+      </w:r>
+    </w:p>
+    <w:p>
+      <w:pPr>
+        <w:spacing w:before="0" w:after="0" w:line="364" w:lineRule="exact"/>
+      </w:pPr>
+      <w:r>
+        <w:rPr>
+          <w:rFonts w:ascii="TH SarabunPSK" w:hAnsi="TH SarabunPSK" w:cs="TH SarabunPSK" w:eastAsia="TH SarabunPSK"/>
+          <w:b w:val="0"/>
+          <w:sz w:val="21"/>
+          <w:szCs w:val="21"/>
+        </w:rPr>
+        <w:t>โทร. ๐ ๒๕๗๒ ๒๕๒๗</w:t>
+      </w:r>
+    </w:p>
+    <w:p>
+      <w:pPr>
+        <w:tabs>
+          <w:tab w:pos="2886" w:val="left"/>
+        </w:tabs>
+        <w:spacing w:before="580" w:after="0" w:line="440" w:lineRule="exact"/>
+        <w:ind w:left="2886" w:hanging="720"/>
+      </w:pPr>
       <w:r>
         <w:rPr>
           <w:rFonts w:ascii="TH SarabunPSK" w:hAnsi="TH SarabunPSK" w:cs="TH SarabunPSK" w:eastAsia="TH SarabunPSK"/>
@@ -1516,7 +1938,9 @@
           <w:szCs w:val="26"/>
           <w:bCs/>
         </w:rPr>
-        <w:t>กรมการสื่อสารทหาร</w:t>
+        <w:t>เรียน</w:t>
+        <w:tab/>
+        <w:t>ผู้บังคับหน่วยพัฒนาการเคลื่อนที่ 13 สำนักงานพัฒนาภาค 1</w:t>
       </w:r>
     </w:p>
     <w:p>
@@ -1565,10 +1989,10 @@
     <w:p>
       <w:pPr>
         <w:tabs>
-          <w:tab w:pos="3028" w:val="left"/>
+          <w:tab w:pos="2886" w:val="left"/>
         </w:tabs>
         <w:spacing w:before="580" w:after="0" w:line="440" w:lineRule="exact"/>
-        <w:ind w:left="3028" w:hanging="720"/>
+        <w:ind w:left="2886" w:hanging="720"/>
       </w:pPr>
       <w:r>
         <w:rPr>
@@ -1580,9 +2004,60 @@
         </w:rPr>
         <w:t>เรียน</w:t>
         <w:tab/>
-        <w:t>ผู้อำนวยการสำนักบริหารทรัพยากร</w:t>
-        <w:br/>
-      </w:r>
+        <w:t>ผู้บังคับหน่วยพัฒนาการเคลื่อนที่ 14 สำนักงานพัฒนาภาค 1</w:t>
+      </w:r>
+    </w:p>
+    <w:p>
+      <w:pPr>
+        <w:pageBreakBefore/>
+        <w:spacing w:before="0" w:after="0" w:line="364" w:lineRule="exact"/>
+      </w:pPr>
+      <w:r>
+        <w:rPr>
+          <w:rFonts w:ascii="TH SarabunPSK" w:hAnsi="TH SarabunPSK" w:cs="TH SarabunPSK" w:eastAsia="TH SarabunPSK"/>
+          <w:b w:val="0"/>
+          <w:sz w:val="21"/>
+          <w:szCs w:val="21"/>
+        </w:rPr>
+        <w:t>วปอ.สปท.</w:t>
+      </w:r>
+    </w:p>
+    <w:p>
+      <w:pPr>
+        <w:spacing w:before="0" w:after="0" w:line="364" w:lineRule="exact"/>
+      </w:pPr>
+      <w:r>
+        <w:rPr>
+          <w:rFonts w:ascii="TH SarabunPSK" w:hAnsi="TH SarabunPSK" w:cs="TH SarabunPSK" w:eastAsia="TH SarabunPSK"/>
+          <w:b w:val="0"/>
+          <w:sz w:val="21"/>
+          <w:szCs w:val="21"/>
+        </w:rPr>
+        <w:t>กห ๐๓๑๗.๒/๑๖๑๑</w:t>
+      </w:r>
+    </w:p>
+    <w:p>
+      <w:pPr>
+        <w:spacing w:before="0" w:after="0" w:line="364" w:lineRule="exact"/>
+      </w:pPr>
+      <w:r>
+        <w:rPr>
+          <w:rFonts w:ascii="TH SarabunPSK" w:hAnsi="TH SarabunPSK" w:cs="TH SarabunPSK" w:eastAsia="TH SarabunPSK"/>
+          <w:b w:val="0"/>
+          <w:sz w:val="21"/>
+          <w:szCs w:val="21"/>
+        </w:rPr>
+        <w:t>โทร. ๐ ๒๕๗๒ ๒๕๒๗</w:t>
+      </w:r>
+    </w:p>
+    <w:p>
+      <w:pPr>
+        <w:tabs>
+          <w:tab w:pos="2886" w:val="left"/>
+        </w:tabs>
+        <w:spacing w:before="580" w:after="0" w:line="440" w:lineRule="exact"/>
+        <w:ind w:left="2886" w:hanging="720"/>
+      </w:pPr>
       <w:r>
         <w:rPr>
           <w:rFonts w:ascii="TH SarabunPSK" w:hAnsi="TH SarabunPSK" w:cs="TH SarabunPSK" w:eastAsia="TH SarabunPSK"/>
@@ -1591,7 +2066,9 @@
           <w:szCs w:val="26"/>
           <w:bCs/>
         </w:rPr>
-        <w:t>สำนักงานปลัดบัญชีทหาร</w:t>
+        <w:t>เรียน</w:t>
+        <w:tab/>
+        <w:t>ผู้บังคับหน่วยพัฒนาการเคลื่อนที่ 15 สำนักงานพัฒนาภาค 1</w:t>
       </w:r>
     </w:p>
     <w:p>
@@ -1640,10 +2117,10 @@
     <w:p>
       <w:pPr>
         <w:tabs>
-          <w:tab w:pos="3028" w:val="left"/>
+          <w:tab w:pos="2604" w:val="left"/>
         </w:tabs>
         <w:spacing w:before="580" w:after="0" w:line="440" w:lineRule="exact"/>
-        <w:ind w:left="3028" w:hanging="720"/>
+        <w:ind w:left="2604" w:hanging="720"/>
       </w:pPr>
       <w:r>
         <w:rPr>
@@ -1655,9 +2132,60 @@
         </w:rPr>
         <w:t>เรียน</w:t>
         <w:tab/>
-        <w:t>ผู้อำนวยการสำนักงานทหารพัฒนา</w:t>
-        <w:br/>
-      </w:r>
+        <w:t>ผู้อำนวยการสำนักงานพัฒนาภาค 2 หน่วยบัญชาการทหารพัฒนา</w:t>
+      </w:r>
+    </w:p>
+    <w:p>
+      <w:pPr>
+        <w:pageBreakBefore/>
+        <w:spacing w:before="0" w:after="0" w:line="364" w:lineRule="exact"/>
+      </w:pPr>
+      <w:r>
+        <w:rPr>
+          <w:rFonts w:ascii="TH SarabunPSK" w:hAnsi="TH SarabunPSK" w:cs="TH SarabunPSK" w:eastAsia="TH SarabunPSK"/>
+          <w:b w:val="0"/>
+          <w:sz w:val="21"/>
+          <w:szCs w:val="21"/>
+        </w:rPr>
+        <w:t>วปอ.สปท.</w:t>
+      </w:r>
+    </w:p>
+    <w:p>
+      <w:pPr>
+        <w:spacing w:before="0" w:after="0" w:line="364" w:lineRule="exact"/>
+      </w:pPr>
+      <w:r>
+        <w:rPr>
+          <w:rFonts w:ascii="TH SarabunPSK" w:hAnsi="TH SarabunPSK" w:cs="TH SarabunPSK" w:eastAsia="TH SarabunPSK"/>
+          <w:b w:val="0"/>
+          <w:sz w:val="21"/>
+          <w:szCs w:val="21"/>
+        </w:rPr>
+        <w:t>กห ๐๓๑๗.๒/๑๖๑๑</w:t>
+      </w:r>
+    </w:p>
+    <w:p>
+      <w:pPr>
+        <w:spacing w:before="0" w:after="0" w:line="364" w:lineRule="exact"/>
+      </w:pPr>
+      <w:r>
+        <w:rPr>
+          <w:rFonts w:ascii="TH SarabunPSK" w:hAnsi="TH SarabunPSK" w:cs="TH SarabunPSK" w:eastAsia="TH SarabunPSK"/>
+          <w:b w:val="0"/>
+          <w:sz w:val="21"/>
+          <w:szCs w:val="21"/>
+        </w:rPr>
+        <w:t>โทร. ๐ ๒๕๗๒ ๒๕๒๗</w:t>
+      </w:r>
+    </w:p>
+    <w:p>
+      <w:pPr>
+        <w:tabs>
+          <w:tab w:pos="2886" w:val="left"/>
+        </w:tabs>
+        <w:spacing w:before="580" w:after="0" w:line="440" w:lineRule="exact"/>
+        <w:ind w:left="2886" w:hanging="720"/>
+      </w:pPr>
       <w:r>
         <w:rPr>
           <w:rFonts w:ascii="TH SarabunPSK" w:hAnsi="TH SarabunPSK" w:cs="TH SarabunPSK" w:eastAsia="TH SarabunPSK"/>
@@ -1666,7 +2194,9 @@
           <w:szCs w:val="26"/>
           <w:bCs/>
         </w:rPr>
-        <w:t>หน่วยบัญชาการทหารพัฒนา</w:t>
+        <w:t>เรียน</w:t>
+        <w:tab/>
+        <w:t>ผู้บังคับหน่วยพัฒนาการเคลื่อนที่ 21 สำนักงานพัฒนาภาค 2</w:t>
       </w:r>
     </w:p>
     <w:p>
@@ -1715,10 +2245,10 @@
     <w:p>
       <w:pPr>
         <w:tabs>
-          <w:tab w:pos="3028" w:val="left"/>
+          <w:tab w:pos="2886" w:val="left"/>
         </w:tabs>
         <w:spacing w:before="580" w:after="0" w:line="440" w:lineRule="exact"/>
-        <w:ind w:left="3028" w:hanging="720"/>
+        <w:ind w:left="2886" w:hanging="720"/>
       </w:pPr>
       <w:r>
         <w:rPr>
@@ -1730,9 +2260,60 @@
         </w:rPr>
         <w:t>เรียน</w:t>
         <w:tab/>
-        <w:t>ผู้อำนวยการสำนักงานสนับสนุน</w:t>
-        <w:br/>
-      </w:r>
+        <w:t>ผู้บังคับหน่วยพัฒนาการเคลื่อนที่ 22 สำนักงานพัฒนาภาค 2</w:t>
+      </w:r>
+    </w:p>
+    <w:p>
+      <w:pPr>
+        <w:pageBreakBefore/>
+        <w:spacing w:before="0" w:after="0" w:line="364" w:lineRule="exact"/>
+      </w:pPr>
+      <w:r>
+        <w:rPr>
+          <w:rFonts w:ascii="TH SarabunPSK" w:hAnsi="TH SarabunPSK" w:cs="TH SarabunPSK" w:eastAsia="TH SarabunPSK"/>
+          <w:b w:val="0"/>
+          <w:sz w:val="21"/>
+          <w:szCs w:val="21"/>
+        </w:rPr>
+        <w:t>วปอ.สปท.</w:t>
+      </w:r>
+    </w:p>
+    <w:p>
+      <w:pPr>
+        <w:spacing w:before="0" w:after="0" w:line="364" w:lineRule="exact"/>
+      </w:pPr>
+      <w:r>
+        <w:rPr>
+          <w:rFonts w:ascii="TH SarabunPSK" w:hAnsi="TH SarabunPSK" w:cs="TH SarabunPSK" w:eastAsia="TH SarabunPSK"/>
+          <w:b w:val="0"/>
+          <w:sz w:val="21"/>
+          <w:szCs w:val="21"/>
+        </w:rPr>
+        <w:t>กห ๐๓๑๗.๒/๑๖๑๑</w:t>
+      </w:r>
+    </w:p>
+    <w:p>
+      <w:pPr>
+        <w:spacing w:before="0" w:after="0" w:line="364" w:lineRule="exact"/>
+      </w:pPr>
+      <w:r>
+        <w:rPr>
+          <w:rFonts w:ascii="TH SarabunPSK" w:hAnsi="TH SarabunPSK" w:cs="TH SarabunPSK" w:eastAsia="TH SarabunPSK"/>
+          <w:b w:val="0"/>
+          <w:sz w:val="21"/>
+          <w:szCs w:val="21"/>
+        </w:rPr>
+        <w:t>โทร. ๐ ๒๕๗๒ ๒๕๒๗</w:t>
+      </w:r>
+    </w:p>
+    <w:p>
+      <w:pPr>
+        <w:tabs>
+          <w:tab w:pos="2886" w:val="left"/>
+        </w:tabs>
+        <w:spacing w:before="580" w:after="0" w:line="440" w:lineRule="exact"/>
+        <w:ind w:left="2886" w:hanging="720"/>
+      </w:pPr>
       <w:r>
         <w:rPr>
           <w:rFonts w:ascii="TH SarabunPSK" w:hAnsi="TH SarabunPSK" w:cs="TH SarabunPSK" w:eastAsia="TH SarabunPSK"/>
@@ -1741,7 +2322,9 @@
           <w:szCs w:val="26"/>
           <w:bCs/>
         </w:rPr>
-        <w:t>หน่วยบัญชาการทหารพัฒนา</w:t>
+        <w:t>เรียน</w:t>
+        <w:tab/>
+        <w:t>ผู้บังคับหน่วยพัฒนาการเคลื่อนที่ 23 สำนักงานพัฒนาภาค 2</w:t>
       </w:r>
     </w:p>
     <w:p>
@@ -1790,10 +2373,10 @@
     <w:p>
       <w:pPr>
         <w:tabs>
-          <w:tab w:pos="3028" w:val="left"/>
+          <w:tab w:pos="2886" w:val="left"/>
         </w:tabs>
         <w:spacing w:before="580" w:after="0" w:line="440" w:lineRule="exact"/>
-        <w:ind w:left="3028" w:hanging="720"/>
+        <w:ind w:left="2886" w:hanging="720"/>
       </w:pPr>
       <w:r>
         <w:rPr>
@@ -1805,9 +2388,60 @@
         </w:rPr>
         <w:t>เรียน</w:t>
         <w:tab/>
-        <w:t>ผู้อำนวยการสำนักงานพัฒนาโครงการ</w:t>
-        <w:br/>
-      </w:r>
+        <w:t>ผู้บังคับหน่วยพัฒนาการเคลื่อนที่ 24 สำนักงานพัฒนาภาค 2</w:t>
+      </w:r>
+    </w:p>
+    <w:p>
+      <w:pPr>
+        <w:pageBreakBefore/>
+        <w:spacing w:before="0" w:after="0" w:line="364" w:lineRule="exact"/>
+      </w:pPr>
+      <w:r>
+        <w:rPr>
+          <w:rFonts w:ascii="TH SarabunPSK" w:hAnsi="TH SarabunPSK" w:cs="TH SarabunPSK" w:eastAsia="TH SarabunPSK"/>
+          <w:b w:val="0"/>
+          <w:sz w:val="21"/>
+          <w:szCs w:val="21"/>
+        </w:rPr>
+        <w:t>วปอ.สปท.</w:t>
+      </w:r>
+    </w:p>
+    <w:p>
+      <w:pPr>
+        <w:spacing w:before="0" w:after="0" w:line="364" w:lineRule="exact"/>
+      </w:pPr>
+      <w:r>
+        <w:rPr>
+          <w:rFonts w:ascii="TH SarabunPSK" w:hAnsi="TH SarabunPSK" w:cs="TH SarabunPSK" w:eastAsia="TH SarabunPSK"/>
+          <w:b w:val="0"/>
+          <w:sz w:val="21"/>
+          <w:szCs w:val="21"/>
+        </w:rPr>
+        <w:t>กห ๐๓๑๗.๒/๑๖๑๑</w:t>
+      </w:r>
+    </w:p>
+    <w:p>
+      <w:pPr>
+        <w:spacing w:before="0" w:after="0" w:line="364" w:lineRule="exact"/>
+      </w:pPr>
+      <w:r>
+        <w:rPr>
+          <w:rFonts w:ascii="TH SarabunPSK" w:hAnsi="TH SarabunPSK" w:cs="TH SarabunPSK" w:eastAsia="TH SarabunPSK"/>
+          <w:b w:val="0"/>
+          <w:sz w:val="21"/>
+          <w:szCs w:val="21"/>
+        </w:rPr>
+        <w:t>โทร. ๐ ๒๕๗๒ ๒๕๒๗</w:t>
+      </w:r>
+    </w:p>
+    <w:p>
+      <w:pPr>
+        <w:tabs>
+          <w:tab w:pos="2886" w:val="left"/>
+        </w:tabs>
+        <w:spacing w:before="580" w:after="0" w:line="440" w:lineRule="exact"/>
+        <w:ind w:left="2886" w:hanging="720"/>
+      </w:pPr>
       <w:r>
         <w:rPr>
           <w:rFonts w:ascii="TH SarabunPSK" w:hAnsi="TH SarabunPSK" w:cs="TH SarabunPSK" w:eastAsia="TH SarabunPSK"/>
@@ -1816,7 +2450,9 @@
           <w:szCs w:val="26"/>
           <w:bCs/>
         </w:rPr>
-        <w:t>อันเนื่องมาจากพระราชดำริ หน่วยบัญชาการทหารพัฒนา</w:t>
+        <w:t>เรียน</w:t>
+        <w:tab/>
+        <w:t>ผู้บังคับหน่วยพัฒนาการเคลื่อนที่ 25 สำนักงานพัฒนาภาค 2</w:t>
       </w:r>
     </w:p>
     <w:p>
@@ -1865,10 +2501,10 @@
     <w:p>
       <w:pPr>
         <w:tabs>
-          <w:tab w:pos="3028" w:val="left"/>
+          <w:tab w:pos="2886" w:val="left"/>
         </w:tabs>
         <w:spacing w:before="580" w:after="0" w:line="440" w:lineRule="exact"/>
-        <w:ind w:left="3028" w:hanging="720"/>
+        <w:ind w:left="2886" w:hanging="720"/>
       </w:pPr>
       <w:r>
         <w:rPr>
@@ -1880,9 +2516,60 @@
         </w:rPr>
         <w:t>เรียน</w:t>
         <w:tab/>
-        <w:t>ผู้อำนวยการสำนักงานพัฒนาภาค 1</w:t>
-        <w:br/>
-      </w:r>
+        <w:t>ผู้บังคับหน่วยพัฒนาการเคลื่อนที่ 26 สำนักงานพัฒนาภาค 2</w:t>
+      </w:r>
+    </w:p>
+    <w:p>
+      <w:pPr>
+        <w:pageBreakBefore/>
+        <w:spacing w:before="0" w:after="0" w:line="364" w:lineRule="exact"/>
+      </w:pPr>
+      <w:r>
+        <w:rPr>
+          <w:rFonts w:ascii="TH SarabunPSK" w:hAnsi="TH SarabunPSK" w:cs="TH SarabunPSK" w:eastAsia="TH SarabunPSK"/>
+          <w:b w:val="0"/>
+          <w:sz w:val="21"/>
+          <w:szCs w:val="21"/>
+        </w:rPr>
+        <w:t>วปอ.สปท.</w:t>
+      </w:r>
+    </w:p>
+    <w:p>
+      <w:pPr>
+        <w:spacing w:before="0" w:after="0" w:line="364" w:lineRule="exact"/>
+      </w:pPr>
+      <w:r>
+        <w:rPr>
+          <w:rFonts w:ascii="TH SarabunPSK" w:hAnsi="TH SarabunPSK" w:cs="TH SarabunPSK" w:eastAsia="TH SarabunPSK"/>
+          <w:b w:val="0"/>
+          <w:sz w:val="21"/>
+          <w:szCs w:val="21"/>
+        </w:rPr>
+        <w:t>กห ๐๓๑๗.๒/๑๖๑๑</w:t>
+      </w:r>
+    </w:p>
+    <w:p>
+      <w:pPr>
+        <w:spacing w:before="0" w:after="0" w:line="364" w:lineRule="exact"/>
+      </w:pPr>
+      <w:r>
+        <w:rPr>
+          <w:rFonts w:ascii="TH SarabunPSK" w:hAnsi="TH SarabunPSK" w:cs="TH SarabunPSK" w:eastAsia="TH SarabunPSK"/>
+          <w:b w:val="0"/>
+          <w:sz w:val="21"/>
+          <w:szCs w:val="21"/>
+        </w:rPr>
+        <w:t>โทร. ๐ ๒๕๗๒ ๒๕๒๗</w:t>
+      </w:r>
+    </w:p>
+    <w:p>
+      <w:pPr>
+        <w:tabs>
+          <w:tab w:pos="2604" w:val="left"/>
+        </w:tabs>
+        <w:spacing w:before="580" w:after="0" w:line="440" w:lineRule="exact"/>
+        <w:ind w:left="2604" w:hanging="720"/>
+      </w:pPr>
       <w:r>
         <w:rPr>
           <w:rFonts w:ascii="TH SarabunPSK" w:hAnsi="TH SarabunPSK" w:cs="TH SarabunPSK" w:eastAsia="TH SarabunPSK"/>
@@ -1891,7 +2578,9 @@
           <w:szCs w:val="26"/>
           <w:bCs/>
         </w:rPr>
-        <w:t>หน่วยบัญชาการทหารพัฒนา</w:t>
+        <w:t>เรียน</w:t>
+        <w:tab/>
+        <w:t>ผู้อำนวยการสำนักงานพัฒนาภาค 3 หน่วยบัญชาการทหารพัฒนา</w:t>
       </w:r>
     </w:p>
     <w:p>
@@ -1940,10 +2629,10 @@
     <w:p>
       <w:pPr>
         <w:tabs>
-          <w:tab w:pos="3028" w:val="left"/>
+          <w:tab w:pos="2886" w:val="left"/>
         </w:tabs>
         <w:spacing w:before="580" w:after="0" w:line="440" w:lineRule="exact"/>
-        <w:ind w:left="3028" w:hanging="720"/>
+        <w:ind w:left="2886" w:hanging="720"/>
       </w:pPr>
       <w:r>
         <w:rPr>
@@ -1955,7 +2644,7 @@
         </w:rPr>
         <w:t>เรียน</w:t>
         <w:tab/>
-        <w:t>ผู้บังคับหน่วยพัฒนาการเคลื่อนที่ 11 สำนักงานพัฒนาภาค 1</w:t>
+        <w:t>ผู้บังคับหน่วยพัฒนาการเคลื่อนที่ 31 สำนักงานพัฒนาภาค 3</w:t>
       </w:r>
     </w:p>
     <w:p>
@@ -2004,10 +2693,10 @@
     <w:p>
       <w:pPr>
         <w:tabs>
-          <w:tab w:pos="3028" w:val="left"/>
+          <w:tab w:pos="2886" w:val="left"/>
         </w:tabs>
         <w:spacing w:before="580" w:after="0" w:line="440" w:lineRule="exact"/>
-        <w:ind w:left="3028" w:hanging="720"/>
+        <w:ind w:left="2886" w:hanging="720"/>
       </w:pPr>
       <w:r>
         <w:rPr>
@@ -2019,7 +2708,7 @@
         </w:rPr>
         <w:t>เรียน</w:t>
         <w:tab/>
-        <w:t>ผู้บังคับหน่วยพัฒนาการเคลื่อนที่ 12 สำนักงานพัฒนาภาค 1</w:t>
+        <w:t>ผู้บังคับหน่วยพัฒนาการเคลื่อนที่ 32 สำนักงานพัฒนาภาค 3</w:t>
       </w:r>
     </w:p>
     <w:p>
@@ -2068,10 +2757,10 @@
     <w:p>
       <w:pPr>
         <w:tabs>
-          <w:tab w:pos="3028" w:val="left"/>
+          <w:tab w:pos="2886" w:val="left"/>
         </w:tabs>
         <w:spacing w:before="580" w:after="0" w:line="440" w:lineRule="exact"/>
-        <w:ind w:left="3028" w:hanging="720"/>
+        <w:ind w:left="2886" w:hanging="720"/>
       </w:pPr>
       <w:r>
         <w:rPr>
@@ -2083,7 +2772,7 @@
         </w:rPr>
         <w:t>เรียน</w:t>
         <w:tab/>
-        <w:t>ผู้บังคับหน่วยพัฒนาการเคลื่อนที่ 13 สำนักงานพัฒนาภาค 1</w:t>
+        <w:t>ผู้บังคับหน่วยพัฒนาการเคลื่อนที่ 33 สำนักงานพัฒนาภาค 3</w:t>
       </w:r>
     </w:p>
     <w:p>
@@ -2132,10 +2821,10 @@
     <w:p>
       <w:pPr>
         <w:tabs>
-          <w:tab w:pos="3028" w:val="left"/>
+          <w:tab w:pos="2886" w:val="left"/>
         </w:tabs>
         <w:spacing w:before="580" w:after="0" w:line="440" w:lineRule="exact"/>
-        <w:ind w:left="3028" w:hanging="720"/>
+        <w:ind w:left="2886" w:hanging="720"/>
       </w:pPr>
       <w:r>
         <w:rPr>
@@ -2147,7 +2836,7 @@
         </w:rPr>
         <w:t>เรียน</w:t>
         <w:tab/>
-        <w:t>ผู้บังคับหน่วยพัฒนาการเคลื่อนที่ 14 สำนักงานพัฒนาภาค 1</w:t>
+        <w:t>ผู้บังคับหน่วยพัฒนาการเคลื่อนที่ 34 สำนักงานพัฒนาภาค 3</w:t>
       </w:r>
     </w:p>
     <w:p>
@@ -2196,10 +2885,10 @@
     <w:p>
       <w:pPr>
         <w:tabs>
-          <w:tab w:pos="3028" w:val="left"/>
+          <w:tab w:pos="2886" w:val="left"/>
         </w:tabs>
         <w:spacing w:before="580" w:after="0" w:line="440" w:lineRule="exact"/>
-        <w:ind w:left="3028" w:hanging="720"/>
+        <w:ind w:left="2886" w:hanging="720"/>
       </w:pPr>
       <w:r>
         <w:rPr>
@@ -2211,7 +2900,7 @@
         </w:rPr>
         <w:t>เรียน</w:t>
         <w:tab/>
-        <w:t>ผู้บังคับหน่วยพัฒนาการเคลื่อนที่ 15 สำนักงานพัฒนาภาค 1</w:t>
+        <w:t>ผู้บังคับหน่วยพัฒนาการเคลื่อนที่ 35 สำนักงานพัฒนาภาค 3</w:t>
       </w:r>
     </w:p>
     <w:p>
@@ -2260,10 +2949,10 @@
     <w:p>
       <w:pPr>
         <w:tabs>
-          <w:tab w:pos="3028" w:val="left"/>
+          <w:tab w:pos="2886" w:val="left"/>
         </w:tabs>
         <w:spacing w:before="580" w:after="0" w:line="440" w:lineRule="exact"/>
-        <w:ind w:left="3028" w:hanging="720"/>
+        <w:ind w:left="2886" w:hanging="720"/>
       </w:pPr>
       <w:r>
         <w:rPr>
@@ -2275,9 +2964,60 @@
         </w:rPr>
         <w:t>เรียน</w:t>
         <w:tab/>
-        <w:t>ผู้อำนวยการสำนักงานพัฒนาภาค 2</w:t>
-        <w:br/>
-      </w:r>
+        <w:t>ผู้บังคับหน่วยพัฒนาการเคลื่อนที่ 36 สำนักงานพัฒนาภาค 3</w:t>
+      </w:r>
+    </w:p>
+    <w:p>
+      <w:pPr>
+        <w:pageBreakBefore/>
+        <w:spacing w:before="0" w:after="0" w:line="364" w:lineRule="exact"/>
+      </w:pPr>
+      <w:r>
+        <w:rPr>
+          <w:rFonts w:ascii="TH SarabunPSK" w:hAnsi="TH SarabunPSK" w:cs="TH SarabunPSK" w:eastAsia="TH SarabunPSK"/>
+          <w:b w:val="0"/>
+          <w:sz w:val="21"/>
+          <w:szCs w:val="21"/>
+        </w:rPr>
+        <w:t>วปอ.สปท.</w:t>
+      </w:r>
+    </w:p>
+    <w:p>
+      <w:pPr>
+        <w:spacing w:before="0" w:after="0" w:line="364" w:lineRule="exact"/>
+      </w:pPr>
+      <w:r>
+        <w:rPr>
+          <w:rFonts w:ascii="TH SarabunPSK" w:hAnsi="TH SarabunPSK" w:cs="TH SarabunPSK" w:eastAsia="TH SarabunPSK"/>
+          <w:b w:val="0"/>
+          <w:sz w:val="21"/>
+          <w:szCs w:val="21"/>
+        </w:rPr>
+        <w:t>กห ๐๓๑๗.๒/๑๖๑๑</w:t>
+      </w:r>
+    </w:p>
+    <w:p>
+      <w:pPr>
+        <w:spacing w:before="0" w:after="0" w:line="364" w:lineRule="exact"/>
+      </w:pPr>
+      <w:r>
+        <w:rPr>
+          <w:rFonts w:ascii="TH SarabunPSK" w:hAnsi="TH SarabunPSK" w:cs="TH SarabunPSK" w:eastAsia="TH SarabunPSK"/>
+          <w:b w:val="0"/>
+          <w:sz w:val="21"/>
+          <w:szCs w:val="21"/>
+        </w:rPr>
+        <w:t>โทร. ๐ ๒๕๗๒ ๒๕๒๗</w:t>
+      </w:r>
+    </w:p>
+    <w:p>
+      <w:pPr>
+        <w:tabs>
+          <w:tab w:pos="2604" w:val="left"/>
+        </w:tabs>
+        <w:spacing w:before="580" w:after="0" w:line="440" w:lineRule="exact"/>
+        <w:ind w:left="2604" w:hanging="720"/>
+      </w:pPr>
       <w:r>
         <w:rPr>
           <w:rFonts w:ascii="TH SarabunPSK" w:hAnsi="TH SarabunPSK" w:cs="TH SarabunPSK" w:eastAsia="TH SarabunPSK"/>
@@ -2286,7 +3026,9 @@
           <w:szCs w:val="26"/>
           <w:bCs/>
         </w:rPr>
-        <w:t>หน่วยบัญชาการทหารพัฒนา</w:t>
+        <w:t>เรียน</w:t>
+        <w:tab/>
+        <w:t>ผู้อำนวยการสำนักงานพัฒนาภาค 4 หน่วยบัญชาการทหารพัฒนา</w:t>
       </w:r>
     </w:p>
     <w:p>
@@ -2335,10 +3077,10 @@
     <w:p>
       <w:pPr>
         <w:tabs>
-          <w:tab w:pos="3028" w:val="left"/>
+          <w:tab w:pos="2886" w:val="left"/>
         </w:tabs>
         <w:spacing w:before="580" w:after="0" w:line="440" w:lineRule="exact"/>
-        <w:ind w:left="3028" w:hanging="720"/>
+        <w:ind w:left="2886" w:hanging="720"/>
       </w:pPr>
       <w:r>
         <w:rPr>
@@ -2350,7 +3092,7 @@
         </w:rPr>
         <w:t>เรียน</w:t>
         <w:tab/>
-        <w:t>ผู้บังคับหน่วยพัฒนาการเคลื่อนที่ 21 สำนักงานพัฒนาภาค 2</w:t>
+        <w:t>ผู้บังคับหน่วยพัฒนาการเคลื่อนที่ 41 สำนักงานพัฒนาภาค 4</w:t>
       </w:r>
     </w:p>
     <w:p>
@@ -2399,10 +3141,10 @@
     <w:p>
       <w:pPr>
         <w:tabs>
-          <w:tab w:pos="3028" w:val="left"/>
+          <w:tab w:pos="2886" w:val="left"/>
         </w:tabs>
         <w:spacing w:before="580" w:after="0" w:line="440" w:lineRule="exact"/>
-        <w:ind w:left="3028" w:hanging="720"/>
+        <w:ind w:left="2886" w:hanging="720"/>
       </w:pPr>
       <w:r>
         <w:rPr>
@@ -2414,7 +3156,7 @@
         </w:rPr>
         <w:t>เรียน</w:t>
         <w:tab/>
-        <w:t>ผู้บังคับหน่วยพัฒนาการเคลื่อนที่ 22 สำนักงานพัฒนาภาค 2</w:t>
+        <w:t>ผู้บังคับหน่วยพัฒนาการเคลื่อนที่ 42 สำนักงานพัฒนาภาค 4</w:t>
       </w:r>
     </w:p>
     <w:p>
@@ -2463,10 +3205,10 @@
     <w:p>
       <w:pPr>
         <w:tabs>
-          <w:tab w:pos="3028" w:val="left"/>
+          <w:tab w:pos="2886" w:val="left"/>
         </w:tabs>
         <w:spacing w:before="580" w:after="0" w:line="440" w:lineRule="exact"/>
-        <w:ind w:left="3028" w:hanging="720"/>
+        <w:ind w:left="2886" w:hanging="720"/>
       </w:pPr>
       <w:r>
         <w:rPr>
@@ -2478,7 +3220,7 @@
         </w:rPr>
         <w:t>เรียน</w:t>
         <w:tab/>
-        <w:t>ผู้บังคับหน่วยพัฒนาการเคลื่อนที่ 23 สำนักงานพัฒนาภาค 2</w:t>
+        <w:t>ผู้บังคับหน่วยพัฒนาการเคลื่อนที่ 43 สำนักงานพัฒนาภาค 4</w:t>
       </w:r>
     </w:p>
     <w:p>
@@ -2527,10 +3269,10 @@
     <w:p>
       <w:pPr>
         <w:tabs>
-          <w:tab w:pos="3028" w:val="left"/>
+          <w:tab w:pos="2886" w:val="left"/>
         </w:tabs>
         <w:spacing w:before="580" w:after="0" w:line="440" w:lineRule="exact"/>
-        <w:ind w:left="3028" w:hanging="720"/>
+        <w:ind w:left="2886" w:hanging="720"/>
       </w:pPr>
       <w:r>
         <w:rPr>
@@ -2542,7 +3284,7 @@
         </w:rPr>
         <w:t>เรียน</w:t>
         <w:tab/>
-        <w:t>ผู้บังคับหน่วยพัฒนาการเคลื่อนที่ 24 สำนักงานพัฒนาภาค 2</w:t>
+        <w:t>ผู้บังคับหน่วยพัฒนาการเคลื่อนที่ 44 สำนักงานพัฒนาภาค 4</w:t>
       </w:r>
     </w:p>
     <w:p>
@@ -2591,10 +3333,10 @@
     <w:p>
       <w:pPr>
         <w:tabs>
-          <w:tab w:pos="3028" w:val="left"/>
+          <w:tab w:pos="2886" w:val="left"/>
         </w:tabs>
         <w:spacing w:before="580" w:after="0" w:line="440" w:lineRule="exact"/>
-        <w:ind w:left="3028" w:hanging="720"/>
+        <w:ind w:left="2886" w:hanging="720"/>
       </w:pPr>
       <w:r>
         <w:rPr>
@@ -2606,7 +3348,7 @@
         </w:rPr>
         <w:t>เรียน</w:t>
         <w:tab/>
-        <w:t>ผู้บังคับหน่วยพัฒนาการเคลื่อนที่ 25 สำนักงานพัฒนาภาค 2</w:t>
+        <w:t>ผู้บังคับหน่วยพัฒนาการเคลื่อนที่ 45 สำนักงานพัฒนาภาค 4</w:t>
       </w:r>
     </w:p>
     <w:p>
@@ -2655,10 +3397,10 @@
     <w:p>
       <w:pPr>
         <w:tabs>
-          <w:tab w:pos="3028" w:val="left"/>
+          <w:tab w:pos="2886" w:val="left"/>
         </w:tabs>
         <w:spacing w:before="580" w:after="0" w:line="440" w:lineRule="exact"/>
-        <w:ind w:left="3028" w:hanging="720"/>
+        <w:ind w:left="2886" w:hanging="720"/>
       </w:pPr>
       <w:r>
         <w:rPr>
@@ -2670,7 +3412,7 @@
         </w:rPr>
         <w:t>เรียน</w:t>
         <w:tab/>
-        <w:t>ผู้บังคับหน่วยพัฒนาการเคลื่อนที่ 26 สำนักงานพัฒนาภาค 2</w:t>
+        <w:t>ผู้บังคับหน่วยพัฒนาการเคลื่อนที่ 46 สำนักงานพัฒนาภาค 4</w:t>
       </w:r>
     </w:p>
     <w:p>
@@ -2719,10 +3461,10 @@
     <w:p>
       <w:pPr>
         <w:tabs>
-          <w:tab w:pos="3028" w:val="left"/>
+          <w:tab w:pos="2604" w:val="left"/>
         </w:tabs>
         <w:spacing w:before="580" w:after="0" w:line="440" w:lineRule="exact"/>
-        <w:ind w:left="3028" w:hanging="720"/>
+        <w:ind w:left="2604" w:hanging="720"/>
       </w:pPr>
       <w:r>
         <w:rPr>
@@ -2734,9 +3476,60 @@
         </w:rPr>
         <w:t>เรียน</w:t>
         <w:tab/>
-        <w:t>ผู้อำนวยการสำนักงานพัฒนาภาค 3</w:t>
-        <w:br/>
-      </w:r>
+        <w:t>ผู้อำนวยการสำนักงานพัฒนาภาค 5 หน่วยบัญชาการทหารพัฒนา</w:t>
+      </w:r>
+    </w:p>
+    <w:p>
+      <w:pPr>
+        <w:pageBreakBefore/>
+        <w:spacing w:before="0" w:after="0" w:line="364" w:lineRule="exact"/>
+      </w:pPr>
+      <w:r>
+        <w:rPr>
+          <w:rFonts w:ascii="TH SarabunPSK" w:hAnsi="TH SarabunPSK" w:cs="TH SarabunPSK" w:eastAsia="TH SarabunPSK"/>
+          <w:b w:val="0"/>
+          <w:sz w:val="21"/>
+          <w:szCs w:val="21"/>
+        </w:rPr>
+        <w:t>วปอ.สปท.</w:t>
+      </w:r>
+    </w:p>
+    <w:p>
+      <w:pPr>
+        <w:spacing w:before="0" w:after="0" w:line="364" w:lineRule="exact"/>
+      </w:pPr>
+      <w:r>
+        <w:rPr>
+          <w:rFonts w:ascii="TH SarabunPSK" w:hAnsi="TH SarabunPSK" w:cs="TH SarabunPSK" w:eastAsia="TH SarabunPSK"/>
+          <w:b w:val="0"/>
+          <w:sz w:val="21"/>
+          <w:szCs w:val="21"/>
+        </w:rPr>
+        <w:t>กห ๐๓๑๗.๒/๑๖๑๑</w:t>
+      </w:r>
+    </w:p>
+    <w:p>
+      <w:pPr>
+        <w:spacing w:before="0" w:after="0" w:line="364" w:lineRule="exact"/>
+      </w:pPr>
+      <w:r>
+        <w:rPr>
+          <w:rFonts w:ascii="TH SarabunPSK" w:hAnsi="TH SarabunPSK" w:cs="TH SarabunPSK" w:eastAsia="TH SarabunPSK"/>
+          <w:b w:val="0"/>
+          <w:sz w:val="21"/>
+          <w:szCs w:val="21"/>
+        </w:rPr>
+        <w:t>โทร. ๐ ๒๕๗๒ ๒๕๒๗</w:t>
+      </w:r>
+    </w:p>
+    <w:p>
+      <w:pPr>
+        <w:tabs>
+          <w:tab w:pos="2886" w:val="left"/>
+        </w:tabs>
+        <w:spacing w:before="580" w:after="0" w:line="440" w:lineRule="exact"/>
+        <w:ind w:left="2886" w:hanging="720"/>
+      </w:pPr>
       <w:r>
         <w:rPr>
           <w:rFonts w:ascii="TH SarabunPSK" w:hAnsi="TH SarabunPSK" w:cs="TH SarabunPSK" w:eastAsia="TH SarabunPSK"/>
@@ -2745,7 +3538,9 @@
           <w:szCs w:val="26"/>
           <w:bCs/>
         </w:rPr>
-        <w:t>หน่วยบัญชาการทหารพัฒนา</w:t>
+        <w:t>เรียน</w:t>
+        <w:tab/>
+        <w:t>ผู้บังคับหน่วยพัฒนาการเคลื่อนที่ 51 สำนักงานพัฒนาภาค 5</w:t>
       </w:r>
     </w:p>
     <w:p>
@@ -2794,10 +3589,10 @@
     <w:p>
       <w:pPr>
         <w:tabs>
-          <w:tab w:pos="3028" w:val="left"/>
+          <w:tab w:pos="2886" w:val="left"/>
         </w:tabs>
         <w:spacing w:before="580" w:after="0" w:line="440" w:lineRule="exact"/>
-        <w:ind w:left="3028" w:hanging="720"/>
+        <w:ind w:left="2886" w:hanging="720"/>
       </w:pPr>
       <w:r>
         <w:rPr>
@@ -2809,7 +3604,7 @@
         </w:rPr>
         <w:t>เรียน</w:t>
         <w:tab/>
-        <w:t>ผู้บังคับหน่วยพัฒนาการเคลื่อนที่ 31 สำนักงานพัฒนาภาค 3</w:t>
+        <w:t>ผู้บังคับหน่วยพัฒนาการเคลื่อนที่ 52 สำนักงานพัฒนาภาค 5</w:t>
       </w:r>
     </w:p>
     <w:p>
@@ -2858,10 +3653,10 @@
     <w:p>
       <w:pPr>
         <w:tabs>
-          <w:tab w:pos="3028" w:val="left"/>
+          <w:tab w:pos="2886" w:val="left"/>
         </w:tabs>
         <w:spacing w:before="580" w:after="0" w:line="440" w:lineRule="exact"/>
-        <w:ind w:left="3028" w:hanging="720"/>
+        <w:ind w:left="2886" w:hanging="720"/>
       </w:pPr>
       <w:r>
         <w:rPr>
@@ -2873,7 +3668,7 @@
         </w:rPr>
         <w:t>เรียน</w:t>
         <w:tab/>
-        <w:t>ผู้บังคับหน่วยพัฒนาการเคลื่อนที่ 32 สำนักงานพัฒนาภาค 3</w:t>
+        <w:t>ผู้บังคับหน่วยพัฒนาการเคลื่อนที่ 53 สำนักงานพัฒนาภาค 5</w:t>
       </w:r>
     </w:p>
     <w:p>
@@ -2922,10 +3717,10 @@
     <w:p>
       <w:pPr>
         <w:tabs>
-          <w:tab w:pos="3028" w:val="left"/>
+          <w:tab w:pos="2886" w:val="left"/>
         </w:tabs>
         <w:spacing w:before="580" w:after="0" w:line="440" w:lineRule="exact"/>
-        <w:ind w:left="3028" w:hanging="720"/>
+        <w:ind w:left="2886" w:hanging="720"/>
       </w:pPr>
       <w:r>
         <w:rPr>
@@ -2937,7 +3732,7 @@
         </w:rPr>
         <w:t>เรียน</w:t>
         <w:tab/>
-        <w:t>ผู้บังคับหน่วยพัฒนาการเคลื่อนที่ 33 สำนักงานพัฒนาภาค 3</w:t>
+        <w:t>ผู้บังคับหน่วยพัฒนาการเคลื่อนที่ 54 สำนักงานพัฒนาภาค 5</w:t>
       </w:r>
     </w:p>
     <w:p>
@@ -2986,10 +3781,10 @@
     <w:p>
       <w:pPr>
         <w:tabs>
-          <w:tab w:pos="3028" w:val="left"/>
+          <w:tab w:pos="2886" w:val="left"/>
         </w:tabs>
         <w:spacing w:before="580" w:after="0" w:line="440" w:lineRule="exact"/>
-        <w:ind w:left="3028" w:hanging="720"/>
+        <w:ind w:left="2886" w:hanging="720"/>
       </w:pPr>
       <w:r>
         <w:rPr>
@@ -3001,7 +3796,7 @@
         </w:rPr>
         <w:t>เรียน</w:t>
         <w:tab/>
-        <w:t>ผู้บังคับหน่วยพัฒนาการเคลื่อนที่ 34 สำนักงานพัฒนาภาค 3</w:t>
+        <w:t>ผู้บังคับหน่วยพัฒนาการเคลื่อนที่ 55 สำนักงานพัฒนาภาค 5</w:t>
       </w:r>
     </w:p>
     <w:p>
@@ -3050,10 +3845,10 @@
     <w:p>
       <w:pPr>
         <w:tabs>
-          <w:tab w:pos="3028" w:val="left"/>
+          <w:tab w:pos="2886" w:val="left"/>
         </w:tabs>
         <w:spacing w:before="580" w:after="0" w:line="440" w:lineRule="exact"/>
-        <w:ind w:left="3028" w:hanging="720"/>
+        <w:ind w:left="2886" w:hanging="720"/>
       </w:pPr>
       <w:r>
         <w:rPr>
@@ -3065,7 +3860,7 @@
         </w:rPr>
         <w:t>เรียน</w:t>
         <w:tab/>
-        <w:t>ผู้บังคับหน่วยพัฒนาการเคลื่อนที่ 35 สำนักงานพัฒนาภาค 3</w:t>
+        <w:t>ผู้บังคับหน่วยพัฒนาการเคลื่อนที่ 56 สำนักงานพัฒนาภาค 5</w:t>
       </w:r>
     </w:p>
     <w:p>
@@ -3114,10 +3909,10 @@
     <w:p>
       <w:pPr>
         <w:tabs>
-          <w:tab w:pos="3028" w:val="left"/>
+          <w:tab w:pos="2910" w:val="left"/>
         </w:tabs>
         <w:spacing w:before="580" w:after="0" w:line="440" w:lineRule="exact"/>
-        <w:ind w:left="3028" w:hanging="720"/>
+        <w:ind w:left="2910" w:hanging="720"/>
       </w:pPr>
       <w:r>
         <w:rPr>
@@ -3129,7 +3924,7 @@
         </w:rPr>
         <w:t>เรียน</w:t>
         <w:tab/>
-        <w:t>ผู้บังคับหน่วยพัฒนาการเคลื่อนที่ 36 สำนักงานพัฒนาภาค 3</w:t>
+        <w:t>ผู้บังคับหน่วยพัฒนาการพิเศษ หน่วยบัญชาการทหารพัฒนา</w:t>
       </w:r>
     </w:p>
     <w:p>
@@ -3178,10 +3973,10 @@
     <w:p>
       <w:pPr>
         <w:tabs>
-          <w:tab w:pos="3028" w:val="left"/>
+          <w:tab w:pos="2966" w:val="left"/>
         </w:tabs>
         <w:spacing w:before="580" w:after="0" w:line="440" w:lineRule="exact"/>
-        <w:ind w:left="3028" w:hanging="720"/>
+        <w:ind w:left="2966" w:hanging="720"/>
       </w:pPr>
       <w:r>
         <w:rPr>
@@ -3193,9 +3988,60 @@
         </w:rPr>
         <w:t>เรียน</w:t>
         <w:tab/>
-        <w:t>ผู้อำนวยการสำนักงานพัฒนาภาค 4</w:t>
-        <w:br/>
-      </w:r>
+        <w:t>ผู้อำนวยการสำนักปฏิบัติการข่าว ศูนย์รักษาความปลอดภัย</w:t>
+      </w:r>
+    </w:p>
+    <w:p>
+      <w:pPr>
+        <w:pageBreakBefore/>
+        <w:spacing w:before="0" w:after="0" w:line="364" w:lineRule="exact"/>
+      </w:pPr>
+      <w:r>
+        <w:rPr>
+          <w:rFonts w:ascii="TH SarabunPSK" w:hAnsi="TH SarabunPSK" w:cs="TH SarabunPSK" w:eastAsia="TH SarabunPSK"/>
+          <w:b w:val="0"/>
+          <w:sz w:val="21"/>
+          <w:szCs w:val="21"/>
+        </w:rPr>
+        <w:t>วปอ.สปท.</w:t>
+      </w:r>
+    </w:p>
+    <w:p>
+      <w:pPr>
+        <w:spacing w:before="0" w:after="0" w:line="364" w:lineRule="exact"/>
+      </w:pPr>
+      <w:r>
+        <w:rPr>
+          <w:rFonts w:ascii="TH SarabunPSK" w:hAnsi="TH SarabunPSK" w:cs="TH SarabunPSK" w:eastAsia="TH SarabunPSK"/>
+          <w:b w:val="0"/>
+          <w:sz w:val="21"/>
+          <w:szCs w:val="21"/>
+        </w:rPr>
+        <w:t>กห ๐๓๑๗.๒/๑๖๑๑</w:t>
+      </w:r>
+    </w:p>
+    <w:p>
+      <w:pPr>
+        <w:spacing w:before="0" w:after="0" w:line="364" w:lineRule="exact"/>
+      </w:pPr>
+      <w:r>
+        <w:rPr>
+          <w:rFonts w:ascii="TH SarabunPSK" w:hAnsi="TH SarabunPSK" w:cs="TH SarabunPSK" w:eastAsia="TH SarabunPSK"/>
+          <w:b w:val="0"/>
+          <w:sz w:val="21"/>
+          <w:szCs w:val="21"/>
+        </w:rPr>
+        <w:t>โทร. ๐ ๒๕๗๒ ๒๕๒๗</w:t>
+      </w:r>
+    </w:p>
+    <w:p>
+      <w:pPr>
+        <w:tabs>
+          <w:tab w:pos="2648" w:val="left"/>
+        </w:tabs>
+        <w:spacing w:before="580" w:after="0" w:line="440" w:lineRule="exact"/>
+        <w:ind w:left="2648" w:hanging="720"/>
+      </w:pPr>
       <w:r>
         <w:rPr>
           <w:rFonts w:ascii="TH SarabunPSK" w:hAnsi="TH SarabunPSK" w:cs="TH SarabunPSK" w:eastAsia="TH SarabunPSK"/>
@@ -3204,7 +4050,9 @@
           <w:szCs w:val="26"/>
           <w:bCs/>
         </w:rPr>
-        <w:t>หน่วยบัญชาการทหารพัฒนา</w:t>
+        <w:t>เรียน</w:t>
+        <w:tab/>
+        <w:t>ผู้อำนวยการสำนักรักษาความปลอดภัย ศูนย์รักษาความปลอดภัย</w:t>
       </w:r>
     </w:p>
     <w:p>
@@ -3253,10 +4101,10 @@
     <w:p>
       <w:pPr>
         <w:tabs>
-          <w:tab w:pos="3028" w:val="left"/>
+          <w:tab w:pos="2422" w:val="left"/>
         </w:tabs>
         <w:spacing w:before="580" w:after="0" w:line="440" w:lineRule="exact"/>
-        <w:ind w:left="3028" w:hanging="720"/>
+        <w:ind w:left="2422" w:hanging="720"/>
       </w:pPr>
       <w:r>
         <w:rPr>
@@ -3268,7 +4116,7 @@
         </w:rPr>
         <w:t>เรียน</w:t>
         <w:tab/>
-        <w:t>ผู้บังคับหน่วยพัฒนาการเคลื่อนที่ 41 สำนักงานพัฒนาภาค 4</w:t>
+        <w:t>ผู้อำนวยการสำนักบริการสิทธิประโยชน์กำลังพล กรมสารบรรณทหาร</w:t>
       </w:r>
     </w:p>
     <w:p>
@@ -3317,10 +4165,10 @@
     <w:p>
       <w:pPr>
         <w:tabs>
-          <w:tab w:pos="3028" w:val="left"/>
+          <w:tab w:pos="2326" w:val="left"/>
         </w:tabs>
         <w:spacing w:before="580" w:after="0" w:line="440" w:lineRule="exact"/>
-        <w:ind w:left="3028" w:hanging="720"/>
+        <w:ind w:left="2326" w:hanging="720"/>
       </w:pPr>
       <w:r>
         <w:rPr>
@@ -3332,7 +4180,7 @@
         </w:rPr>
         <w:t>เรียน</w:t>
         <w:tab/>
-        <w:t>ผู้บังคับหน่วยพัฒนาการเคลื่อนที่ 42 สำนักงานพัฒนาภาค 4</w:t>
+        <w:t>ผู้อำนวยการสำนักปฏิบัติการเพื่อความมั่นคง กรมกิจการชายแดนทหาร</w:t>
       </w:r>
     </w:p>
     <w:p>
@@ -3381,10 +4229,10 @@
     <w:p>
       <w:pPr>
         <w:tabs>
-          <w:tab w:pos="3028" w:val="left"/>
+          <w:tab w:pos="2531" w:val="left"/>
         </w:tabs>
         <w:spacing w:before="580" w:after="0" w:line="440" w:lineRule="exact"/>
-        <w:ind w:left="3028" w:hanging="720"/>
+        <w:ind w:left="2531" w:hanging="720"/>
       </w:pPr>
       <w:r>
         <w:rPr>
@@ -3396,7 +4244,7 @@
         </w:rPr>
         <w:t>เรียน</w:t>
         <w:tab/>
-        <w:t>ผู้บังคับหน่วยพัฒนาการเคลื่อนที่ 43 สำนักงานพัฒนาภาค 4</w:t>
+        <w:t>เสนาธิการวิทยาลัยเสนาธิการทหาร สถาบันวิชาการป้องกันประเทศ</w:t>
       </w:r>
     </w:p>
     <w:p>
@@ -3445,10 +4293,10 @@
     <w:p>
       <w:pPr>
         <w:tabs>
-          <w:tab w:pos="3028" w:val="left"/>
+          <w:tab w:pos="3009" w:val="left"/>
         </w:tabs>
         <w:spacing w:before="580" w:after="0" w:line="440" w:lineRule="exact"/>
-        <w:ind w:left="3028" w:hanging="720"/>
+        <w:ind w:left="3009" w:hanging="720"/>
       </w:pPr>
       <w:r>
         <w:rPr>
@@ -3460,7 +4308,7 @@
         </w:rPr>
         <w:t>เรียน</w:t>
         <w:tab/>
-        <w:t>ผู้บังคับหน่วยพัฒนาการเคลื่อนที่ 44 สำนักงานพัฒนาภาค 4</w:t>
+        <w:t>คุณ เนวิน บุญฤทธิ์ ผู้จัดการธนาคาร ทีทีบี สาขาสนามเป้า</w:t>
       </w:r>
     </w:p>
     <w:p>
@@ -3509,10 +4357,10 @@
     <w:p>
       <w:pPr>
         <w:tabs>
-          <w:tab w:pos="3028" w:val="left"/>
+          <w:tab w:pos="4022" w:val="left"/>
         </w:tabs>
         <w:spacing w:before="580" w:after="0" w:line="440" w:lineRule="exact"/>
-        <w:ind w:left="3028" w:hanging="720"/>
+        <w:ind w:left="4022" w:hanging="720"/>
       </w:pPr>
       <w:r>
         <w:rPr>
@@ -3524,7 +4372,7 @@
         </w:rPr>
         <w:t>เรียน</w:t>
         <w:tab/>
-        <w:t>ผู้บังคับหน่วยพัฒนาการเคลื่อนที่ 45 สำนักงานพัฒนาภาค 4</w:t>
+        <w:t>บริษัท เพชราภรณ์ กรุ๊ป แทรเวล จำกัด</w:t>
       </w:r>
     </w:p>
     <w:p>
@@ -3573,10 +4421,10 @@
     <w:p>
       <w:pPr>
         <w:tabs>
-          <w:tab w:pos="3028" w:val="left"/>
+          <w:tab w:pos="4684" w:val="left"/>
         </w:tabs>
         <w:spacing w:before="580" w:after="0" w:line="440" w:lineRule="exact"/>
-        <w:ind w:left="3028" w:hanging="720"/>
+        <w:ind w:left="4684" w:hanging="720"/>
       </w:pPr>
       <w:r>
         <w:rPr>
@@ -3588,7 +4436,7 @@
         </w:rPr>
         <w:t>เรียน</w:t>
         <w:tab/>
-        <w:t>ผู้บังคับหน่วยพัฒนาการเคลื่อนที่ 46 สำนักงานพัฒนาภาค 4</w:t>
+        <w:t>บริษัท ซูพีเรียร์ ทัวร์ จำกัด</w:t>
       </w:r>
     </w:p>
     <w:p>
@@ -3637,10 +4485,10 @@
     <w:p>
       <w:pPr>
         <w:tabs>
-          <w:tab w:pos="3028" w:val="left"/>
+          <w:tab w:pos="4450" w:val="left"/>
         </w:tabs>
         <w:spacing w:before="580" w:after="0" w:line="440" w:lineRule="exact"/>
-        <w:ind w:left="3028" w:hanging="720"/>
+        <w:ind w:left="4450" w:hanging="720"/>
       </w:pPr>
       <w:r>
         <w:rPr>
@@ -3652,9 +4500,60 @@
         </w:rPr>
         <w:t>เรียน</w:t>
         <w:tab/>
-        <w:t>ผู้อำนวยการสำนักงานพัฒนาภาค 5</w:t>
-        <w:br/>
-      </w:r>
+        <w:t>บริษัท กรีน เวย์ แทรเวล จำกัด</w:t>
+      </w:r>
+    </w:p>
+    <w:p>
+      <w:pPr>
+        <w:pageBreakBefore/>
+        <w:spacing w:before="0" w:after="0" w:line="364" w:lineRule="exact"/>
+      </w:pPr>
+      <w:r>
+        <w:rPr>
+          <w:rFonts w:ascii="TH SarabunPSK" w:hAnsi="TH SarabunPSK" w:cs="TH SarabunPSK" w:eastAsia="TH SarabunPSK"/>
+          <w:b w:val="0"/>
+          <w:sz w:val="21"/>
+          <w:szCs w:val="21"/>
+        </w:rPr>
+        <w:t>วปอ.สปท.</w:t>
+      </w:r>
+    </w:p>
+    <w:p>
+      <w:pPr>
+        <w:spacing w:before="0" w:after="0" w:line="364" w:lineRule="exact"/>
+      </w:pPr>
+      <w:r>
+        <w:rPr>
+          <w:rFonts w:ascii="TH SarabunPSK" w:hAnsi="TH SarabunPSK" w:cs="TH SarabunPSK" w:eastAsia="TH SarabunPSK"/>
+          <w:b w:val="0"/>
+          <w:sz w:val="21"/>
+          <w:szCs w:val="21"/>
+        </w:rPr>
+        <w:t>กห ๐๓๑๗.๒/๑๖๑๑</w:t>
+      </w:r>
+    </w:p>
+    <w:p>
+      <w:pPr>
+        <w:spacing w:before="0" w:after="0" w:line="364" w:lineRule="exact"/>
+      </w:pPr>
+      <w:r>
+        <w:rPr>
+          <w:rFonts w:ascii="TH SarabunPSK" w:hAnsi="TH SarabunPSK" w:cs="TH SarabunPSK" w:eastAsia="TH SarabunPSK"/>
+          <w:b w:val="0"/>
+          <w:sz w:val="21"/>
+          <w:szCs w:val="21"/>
+        </w:rPr>
+        <w:t>โทร. ๐ ๒๕๗๒ ๒๕๒๗</w:t>
+      </w:r>
+    </w:p>
+    <w:p>
+      <w:pPr>
+        <w:tabs>
+          <w:tab w:pos="4298" w:val="left"/>
+        </w:tabs>
+        <w:spacing w:before="580" w:after="0" w:line="440" w:lineRule="exact"/>
+        <w:ind w:left="4298" w:hanging="720"/>
+      </w:pPr>
       <w:r>
         <w:rPr>
           <w:rFonts w:ascii="TH SarabunPSK" w:hAnsi="TH SarabunPSK" w:cs="TH SarabunPSK" w:eastAsia="TH SarabunPSK"/>
@@ -3663,7 +4562,9 @@
           <w:szCs w:val="26"/>
           <w:bCs/>
         </w:rPr>
-        <w:t>หน่วยบัญชาการทหารพัฒนา</w:t>
+        <w:t>เรียน</w:t>
+        <w:tab/>
+        <w:t>บริษัท เวิลด์ แทรเวิล ดีไซน์ จำกัด</w:t>
       </w:r>
     </w:p>
     <w:p>
@@ -3712,10 +4613,10 @@
     <w:p>
       <w:pPr>
         <w:tabs>
-          <w:tab w:pos="3028" w:val="left"/>
+          <w:tab w:pos="4538" w:val="left"/>
         </w:tabs>
         <w:spacing w:before="580" w:after="0" w:line="440" w:lineRule="exact"/>
-        <w:ind w:left="3028" w:hanging="720"/>
+        <w:ind w:left="4538" w:hanging="720"/>
       </w:pPr>
       <w:r>
         <w:rPr>
@@ -3727,7 +4628,7 @@
         </w:rPr>
         <w:t>เรียน</w:t>
         <w:tab/>
-        <w:t>ผู้บังคับหน่วยพัฒนาการเคลื่อนที่ 51 สำนักงานพัฒนาภาค 5</w:t>
+        <w:t>บริษัท มาร์วิน แทรเวิล จำกัด</w:t>
       </w:r>
     </w:p>
     <w:p>
@@ -3776,10 +4677,10 @@
     <w:p>
       <w:pPr>
         <w:tabs>
-          <w:tab w:pos="3028" w:val="left"/>
+          <w:tab w:pos="4690" w:val="left"/>
         </w:tabs>
         <w:spacing w:before="580" w:after="0" w:line="440" w:lineRule="exact"/>
-        <w:ind w:left="3028" w:hanging="720"/>
+        <w:ind w:left="4690" w:hanging="720"/>
       </w:pPr>
       <w:r>
         <w:rPr>
@@ -3791,7 +4692,7 @@
         </w:rPr>
         <w:t>เรียน</w:t>
         <w:tab/>
-        <w:t>ผู้บังคับหน่วยพัฒนาการเคลื่อนที่ 52 สำนักงานพัฒนาภาค 5</w:t>
+        <w:t>บริษัท อัลโมโด ทัวร์ จำกัด</w:t>
       </w:r>
     </w:p>
     <w:p>
@@ -3840,10 +4741,10 @@
     <w:p>
       <w:pPr>
         <w:tabs>
-          <w:tab w:pos="3028" w:val="left"/>
+          <w:tab w:pos="4482" w:val="left"/>
         </w:tabs>
         <w:spacing w:before="580" w:after="0" w:line="440" w:lineRule="exact"/>
-        <w:ind w:left="3028" w:hanging="720"/>
+        <w:ind w:left="4482" w:hanging="720"/>
       </w:pPr>
       <w:r>
         <w:rPr>
@@ -3855,7 +4756,7 @@
         </w:rPr>
         <w:t>เรียน</w:t>
         <w:tab/>
-        <w:t>ผู้บังคับหน่วยพัฒนาการเคลื่อนที่ 53 สำนักงานพัฒนาภาค 5</w:t>
+        <w:t>บริษัท ออล อิน ทราเวล จำกัด</w:t>
       </w:r>
     </w:p>
     <w:p>
@@ -3904,10 +4805,10 @@
     <w:p>
       <w:pPr>
         <w:tabs>
-          <w:tab w:pos="3028" w:val="left"/>
+          <w:tab w:pos="4712" w:val="left"/>
         </w:tabs>
         <w:spacing w:before="580" w:after="0" w:line="440" w:lineRule="exact"/>
-        <w:ind w:left="3028" w:hanging="720"/>
+        <w:ind w:left="4712" w:hanging="720"/>
       </w:pPr>
       <w:r>
         <w:rPr>
@@ -3919,7 +4820,7 @@
         </w:rPr>
         <w:t>เรียน</w:t>
         <w:tab/>
-        <w:t>ผู้บังคับหน่วยพัฒนาการเคลื่อนที่ 54 สำนักงานพัฒนาภาค 5</w:t>
+        <w:t>บริษัท นีโอ ทราเวล จำกัด</w:t>
       </w:r>
     </w:p>
     <w:p>
@@ -3968,10 +4869,10 @@
     <w:p>
       <w:pPr>
         <w:tabs>
-          <w:tab w:pos="3028" w:val="left"/>
+          <w:tab w:pos="4665" w:val="left"/>
         </w:tabs>
         <w:spacing w:before="580" w:after="0" w:line="440" w:lineRule="exact"/>
-        <w:ind w:left="3028" w:hanging="720"/>
+        <w:ind w:left="4665" w:hanging="720"/>
       </w:pPr>
       <w:r>
         <w:rPr>
@@ -3983,7 +4884,7 @@
         </w:rPr>
         <w:t>เรียน</w:t>
         <w:tab/>
-        <w:t>ผู้บังคับหน่วยพัฒนาการเคลื่อนที่ 55 สำนักงานพัฒนาภาค 5</w:t>
+        <w:t>บริษัท ไดนามิค ทัวร์ จำกัด</w:t>
       </w:r>
     </w:p>
     <w:p>
@@ -4032,10 +4933,10 @@
     <w:p>
       <w:pPr>
         <w:tabs>
-          <w:tab w:pos="3028" w:val="left"/>
+          <w:tab w:pos="4129" w:val="left"/>
         </w:tabs>
         <w:spacing w:before="580" w:after="0" w:line="440" w:lineRule="exact"/>
-        <w:ind w:left="3028" w:hanging="720"/>
+        <w:ind w:left="4129" w:hanging="720"/>
       </w:pPr>
       <w:r>
         <w:rPr>
@@ -4047,7 +4948,7 @@
         </w:rPr>
         <w:t>เรียน</w:t>
         <w:tab/>
-        <w:t>ผู้บังคับหน่วยพัฒนาการเคลื่อนที่ 56 สำนักงานพัฒนาภาค 5</w:t>
+        <w:t>บริษัท ธนัชวิชญ์ แทรเวล กรุ๊ป จำกัด</w:t>
       </w:r>
     </w:p>
     <w:p>
@@ -4096,10 +4997,10 @@
     <w:p>
       <w:pPr>
         <w:tabs>
-          <w:tab w:pos="3028" w:val="left"/>
+          <w:tab w:pos="3661" w:val="left"/>
         </w:tabs>
         <w:spacing w:before="580" w:after="0" w:line="440" w:lineRule="exact"/>
-        <w:ind w:left="3028" w:hanging="720"/>
+        <w:ind w:left="3661" w:hanging="720"/>
       </w:pPr>
       <w:r>
         <w:rPr>
@@ -4111,7 +5012,7 @@
         </w:rPr>
         <w:t>เรียน</w:t>
         <w:tab/>
-        <w:t>ผู้บังคับหน่วยพัฒนาการพิเศษ หน่วยบัญชาการทหารพัฒนา</w:t>
+        <w:t>K-MAN Distribution (เค-แมน ดิสทริบิวชั่น)</w:t>
       </w:r>
     </w:p>
     <w:p>
@@ -4160,10 +5061,10 @@
     <w:p>
       <w:pPr>
         <w:tabs>
-          <w:tab w:pos="3028" w:val="left"/>
+          <w:tab w:pos="4888" w:val="left"/>
         </w:tabs>
         <w:spacing w:before="580" w:after="0" w:line="440" w:lineRule="exact"/>
-        <w:ind w:left="3028" w:hanging="720"/>
+        <w:ind w:left="4888" w:hanging="720"/>
       </w:pPr>
       <w:r>
         <w:rPr>
@@ -4175,7 +5076,7 @@
         </w:rPr>
         <w:t>เรียน</w:t>
         <w:tab/>
-        <w:t>ผู้อำนวยการสำนักปฏิบัติการข่าว ศูนย์รักษาความปลอดภัย</w:t>
+        <w:t>บริษัท อภิสฤษฎิ์ จำกัด</w:t>
       </w:r>
     </w:p>
     <w:p>
@@ -4224,10 +5125,10 @@
     <w:p>
       <w:pPr>
         <w:tabs>
-          <w:tab w:pos="3028" w:val="left"/>
+          <w:tab w:pos="4723" w:val="left"/>
         </w:tabs>
         <w:spacing w:before="580" w:after="0" w:line="440" w:lineRule="exact"/>
-        <w:ind w:left="3028" w:hanging="720"/>
+        <w:ind w:left="4723" w:hanging="720"/>
       </w:pPr>
       <w:r>
         <w:rPr>
@@ -4239,9 +5140,60 @@
         </w:rPr>
         <w:t>เรียน</w:t>
         <w:tab/>
-        <w:t>ผู้อำนวยการสำนักรักษาความปลอดภัย</w:t>
-        <w:br/>
-      </w:r>
+        <w:t>บริษัท กีล่า สปอร์ต จำกัด</w:t>
+      </w:r>
+    </w:p>
+    <w:p>
+      <w:pPr>
+        <w:pageBreakBefore/>
+        <w:spacing w:before="0" w:after="0" w:line="364" w:lineRule="exact"/>
+      </w:pPr>
+      <w:r>
+        <w:rPr>
+          <w:rFonts w:ascii="TH SarabunPSK" w:hAnsi="TH SarabunPSK" w:cs="TH SarabunPSK" w:eastAsia="TH SarabunPSK"/>
+          <w:b w:val="0"/>
+          <w:sz w:val="21"/>
+          <w:szCs w:val="21"/>
+        </w:rPr>
+        <w:t>วปอ.สปท.</w:t>
+      </w:r>
+    </w:p>
+    <w:p>
+      <w:pPr>
+        <w:spacing w:before="0" w:after="0" w:line="364" w:lineRule="exact"/>
+      </w:pPr>
+      <w:r>
+        <w:rPr>
+          <w:rFonts w:ascii="TH SarabunPSK" w:hAnsi="TH SarabunPSK" w:cs="TH SarabunPSK" w:eastAsia="TH SarabunPSK"/>
+          <w:b w:val="0"/>
+          <w:sz w:val="21"/>
+          <w:szCs w:val="21"/>
+        </w:rPr>
+        <w:t>กห ๐๓๑๗.๒/๑๖๑๑</w:t>
+      </w:r>
+    </w:p>
+    <w:p>
+      <w:pPr>
+        <w:spacing w:before="0" w:after="0" w:line="364" w:lineRule="exact"/>
+      </w:pPr>
+      <w:r>
+        <w:rPr>
+          <w:rFonts w:ascii="TH SarabunPSK" w:hAnsi="TH SarabunPSK" w:cs="TH SarabunPSK" w:eastAsia="TH SarabunPSK"/>
+          <w:b w:val="0"/>
+          <w:sz w:val="21"/>
+          <w:szCs w:val="21"/>
+        </w:rPr>
+        <w:t>โทร. ๐ ๒๕๗๒ ๒๕๒๗</w:t>
+      </w:r>
+    </w:p>
+    <w:p>
+      <w:pPr>
+        <w:tabs>
+          <w:tab w:pos="3691" w:val="left"/>
+        </w:tabs>
+        <w:spacing w:before="580" w:after="0" w:line="440" w:lineRule="exact"/>
+        <w:ind w:left="3691" w:hanging="720"/>
+      </w:pPr>
       <w:r>
         <w:rPr>
           <w:rFonts w:ascii="TH SarabunPSK" w:hAnsi="TH SarabunPSK" w:cs="TH SarabunPSK" w:eastAsia="TH SarabunPSK"/>
@@ -4250,7 +5202,9 @@
           <w:szCs w:val="26"/>
           <w:bCs/>
         </w:rPr>
-        <w:t>ศูนย์รักษาความปลอดภัย</w:t>
+        <w:t>เรียน</w:t>
+        <w:tab/>
+        <w:t>บริษัท วี.เค.การ์เมนท์ จำกัด (สำนักงานใหญ่)</w:t>
       </w:r>
     </w:p>
     <w:p>
@@ -4299,10 +5253,10 @@
     <w:p>
       <w:pPr>
         <w:tabs>
-          <w:tab w:pos="3028" w:val="left"/>
+          <w:tab w:pos="3400" w:val="left"/>
         </w:tabs>
         <w:spacing w:before="580" w:after="0" w:line="440" w:lineRule="exact"/>
-        <w:ind w:left="3028" w:hanging="720"/>
+        <w:ind w:left="3400" w:hanging="720"/>
       </w:pPr>
       <w:r>
         <w:rPr>
@@ -4314,9 +5268,60 @@
         </w:rPr>
         <w:t>เรียน</w:t>
         <w:tab/>
-        <w:t>ผู้อำนวยการสำนักบริการสิทธิประโยชน์กำลังพล</w:t>
-        <w:br/>
-      </w:r>
+        <w:t>บริษัท พลอยศรีรัฐ ซัพลาย จำกัด (สำนักงานใหญ่)</w:t>
+      </w:r>
+    </w:p>
+    <w:p>
+      <w:pPr>
+        <w:pageBreakBefore/>
+        <w:spacing w:before="0" w:after="0" w:line="364" w:lineRule="exact"/>
+      </w:pPr>
+      <w:r>
+        <w:rPr>
+          <w:rFonts w:ascii="TH SarabunPSK" w:hAnsi="TH SarabunPSK" w:cs="TH SarabunPSK" w:eastAsia="TH SarabunPSK"/>
+          <w:b w:val="0"/>
+          <w:sz w:val="21"/>
+          <w:szCs w:val="21"/>
+        </w:rPr>
+        <w:t>วปอ.สปท.</w:t>
+      </w:r>
+    </w:p>
+    <w:p>
+      <w:pPr>
+        <w:spacing w:before="0" w:after="0" w:line="364" w:lineRule="exact"/>
+      </w:pPr>
+      <w:r>
+        <w:rPr>
+          <w:rFonts w:ascii="TH SarabunPSK" w:hAnsi="TH SarabunPSK" w:cs="TH SarabunPSK" w:eastAsia="TH SarabunPSK"/>
+          <w:b w:val="0"/>
+          <w:sz w:val="21"/>
+          <w:szCs w:val="21"/>
+        </w:rPr>
+        <w:t>กห ๐๓๑๗.๒/๑๖๑๑</w:t>
+      </w:r>
+    </w:p>
+    <w:p>
+      <w:pPr>
+        <w:spacing w:before="0" w:after="0" w:line="364" w:lineRule="exact"/>
+      </w:pPr>
+      <w:r>
+        <w:rPr>
+          <w:rFonts w:ascii="TH SarabunPSK" w:hAnsi="TH SarabunPSK" w:cs="TH SarabunPSK" w:eastAsia="TH SarabunPSK"/>
+          <w:b w:val="0"/>
+          <w:sz w:val="21"/>
+          <w:szCs w:val="21"/>
+        </w:rPr>
+        <w:t>โทร. ๐ ๒๕๗๒ ๒๕๒๗</w:t>
+      </w:r>
+    </w:p>
+    <w:p>
+      <w:pPr>
+        <w:tabs>
+          <w:tab w:pos="4555" w:val="left"/>
+        </w:tabs>
+        <w:spacing w:before="580" w:after="0" w:line="440" w:lineRule="exact"/>
+        <w:ind w:left="4555" w:hanging="720"/>
+      </w:pPr>
       <w:r>
         <w:rPr>
           <w:rFonts w:ascii="TH SarabunPSK" w:hAnsi="TH SarabunPSK" w:cs="TH SarabunPSK" w:eastAsia="TH SarabunPSK"/>
@@ -4325,7 +5330,9 @@
           <w:szCs w:val="26"/>
           <w:bCs/>
         </w:rPr>
-        <w:t>กรมสารบรรณทหาร</w:t>
+        <w:t>เรียน</w:t>
+        <w:tab/>
+        <w:t>ห้างหุ้นส่วนจำกัด ศ.วีระพันธ์</w:t>
       </w:r>
     </w:p>
     <w:p>
@@ -4374,10 +5381,10 @@
     <w:p>
       <w:pPr>
         <w:tabs>
-          <w:tab w:pos="3028" w:val="left"/>
+          <w:tab w:pos="4288" w:val="left"/>
         </w:tabs>
         <w:spacing w:before="580" w:after="0" w:line="440" w:lineRule="exact"/>
-        <w:ind w:left="3028" w:hanging="720"/>
+        <w:ind w:left="4288" w:hanging="720"/>
       </w:pPr>
       <w:r>
         <w:rPr>
@@ -4389,9 +5396,60 @@
         </w:rPr>
         <w:t>เรียน</w:t>
         <w:tab/>
-        <w:t>ผู้อำนวยการสำนักปฏิบัติการเพื่อความมั่นคง</w:t>
-        <w:br/>
-      </w:r>
+        <w:t>ร้าน สูทสภา (อรุณลักษณ์สูทสภา)</w:t>
+      </w:r>
+    </w:p>
+    <w:p>
+      <w:pPr>
+        <w:pageBreakBefore/>
+        <w:spacing w:before="0" w:after="0" w:line="364" w:lineRule="exact"/>
+      </w:pPr>
+      <w:r>
+        <w:rPr>
+          <w:rFonts w:ascii="TH SarabunPSK" w:hAnsi="TH SarabunPSK" w:cs="TH SarabunPSK" w:eastAsia="TH SarabunPSK"/>
+          <w:b w:val="0"/>
+          <w:sz w:val="21"/>
+          <w:szCs w:val="21"/>
+        </w:rPr>
+        <w:t>วปอ.สปท.</w:t>
+      </w:r>
+    </w:p>
+    <w:p>
+      <w:pPr>
+        <w:spacing w:before="0" w:after="0" w:line="364" w:lineRule="exact"/>
+      </w:pPr>
+      <w:r>
+        <w:rPr>
+          <w:rFonts w:ascii="TH SarabunPSK" w:hAnsi="TH SarabunPSK" w:cs="TH SarabunPSK" w:eastAsia="TH SarabunPSK"/>
+          <w:b w:val="0"/>
+          <w:sz w:val="21"/>
+          <w:szCs w:val="21"/>
+        </w:rPr>
+        <w:t>กห ๐๓๑๗.๒/๑๖๑๑</w:t>
+      </w:r>
+    </w:p>
+    <w:p>
+      <w:pPr>
+        <w:spacing w:before="0" w:after="0" w:line="364" w:lineRule="exact"/>
+      </w:pPr>
+      <w:r>
+        <w:rPr>
+          <w:rFonts w:ascii="TH SarabunPSK" w:hAnsi="TH SarabunPSK" w:cs="TH SarabunPSK" w:eastAsia="TH SarabunPSK"/>
+          <w:b w:val="0"/>
+          <w:sz w:val="21"/>
+          <w:szCs w:val="21"/>
+        </w:rPr>
+        <w:t>โทร. ๐ ๒๕๗๒ ๒๕๒๗</w:t>
+      </w:r>
+    </w:p>
+    <w:p>
+      <w:pPr>
+        <w:tabs>
+          <w:tab w:pos="4639" w:val="left"/>
+        </w:tabs>
+        <w:spacing w:before="580" w:after="0" w:line="440" w:lineRule="exact"/>
+        <w:ind w:left="4639" w:hanging="720"/>
+      </w:pPr>
       <w:r>
         <w:rPr>
           <w:rFonts w:ascii="TH SarabunPSK" w:hAnsi="TH SarabunPSK" w:cs="TH SarabunPSK" w:eastAsia="TH SarabunPSK"/>
@@ -4400,7 +5458,9 @@
           <w:szCs w:val="26"/>
           <w:bCs/>
         </w:rPr>
-        <w:t>กรมกิจการชายแดนทหาร</w:t>
+        <w:t>เรียน</w:t>
+        <w:tab/>
+        <w:t>ร้าน John Perfect Tailor</w:t>
       </w:r>
     </w:p>
     <w:p>
@@ -4449,10 +5509,10 @@
     <w:p>
       <w:pPr>
         <w:tabs>
-          <w:tab w:pos="3028" w:val="left"/>
+          <w:tab w:pos="5143" w:val="left"/>
         </w:tabs>
         <w:spacing w:before="580" w:after="0" w:line="440" w:lineRule="exact"/>
-        <w:ind w:left="3028" w:hanging="720"/>
+        <w:ind w:left="5143" w:hanging="720"/>
       </w:pPr>
       <w:r>
         <w:rPr>
@@ -4464,9 +5524,60 @@
         </w:rPr>
         <w:t>เรียน</w:t>
         <w:tab/>
-        <w:t>เสนาธิการวิทยาลัยเสนาธิการทหาร</w:t>
-        <w:br/>
-      </w:r>
+        <w:t>ร้าน เด่นแชมป์สูท</w:t>
+      </w:r>
+    </w:p>
+    <w:p>
+      <w:pPr>
+        <w:pageBreakBefore/>
+        <w:spacing w:before="0" w:after="0" w:line="364" w:lineRule="exact"/>
+      </w:pPr>
+      <w:r>
+        <w:rPr>
+          <w:rFonts w:ascii="TH SarabunPSK" w:hAnsi="TH SarabunPSK" w:cs="TH SarabunPSK" w:eastAsia="TH SarabunPSK"/>
+          <w:b w:val="0"/>
+          <w:sz w:val="21"/>
+          <w:szCs w:val="21"/>
+        </w:rPr>
+        <w:t>วปอ.สปท.</w:t>
+      </w:r>
+    </w:p>
+    <w:p>
+      <w:pPr>
+        <w:spacing w:before="0" w:after="0" w:line="364" w:lineRule="exact"/>
+      </w:pPr>
+      <w:r>
+        <w:rPr>
+          <w:rFonts w:ascii="TH SarabunPSK" w:hAnsi="TH SarabunPSK" w:cs="TH SarabunPSK" w:eastAsia="TH SarabunPSK"/>
+          <w:b w:val="0"/>
+          <w:sz w:val="21"/>
+          <w:szCs w:val="21"/>
+        </w:rPr>
+        <w:t>กห ๐๓๑๗.๒/๑๖๑๑</w:t>
+      </w:r>
+    </w:p>
+    <w:p>
+      <w:pPr>
+        <w:spacing w:before="0" w:after="0" w:line="364" w:lineRule="exact"/>
+      </w:pPr>
+      <w:r>
+        <w:rPr>
+          <w:rFonts w:ascii="TH SarabunPSK" w:hAnsi="TH SarabunPSK" w:cs="TH SarabunPSK" w:eastAsia="TH SarabunPSK"/>
+          <w:b w:val="0"/>
+          <w:sz w:val="21"/>
+          <w:szCs w:val="21"/>
+        </w:rPr>
+        <w:t>โทร. ๐ ๒๕๗๒ ๒๕๒๗</w:t>
+      </w:r>
+    </w:p>
+    <w:p>
+      <w:pPr>
+        <w:tabs>
+          <w:tab w:pos="4153" w:val="left"/>
+        </w:tabs>
+        <w:spacing w:before="580" w:after="0" w:line="440" w:lineRule="exact"/>
+        <w:ind w:left="4153" w:hanging="720"/>
+      </w:pPr>
       <w:r>
         <w:rPr>
           <w:rFonts w:ascii="TH SarabunPSK" w:hAnsi="TH SarabunPSK" w:cs="TH SarabunPSK" w:eastAsia="TH SarabunPSK"/>
@@ -4475,7 +5586,9 @@
           <w:szCs w:val="26"/>
           <w:bCs/>
         </w:rPr>
-        <w:t>สถาบันวิชาการป้องกันประเทศ</w:t>
+        <w:t>เรียน</w:t>
+        <w:tab/>
+        <w:t>ร้าน AR Tailor House (ร้านชูวิทย์)</w:t>
       </w:r>
     </w:p>
     <w:p>
@@ -4524,10 +5637,10 @@
     <w:p>
       <w:pPr>
         <w:tabs>
-          <w:tab w:pos="3028" w:val="left"/>
+          <w:tab w:pos="4931" w:val="left"/>
         </w:tabs>
         <w:spacing w:before="580" w:after="0" w:line="440" w:lineRule="exact"/>
-        <w:ind w:left="3028" w:hanging="720"/>
+        <w:ind w:left="4931" w:hanging="720"/>
       </w:pPr>
       <w:r>
         <w:rPr>
@@ -4539,7 +5652,7 @@
         </w:rPr>
         <w:t>เรียน</w:t>
         <w:tab/>
-        <w:t>คุณ เนวิน บุญฤทธิ์ ผู้จัดการธนาคาร ทีทีบี สาขาสนามเป้า</w:t>
+        <w:t>ร้าน สูทเวิลด์เซ็นเตอร์</w:t>
       </w:r>
     </w:p>
     <w:p>
@@ -4588,10 +5701,10 @@
     <w:p>
       <w:pPr>
         <w:tabs>
-          <w:tab w:pos="3028" w:val="left"/>
+          <w:tab w:pos="5183" w:val="left"/>
         </w:tabs>
         <w:spacing w:before="580" w:after="0" w:line="440" w:lineRule="exact"/>
-        <w:ind w:left="3028" w:hanging="720"/>
+        <w:ind w:left="5183" w:hanging="720"/>
       </w:pPr>
       <w:r>
         <w:rPr>
@@ -4603,7 +5716,7 @@
         </w:rPr>
         <w:t>เรียน</w:t>
         <w:tab/>
-        <w:t>บริษัท เพชราภรณ์ กรุ๊ป แทรเวล จำกัด</w:t>
+        <w:t>ร้าน ช่อชัยพฤกษ์</w:t>
       </w:r>
     </w:p>
     <w:p>
@@ -4652,10 +5765,10 @@
     <w:p>
       <w:pPr>
         <w:tabs>
-          <w:tab w:pos="3028" w:val="left"/>
+          <w:tab w:pos="4973" w:val="left"/>
         </w:tabs>
         <w:spacing w:before="580" w:after="0" w:line="440" w:lineRule="exact"/>
-        <w:ind w:left="3028" w:hanging="720"/>
+        <w:ind w:left="4973" w:hanging="720"/>
       </w:pPr>
       <w:r>
         <w:rPr>
@@ -4667,7 +5780,7 @@
         </w:rPr>
         <w:t>เรียน</w:t>
         <w:tab/>
-        <w:t>บริษัท ซูพีเรียร์ ทัวร์ จำกัด</w:t>
+        <w:t>บริษัท สูทแน็ค จำกัด</w:t>
       </w:r>
     </w:p>
     <w:p>
@@ -4716,10 +5829,10 @@
     <w:p>
       <w:pPr>
         <w:tabs>
-          <w:tab w:pos="3028" w:val="left"/>
+          <w:tab w:pos="5375" w:val="left"/>
         </w:tabs>
         <w:spacing w:before="580" w:after="0" w:line="440" w:lineRule="exact"/>
-        <w:ind w:left="3028" w:hanging="720"/>
+        <w:ind w:left="5375" w:hanging="720"/>
       </w:pPr>
       <w:r>
         <w:rPr>
@@ -4731,7 +5844,7 @@
         </w:rPr>
         <w:t>เรียน</w:t>
         <w:tab/>
-        <w:t>บริษัท กรีน เวย์ แทรเวล จำกัด</w:t>
+        <w:t>ร้าน สูททะนง</w:t>
       </w:r>
     </w:p>
     <w:p>
@@ -4780,10 +5893,10 @@
     <w:p>
       <w:pPr>
         <w:tabs>
-          <w:tab w:pos="3028" w:val="left"/>
+          <w:tab w:pos="4858" w:val="left"/>
         </w:tabs>
         <w:spacing w:before="580" w:after="0" w:line="440" w:lineRule="exact"/>
-        <w:ind w:left="3028" w:hanging="720"/>
+        <w:ind w:left="4858" w:hanging="720"/>
       </w:pPr>
       <w:r>
         <w:rPr>
@@ -4795,7 +5908,7 @@
         </w:rPr>
         <w:t>เรียน</w:t>
         <w:tab/>
-        <w:t>บริษัท เวิลด์ แทรเวิล ดีไซน์ จำกัด</w:t>
+        <w:t>ร้าน Aek Siam Tailor</w:t>
       </w:r>
     </w:p>
     <w:p>
@@ -4844,10 +5957,10 @@
     <w:p>
       <w:pPr>
         <w:tabs>
-          <w:tab w:pos="3028" w:val="left"/>
+          <w:tab w:pos="4969" w:val="left"/>
         </w:tabs>
         <w:spacing w:before="580" w:after="0" w:line="440" w:lineRule="exact"/>
-        <w:ind w:left="3028" w:hanging="720"/>
+        <w:ind w:left="4969" w:hanging="720"/>
       </w:pPr>
       <w:r>
         <w:rPr>
@@ -4859,7 +5972,7 @@
         </w:rPr>
         <w:t>เรียน</w:t>
         <w:tab/>
-        <w:t>บริษัท มาร์วิน แทรเวิล จำกัด</w:t>
+        <w:t>บริษัท ทวินสูท จำกัด</w:t>
       </w:r>
     </w:p>
     <w:p>
@@ -4908,1354 +6021,10 @@
     <w:p>
       <w:pPr>
         <w:tabs>
-          <w:tab w:pos="3028" w:val="left"/>
+          <w:tab w:pos="4995" w:val="left"/>
         </w:tabs>
         <w:spacing w:before="580" w:after="0" w:line="440" w:lineRule="exact"/>
-        <w:ind w:left="3028" w:hanging="720"/>
-      </w:pPr>
-      <w:r>
-        <w:rPr>
-          <w:rFonts w:ascii="TH SarabunPSK" w:hAnsi="TH SarabunPSK" w:cs="TH SarabunPSK" w:eastAsia="TH SarabunPSK"/>
-          <w:b/>
-          <w:sz w:val="26"/>
-          <w:szCs w:val="26"/>
-          <w:bCs/>
-        </w:rPr>
-        <w:t>เรียน</w:t>
-        <w:tab/>
-        <w:t>บริษัท อัลโมโด ทัวร์ จำกัด</w:t>
-      </w:r>
-    </w:p>
-    <w:p>
-      <w:pPr>
-        <w:pageBreakBefore/>
-        <w:spacing w:before="0" w:after="0" w:line="364" w:lineRule="exact"/>
-      </w:pPr>
-      <w:r>
-        <w:rPr>
-          <w:rFonts w:ascii="TH SarabunPSK" w:hAnsi="TH SarabunPSK" w:cs="TH SarabunPSK" w:eastAsia="TH SarabunPSK"/>
-          <w:b w:val="0"/>
-          <w:sz w:val="21"/>
-          <w:szCs w:val="21"/>
-        </w:rPr>
-        <w:t>วปอ.สปท.</w:t>
-      </w:r>
-    </w:p>
-    <w:p>
-      <w:pPr>
-        <w:spacing w:before="0" w:after="0" w:line="364" w:lineRule="exact"/>
-      </w:pPr>
-      <w:r>
-        <w:rPr>
-          <w:rFonts w:ascii="TH SarabunPSK" w:hAnsi="TH SarabunPSK" w:cs="TH SarabunPSK" w:eastAsia="TH SarabunPSK"/>
-          <w:b w:val="0"/>
-          <w:sz w:val="21"/>
-          <w:szCs w:val="21"/>
-        </w:rPr>
-        <w:t>กห ๐๓๑๗.๒/๑๖๑๑</w:t>
-      </w:r>
-    </w:p>
-    <w:p>
-      <w:pPr>
-        <w:spacing w:before="0" w:after="0" w:line="364" w:lineRule="exact"/>
-      </w:pPr>
-      <w:r>
-        <w:rPr>
-          <w:rFonts w:ascii="TH SarabunPSK" w:hAnsi="TH SarabunPSK" w:cs="TH SarabunPSK" w:eastAsia="TH SarabunPSK"/>
-          <w:b w:val="0"/>
-          <w:sz w:val="21"/>
-          <w:szCs w:val="21"/>
-        </w:rPr>
-        <w:t>โทร. ๐ ๒๕๗๒ ๒๕๒๗</w:t>
-      </w:r>
-    </w:p>
-    <w:p>
-      <w:pPr>
-        <w:tabs>
-          <w:tab w:pos="3028" w:val="left"/>
-        </w:tabs>
-        <w:spacing w:before="580" w:after="0" w:line="440" w:lineRule="exact"/>
-        <w:ind w:left="3028" w:hanging="720"/>
-      </w:pPr>
-      <w:r>
-        <w:rPr>
-          <w:rFonts w:ascii="TH SarabunPSK" w:hAnsi="TH SarabunPSK" w:cs="TH SarabunPSK" w:eastAsia="TH SarabunPSK"/>
-          <w:b/>
-          <w:sz w:val="26"/>
-          <w:szCs w:val="26"/>
-          <w:bCs/>
-        </w:rPr>
-        <w:t>เรียน</w:t>
-        <w:tab/>
-        <w:t>บริษัท ออล อิน ทราเวล จำกัด</w:t>
-      </w:r>
-    </w:p>
-    <w:p>
-      <w:pPr>
-        <w:pageBreakBefore/>
-        <w:spacing w:before="0" w:after="0" w:line="364" w:lineRule="exact"/>
-      </w:pPr>
-      <w:r>
-        <w:rPr>
-          <w:rFonts w:ascii="TH SarabunPSK" w:hAnsi="TH SarabunPSK" w:cs="TH SarabunPSK" w:eastAsia="TH SarabunPSK"/>
-          <w:b w:val="0"/>
-          <w:sz w:val="21"/>
-          <w:szCs w:val="21"/>
-        </w:rPr>
-        <w:t>วปอ.สปท.</w:t>
-      </w:r>
-    </w:p>
-    <w:p>
-      <w:pPr>
-        <w:spacing w:before="0" w:after="0" w:line="364" w:lineRule="exact"/>
-      </w:pPr>
-      <w:r>
-        <w:rPr>
-          <w:rFonts w:ascii="TH SarabunPSK" w:hAnsi="TH SarabunPSK" w:cs="TH SarabunPSK" w:eastAsia="TH SarabunPSK"/>
-          <w:b w:val="0"/>
-          <w:sz w:val="21"/>
-          <w:szCs w:val="21"/>
-        </w:rPr>
-        <w:t>กห ๐๓๑๗.๒/๑๖๑๑</w:t>
-      </w:r>
-    </w:p>
-    <w:p>
-      <w:pPr>
-        <w:spacing w:before="0" w:after="0" w:line="364" w:lineRule="exact"/>
-      </w:pPr>
-      <w:r>
-        <w:rPr>
-          <w:rFonts w:ascii="TH SarabunPSK" w:hAnsi="TH SarabunPSK" w:cs="TH SarabunPSK" w:eastAsia="TH SarabunPSK"/>
-          <w:b w:val="0"/>
-          <w:sz w:val="21"/>
-          <w:szCs w:val="21"/>
-        </w:rPr>
-        <w:t>โทร. ๐ ๒๕๗๒ ๒๕๒๗</w:t>
-      </w:r>
-    </w:p>
-    <w:p>
-      <w:pPr>
-        <w:tabs>
-          <w:tab w:pos="3028" w:val="left"/>
-        </w:tabs>
-        <w:spacing w:before="580" w:after="0" w:line="440" w:lineRule="exact"/>
-        <w:ind w:left="3028" w:hanging="720"/>
-      </w:pPr>
-      <w:r>
-        <w:rPr>
-          <w:rFonts w:ascii="TH SarabunPSK" w:hAnsi="TH SarabunPSK" w:cs="TH SarabunPSK" w:eastAsia="TH SarabunPSK"/>
-          <w:b/>
-          <w:sz w:val="26"/>
-          <w:szCs w:val="26"/>
-          <w:bCs/>
-        </w:rPr>
-        <w:t>เรียน</w:t>
-        <w:tab/>
-        <w:t>บริษัท นีโอ ทราเวล จำกัด</w:t>
-      </w:r>
-    </w:p>
-    <w:p>
-      <w:pPr>
-        <w:pageBreakBefore/>
-        <w:spacing w:before="0" w:after="0" w:line="364" w:lineRule="exact"/>
-      </w:pPr>
-      <w:r>
-        <w:rPr>
-          <w:rFonts w:ascii="TH SarabunPSK" w:hAnsi="TH SarabunPSK" w:cs="TH SarabunPSK" w:eastAsia="TH SarabunPSK"/>
-          <w:b w:val="0"/>
-          <w:sz w:val="21"/>
-          <w:szCs w:val="21"/>
-        </w:rPr>
-        <w:t>วปอ.สปท.</w:t>
-      </w:r>
-    </w:p>
-    <w:p>
-      <w:pPr>
-        <w:spacing w:before="0" w:after="0" w:line="364" w:lineRule="exact"/>
-      </w:pPr>
-      <w:r>
-        <w:rPr>
-          <w:rFonts w:ascii="TH SarabunPSK" w:hAnsi="TH SarabunPSK" w:cs="TH SarabunPSK" w:eastAsia="TH SarabunPSK"/>
-          <w:b w:val="0"/>
-          <w:sz w:val="21"/>
-          <w:szCs w:val="21"/>
-        </w:rPr>
-        <w:t>กห ๐๓๑๗.๒/๑๖๑๑</w:t>
-      </w:r>
-    </w:p>
-    <w:p>
-      <w:pPr>
-        <w:spacing w:before="0" w:after="0" w:line="364" w:lineRule="exact"/>
-      </w:pPr>
-      <w:r>
-        <w:rPr>
-          <w:rFonts w:ascii="TH SarabunPSK" w:hAnsi="TH SarabunPSK" w:cs="TH SarabunPSK" w:eastAsia="TH SarabunPSK"/>
-          <w:b w:val="0"/>
-          <w:sz w:val="21"/>
-          <w:szCs w:val="21"/>
-        </w:rPr>
-        <w:t>โทร. ๐ ๒๕๗๒ ๒๕๒๗</w:t>
-      </w:r>
-    </w:p>
-    <w:p>
-      <w:pPr>
-        <w:tabs>
-          <w:tab w:pos="3028" w:val="left"/>
-        </w:tabs>
-        <w:spacing w:before="580" w:after="0" w:line="440" w:lineRule="exact"/>
-        <w:ind w:left="3028" w:hanging="720"/>
-      </w:pPr>
-      <w:r>
-        <w:rPr>
-          <w:rFonts w:ascii="TH SarabunPSK" w:hAnsi="TH SarabunPSK" w:cs="TH SarabunPSK" w:eastAsia="TH SarabunPSK"/>
-          <w:b/>
-          <w:sz w:val="26"/>
-          <w:szCs w:val="26"/>
-          <w:bCs/>
-        </w:rPr>
-        <w:t>เรียน</w:t>
-        <w:tab/>
-        <w:t>บริษัท ไดนามิค ทัวร์ จำกัด</w:t>
-      </w:r>
-    </w:p>
-    <w:p>
-      <w:pPr>
-        <w:pageBreakBefore/>
-        <w:spacing w:before="0" w:after="0" w:line="364" w:lineRule="exact"/>
-      </w:pPr>
-      <w:r>
-        <w:rPr>
-          <w:rFonts w:ascii="TH SarabunPSK" w:hAnsi="TH SarabunPSK" w:cs="TH SarabunPSK" w:eastAsia="TH SarabunPSK"/>
-          <w:b w:val="0"/>
-          <w:sz w:val="21"/>
-          <w:szCs w:val="21"/>
-        </w:rPr>
-        <w:t>วปอ.สปท.</w:t>
-      </w:r>
-    </w:p>
-    <w:p>
-      <w:pPr>
-        <w:spacing w:before="0" w:after="0" w:line="364" w:lineRule="exact"/>
-      </w:pPr>
-      <w:r>
-        <w:rPr>
-          <w:rFonts w:ascii="TH SarabunPSK" w:hAnsi="TH SarabunPSK" w:cs="TH SarabunPSK" w:eastAsia="TH SarabunPSK"/>
-          <w:b w:val="0"/>
-          <w:sz w:val="21"/>
-          <w:szCs w:val="21"/>
-        </w:rPr>
-        <w:t>กห ๐๓๑๗.๒/๑๖๑๑</w:t>
-      </w:r>
-    </w:p>
-    <w:p>
-      <w:pPr>
-        <w:spacing w:before="0" w:after="0" w:line="364" w:lineRule="exact"/>
-      </w:pPr>
-      <w:r>
-        <w:rPr>
-          <w:rFonts w:ascii="TH SarabunPSK" w:hAnsi="TH SarabunPSK" w:cs="TH SarabunPSK" w:eastAsia="TH SarabunPSK"/>
-          <w:b w:val="0"/>
-          <w:sz w:val="21"/>
-          <w:szCs w:val="21"/>
-        </w:rPr>
-        <w:t>โทร. ๐ ๒๕๗๒ ๒๕๒๗</w:t>
-      </w:r>
-    </w:p>
-    <w:p>
-      <w:pPr>
-        <w:tabs>
-          <w:tab w:pos="3028" w:val="left"/>
-        </w:tabs>
-        <w:spacing w:before="580" w:after="0" w:line="440" w:lineRule="exact"/>
-        <w:ind w:left="3028" w:hanging="720"/>
-      </w:pPr>
-      <w:r>
-        <w:rPr>
-          <w:rFonts w:ascii="TH SarabunPSK" w:hAnsi="TH SarabunPSK" w:cs="TH SarabunPSK" w:eastAsia="TH SarabunPSK"/>
-          <w:b/>
-          <w:sz w:val="26"/>
-          <w:szCs w:val="26"/>
-          <w:bCs/>
-        </w:rPr>
-        <w:t>เรียน</w:t>
-        <w:tab/>
-        <w:t>บริษัท ธนัชวิชญ์ แทรเวล กรุ๊ป จำกัด</w:t>
-      </w:r>
-    </w:p>
-    <w:p>
-      <w:pPr>
-        <w:pageBreakBefore/>
-        <w:spacing w:before="0" w:after="0" w:line="364" w:lineRule="exact"/>
-      </w:pPr>
-      <w:r>
-        <w:rPr>
-          <w:rFonts w:ascii="TH SarabunPSK" w:hAnsi="TH SarabunPSK" w:cs="TH SarabunPSK" w:eastAsia="TH SarabunPSK"/>
-          <w:b w:val="0"/>
-          <w:sz w:val="21"/>
-          <w:szCs w:val="21"/>
-        </w:rPr>
-        <w:t>วปอ.สปท.</w:t>
-      </w:r>
-    </w:p>
-    <w:p>
-      <w:pPr>
-        <w:spacing w:before="0" w:after="0" w:line="364" w:lineRule="exact"/>
-      </w:pPr>
-      <w:r>
-        <w:rPr>
-          <w:rFonts w:ascii="TH SarabunPSK" w:hAnsi="TH SarabunPSK" w:cs="TH SarabunPSK" w:eastAsia="TH SarabunPSK"/>
-          <w:b w:val="0"/>
-          <w:sz w:val="21"/>
-          <w:szCs w:val="21"/>
-        </w:rPr>
-        <w:t>กห ๐๓๑๗.๒/๑๖๑๑</w:t>
-      </w:r>
-    </w:p>
-    <w:p>
-      <w:pPr>
-        <w:spacing w:before="0" w:after="0" w:line="364" w:lineRule="exact"/>
-      </w:pPr>
-      <w:r>
-        <w:rPr>
-          <w:rFonts w:ascii="TH SarabunPSK" w:hAnsi="TH SarabunPSK" w:cs="TH SarabunPSK" w:eastAsia="TH SarabunPSK"/>
-          <w:b w:val="0"/>
-          <w:sz w:val="21"/>
-          <w:szCs w:val="21"/>
-        </w:rPr>
-        <w:t>โทร. ๐ ๒๕๗๒ ๒๕๒๗</w:t>
-      </w:r>
-    </w:p>
-    <w:p>
-      <w:pPr>
-        <w:tabs>
-          <w:tab w:pos="3028" w:val="left"/>
-        </w:tabs>
-        <w:spacing w:before="580" w:after="0" w:line="440" w:lineRule="exact"/>
-        <w:ind w:left="3028" w:hanging="720"/>
-      </w:pPr>
-      <w:r>
-        <w:rPr>
-          <w:rFonts w:ascii="TH SarabunPSK" w:hAnsi="TH SarabunPSK" w:cs="TH SarabunPSK" w:eastAsia="TH SarabunPSK"/>
-          <w:b/>
-          <w:sz w:val="26"/>
-          <w:szCs w:val="26"/>
-          <w:bCs/>
-        </w:rPr>
-        <w:t>เรียน</w:t>
-        <w:tab/>
-        <w:t>K-MAN Distribution (เค-แมน ดิสทริบิวชั่น)</w:t>
-      </w:r>
-    </w:p>
-    <w:p>
-      <w:pPr>
-        <w:pageBreakBefore/>
-        <w:spacing w:before="0" w:after="0" w:line="364" w:lineRule="exact"/>
-      </w:pPr>
-      <w:r>
-        <w:rPr>
-          <w:rFonts w:ascii="TH SarabunPSK" w:hAnsi="TH SarabunPSK" w:cs="TH SarabunPSK" w:eastAsia="TH SarabunPSK"/>
-          <w:b w:val="0"/>
-          <w:sz w:val="21"/>
-          <w:szCs w:val="21"/>
-        </w:rPr>
-        <w:t>วปอ.สปท.</w:t>
-      </w:r>
-    </w:p>
-    <w:p>
-      <w:pPr>
-        <w:spacing w:before="0" w:after="0" w:line="364" w:lineRule="exact"/>
-      </w:pPr>
-      <w:r>
-        <w:rPr>
-          <w:rFonts w:ascii="TH SarabunPSK" w:hAnsi="TH SarabunPSK" w:cs="TH SarabunPSK" w:eastAsia="TH SarabunPSK"/>
-          <w:b w:val="0"/>
-          <w:sz w:val="21"/>
-          <w:szCs w:val="21"/>
-        </w:rPr>
-        <w:t>กห ๐๓๑๗.๒/๑๖๑๑</w:t>
-      </w:r>
-    </w:p>
-    <w:p>
-      <w:pPr>
-        <w:spacing w:before="0" w:after="0" w:line="364" w:lineRule="exact"/>
-      </w:pPr>
-      <w:r>
-        <w:rPr>
-          <w:rFonts w:ascii="TH SarabunPSK" w:hAnsi="TH SarabunPSK" w:cs="TH SarabunPSK" w:eastAsia="TH SarabunPSK"/>
-          <w:b w:val="0"/>
-          <w:sz w:val="21"/>
-          <w:szCs w:val="21"/>
-        </w:rPr>
-        <w:t>โทร. ๐ ๒๕๗๒ ๒๕๒๗</w:t>
-      </w:r>
-    </w:p>
-    <w:p>
-      <w:pPr>
-        <w:tabs>
-          <w:tab w:pos="3028" w:val="left"/>
-        </w:tabs>
-        <w:spacing w:before="580" w:after="0" w:line="440" w:lineRule="exact"/>
-        <w:ind w:left="3028" w:hanging="720"/>
-      </w:pPr>
-      <w:r>
-        <w:rPr>
-          <w:rFonts w:ascii="TH SarabunPSK" w:hAnsi="TH SarabunPSK" w:cs="TH SarabunPSK" w:eastAsia="TH SarabunPSK"/>
-          <w:b/>
-          <w:sz w:val="26"/>
-          <w:szCs w:val="26"/>
-          <w:bCs/>
-        </w:rPr>
-        <w:t>เรียน</w:t>
-        <w:tab/>
-        <w:t>บริษัท อภิสฤษฎิ์ จำกัด</w:t>
-      </w:r>
-    </w:p>
-    <w:p>
-      <w:pPr>
-        <w:pageBreakBefore/>
-        <w:spacing w:before="0" w:after="0" w:line="364" w:lineRule="exact"/>
-      </w:pPr>
-      <w:r>
-        <w:rPr>
-          <w:rFonts w:ascii="TH SarabunPSK" w:hAnsi="TH SarabunPSK" w:cs="TH SarabunPSK" w:eastAsia="TH SarabunPSK"/>
-          <w:b w:val="0"/>
-          <w:sz w:val="21"/>
-          <w:szCs w:val="21"/>
-        </w:rPr>
-        <w:t>วปอ.สปท.</w:t>
-      </w:r>
-    </w:p>
-    <w:p>
-      <w:pPr>
-        <w:spacing w:before="0" w:after="0" w:line="364" w:lineRule="exact"/>
-      </w:pPr>
-      <w:r>
-        <w:rPr>
-          <w:rFonts w:ascii="TH SarabunPSK" w:hAnsi="TH SarabunPSK" w:cs="TH SarabunPSK" w:eastAsia="TH SarabunPSK"/>
-          <w:b w:val="0"/>
-          <w:sz w:val="21"/>
-          <w:szCs w:val="21"/>
-        </w:rPr>
-        <w:t>กห ๐๓๑๗.๒/๑๖๑๑</w:t>
-      </w:r>
-    </w:p>
-    <w:p>
-      <w:pPr>
-        <w:spacing w:before="0" w:after="0" w:line="364" w:lineRule="exact"/>
-      </w:pPr>
-      <w:r>
-        <w:rPr>
-          <w:rFonts w:ascii="TH SarabunPSK" w:hAnsi="TH SarabunPSK" w:cs="TH SarabunPSK" w:eastAsia="TH SarabunPSK"/>
-          <w:b w:val="0"/>
-          <w:sz w:val="21"/>
-          <w:szCs w:val="21"/>
-        </w:rPr>
-        <w:t>โทร. ๐ ๒๕๗๒ ๒๕๒๗</w:t>
-      </w:r>
-    </w:p>
-    <w:p>
-      <w:pPr>
-        <w:tabs>
-          <w:tab w:pos="3028" w:val="left"/>
-        </w:tabs>
-        <w:spacing w:before="580" w:after="0" w:line="440" w:lineRule="exact"/>
-        <w:ind w:left="3028" w:hanging="720"/>
-      </w:pPr>
-      <w:r>
-        <w:rPr>
-          <w:rFonts w:ascii="TH SarabunPSK" w:hAnsi="TH SarabunPSK" w:cs="TH SarabunPSK" w:eastAsia="TH SarabunPSK"/>
-          <w:b/>
-          <w:sz w:val="26"/>
-          <w:szCs w:val="26"/>
-          <w:bCs/>
-        </w:rPr>
-        <w:t>เรียน</w:t>
-        <w:tab/>
-        <w:t>บริษัท กีล่า สปอร์ต จำกัด</w:t>
-      </w:r>
-    </w:p>
-    <w:p>
-      <w:pPr>
-        <w:pageBreakBefore/>
-        <w:spacing w:before="0" w:after="0" w:line="364" w:lineRule="exact"/>
-      </w:pPr>
-      <w:r>
-        <w:rPr>
-          <w:rFonts w:ascii="TH SarabunPSK" w:hAnsi="TH SarabunPSK" w:cs="TH SarabunPSK" w:eastAsia="TH SarabunPSK"/>
-          <w:b w:val="0"/>
-          <w:sz w:val="21"/>
-          <w:szCs w:val="21"/>
-        </w:rPr>
-        <w:t>วปอ.สปท.</w:t>
-      </w:r>
-    </w:p>
-    <w:p>
-      <w:pPr>
-        <w:spacing w:before="0" w:after="0" w:line="364" w:lineRule="exact"/>
-      </w:pPr>
-      <w:r>
-        <w:rPr>
-          <w:rFonts w:ascii="TH SarabunPSK" w:hAnsi="TH SarabunPSK" w:cs="TH SarabunPSK" w:eastAsia="TH SarabunPSK"/>
-          <w:b w:val="0"/>
-          <w:sz w:val="21"/>
-          <w:szCs w:val="21"/>
-        </w:rPr>
-        <w:t>กห ๐๓๑๗.๒/๑๖๑๑</w:t>
-      </w:r>
-    </w:p>
-    <w:p>
-      <w:pPr>
-        <w:spacing w:before="0" w:after="0" w:line="364" w:lineRule="exact"/>
-      </w:pPr>
-      <w:r>
-        <w:rPr>
-          <w:rFonts w:ascii="TH SarabunPSK" w:hAnsi="TH SarabunPSK" w:cs="TH SarabunPSK" w:eastAsia="TH SarabunPSK"/>
-          <w:b w:val="0"/>
-          <w:sz w:val="21"/>
-          <w:szCs w:val="21"/>
-        </w:rPr>
-        <w:t>โทร. ๐ ๒๕๗๒ ๒๕๒๗</w:t>
-      </w:r>
-    </w:p>
-    <w:p>
-      <w:pPr>
-        <w:tabs>
-          <w:tab w:pos="3028" w:val="left"/>
-        </w:tabs>
-        <w:spacing w:before="580" w:after="0" w:line="440" w:lineRule="exact"/>
-        <w:ind w:left="3028" w:hanging="720"/>
-      </w:pPr>
-      <w:r>
-        <w:rPr>
-          <w:rFonts w:ascii="TH SarabunPSK" w:hAnsi="TH SarabunPSK" w:cs="TH SarabunPSK" w:eastAsia="TH SarabunPSK"/>
-          <w:b/>
-          <w:sz w:val="26"/>
-          <w:szCs w:val="26"/>
-          <w:bCs/>
-        </w:rPr>
-        <w:t>เรียน</w:t>
-        <w:tab/>
-        <w:t>บริษัท วี.เค.การ์เมนท์ จำกัด (สำนักงานใหญ่)</w:t>
-      </w:r>
-    </w:p>
-    <w:p>
-      <w:pPr>
-        <w:pageBreakBefore/>
-        <w:spacing w:before="0" w:after="0" w:line="364" w:lineRule="exact"/>
-      </w:pPr>
-      <w:r>
-        <w:rPr>
-          <w:rFonts w:ascii="TH SarabunPSK" w:hAnsi="TH SarabunPSK" w:cs="TH SarabunPSK" w:eastAsia="TH SarabunPSK"/>
-          <w:b w:val="0"/>
-          <w:sz w:val="21"/>
-          <w:szCs w:val="21"/>
-        </w:rPr>
-        <w:t>วปอ.สปท.</w:t>
-      </w:r>
-    </w:p>
-    <w:p>
-      <w:pPr>
-        <w:spacing w:before="0" w:after="0" w:line="364" w:lineRule="exact"/>
-      </w:pPr>
-      <w:r>
-        <w:rPr>
-          <w:rFonts w:ascii="TH SarabunPSK" w:hAnsi="TH SarabunPSK" w:cs="TH SarabunPSK" w:eastAsia="TH SarabunPSK"/>
-          <w:b w:val="0"/>
-          <w:sz w:val="21"/>
-          <w:szCs w:val="21"/>
-        </w:rPr>
-        <w:t>กห ๐๓๑๗.๒/๑๖๑๑</w:t>
-      </w:r>
-    </w:p>
-    <w:p>
-      <w:pPr>
-        <w:spacing w:before="0" w:after="0" w:line="364" w:lineRule="exact"/>
-      </w:pPr>
-      <w:r>
-        <w:rPr>
-          <w:rFonts w:ascii="TH SarabunPSK" w:hAnsi="TH SarabunPSK" w:cs="TH SarabunPSK" w:eastAsia="TH SarabunPSK"/>
-          <w:b w:val="0"/>
-          <w:sz w:val="21"/>
-          <w:szCs w:val="21"/>
-        </w:rPr>
-        <w:t>โทร. ๐ ๒๕๗๒ ๒๕๒๗</w:t>
-      </w:r>
-    </w:p>
-    <w:p>
-      <w:pPr>
-        <w:tabs>
-          <w:tab w:pos="3028" w:val="left"/>
-        </w:tabs>
-        <w:spacing w:before="580" w:after="0" w:line="440" w:lineRule="exact"/>
-        <w:ind w:left="3028" w:hanging="720"/>
-      </w:pPr>
-      <w:r>
-        <w:rPr>
-          <w:rFonts w:ascii="TH SarabunPSK" w:hAnsi="TH SarabunPSK" w:cs="TH SarabunPSK" w:eastAsia="TH SarabunPSK"/>
-          <w:b/>
-          <w:sz w:val="26"/>
-          <w:szCs w:val="26"/>
-          <w:bCs/>
-        </w:rPr>
-        <w:t>เรียน</w:t>
-        <w:tab/>
-        <w:t>บริษัท พลอยศรีรัฐ ซัพลาย จำกัด (สำนักงานใหญ่)</w:t>
-      </w:r>
-    </w:p>
-    <w:p>
-      <w:pPr>
-        <w:pageBreakBefore/>
-        <w:spacing w:before="0" w:after="0" w:line="364" w:lineRule="exact"/>
-      </w:pPr>
-      <w:r>
-        <w:rPr>
-          <w:rFonts w:ascii="TH SarabunPSK" w:hAnsi="TH SarabunPSK" w:cs="TH SarabunPSK" w:eastAsia="TH SarabunPSK"/>
-          <w:b w:val="0"/>
-          <w:sz w:val="21"/>
-          <w:szCs w:val="21"/>
-        </w:rPr>
-        <w:t>วปอ.สปท.</w:t>
-      </w:r>
-    </w:p>
-    <w:p>
-      <w:pPr>
-        <w:spacing w:before="0" w:after="0" w:line="364" w:lineRule="exact"/>
-      </w:pPr>
-      <w:r>
-        <w:rPr>
-          <w:rFonts w:ascii="TH SarabunPSK" w:hAnsi="TH SarabunPSK" w:cs="TH SarabunPSK" w:eastAsia="TH SarabunPSK"/>
-          <w:b w:val="0"/>
-          <w:sz w:val="21"/>
-          <w:szCs w:val="21"/>
-        </w:rPr>
-        <w:t>กห ๐๓๑๗.๒/๑๖๑๑</w:t>
-      </w:r>
-    </w:p>
-    <w:p>
-      <w:pPr>
-        <w:spacing w:before="0" w:after="0" w:line="364" w:lineRule="exact"/>
-      </w:pPr>
-      <w:r>
-        <w:rPr>
-          <w:rFonts w:ascii="TH SarabunPSK" w:hAnsi="TH SarabunPSK" w:cs="TH SarabunPSK" w:eastAsia="TH SarabunPSK"/>
-          <w:b w:val="0"/>
-          <w:sz w:val="21"/>
-          <w:szCs w:val="21"/>
-        </w:rPr>
-        <w:t>โทร. ๐ ๒๕๗๒ ๒๕๒๗</w:t>
-      </w:r>
-    </w:p>
-    <w:p>
-      <w:pPr>
-        <w:tabs>
-          <w:tab w:pos="3028" w:val="left"/>
-        </w:tabs>
-        <w:spacing w:before="580" w:after="0" w:line="440" w:lineRule="exact"/>
-        <w:ind w:left="3028" w:hanging="720"/>
-      </w:pPr>
-      <w:r>
-        <w:rPr>
-          <w:rFonts w:ascii="TH SarabunPSK" w:hAnsi="TH SarabunPSK" w:cs="TH SarabunPSK" w:eastAsia="TH SarabunPSK"/>
-          <w:b/>
-          <w:sz w:val="26"/>
-          <w:szCs w:val="26"/>
-          <w:bCs/>
-        </w:rPr>
-        <w:t>เรียน</w:t>
-        <w:tab/>
-        <w:t>ห้างหุ้นส่วนจำกัด ศ.วีระพันธ์</w:t>
-      </w:r>
-    </w:p>
-    <w:p>
-      <w:pPr>
-        <w:pageBreakBefore/>
-        <w:spacing w:before="0" w:after="0" w:line="364" w:lineRule="exact"/>
-      </w:pPr>
-      <w:r>
-        <w:rPr>
-          <w:rFonts w:ascii="TH SarabunPSK" w:hAnsi="TH SarabunPSK" w:cs="TH SarabunPSK" w:eastAsia="TH SarabunPSK"/>
-          <w:b w:val="0"/>
-          <w:sz w:val="21"/>
-          <w:szCs w:val="21"/>
-        </w:rPr>
-        <w:t>วปอ.สปท.</w:t>
-      </w:r>
-    </w:p>
-    <w:p>
-      <w:pPr>
-        <w:spacing w:before="0" w:after="0" w:line="364" w:lineRule="exact"/>
-      </w:pPr>
-      <w:r>
-        <w:rPr>
-          <w:rFonts w:ascii="TH SarabunPSK" w:hAnsi="TH SarabunPSK" w:cs="TH SarabunPSK" w:eastAsia="TH SarabunPSK"/>
-          <w:b w:val="0"/>
-          <w:sz w:val="21"/>
-          <w:szCs w:val="21"/>
-        </w:rPr>
-        <w:t>กห ๐๓๑๗.๒/๑๖๑๑</w:t>
-      </w:r>
-    </w:p>
-    <w:p>
-      <w:pPr>
-        <w:spacing w:before="0" w:after="0" w:line="364" w:lineRule="exact"/>
-      </w:pPr>
-      <w:r>
-        <w:rPr>
-          <w:rFonts w:ascii="TH SarabunPSK" w:hAnsi="TH SarabunPSK" w:cs="TH SarabunPSK" w:eastAsia="TH SarabunPSK"/>
-          <w:b w:val="0"/>
-          <w:sz w:val="21"/>
-          <w:szCs w:val="21"/>
-        </w:rPr>
-        <w:t>โทร. ๐ ๒๕๗๒ ๒๕๒๗</w:t>
-      </w:r>
-    </w:p>
-    <w:p>
-      <w:pPr>
-        <w:tabs>
-          <w:tab w:pos="3028" w:val="left"/>
-        </w:tabs>
-        <w:spacing w:before="580" w:after="0" w:line="440" w:lineRule="exact"/>
-        <w:ind w:left="3028" w:hanging="720"/>
-      </w:pPr>
-      <w:r>
-        <w:rPr>
-          <w:rFonts w:ascii="TH SarabunPSK" w:hAnsi="TH SarabunPSK" w:cs="TH SarabunPSK" w:eastAsia="TH SarabunPSK"/>
-          <w:b/>
-          <w:sz w:val="26"/>
-          <w:szCs w:val="26"/>
-          <w:bCs/>
-        </w:rPr>
-        <w:t>เรียน</w:t>
-        <w:tab/>
-        <w:t>ร้าน สูทสภา (อรุณลักษณ์สูทสภา)</w:t>
-      </w:r>
-    </w:p>
-    <w:p>
-      <w:pPr>
-        <w:pageBreakBefore/>
-        <w:spacing w:before="0" w:after="0" w:line="364" w:lineRule="exact"/>
-      </w:pPr>
-      <w:r>
-        <w:rPr>
-          <w:rFonts w:ascii="TH SarabunPSK" w:hAnsi="TH SarabunPSK" w:cs="TH SarabunPSK" w:eastAsia="TH SarabunPSK"/>
-          <w:b w:val="0"/>
-          <w:sz w:val="21"/>
-          <w:szCs w:val="21"/>
-        </w:rPr>
-        <w:t>วปอ.สปท.</w:t>
-      </w:r>
-    </w:p>
-    <w:p>
-      <w:pPr>
-        <w:spacing w:before="0" w:after="0" w:line="364" w:lineRule="exact"/>
-      </w:pPr>
-      <w:r>
-        <w:rPr>
-          <w:rFonts w:ascii="TH SarabunPSK" w:hAnsi="TH SarabunPSK" w:cs="TH SarabunPSK" w:eastAsia="TH SarabunPSK"/>
-          <w:b w:val="0"/>
-          <w:sz w:val="21"/>
-          <w:szCs w:val="21"/>
-        </w:rPr>
-        <w:t>กห ๐๓๑๗.๒/๑๖๑๑</w:t>
-      </w:r>
-    </w:p>
-    <w:p>
-      <w:pPr>
-        <w:spacing w:before="0" w:after="0" w:line="364" w:lineRule="exact"/>
-      </w:pPr>
-      <w:r>
-        <w:rPr>
-          <w:rFonts w:ascii="TH SarabunPSK" w:hAnsi="TH SarabunPSK" w:cs="TH SarabunPSK" w:eastAsia="TH SarabunPSK"/>
-          <w:b w:val="0"/>
-          <w:sz w:val="21"/>
-          <w:szCs w:val="21"/>
-        </w:rPr>
-        <w:t>โทร. ๐ ๒๕๗๒ ๒๕๒๗</w:t>
-      </w:r>
-    </w:p>
-    <w:p>
-      <w:pPr>
-        <w:tabs>
-          <w:tab w:pos="3028" w:val="left"/>
-        </w:tabs>
-        <w:spacing w:before="580" w:after="0" w:line="440" w:lineRule="exact"/>
-        <w:ind w:left="3028" w:hanging="720"/>
-      </w:pPr>
-      <w:r>
-        <w:rPr>
-          <w:rFonts w:ascii="TH SarabunPSK" w:hAnsi="TH SarabunPSK" w:cs="TH SarabunPSK" w:eastAsia="TH SarabunPSK"/>
-          <w:b/>
-          <w:sz w:val="26"/>
-          <w:szCs w:val="26"/>
-          <w:bCs/>
-        </w:rPr>
-        <w:t>เรียน</w:t>
-        <w:tab/>
-        <w:t>ร้าน John Perfect Tailor</w:t>
-      </w:r>
-    </w:p>
-    <w:p>
-      <w:pPr>
-        <w:pageBreakBefore/>
-        <w:spacing w:before="0" w:after="0" w:line="364" w:lineRule="exact"/>
-      </w:pPr>
-      <w:r>
-        <w:rPr>
-          <w:rFonts w:ascii="TH SarabunPSK" w:hAnsi="TH SarabunPSK" w:cs="TH SarabunPSK" w:eastAsia="TH SarabunPSK"/>
-          <w:b w:val="0"/>
-          <w:sz w:val="21"/>
-          <w:szCs w:val="21"/>
-        </w:rPr>
-        <w:t>วปอ.สปท.</w:t>
-      </w:r>
-    </w:p>
-    <w:p>
-      <w:pPr>
-        <w:spacing w:before="0" w:after="0" w:line="364" w:lineRule="exact"/>
-      </w:pPr>
-      <w:r>
-        <w:rPr>
-          <w:rFonts w:ascii="TH SarabunPSK" w:hAnsi="TH SarabunPSK" w:cs="TH SarabunPSK" w:eastAsia="TH SarabunPSK"/>
-          <w:b w:val="0"/>
-          <w:sz w:val="21"/>
-          <w:szCs w:val="21"/>
-        </w:rPr>
-        <w:t>กห ๐๓๑๗.๒/๑๖๑๑</w:t>
-      </w:r>
-    </w:p>
-    <w:p>
-      <w:pPr>
-        <w:spacing w:before="0" w:after="0" w:line="364" w:lineRule="exact"/>
-      </w:pPr>
-      <w:r>
-        <w:rPr>
-          <w:rFonts w:ascii="TH SarabunPSK" w:hAnsi="TH SarabunPSK" w:cs="TH SarabunPSK" w:eastAsia="TH SarabunPSK"/>
-          <w:b w:val="0"/>
-          <w:sz w:val="21"/>
-          <w:szCs w:val="21"/>
-        </w:rPr>
-        <w:t>โทร. ๐ ๒๕๗๒ ๒๕๒๗</w:t>
-      </w:r>
-    </w:p>
-    <w:p>
-      <w:pPr>
-        <w:tabs>
-          <w:tab w:pos="3028" w:val="left"/>
-        </w:tabs>
-        <w:spacing w:before="580" w:after="0" w:line="440" w:lineRule="exact"/>
-        <w:ind w:left="3028" w:hanging="720"/>
-      </w:pPr>
-      <w:r>
-        <w:rPr>
-          <w:rFonts w:ascii="TH SarabunPSK" w:hAnsi="TH SarabunPSK" w:cs="TH SarabunPSK" w:eastAsia="TH SarabunPSK"/>
-          <w:b/>
-          <w:sz w:val="26"/>
-          <w:szCs w:val="26"/>
-          <w:bCs/>
-        </w:rPr>
-        <w:t>เรียน</w:t>
-        <w:tab/>
-        <w:t>ร้าน เด่นแชมป์สูท</w:t>
-      </w:r>
-    </w:p>
-    <w:p>
-      <w:pPr>
-        <w:pageBreakBefore/>
-        <w:spacing w:before="0" w:after="0" w:line="364" w:lineRule="exact"/>
-      </w:pPr>
-      <w:r>
-        <w:rPr>
-          <w:rFonts w:ascii="TH SarabunPSK" w:hAnsi="TH SarabunPSK" w:cs="TH SarabunPSK" w:eastAsia="TH SarabunPSK"/>
-          <w:b w:val="0"/>
-          <w:sz w:val="21"/>
-          <w:szCs w:val="21"/>
-        </w:rPr>
-        <w:t>วปอ.สปท.</w:t>
-      </w:r>
-    </w:p>
-    <w:p>
-      <w:pPr>
-        <w:spacing w:before="0" w:after="0" w:line="364" w:lineRule="exact"/>
-      </w:pPr>
-      <w:r>
-        <w:rPr>
-          <w:rFonts w:ascii="TH SarabunPSK" w:hAnsi="TH SarabunPSK" w:cs="TH SarabunPSK" w:eastAsia="TH SarabunPSK"/>
-          <w:b w:val="0"/>
-          <w:sz w:val="21"/>
-          <w:szCs w:val="21"/>
-        </w:rPr>
-        <w:t>กห ๐๓๑๗.๒/๑๖๑๑</w:t>
-      </w:r>
-    </w:p>
-    <w:p>
-      <w:pPr>
-        <w:spacing w:before="0" w:after="0" w:line="364" w:lineRule="exact"/>
-      </w:pPr>
-      <w:r>
-        <w:rPr>
-          <w:rFonts w:ascii="TH SarabunPSK" w:hAnsi="TH SarabunPSK" w:cs="TH SarabunPSK" w:eastAsia="TH SarabunPSK"/>
-          <w:b w:val="0"/>
-          <w:sz w:val="21"/>
-          <w:szCs w:val="21"/>
-        </w:rPr>
-        <w:t>โทร. ๐ ๒๕๗๒ ๒๕๒๗</w:t>
-      </w:r>
-    </w:p>
-    <w:p>
-      <w:pPr>
-        <w:tabs>
-          <w:tab w:pos="3028" w:val="left"/>
-        </w:tabs>
-        <w:spacing w:before="580" w:after="0" w:line="440" w:lineRule="exact"/>
-        <w:ind w:left="3028" w:hanging="720"/>
-      </w:pPr>
-      <w:r>
-        <w:rPr>
-          <w:rFonts w:ascii="TH SarabunPSK" w:hAnsi="TH SarabunPSK" w:cs="TH SarabunPSK" w:eastAsia="TH SarabunPSK"/>
-          <w:b/>
-          <w:sz w:val="26"/>
-          <w:szCs w:val="26"/>
-          <w:bCs/>
-        </w:rPr>
-        <w:t>เรียน</w:t>
-        <w:tab/>
-        <w:t>ร้าน AR Tailor House (ร้านชูวิทย์)</w:t>
-      </w:r>
-    </w:p>
-    <w:p>
-      <w:pPr>
-        <w:pageBreakBefore/>
-        <w:spacing w:before="0" w:after="0" w:line="364" w:lineRule="exact"/>
-      </w:pPr>
-      <w:r>
-        <w:rPr>
-          <w:rFonts w:ascii="TH SarabunPSK" w:hAnsi="TH SarabunPSK" w:cs="TH SarabunPSK" w:eastAsia="TH SarabunPSK"/>
-          <w:b w:val="0"/>
-          <w:sz w:val="21"/>
-          <w:szCs w:val="21"/>
-        </w:rPr>
-        <w:t>วปอ.สปท.</w:t>
-      </w:r>
-    </w:p>
-    <w:p>
-      <w:pPr>
-        <w:spacing w:before="0" w:after="0" w:line="364" w:lineRule="exact"/>
-      </w:pPr>
-      <w:r>
-        <w:rPr>
-          <w:rFonts w:ascii="TH SarabunPSK" w:hAnsi="TH SarabunPSK" w:cs="TH SarabunPSK" w:eastAsia="TH SarabunPSK"/>
-          <w:b w:val="0"/>
-          <w:sz w:val="21"/>
-          <w:szCs w:val="21"/>
-        </w:rPr>
-        <w:t>กห ๐๓๑๗.๒/๑๖๑๑</w:t>
-      </w:r>
-    </w:p>
-    <w:p>
-      <w:pPr>
-        <w:spacing w:before="0" w:after="0" w:line="364" w:lineRule="exact"/>
-      </w:pPr>
-      <w:r>
-        <w:rPr>
-          <w:rFonts w:ascii="TH SarabunPSK" w:hAnsi="TH SarabunPSK" w:cs="TH SarabunPSK" w:eastAsia="TH SarabunPSK"/>
-          <w:b w:val="0"/>
-          <w:sz w:val="21"/>
-          <w:szCs w:val="21"/>
-        </w:rPr>
-        <w:t>โทร. ๐ ๒๕๗๒ ๒๕๒๗</w:t>
-      </w:r>
-    </w:p>
-    <w:p>
-      <w:pPr>
-        <w:tabs>
-          <w:tab w:pos="3028" w:val="left"/>
-        </w:tabs>
-        <w:spacing w:before="580" w:after="0" w:line="440" w:lineRule="exact"/>
-        <w:ind w:left="3028" w:hanging="720"/>
-      </w:pPr>
-      <w:r>
-        <w:rPr>
-          <w:rFonts w:ascii="TH SarabunPSK" w:hAnsi="TH SarabunPSK" w:cs="TH SarabunPSK" w:eastAsia="TH SarabunPSK"/>
-          <w:b/>
-          <w:sz w:val="26"/>
-          <w:szCs w:val="26"/>
-          <w:bCs/>
-        </w:rPr>
-        <w:t>เรียน</w:t>
-        <w:tab/>
-        <w:t>ร้าน สูทเวิลด์เซ็นเตอร์</w:t>
-      </w:r>
-    </w:p>
-    <w:p>
-      <w:pPr>
-        <w:pageBreakBefore/>
-        <w:spacing w:before="0" w:after="0" w:line="364" w:lineRule="exact"/>
-      </w:pPr>
-      <w:r>
-        <w:rPr>
-          <w:rFonts w:ascii="TH SarabunPSK" w:hAnsi="TH SarabunPSK" w:cs="TH SarabunPSK" w:eastAsia="TH SarabunPSK"/>
-          <w:b w:val="0"/>
-          <w:sz w:val="21"/>
-          <w:szCs w:val="21"/>
-        </w:rPr>
-        <w:t>วปอ.สปท.</w:t>
-      </w:r>
-    </w:p>
-    <w:p>
-      <w:pPr>
-        <w:spacing w:before="0" w:after="0" w:line="364" w:lineRule="exact"/>
-      </w:pPr>
-      <w:r>
-        <w:rPr>
-          <w:rFonts w:ascii="TH SarabunPSK" w:hAnsi="TH SarabunPSK" w:cs="TH SarabunPSK" w:eastAsia="TH SarabunPSK"/>
-          <w:b w:val="0"/>
-          <w:sz w:val="21"/>
-          <w:szCs w:val="21"/>
-        </w:rPr>
-        <w:t>กห ๐๓๑๗.๒/๑๖๑๑</w:t>
-      </w:r>
-    </w:p>
-    <w:p>
-      <w:pPr>
-        <w:spacing w:before="0" w:after="0" w:line="364" w:lineRule="exact"/>
-      </w:pPr>
-      <w:r>
-        <w:rPr>
-          <w:rFonts w:ascii="TH SarabunPSK" w:hAnsi="TH SarabunPSK" w:cs="TH SarabunPSK" w:eastAsia="TH SarabunPSK"/>
-          <w:b w:val="0"/>
-          <w:sz w:val="21"/>
-          <w:szCs w:val="21"/>
-        </w:rPr>
-        <w:t>โทร. ๐ ๒๕๗๒ ๒๕๒๗</w:t>
-      </w:r>
-    </w:p>
-    <w:p>
-      <w:pPr>
-        <w:tabs>
-          <w:tab w:pos="3028" w:val="left"/>
-        </w:tabs>
-        <w:spacing w:before="580" w:after="0" w:line="440" w:lineRule="exact"/>
-        <w:ind w:left="3028" w:hanging="720"/>
-      </w:pPr>
-      <w:r>
-        <w:rPr>
-          <w:rFonts w:ascii="TH SarabunPSK" w:hAnsi="TH SarabunPSK" w:cs="TH SarabunPSK" w:eastAsia="TH SarabunPSK"/>
-          <w:b/>
-          <w:sz w:val="26"/>
-          <w:szCs w:val="26"/>
-          <w:bCs/>
-        </w:rPr>
-        <w:t>เรียน</w:t>
-        <w:tab/>
-        <w:t>ร้าน ช่อชัยพฤกษ์</w:t>
-      </w:r>
-    </w:p>
-    <w:p>
-      <w:pPr>
-        <w:pageBreakBefore/>
-        <w:spacing w:before="0" w:after="0" w:line="364" w:lineRule="exact"/>
-      </w:pPr>
-      <w:r>
-        <w:rPr>
-          <w:rFonts w:ascii="TH SarabunPSK" w:hAnsi="TH SarabunPSK" w:cs="TH SarabunPSK" w:eastAsia="TH SarabunPSK"/>
-          <w:b w:val="0"/>
-          <w:sz w:val="21"/>
-          <w:szCs w:val="21"/>
-        </w:rPr>
-        <w:t>วปอ.สปท.</w:t>
-      </w:r>
-    </w:p>
-    <w:p>
-      <w:pPr>
-        <w:spacing w:before="0" w:after="0" w:line="364" w:lineRule="exact"/>
-      </w:pPr>
-      <w:r>
-        <w:rPr>
-          <w:rFonts w:ascii="TH SarabunPSK" w:hAnsi="TH SarabunPSK" w:cs="TH SarabunPSK" w:eastAsia="TH SarabunPSK"/>
-          <w:b w:val="0"/>
-          <w:sz w:val="21"/>
-          <w:szCs w:val="21"/>
-        </w:rPr>
-        <w:t>กห ๐๓๑๗.๒/๑๖๑๑</w:t>
-      </w:r>
-    </w:p>
-    <w:p>
-      <w:pPr>
-        <w:spacing w:before="0" w:after="0" w:line="364" w:lineRule="exact"/>
-      </w:pPr>
-      <w:r>
-        <w:rPr>
-          <w:rFonts w:ascii="TH SarabunPSK" w:hAnsi="TH SarabunPSK" w:cs="TH SarabunPSK" w:eastAsia="TH SarabunPSK"/>
-          <w:b w:val="0"/>
-          <w:sz w:val="21"/>
-          <w:szCs w:val="21"/>
-        </w:rPr>
-        <w:t>โทร. ๐ ๒๕๗๒ ๒๕๒๗</w:t>
-      </w:r>
-    </w:p>
-    <w:p>
-      <w:pPr>
-        <w:tabs>
-          <w:tab w:pos="3028" w:val="left"/>
-        </w:tabs>
-        <w:spacing w:before="580" w:after="0" w:line="440" w:lineRule="exact"/>
-        <w:ind w:left="3028" w:hanging="720"/>
-      </w:pPr>
-      <w:r>
-        <w:rPr>
-          <w:rFonts w:ascii="TH SarabunPSK" w:hAnsi="TH SarabunPSK" w:cs="TH SarabunPSK" w:eastAsia="TH SarabunPSK"/>
-          <w:b/>
-          <w:sz w:val="26"/>
-          <w:szCs w:val="26"/>
-          <w:bCs/>
-        </w:rPr>
-        <w:t>เรียน</w:t>
-        <w:tab/>
-        <w:t>บริษัท สูทแน็ค จำกัด</w:t>
-      </w:r>
-    </w:p>
-    <w:p>
-      <w:pPr>
-        <w:pageBreakBefore/>
-        <w:spacing w:before="0" w:after="0" w:line="364" w:lineRule="exact"/>
-      </w:pPr>
-      <w:r>
-        <w:rPr>
-          <w:rFonts w:ascii="TH SarabunPSK" w:hAnsi="TH SarabunPSK" w:cs="TH SarabunPSK" w:eastAsia="TH SarabunPSK"/>
-          <w:b w:val="0"/>
-          <w:sz w:val="21"/>
-          <w:szCs w:val="21"/>
-        </w:rPr>
-        <w:t>วปอ.สปท.</w:t>
-      </w:r>
-    </w:p>
-    <w:p>
-      <w:pPr>
-        <w:spacing w:before="0" w:after="0" w:line="364" w:lineRule="exact"/>
-      </w:pPr>
-      <w:r>
-        <w:rPr>
-          <w:rFonts w:ascii="TH SarabunPSK" w:hAnsi="TH SarabunPSK" w:cs="TH SarabunPSK" w:eastAsia="TH SarabunPSK"/>
-          <w:b w:val="0"/>
-          <w:sz w:val="21"/>
-          <w:szCs w:val="21"/>
-        </w:rPr>
-        <w:t>กห ๐๓๑๗.๒/๑๖๑๑</w:t>
-      </w:r>
-    </w:p>
-    <w:p>
-      <w:pPr>
-        <w:spacing w:before="0" w:after="0" w:line="364" w:lineRule="exact"/>
-      </w:pPr>
-      <w:r>
-        <w:rPr>
-          <w:rFonts w:ascii="TH SarabunPSK" w:hAnsi="TH SarabunPSK" w:cs="TH SarabunPSK" w:eastAsia="TH SarabunPSK"/>
-          <w:b w:val="0"/>
-          <w:sz w:val="21"/>
-          <w:szCs w:val="21"/>
-        </w:rPr>
-        <w:t>โทร. ๐ ๒๕๗๒ ๒๕๒๗</w:t>
-      </w:r>
-    </w:p>
-    <w:p>
-      <w:pPr>
-        <w:tabs>
-          <w:tab w:pos="3028" w:val="left"/>
-        </w:tabs>
-        <w:spacing w:before="580" w:after="0" w:line="440" w:lineRule="exact"/>
-        <w:ind w:left="3028" w:hanging="720"/>
-      </w:pPr>
-      <w:r>
-        <w:rPr>
-          <w:rFonts w:ascii="TH SarabunPSK" w:hAnsi="TH SarabunPSK" w:cs="TH SarabunPSK" w:eastAsia="TH SarabunPSK"/>
-          <w:b/>
-          <w:sz w:val="26"/>
-          <w:szCs w:val="26"/>
-          <w:bCs/>
-        </w:rPr>
-        <w:t>เรียน</w:t>
-        <w:tab/>
-        <w:t>ร้าน สูททะนง</w:t>
-      </w:r>
-    </w:p>
-    <w:p>
-      <w:pPr>
-        <w:pageBreakBefore/>
-        <w:spacing w:before="0" w:after="0" w:line="364" w:lineRule="exact"/>
-      </w:pPr>
-      <w:r>
-        <w:rPr>
-          <w:rFonts w:ascii="TH SarabunPSK" w:hAnsi="TH SarabunPSK" w:cs="TH SarabunPSK" w:eastAsia="TH SarabunPSK"/>
-          <w:b w:val="0"/>
-          <w:sz w:val="21"/>
-          <w:szCs w:val="21"/>
-        </w:rPr>
-        <w:t>วปอ.สปท.</w:t>
-      </w:r>
-    </w:p>
-    <w:p>
-      <w:pPr>
-        <w:spacing w:before="0" w:after="0" w:line="364" w:lineRule="exact"/>
-      </w:pPr>
-      <w:r>
-        <w:rPr>
-          <w:rFonts w:ascii="TH SarabunPSK" w:hAnsi="TH SarabunPSK" w:cs="TH SarabunPSK" w:eastAsia="TH SarabunPSK"/>
-          <w:b w:val="0"/>
-          <w:sz w:val="21"/>
-          <w:szCs w:val="21"/>
-        </w:rPr>
-        <w:t>กห ๐๓๑๗.๒/๑๖๑๑</w:t>
-      </w:r>
-    </w:p>
-    <w:p>
-      <w:pPr>
-        <w:spacing w:before="0" w:after="0" w:line="364" w:lineRule="exact"/>
-      </w:pPr>
-      <w:r>
-        <w:rPr>
-          <w:rFonts w:ascii="TH SarabunPSK" w:hAnsi="TH SarabunPSK" w:cs="TH SarabunPSK" w:eastAsia="TH SarabunPSK"/>
-          <w:b w:val="0"/>
-          <w:sz w:val="21"/>
-          <w:szCs w:val="21"/>
-        </w:rPr>
-        <w:t>โทร. ๐ ๒๕๗๒ ๒๕๒๗</w:t>
-      </w:r>
-    </w:p>
-    <w:p>
-      <w:pPr>
-        <w:tabs>
-          <w:tab w:pos="3028" w:val="left"/>
-        </w:tabs>
-        <w:spacing w:before="580" w:after="0" w:line="440" w:lineRule="exact"/>
-        <w:ind w:left="3028" w:hanging="720"/>
-      </w:pPr>
-      <w:r>
-        <w:rPr>
-          <w:rFonts w:ascii="TH SarabunPSK" w:hAnsi="TH SarabunPSK" w:cs="TH SarabunPSK" w:eastAsia="TH SarabunPSK"/>
-          <w:b/>
-          <w:sz w:val="26"/>
-          <w:szCs w:val="26"/>
-          <w:bCs/>
-        </w:rPr>
-        <w:t>เรียน</w:t>
-        <w:tab/>
-        <w:t>ร้าน Aek Siam Tailor</w:t>
-      </w:r>
-    </w:p>
-    <w:p>
-      <w:pPr>
-        <w:pageBreakBefore/>
-        <w:spacing w:before="0" w:after="0" w:line="364" w:lineRule="exact"/>
-      </w:pPr>
-      <w:r>
-        <w:rPr>
-          <w:rFonts w:ascii="TH SarabunPSK" w:hAnsi="TH SarabunPSK" w:cs="TH SarabunPSK" w:eastAsia="TH SarabunPSK"/>
-          <w:b w:val="0"/>
-          <w:sz w:val="21"/>
-          <w:szCs w:val="21"/>
-        </w:rPr>
-        <w:t>วปอ.สปท.</w:t>
-      </w:r>
-    </w:p>
-    <w:p>
-      <w:pPr>
-        <w:spacing w:before="0" w:after="0" w:line="364" w:lineRule="exact"/>
-      </w:pPr>
-      <w:r>
-        <w:rPr>
-          <w:rFonts w:ascii="TH SarabunPSK" w:hAnsi="TH SarabunPSK" w:cs="TH SarabunPSK" w:eastAsia="TH SarabunPSK"/>
-          <w:b w:val="0"/>
-          <w:sz w:val="21"/>
-          <w:szCs w:val="21"/>
-        </w:rPr>
-        <w:t>กห ๐๓๑๗.๒/๑๖๑๑</w:t>
-      </w:r>
-    </w:p>
-    <w:p>
-      <w:pPr>
-        <w:spacing w:before="0" w:after="0" w:line="364" w:lineRule="exact"/>
-      </w:pPr>
-      <w:r>
-        <w:rPr>
-          <w:rFonts w:ascii="TH SarabunPSK" w:hAnsi="TH SarabunPSK" w:cs="TH SarabunPSK" w:eastAsia="TH SarabunPSK"/>
-          <w:b w:val="0"/>
-          <w:sz w:val="21"/>
-          <w:szCs w:val="21"/>
-        </w:rPr>
-        <w:t>โทร. ๐ ๒๕๗๒ ๒๕๒๗</w:t>
-      </w:r>
-    </w:p>
-    <w:p>
-      <w:pPr>
-        <w:tabs>
-          <w:tab w:pos="3028" w:val="left"/>
-        </w:tabs>
-        <w:spacing w:before="580" w:after="0" w:line="440" w:lineRule="exact"/>
-        <w:ind w:left="3028" w:hanging="720"/>
-      </w:pPr>
-      <w:r>
-        <w:rPr>
-          <w:rFonts w:ascii="TH SarabunPSK" w:hAnsi="TH SarabunPSK" w:cs="TH SarabunPSK" w:eastAsia="TH SarabunPSK"/>
-          <w:b/>
-          <w:sz w:val="26"/>
-          <w:szCs w:val="26"/>
-          <w:bCs/>
-        </w:rPr>
-        <w:t>เรียน</w:t>
-        <w:tab/>
-        <w:t>บริษัท ทวินสูท จำกัด</w:t>
-      </w:r>
-    </w:p>
-    <w:p>
-      <w:pPr>
-        <w:pageBreakBefore/>
-        <w:spacing w:before="0" w:after="0" w:line="364" w:lineRule="exact"/>
-      </w:pPr>
-      <w:r>
-        <w:rPr>
-          <w:rFonts w:ascii="TH SarabunPSK" w:hAnsi="TH SarabunPSK" w:cs="TH SarabunPSK" w:eastAsia="TH SarabunPSK"/>
-          <w:b w:val="0"/>
-          <w:sz w:val="21"/>
-          <w:szCs w:val="21"/>
-        </w:rPr>
-        <w:t>วปอ.สปท.</w:t>
-      </w:r>
-    </w:p>
-    <w:p>
-      <w:pPr>
-        <w:spacing w:before="0" w:after="0" w:line="364" w:lineRule="exact"/>
-      </w:pPr>
-      <w:r>
-        <w:rPr>
-          <w:rFonts w:ascii="TH SarabunPSK" w:hAnsi="TH SarabunPSK" w:cs="TH SarabunPSK" w:eastAsia="TH SarabunPSK"/>
-          <w:b w:val="0"/>
-          <w:sz w:val="21"/>
-          <w:szCs w:val="21"/>
-        </w:rPr>
-        <w:t>กห ๐๓๑๗.๒/๑๖๑๑</w:t>
-      </w:r>
-    </w:p>
-    <w:p>
-      <w:pPr>
-        <w:spacing w:before="0" w:after="0" w:line="364" w:lineRule="exact"/>
-      </w:pPr>
-      <w:r>
-        <w:rPr>
-          <w:rFonts w:ascii="TH SarabunPSK" w:hAnsi="TH SarabunPSK" w:cs="TH SarabunPSK" w:eastAsia="TH SarabunPSK"/>
-          <w:b w:val="0"/>
-          <w:sz w:val="21"/>
-          <w:szCs w:val="21"/>
-        </w:rPr>
-        <w:t>โทร. ๐ ๒๕๗๒ ๒๕๒๗</w:t>
-      </w:r>
-    </w:p>
-    <w:p>
-      <w:pPr>
-        <w:tabs>
-          <w:tab w:pos="3028" w:val="left"/>
-        </w:tabs>
-        <w:spacing w:before="580" w:after="0" w:line="440" w:lineRule="exact"/>
-        <w:ind w:left="3028" w:hanging="720"/>
+        <w:ind w:left="4995" w:hanging="720"/>
       </w:pPr>
       <w:r>
         <w:rPr>

</xml_diff>

<commit_message>
Use Thai numerals in recipient names; default style TH SarabunPSK
Co-Authored-By: Claude Opus 5.5 <noreply@anthropic.com>
Claude-Session: https://claude.ai/code/session_01J3NTsmEhLtUpdxrpfiWApU
</commit_message>
<xml_diff>
--- a/output/ซองเรียน_94_หน่วย.docx
+++ b/output/ซองเรียน_94_หน่วย.docx
@@ -1733,10 +1733,10 @@
     <w:p>
       <w:pPr>
         <w:tabs>
-          <w:tab w:pos="2604" w:val="left"/>
+          <w:tab w:pos="2588" w:val="left"/>
         </w:tabs>
         <w:spacing w:before="580" w:after="0" w:line="440" w:lineRule="exact"/>
-        <w:ind w:left="2604" w:hanging="720"/>
+        <w:ind w:left="2588" w:hanging="720"/>
       </w:pPr>
       <w:r>
         <w:rPr>
@@ -1748,7 +1748,7 @@
         </w:rPr>
         <w:t>เรียน</w:t>
         <w:tab/>
-        <w:t>ผู้อำนวยการสำนักงานพัฒนาภาค 1 หน่วยบัญชาการทหารพัฒนา</w:t>
+        <w:t>ผู้อำนวยการสำนักงานพัฒนาภาค ๑ หน่วยบัญชาการทหารพัฒนา</w:t>
       </w:r>
     </w:p>
     <w:p>
@@ -1797,10 +1797,10 @@
     <w:p>
       <w:pPr>
         <w:tabs>
-          <w:tab w:pos="2886" w:val="left"/>
+          <w:tab w:pos="2840" w:val="left"/>
         </w:tabs>
         <w:spacing w:before="580" w:after="0" w:line="440" w:lineRule="exact"/>
-        <w:ind w:left="2886" w:hanging="720"/>
+        <w:ind w:left="2840" w:hanging="720"/>
       </w:pPr>
       <w:r>
         <w:rPr>
@@ -1812,7 +1812,7 @@
         </w:rPr>
         <w:t>เรียน</w:t>
         <w:tab/>
-        <w:t>ผู้บังคับหน่วยพัฒนาการเคลื่อนที่ 11 สำนักงานพัฒนาภาค 1</w:t>
+        <w:t>ผู้บังคับหน่วยพัฒนาการเคลื่อนที่ ๑๑ สำนักงานพัฒนาภาค ๑</w:t>
       </w:r>
     </w:p>
     <w:p>
@@ -1861,10 +1861,10 @@
     <w:p>
       <w:pPr>
         <w:tabs>
-          <w:tab w:pos="2886" w:val="left"/>
+          <w:tab w:pos="2840" w:val="left"/>
         </w:tabs>
         <w:spacing w:before="580" w:after="0" w:line="440" w:lineRule="exact"/>
-        <w:ind w:left="2886" w:hanging="720"/>
+        <w:ind w:left="2840" w:hanging="720"/>
       </w:pPr>
       <w:r>
         <w:rPr>
@@ -1876,7 +1876,7 @@
         </w:rPr>
         <w:t>เรียน</w:t>
         <w:tab/>
-        <w:t>ผู้บังคับหน่วยพัฒนาการเคลื่อนที่ 12 สำนักงานพัฒนาภาค 1</w:t>
+        <w:t>ผู้บังคับหน่วยพัฒนาการเคลื่อนที่ ๑๒ สำนักงานพัฒนาภาค ๑</w:t>
       </w:r>
     </w:p>
     <w:p>
@@ -1925,10 +1925,10 @@
     <w:p>
       <w:pPr>
         <w:tabs>
-          <w:tab w:pos="2886" w:val="left"/>
+          <w:tab w:pos="2840" w:val="left"/>
         </w:tabs>
         <w:spacing w:before="580" w:after="0" w:line="440" w:lineRule="exact"/>
-        <w:ind w:left="2886" w:hanging="720"/>
+        <w:ind w:left="2840" w:hanging="720"/>
       </w:pPr>
       <w:r>
         <w:rPr>
@@ -1940,7 +1940,7 @@
         </w:rPr>
         <w:t>เรียน</w:t>
         <w:tab/>
-        <w:t>ผู้บังคับหน่วยพัฒนาการเคลื่อนที่ 13 สำนักงานพัฒนาภาค 1</w:t>
+        <w:t>ผู้บังคับหน่วยพัฒนาการเคลื่อนที่ ๑๓ สำนักงานพัฒนาภาค ๑</w:t>
       </w:r>
     </w:p>
     <w:p>
@@ -1989,10 +1989,10 @@
     <w:p>
       <w:pPr>
         <w:tabs>
-          <w:tab w:pos="2886" w:val="left"/>
+          <w:tab w:pos="2840" w:val="left"/>
         </w:tabs>
         <w:spacing w:before="580" w:after="0" w:line="440" w:lineRule="exact"/>
-        <w:ind w:left="2886" w:hanging="720"/>
+        <w:ind w:left="2840" w:hanging="720"/>
       </w:pPr>
       <w:r>
         <w:rPr>
@@ -2004,7 +2004,7 @@
         </w:rPr>
         <w:t>เรียน</w:t>
         <w:tab/>
-        <w:t>ผู้บังคับหน่วยพัฒนาการเคลื่อนที่ 14 สำนักงานพัฒนาภาค 1</w:t>
+        <w:t>ผู้บังคับหน่วยพัฒนาการเคลื่อนที่ ๑๔ สำนักงานพัฒนาภาค ๑</w:t>
       </w:r>
     </w:p>
     <w:p>
@@ -2053,10 +2053,10 @@
     <w:p>
       <w:pPr>
         <w:tabs>
-          <w:tab w:pos="2886" w:val="left"/>
+          <w:tab w:pos="2840" w:val="left"/>
         </w:tabs>
         <w:spacing w:before="580" w:after="0" w:line="440" w:lineRule="exact"/>
-        <w:ind w:left="2886" w:hanging="720"/>
+        <w:ind w:left="2840" w:hanging="720"/>
       </w:pPr>
       <w:r>
         <w:rPr>
@@ -2068,7 +2068,7 @@
         </w:rPr>
         <w:t>เรียน</w:t>
         <w:tab/>
-        <w:t>ผู้บังคับหน่วยพัฒนาการเคลื่อนที่ 15 สำนักงานพัฒนาภาค 1</w:t>
+        <w:t>ผู้บังคับหน่วยพัฒนาการเคลื่อนที่ ๑๕ สำนักงานพัฒนาภาค ๑</w:t>
       </w:r>
     </w:p>
     <w:p>
@@ -2117,10 +2117,10 @@
     <w:p>
       <w:pPr>
         <w:tabs>
-          <w:tab w:pos="2604" w:val="left"/>
+          <w:tab w:pos="2588" w:val="left"/>
         </w:tabs>
         <w:spacing w:before="580" w:after="0" w:line="440" w:lineRule="exact"/>
-        <w:ind w:left="2604" w:hanging="720"/>
+        <w:ind w:left="2588" w:hanging="720"/>
       </w:pPr>
       <w:r>
         <w:rPr>
@@ -2132,7 +2132,7 @@
         </w:rPr>
         <w:t>เรียน</w:t>
         <w:tab/>
-        <w:t>ผู้อำนวยการสำนักงานพัฒนาภาค 2 หน่วยบัญชาการทหารพัฒนา</w:t>
+        <w:t>ผู้อำนวยการสำนักงานพัฒนาภาค ๒ หน่วยบัญชาการทหารพัฒนา</w:t>
       </w:r>
     </w:p>
     <w:p>
@@ -2181,10 +2181,10 @@
     <w:p>
       <w:pPr>
         <w:tabs>
-          <w:tab w:pos="2886" w:val="left"/>
+          <w:tab w:pos="2840" w:val="left"/>
         </w:tabs>
         <w:spacing w:before="580" w:after="0" w:line="440" w:lineRule="exact"/>
-        <w:ind w:left="2886" w:hanging="720"/>
+        <w:ind w:left="2840" w:hanging="720"/>
       </w:pPr>
       <w:r>
         <w:rPr>
@@ -2196,7 +2196,7 @@
         </w:rPr>
         <w:t>เรียน</w:t>
         <w:tab/>
-        <w:t>ผู้บังคับหน่วยพัฒนาการเคลื่อนที่ 21 สำนักงานพัฒนาภาค 2</w:t>
+        <w:t>ผู้บังคับหน่วยพัฒนาการเคลื่อนที่ ๒๑ สำนักงานพัฒนาภาค ๒</w:t>
       </w:r>
     </w:p>
     <w:p>
@@ -2245,10 +2245,10 @@
     <w:p>
       <w:pPr>
         <w:tabs>
-          <w:tab w:pos="2886" w:val="left"/>
+          <w:tab w:pos="2840" w:val="left"/>
         </w:tabs>
         <w:spacing w:before="580" w:after="0" w:line="440" w:lineRule="exact"/>
-        <w:ind w:left="2886" w:hanging="720"/>
+        <w:ind w:left="2840" w:hanging="720"/>
       </w:pPr>
       <w:r>
         <w:rPr>
@@ -2260,7 +2260,7 @@
         </w:rPr>
         <w:t>เรียน</w:t>
         <w:tab/>
-        <w:t>ผู้บังคับหน่วยพัฒนาการเคลื่อนที่ 22 สำนักงานพัฒนาภาค 2</w:t>
+        <w:t>ผู้บังคับหน่วยพัฒนาการเคลื่อนที่ ๒๒ สำนักงานพัฒนาภาค ๒</w:t>
       </w:r>
     </w:p>
     <w:p>
@@ -2309,10 +2309,10 @@
     <w:p>
       <w:pPr>
         <w:tabs>
-          <w:tab w:pos="2886" w:val="left"/>
+          <w:tab w:pos="2840" w:val="left"/>
         </w:tabs>
         <w:spacing w:before="580" w:after="0" w:line="440" w:lineRule="exact"/>
-        <w:ind w:left="2886" w:hanging="720"/>
+        <w:ind w:left="2840" w:hanging="720"/>
       </w:pPr>
       <w:r>
         <w:rPr>
@@ -2324,7 +2324,7 @@
         </w:rPr>
         <w:t>เรียน</w:t>
         <w:tab/>
-        <w:t>ผู้บังคับหน่วยพัฒนาการเคลื่อนที่ 23 สำนักงานพัฒนาภาค 2</w:t>
+        <w:t>ผู้บังคับหน่วยพัฒนาการเคลื่อนที่ ๒๓ สำนักงานพัฒนาภาค ๒</w:t>
       </w:r>
     </w:p>
     <w:p>
@@ -2373,10 +2373,10 @@
     <w:p>
       <w:pPr>
         <w:tabs>
-          <w:tab w:pos="2886" w:val="left"/>
+          <w:tab w:pos="2840" w:val="left"/>
         </w:tabs>
         <w:spacing w:before="580" w:after="0" w:line="440" w:lineRule="exact"/>
-        <w:ind w:left="2886" w:hanging="720"/>
+        <w:ind w:left="2840" w:hanging="720"/>
       </w:pPr>
       <w:r>
         <w:rPr>
@@ -2388,7 +2388,7 @@
         </w:rPr>
         <w:t>เรียน</w:t>
         <w:tab/>
-        <w:t>ผู้บังคับหน่วยพัฒนาการเคลื่อนที่ 24 สำนักงานพัฒนาภาค 2</w:t>
+        <w:t>ผู้บังคับหน่วยพัฒนาการเคลื่อนที่ ๒๔ สำนักงานพัฒนาภาค ๒</w:t>
       </w:r>
     </w:p>
     <w:p>
@@ -2437,10 +2437,10 @@
     <w:p>
       <w:pPr>
         <w:tabs>
-          <w:tab w:pos="2886" w:val="left"/>
+          <w:tab w:pos="2840" w:val="left"/>
         </w:tabs>
         <w:spacing w:before="580" w:after="0" w:line="440" w:lineRule="exact"/>
-        <w:ind w:left="2886" w:hanging="720"/>
+        <w:ind w:left="2840" w:hanging="720"/>
       </w:pPr>
       <w:r>
         <w:rPr>
@@ -2452,7 +2452,7 @@
         </w:rPr>
         <w:t>เรียน</w:t>
         <w:tab/>
-        <w:t>ผู้บังคับหน่วยพัฒนาการเคลื่อนที่ 25 สำนักงานพัฒนาภาค 2</w:t>
+        <w:t>ผู้บังคับหน่วยพัฒนาการเคลื่อนที่ ๒๕ สำนักงานพัฒนาภาค ๒</w:t>
       </w:r>
     </w:p>
     <w:p>
@@ -2501,10 +2501,10 @@
     <w:p>
       <w:pPr>
         <w:tabs>
-          <w:tab w:pos="2886" w:val="left"/>
+          <w:tab w:pos="2840" w:val="left"/>
         </w:tabs>
         <w:spacing w:before="580" w:after="0" w:line="440" w:lineRule="exact"/>
-        <w:ind w:left="2886" w:hanging="720"/>
+        <w:ind w:left="2840" w:hanging="720"/>
       </w:pPr>
       <w:r>
         <w:rPr>
@@ -2516,7 +2516,7 @@
         </w:rPr>
         <w:t>เรียน</w:t>
         <w:tab/>
-        <w:t>ผู้บังคับหน่วยพัฒนาการเคลื่อนที่ 26 สำนักงานพัฒนาภาค 2</w:t>
+        <w:t>ผู้บังคับหน่วยพัฒนาการเคลื่อนที่ ๒๖ สำนักงานพัฒนาภาค ๒</w:t>
       </w:r>
     </w:p>
     <w:p>
@@ -2565,10 +2565,10 @@
     <w:p>
       <w:pPr>
         <w:tabs>
-          <w:tab w:pos="2604" w:val="left"/>
+          <w:tab w:pos="2588" w:val="left"/>
         </w:tabs>
         <w:spacing w:before="580" w:after="0" w:line="440" w:lineRule="exact"/>
-        <w:ind w:left="2604" w:hanging="720"/>
+        <w:ind w:left="2588" w:hanging="720"/>
       </w:pPr>
       <w:r>
         <w:rPr>
@@ -2580,7 +2580,7 @@
         </w:rPr>
         <w:t>เรียน</w:t>
         <w:tab/>
-        <w:t>ผู้อำนวยการสำนักงานพัฒนาภาค 3 หน่วยบัญชาการทหารพัฒนา</w:t>
+        <w:t>ผู้อำนวยการสำนักงานพัฒนาภาค ๓ หน่วยบัญชาการทหารพัฒนา</w:t>
       </w:r>
     </w:p>
     <w:p>
@@ -2629,10 +2629,10 @@
     <w:p>
       <w:pPr>
         <w:tabs>
-          <w:tab w:pos="2886" w:val="left"/>
+          <w:tab w:pos="2840" w:val="left"/>
         </w:tabs>
         <w:spacing w:before="580" w:after="0" w:line="440" w:lineRule="exact"/>
-        <w:ind w:left="2886" w:hanging="720"/>
+        <w:ind w:left="2840" w:hanging="720"/>
       </w:pPr>
       <w:r>
         <w:rPr>
@@ -2644,7 +2644,7 @@
         </w:rPr>
         <w:t>เรียน</w:t>
         <w:tab/>
-        <w:t>ผู้บังคับหน่วยพัฒนาการเคลื่อนที่ 31 สำนักงานพัฒนาภาค 3</w:t>
+        <w:t>ผู้บังคับหน่วยพัฒนาการเคลื่อนที่ ๓๑ สำนักงานพัฒนาภาค ๓</w:t>
       </w:r>
     </w:p>
     <w:p>
@@ -2693,10 +2693,10 @@
     <w:p>
       <w:pPr>
         <w:tabs>
-          <w:tab w:pos="2886" w:val="left"/>
+          <w:tab w:pos="2840" w:val="left"/>
         </w:tabs>
         <w:spacing w:before="580" w:after="0" w:line="440" w:lineRule="exact"/>
-        <w:ind w:left="2886" w:hanging="720"/>
+        <w:ind w:left="2840" w:hanging="720"/>
       </w:pPr>
       <w:r>
         <w:rPr>
@@ -2708,7 +2708,7 @@
         </w:rPr>
         <w:t>เรียน</w:t>
         <w:tab/>
-        <w:t>ผู้บังคับหน่วยพัฒนาการเคลื่อนที่ 32 สำนักงานพัฒนาภาค 3</w:t>
+        <w:t>ผู้บังคับหน่วยพัฒนาการเคลื่อนที่ ๓๒ สำนักงานพัฒนาภาค ๓</w:t>
       </w:r>
     </w:p>
     <w:p>
@@ -2757,10 +2757,10 @@
     <w:p>
       <w:pPr>
         <w:tabs>
-          <w:tab w:pos="2886" w:val="left"/>
+          <w:tab w:pos="2840" w:val="left"/>
         </w:tabs>
         <w:spacing w:before="580" w:after="0" w:line="440" w:lineRule="exact"/>
-        <w:ind w:left="2886" w:hanging="720"/>
+        <w:ind w:left="2840" w:hanging="720"/>
       </w:pPr>
       <w:r>
         <w:rPr>
@@ -2772,7 +2772,7 @@
         </w:rPr>
         <w:t>เรียน</w:t>
         <w:tab/>
-        <w:t>ผู้บังคับหน่วยพัฒนาการเคลื่อนที่ 33 สำนักงานพัฒนาภาค 3</w:t>
+        <w:t>ผู้บังคับหน่วยพัฒนาการเคลื่อนที่ ๓๓ สำนักงานพัฒนาภาค ๓</w:t>
       </w:r>
     </w:p>
     <w:p>
@@ -2821,10 +2821,10 @@
     <w:p>
       <w:pPr>
         <w:tabs>
-          <w:tab w:pos="2886" w:val="left"/>
+          <w:tab w:pos="2840" w:val="left"/>
         </w:tabs>
         <w:spacing w:before="580" w:after="0" w:line="440" w:lineRule="exact"/>
-        <w:ind w:left="2886" w:hanging="720"/>
+        <w:ind w:left="2840" w:hanging="720"/>
       </w:pPr>
       <w:r>
         <w:rPr>
@@ -2836,7 +2836,7 @@
         </w:rPr>
         <w:t>เรียน</w:t>
         <w:tab/>
-        <w:t>ผู้บังคับหน่วยพัฒนาการเคลื่อนที่ 34 สำนักงานพัฒนาภาค 3</w:t>
+        <w:t>ผู้บังคับหน่วยพัฒนาการเคลื่อนที่ ๓๔ สำนักงานพัฒนาภาค ๓</w:t>
       </w:r>
     </w:p>
     <w:p>
@@ -2885,10 +2885,10 @@
     <w:p>
       <w:pPr>
         <w:tabs>
-          <w:tab w:pos="2886" w:val="left"/>
+          <w:tab w:pos="2840" w:val="left"/>
         </w:tabs>
         <w:spacing w:before="580" w:after="0" w:line="440" w:lineRule="exact"/>
-        <w:ind w:left="2886" w:hanging="720"/>
+        <w:ind w:left="2840" w:hanging="720"/>
       </w:pPr>
       <w:r>
         <w:rPr>
@@ -2900,7 +2900,7 @@
         </w:rPr>
         <w:t>เรียน</w:t>
         <w:tab/>
-        <w:t>ผู้บังคับหน่วยพัฒนาการเคลื่อนที่ 35 สำนักงานพัฒนาภาค 3</w:t>
+        <w:t>ผู้บังคับหน่วยพัฒนาการเคลื่อนที่ ๓๕ สำนักงานพัฒนาภาค ๓</w:t>
       </w:r>
     </w:p>
     <w:p>
@@ -2949,10 +2949,10 @@
     <w:p>
       <w:pPr>
         <w:tabs>
-          <w:tab w:pos="2886" w:val="left"/>
+          <w:tab w:pos="2840" w:val="left"/>
         </w:tabs>
         <w:spacing w:before="580" w:after="0" w:line="440" w:lineRule="exact"/>
-        <w:ind w:left="2886" w:hanging="720"/>
+        <w:ind w:left="2840" w:hanging="720"/>
       </w:pPr>
       <w:r>
         <w:rPr>
@@ -2964,7 +2964,7 @@
         </w:rPr>
         <w:t>เรียน</w:t>
         <w:tab/>
-        <w:t>ผู้บังคับหน่วยพัฒนาการเคลื่อนที่ 36 สำนักงานพัฒนาภาค 3</w:t>
+        <w:t>ผู้บังคับหน่วยพัฒนาการเคลื่อนที่ ๓๖ สำนักงานพัฒนาภาค ๓</w:t>
       </w:r>
     </w:p>
     <w:p>
@@ -3013,10 +3013,10 @@
     <w:p>
       <w:pPr>
         <w:tabs>
-          <w:tab w:pos="2604" w:val="left"/>
+          <w:tab w:pos="2588" w:val="left"/>
         </w:tabs>
         <w:spacing w:before="580" w:after="0" w:line="440" w:lineRule="exact"/>
-        <w:ind w:left="2604" w:hanging="720"/>
+        <w:ind w:left="2588" w:hanging="720"/>
       </w:pPr>
       <w:r>
         <w:rPr>
@@ -3028,7 +3028,7 @@
         </w:rPr>
         <w:t>เรียน</w:t>
         <w:tab/>
-        <w:t>ผู้อำนวยการสำนักงานพัฒนาภาค 4 หน่วยบัญชาการทหารพัฒนา</w:t>
+        <w:t>ผู้อำนวยการสำนักงานพัฒนาภาค ๔ หน่วยบัญชาการทหารพัฒนา</w:t>
       </w:r>
     </w:p>
     <w:p>
@@ -3077,10 +3077,10 @@
     <w:p>
       <w:pPr>
         <w:tabs>
-          <w:tab w:pos="2886" w:val="left"/>
+          <w:tab w:pos="2840" w:val="left"/>
         </w:tabs>
         <w:spacing w:before="580" w:after="0" w:line="440" w:lineRule="exact"/>
-        <w:ind w:left="2886" w:hanging="720"/>
+        <w:ind w:left="2840" w:hanging="720"/>
       </w:pPr>
       <w:r>
         <w:rPr>
@@ -3092,7 +3092,7 @@
         </w:rPr>
         <w:t>เรียน</w:t>
         <w:tab/>
-        <w:t>ผู้บังคับหน่วยพัฒนาการเคลื่อนที่ 41 สำนักงานพัฒนาภาค 4</w:t>
+        <w:t>ผู้บังคับหน่วยพัฒนาการเคลื่อนที่ ๔๑ สำนักงานพัฒนาภาค ๔</w:t>
       </w:r>
     </w:p>
     <w:p>
@@ -3141,10 +3141,10 @@
     <w:p>
       <w:pPr>
         <w:tabs>
-          <w:tab w:pos="2886" w:val="left"/>
+          <w:tab w:pos="2840" w:val="left"/>
         </w:tabs>
         <w:spacing w:before="580" w:after="0" w:line="440" w:lineRule="exact"/>
-        <w:ind w:left="2886" w:hanging="720"/>
+        <w:ind w:left="2840" w:hanging="720"/>
       </w:pPr>
       <w:r>
         <w:rPr>
@@ -3156,7 +3156,7 @@
         </w:rPr>
         <w:t>เรียน</w:t>
         <w:tab/>
-        <w:t>ผู้บังคับหน่วยพัฒนาการเคลื่อนที่ 42 สำนักงานพัฒนาภาค 4</w:t>
+        <w:t>ผู้บังคับหน่วยพัฒนาการเคลื่อนที่ ๔๒ สำนักงานพัฒนาภาค ๔</w:t>
       </w:r>
     </w:p>
     <w:p>
@@ -3205,10 +3205,10 @@
     <w:p>
       <w:pPr>
         <w:tabs>
-          <w:tab w:pos="2886" w:val="left"/>
+          <w:tab w:pos="2840" w:val="left"/>
         </w:tabs>
         <w:spacing w:before="580" w:after="0" w:line="440" w:lineRule="exact"/>
-        <w:ind w:left="2886" w:hanging="720"/>
+        <w:ind w:left="2840" w:hanging="720"/>
       </w:pPr>
       <w:r>
         <w:rPr>
@@ -3220,7 +3220,7 @@
         </w:rPr>
         <w:t>เรียน</w:t>
         <w:tab/>
-        <w:t>ผู้บังคับหน่วยพัฒนาการเคลื่อนที่ 43 สำนักงานพัฒนาภาค 4</w:t>
+        <w:t>ผู้บังคับหน่วยพัฒนาการเคลื่อนที่ ๔๓ สำนักงานพัฒนาภาค ๔</w:t>
       </w:r>
     </w:p>
     <w:p>
@@ -3269,10 +3269,10 @@
     <w:p>
       <w:pPr>
         <w:tabs>
-          <w:tab w:pos="2886" w:val="left"/>
+          <w:tab w:pos="2840" w:val="left"/>
         </w:tabs>
         <w:spacing w:before="580" w:after="0" w:line="440" w:lineRule="exact"/>
-        <w:ind w:left="2886" w:hanging="720"/>
+        <w:ind w:left="2840" w:hanging="720"/>
       </w:pPr>
       <w:r>
         <w:rPr>
@@ -3284,7 +3284,7 @@
         </w:rPr>
         <w:t>เรียน</w:t>
         <w:tab/>
-        <w:t>ผู้บังคับหน่วยพัฒนาการเคลื่อนที่ 44 สำนักงานพัฒนาภาค 4</w:t>
+        <w:t>ผู้บังคับหน่วยพัฒนาการเคลื่อนที่ ๔๔ สำนักงานพัฒนาภาค ๔</w:t>
       </w:r>
     </w:p>
     <w:p>
@@ -3333,10 +3333,10 @@
     <w:p>
       <w:pPr>
         <w:tabs>
-          <w:tab w:pos="2886" w:val="left"/>
+          <w:tab w:pos="2840" w:val="left"/>
         </w:tabs>
         <w:spacing w:before="580" w:after="0" w:line="440" w:lineRule="exact"/>
-        <w:ind w:left="2886" w:hanging="720"/>
+        <w:ind w:left="2840" w:hanging="720"/>
       </w:pPr>
       <w:r>
         <w:rPr>
@@ -3348,7 +3348,7 @@
         </w:rPr>
         <w:t>เรียน</w:t>
         <w:tab/>
-        <w:t>ผู้บังคับหน่วยพัฒนาการเคลื่อนที่ 45 สำนักงานพัฒนาภาค 4</w:t>
+        <w:t>ผู้บังคับหน่วยพัฒนาการเคลื่อนที่ ๔๕ สำนักงานพัฒนาภาค ๔</w:t>
       </w:r>
     </w:p>
     <w:p>
@@ -3397,10 +3397,10 @@
     <w:p>
       <w:pPr>
         <w:tabs>
-          <w:tab w:pos="2886" w:val="left"/>
+          <w:tab w:pos="2840" w:val="left"/>
         </w:tabs>
         <w:spacing w:before="580" w:after="0" w:line="440" w:lineRule="exact"/>
-        <w:ind w:left="2886" w:hanging="720"/>
+        <w:ind w:left="2840" w:hanging="720"/>
       </w:pPr>
       <w:r>
         <w:rPr>
@@ -3412,7 +3412,7 @@
         </w:rPr>
         <w:t>เรียน</w:t>
         <w:tab/>
-        <w:t>ผู้บังคับหน่วยพัฒนาการเคลื่อนที่ 46 สำนักงานพัฒนาภาค 4</w:t>
+        <w:t>ผู้บังคับหน่วยพัฒนาการเคลื่อนที่ ๔๖ สำนักงานพัฒนาภาค ๔</w:t>
       </w:r>
     </w:p>
     <w:p>
@@ -3461,10 +3461,10 @@
     <w:p>
       <w:pPr>
         <w:tabs>
-          <w:tab w:pos="2604" w:val="left"/>
+          <w:tab w:pos="2588" w:val="left"/>
         </w:tabs>
         <w:spacing w:before="580" w:after="0" w:line="440" w:lineRule="exact"/>
-        <w:ind w:left="2604" w:hanging="720"/>
+        <w:ind w:left="2588" w:hanging="720"/>
       </w:pPr>
       <w:r>
         <w:rPr>
@@ -3476,7 +3476,7 @@
         </w:rPr>
         <w:t>เรียน</w:t>
         <w:tab/>
-        <w:t>ผู้อำนวยการสำนักงานพัฒนาภาค 5 หน่วยบัญชาการทหารพัฒนา</w:t>
+        <w:t>ผู้อำนวยการสำนักงานพัฒนาภาค ๕ หน่วยบัญชาการทหารพัฒนา</w:t>
       </w:r>
     </w:p>
     <w:p>
@@ -3525,10 +3525,10 @@
     <w:p>
       <w:pPr>
         <w:tabs>
-          <w:tab w:pos="2886" w:val="left"/>
+          <w:tab w:pos="2840" w:val="left"/>
         </w:tabs>
         <w:spacing w:before="580" w:after="0" w:line="440" w:lineRule="exact"/>
-        <w:ind w:left="2886" w:hanging="720"/>
+        <w:ind w:left="2840" w:hanging="720"/>
       </w:pPr>
       <w:r>
         <w:rPr>
@@ -3540,7 +3540,7 @@
         </w:rPr>
         <w:t>เรียน</w:t>
         <w:tab/>
-        <w:t>ผู้บังคับหน่วยพัฒนาการเคลื่อนที่ 51 สำนักงานพัฒนาภาค 5</w:t>
+        <w:t>ผู้บังคับหน่วยพัฒนาการเคลื่อนที่ ๕๑ สำนักงานพัฒนาภาค ๕</w:t>
       </w:r>
     </w:p>
     <w:p>
@@ -3589,10 +3589,10 @@
     <w:p>
       <w:pPr>
         <w:tabs>
-          <w:tab w:pos="2886" w:val="left"/>
+          <w:tab w:pos="2840" w:val="left"/>
         </w:tabs>
         <w:spacing w:before="580" w:after="0" w:line="440" w:lineRule="exact"/>
-        <w:ind w:left="2886" w:hanging="720"/>
+        <w:ind w:left="2840" w:hanging="720"/>
       </w:pPr>
       <w:r>
         <w:rPr>
@@ -3604,7 +3604,7 @@
         </w:rPr>
         <w:t>เรียน</w:t>
         <w:tab/>
-        <w:t>ผู้บังคับหน่วยพัฒนาการเคลื่อนที่ 52 สำนักงานพัฒนาภาค 5</w:t>
+        <w:t>ผู้บังคับหน่วยพัฒนาการเคลื่อนที่ ๕๒ สำนักงานพัฒนาภาค ๕</w:t>
       </w:r>
     </w:p>
     <w:p>
@@ -3653,10 +3653,10 @@
     <w:p>
       <w:pPr>
         <w:tabs>
-          <w:tab w:pos="2886" w:val="left"/>
+          <w:tab w:pos="2840" w:val="left"/>
         </w:tabs>
         <w:spacing w:before="580" w:after="0" w:line="440" w:lineRule="exact"/>
-        <w:ind w:left="2886" w:hanging="720"/>
+        <w:ind w:left="2840" w:hanging="720"/>
       </w:pPr>
       <w:r>
         <w:rPr>
@@ -3668,7 +3668,7 @@
         </w:rPr>
         <w:t>เรียน</w:t>
         <w:tab/>
-        <w:t>ผู้บังคับหน่วยพัฒนาการเคลื่อนที่ 53 สำนักงานพัฒนาภาค 5</w:t>
+        <w:t>ผู้บังคับหน่วยพัฒนาการเคลื่อนที่ ๕๓ สำนักงานพัฒนาภาค ๕</w:t>
       </w:r>
     </w:p>
     <w:p>
@@ -3717,10 +3717,10 @@
     <w:p>
       <w:pPr>
         <w:tabs>
-          <w:tab w:pos="2886" w:val="left"/>
+          <w:tab w:pos="2840" w:val="left"/>
         </w:tabs>
         <w:spacing w:before="580" w:after="0" w:line="440" w:lineRule="exact"/>
-        <w:ind w:left="2886" w:hanging="720"/>
+        <w:ind w:left="2840" w:hanging="720"/>
       </w:pPr>
       <w:r>
         <w:rPr>
@@ -3732,7 +3732,7 @@
         </w:rPr>
         <w:t>เรียน</w:t>
         <w:tab/>
-        <w:t>ผู้บังคับหน่วยพัฒนาการเคลื่อนที่ 54 สำนักงานพัฒนาภาค 5</w:t>
+        <w:t>ผู้บังคับหน่วยพัฒนาการเคลื่อนที่ ๕๔ สำนักงานพัฒนาภาค ๕</w:t>
       </w:r>
     </w:p>
     <w:p>
@@ -3781,10 +3781,10 @@
     <w:p>
       <w:pPr>
         <w:tabs>
-          <w:tab w:pos="2886" w:val="left"/>
+          <w:tab w:pos="2840" w:val="left"/>
         </w:tabs>
         <w:spacing w:before="580" w:after="0" w:line="440" w:lineRule="exact"/>
-        <w:ind w:left="2886" w:hanging="720"/>
+        <w:ind w:left="2840" w:hanging="720"/>
       </w:pPr>
       <w:r>
         <w:rPr>
@@ -3796,7 +3796,7 @@
         </w:rPr>
         <w:t>เรียน</w:t>
         <w:tab/>
-        <w:t>ผู้บังคับหน่วยพัฒนาการเคลื่อนที่ 55 สำนักงานพัฒนาภาค 5</w:t>
+        <w:t>ผู้บังคับหน่วยพัฒนาการเคลื่อนที่ ๕๕ สำนักงานพัฒนาภาค ๕</w:t>
       </w:r>
     </w:p>
     <w:p>
@@ -3845,10 +3845,10 @@
     <w:p>
       <w:pPr>
         <w:tabs>
-          <w:tab w:pos="2886" w:val="left"/>
+          <w:tab w:pos="2840" w:val="left"/>
         </w:tabs>
         <w:spacing w:before="580" w:after="0" w:line="440" w:lineRule="exact"/>
-        <w:ind w:left="2886" w:hanging="720"/>
+        <w:ind w:left="2840" w:hanging="720"/>
       </w:pPr>
       <w:r>
         <w:rPr>
@@ -3860,7 +3860,7 @@
         </w:rPr>
         <w:t>เรียน</w:t>
         <w:tab/>
-        <w:t>ผู้บังคับหน่วยพัฒนาการเคลื่อนที่ 56 สำนักงานพัฒนาภาค 5</w:t>
+        <w:t>ผู้บังคับหน่วยพัฒนาการเคลื่อนที่ ๕๖ สำนักงานพัฒนาภาค ๕</w:t>
       </w:r>
     </w:p>
     <w:p>
@@ -6412,6 +6412,10 @@
     <w:name w:val="Normal"/>
     <w:qFormat/>
     <w:rsid w:val="00FC693F"/>
+    <w:rPr>
+      <w:rFonts w:ascii="TH SarabunPSK" w:hAnsi="TH SarabunPSK" w:cs="TH SarabunPSK" w:eastAsia="TH SarabunPSK"/>
+      <w:sz w:val="32"/>
+    </w:rPr>
   </w:style>
   <w:style w:type="paragraph" w:styleId="Header">
     <w:name w:val="header"/>

</xml_diff>